<commit_message>
docs: update the formal documents to the current ICM
Applies what the reports of tasks 1, 2 and 6 listed and what the
comparison with the ICM found: ESLint 9 and decision 0037, Prettier
scope, CI typegen and required job, container steps and .dockerignore,
end-to-end tasks without area owners, no CODEOWNERS, the .env.example
exception, Docker variables, trivial-task criteria and the
documentos-formais/ folder. Tables of contents updated in Word.

Co-Authored-By: Claude Opus 5.5 <noreply@anthropic.com>
</commit_message>
<xml_diff>
--- a/documentos-formais/ArquiteturaDoSoftware.docx
+++ b/documentos-formais/ArquiteturaDoSoftware.docx
@@ -240,7 +240,7 @@
       <w:r>
         <w:fldChar w:fldCharType="separate"/>
       </w:r>
-      <w:hyperlink w:anchor="_Toc242969924" w:history="1">
+      <w:hyperlink w:anchor="_Toc243219198" w:history="1">
         <w:r>
           <w:rPr>
             <w:rStyle w:val="Hyperlink"/>
@@ -263,7 +263,7 @@
           <w:rPr>
             <w:webHidden/>
           </w:rPr>
-          <w:instrText xml:space="preserve"> PAGEREF _Toc242969924 \h </w:instrText>
+          <w:instrText xml:space="preserve"> PAGEREF _Toc243219198 \h </w:instrText>
         </w:r>
         <w:r>
           <w:rPr>
@@ -298,7 +298,7 @@
           <w:lang w:eastAsia="pt-BR"/>
         </w:rPr>
       </w:pPr>
-      <w:hyperlink w:anchor="_Toc242969925" w:history="1">
+      <w:hyperlink w:anchor="_Toc243219199" w:history="1">
         <w:r>
           <w:rPr>
             <w:rStyle w:val="Hyperlink"/>
@@ -321,7 +321,7 @@
           <w:rPr>
             <w:webHidden/>
           </w:rPr>
-          <w:instrText xml:space="preserve"> PAGEREF _Toc242969925 \h </w:instrText>
+          <w:instrText xml:space="preserve"> PAGEREF _Toc243219199 \h </w:instrText>
         </w:r>
         <w:r>
           <w:rPr>
@@ -358,7 +358,7 @@
           <w:lang w:eastAsia="pt-BR"/>
         </w:rPr>
       </w:pPr>
-      <w:hyperlink w:anchor="_Toc242969926" w:history="1">
+      <w:hyperlink w:anchor="_Toc243219200" w:history="1">
         <w:r>
           <w:rPr>
             <w:rStyle w:val="Hyperlink"/>
@@ -381,7 +381,7 @@
           <w:rPr>
             <w:webHidden/>
           </w:rPr>
-          <w:instrText xml:space="preserve"> PAGEREF _Toc242969926 \h </w:instrText>
+          <w:instrText xml:space="preserve"> PAGEREF _Toc243219200 \h </w:instrText>
         </w:r>
         <w:r>
           <w:rPr>
@@ -416,7 +416,7 @@
           <w:lang w:eastAsia="pt-BR"/>
         </w:rPr>
       </w:pPr>
-      <w:hyperlink w:anchor="_Toc242969927" w:history="1">
+      <w:hyperlink w:anchor="_Toc243219201" w:history="1">
         <w:r>
           <w:rPr>
             <w:rStyle w:val="Hyperlink"/>
@@ -439,7 +439,7 @@
           <w:rPr>
             <w:webHidden/>
           </w:rPr>
-          <w:instrText xml:space="preserve"> PAGEREF _Toc242969927 \h </w:instrText>
+          <w:instrText xml:space="preserve"> PAGEREF _Toc243219201 \h </w:instrText>
         </w:r>
         <w:r>
           <w:rPr>
@@ -474,7 +474,7 @@
           <w:lang w:eastAsia="pt-BR"/>
         </w:rPr>
       </w:pPr>
-      <w:hyperlink w:anchor="_Toc242969928" w:history="1">
+      <w:hyperlink w:anchor="_Toc243219202" w:history="1">
         <w:r>
           <w:rPr>
             <w:rStyle w:val="Hyperlink"/>
@@ -497,7 +497,7 @@
           <w:rPr>
             <w:webHidden/>
           </w:rPr>
-          <w:instrText xml:space="preserve"> PAGEREF _Toc242969928 \h </w:instrText>
+          <w:instrText xml:space="preserve"> PAGEREF _Toc243219202 \h </w:instrText>
         </w:r>
         <w:r>
           <w:rPr>
@@ -532,7 +532,7 @@
           <w:lang w:eastAsia="pt-BR"/>
         </w:rPr>
       </w:pPr>
-      <w:hyperlink w:anchor="_Toc242969929" w:history="1">
+      <w:hyperlink w:anchor="_Toc243219203" w:history="1">
         <w:r>
           <w:rPr>
             <w:rStyle w:val="Hyperlink"/>
@@ -555,7 +555,7 @@
           <w:rPr>
             <w:webHidden/>
           </w:rPr>
-          <w:instrText xml:space="preserve"> PAGEREF _Toc242969929 \h </w:instrText>
+          <w:instrText xml:space="preserve"> PAGEREF _Toc243219203 \h </w:instrText>
         </w:r>
         <w:r>
           <w:rPr>
@@ -590,7 +590,7 @@
           <w:lang w:eastAsia="pt-BR"/>
         </w:rPr>
       </w:pPr>
-      <w:hyperlink w:anchor="_Toc242969930" w:history="1">
+      <w:hyperlink w:anchor="_Toc243219204" w:history="1">
         <w:r>
           <w:rPr>
             <w:rStyle w:val="Hyperlink"/>
@@ -613,7 +613,7 @@
           <w:rPr>
             <w:webHidden/>
           </w:rPr>
-          <w:instrText xml:space="preserve"> PAGEREF _Toc242969930 \h </w:instrText>
+          <w:instrText xml:space="preserve"> PAGEREF _Toc243219204 \h </w:instrText>
         </w:r>
         <w:r>
           <w:rPr>
@@ -648,7 +648,7 @@
           <w:lang w:eastAsia="pt-BR"/>
         </w:rPr>
       </w:pPr>
-      <w:hyperlink w:anchor="_Toc242969931" w:history="1">
+      <w:hyperlink w:anchor="_Toc243219205" w:history="1">
         <w:r>
           <w:rPr>
             <w:rStyle w:val="Hyperlink"/>
@@ -671,7 +671,7 @@
           <w:rPr>
             <w:webHidden/>
           </w:rPr>
-          <w:instrText xml:space="preserve"> PAGEREF _Toc242969931 \h </w:instrText>
+          <w:instrText xml:space="preserve"> PAGEREF _Toc243219205 \h </w:instrText>
         </w:r>
         <w:r>
           <w:rPr>
@@ -706,7 +706,7 @@
           <w:lang w:eastAsia="pt-BR"/>
         </w:rPr>
       </w:pPr>
-      <w:hyperlink w:anchor="_Toc242969932" w:history="1">
+      <w:hyperlink w:anchor="_Toc243219206" w:history="1">
         <w:r>
           <w:rPr>
             <w:rStyle w:val="Hyperlink"/>
@@ -729,7 +729,7 @@
           <w:rPr>
             <w:webHidden/>
           </w:rPr>
-          <w:instrText xml:space="preserve"> PAGEREF _Toc242969932 \h </w:instrText>
+          <w:instrText xml:space="preserve"> PAGEREF _Toc243219206 \h </w:instrText>
         </w:r>
         <w:r>
           <w:rPr>
@@ -764,7 +764,7 @@
           <w:lang w:eastAsia="pt-BR"/>
         </w:rPr>
       </w:pPr>
-      <w:hyperlink w:anchor="_Toc242969933" w:history="1">
+      <w:hyperlink w:anchor="_Toc243219207" w:history="1">
         <w:r>
           <w:rPr>
             <w:rStyle w:val="Hyperlink"/>
@@ -787,7 +787,7 @@
           <w:rPr>
             <w:webHidden/>
           </w:rPr>
-          <w:instrText xml:space="preserve"> PAGEREF _Toc242969933 \h </w:instrText>
+          <w:instrText xml:space="preserve"> PAGEREF _Toc243219207 \h </w:instrText>
         </w:r>
         <w:r>
           <w:rPr>
@@ -822,7 +822,7 @@
           <w:lang w:eastAsia="pt-BR"/>
         </w:rPr>
       </w:pPr>
-      <w:hyperlink w:anchor="_Toc242969934" w:history="1">
+      <w:hyperlink w:anchor="_Toc243219208" w:history="1">
         <w:r>
           <w:rPr>
             <w:rStyle w:val="Hyperlink"/>
@@ -845,7 +845,7 @@
           <w:rPr>
             <w:webHidden/>
           </w:rPr>
-          <w:instrText xml:space="preserve"> PAGEREF _Toc242969934 \h </w:instrText>
+          <w:instrText xml:space="preserve"> PAGEREF _Toc243219208 \h </w:instrText>
         </w:r>
         <w:r>
           <w:rPr>
@@ -862,7 +862,7 @@
           <w:rPr>
             <w:webHidden/>
           </w:rPr>
-          <w:t>9</w:t>
+          <w:t>10</w:t>
         </w:r>
         <w:r>
           <w:rPr>
@@ -882,7 +882,7 @@
           <w:lang w:eastAsia="pt-BR"/>
         </w:rPr>
       </w:pPr>
-      <w:hyperlink w:anchor="_Toc242969935" w:history="1">
+      <w:hyperlink w:anchor="_Toc243219209" w:history="1">
         <w:r>
           <w:rPr>
             <w:rStyle w:val="Hyperlink"/>
@@ -905,7 +905,7 @@
           <w:rPr>
             <w:webHidden/>
           </w:rPr>
-          <w:instrText xml:space="preserve"> PAGEREF _Toc242969935 \h </w:instrText>
+          <w:instrText xml:space="preserve"> PAGEREF _Toc243219209 \h </w:instrText>
         </w:r>
         <w:r>
           <w:rPr>
@@ -940,7 +940,7 @@
           <w:lang w:eastAsia="pt-BR"/>
         </w:rPr>
       </w:pPr>
-      <w:hyperlink w:anchor="_Toc242969936" w:history="1">
+      <w:hyperlink w:anchor="_Toc243219210" w:history="1">
         <w:r>
           <w:rPr>
             <w:rStyle w:val="Hyperlink"/>
@@ -963,7 +963,7 @@
           <w:rPr>
             <w:webHidden/>
           </w:rPr>
-          <w:instrText xml:space="preserve"> PAGEREF _Toc242969936 \h </w:instrText>
+          <w:instrText xml:space="preserve"> PAGEREF _Toc243219210 \h </w:instrText>
         </w:r>
         <w:r>
           <w:rPr>
@@ -998,7 +998,7 @@
           <w:lang w:eastAsia="pt-BR"/>
         </w:rPr>
       </w:pPr>
-      <w:hyperlink w:anchor="_Toc242969937" w:history="1">
+      <w:hyperlink w:anchor="_Toc243219211" w:history="1">
         <w:r>
           <w:rPr>
             <w:rStyle w:val="Hyperlink"/>
@@ -1021,7 +1021,7 @@
           <w:rPr>
             <w:webHidden/>
           </w:rPr>
-          <w:instrText xml:space="preserve"> PAGEREF _Toc242969937 \h </w:instrText>
+          <w:instrText xml:space="preserve"> PAGEREF _Toc243219211 \h </w:instrText>
         </w:r>
         <w:r>
           <w:rPr>
@@ -1056,7 +1056,7 @@
           <w:lang w:eastAsia="pt-BR"/>
         </w:rPr>
       </w:pPr>
-      <w:hyperlink w:anchor="_Toc242969938" w:history="1">
+      <w:hyperlink w:anchor="_Toc243219212" w:history="1">
         <w:r>
           <w:rPr>
             <w:rStyle w:val="Hyperlink"/>
@@ -1079,7 +1079,7 @@
           <w:rPr>
             <w:webHidden/>
           </w:rPr>
-          <w:instrText xml:space="preserve"> PAGEREF _Toc242969938 \h </w:instrText>
+          <w:instrText xml:space="preserve"> PAGEREF _Toc243219212 \h </w:instrText>
         </w:r>
         <w:r>
           <w:rPr>
@@ -1114,7 +1114,7 @@
           <w:lang w:eastAsia="pt-BR"/>
         </w:rPr>
       </w:pPr>
-      <w:hyperlink w:anchor="_Toc242969939" w:history="1">
+      <w:hyperlink w:anchor="_Toc243219213" w:history="1">
         <w:r>
           <w:rPr>
             <w:rStyle w:val="Hyperlink"/>
@@ -1137,7 +1137,7 @@
           <w:rPr>
             <w:webHidden/>
           </w:rPr>
-          <w:instrText xml:space="preserve"> PAGEREF _Toc242969939 \h </w:instrText>
+          <w:instrText xml:space="preserve"> PAGEREF _Toc243219213 \h </w:instrText>
         </w:r>
         <w:r>
           <w:rPr>
@@ -1172,7 +1172,7 @@
           <w:lang w:eastAsia="pt-BR"/>
         </w:rPr>
       </w:pPr>
-      <w:hyperlink w:anchor="_Toc242969940" w:history="1">
+      <w:hyperlink w:anchor="_Toc243219214" w:history="1">
         <w:r>
           <w:rPr>
             <w:rStyle w:val="Hyperlink"/>
@@ -1195,7 +1195,7 @@
           <w:rPr>
             <w:webHidden/>
           </w:rPr>
-          <w:instrText xml:space="preserve"> PAGEREF _Toc242969940 \h </w:instrText>
+          <w:instrText xml:space="preserve"> PAGEREF _Toc243219214 \h </w:instrText>
         </w:r>
         <w:r>
           <w:rPr>
@@ -1230,7 +1230,7 @@
           <w:lang w:eastAsia="pt-BR"/>
         </w:rPr>
       </w:pPr>
-      <w:hyperlink w:anchor="_Toc242969941" w:history="1">
+      <w:hyperlink w:anchor="_Toc243219215" w:history="1">
         <w:r>
           <w:rPr>
             <w:rStyle w:val="Hyperlink"/>
@@ -1253,7 +1253,7 @@
           <w:rPr>
             <w:webHidden/>
           </w:rPr>
-          <w:instrText xml:space="preserve"> PAGEREF _Toc242969941 \h </w:instrText>
+          <w:instrText xml:space="preserve"> PAGEREF _Toc243219215 \h </w:instrText>
         </w:r>
         <w:r>
           <w:rPr>
@@ -1288,7 +1288,7 @@
           <w:lang w:eastAsia="pt-BR"/>
         </w:rPr>
       </w:pPr>
-      <w:hyperlink w:anchor="_Toc242969942" w:history="1">
+      <w:hyperlink w:anchor="_Toc243219216" w:history="1">
         <w:r>
           <w:rPr>
             <w:rStyle w:val="Hyperlink"/>
@@ -1311,7 +1311,7 @@
           <w:rPr>
             <w:webHidden/>
           </w:rPr>
-          <w:instrText xml:space="preserve"> PAGEREF _Toc242969942 \h </w:instrText>
+          <w:instrText xml:space="preserve"> PAGEREF _Toc243219216 \h </w:instrText>
         </w:r>
         <w:r>
           <w:rPr>
@@ -1346,7 +1346,7 @@
           <w:lang w:eastAsia="pt-BR"/>
         </w:rPr>
       </w:pPr>
-      <w:hyperlink w:anchor="_Toc242969943" w:history="1">
+      <w:hyperlink w:anchor="_Toc243219217" w:history="1">
         <w:r>
           <w:rPr>
             <w:rStyle w:val="Hyperlink"/>
@@ -1369,7 +1369,7 @@
           <w:rPr>
             <w:webHidden/>
           </w:rPr>
-          <w:instrText xml:space="preserve"> PAGEREF _Toc242969943 \h </w:instrText>
+          <w:instrText xml:space="preserve"> PAGEREF _Toc243219217 \h </w:instrText>
         </w:r>
         <w:r>
           <w:rPr>
@@ -1404,7 +1404,7 @@
           <w:lang w:eastAsia="pt-BR"/>
         </w:rPr>
       </w:pPr>
-      <w:hyperlink w:anchor="_Toc242969944" w:history="1">
+      <w:hyperlink w:anchor="_Toc243219218" w:history="1">
         <w:r>
           <w:rPr>
             <w:rStyle w:val="Hyperlink"/>
@@ -1427,7 +1427,7 @@
           <w:rPr>
             <w:webHidden/>
           </w:rPr>
-          <w:instrText xml:space="preserve"> PAGEREF _Toc242969944 \h </w:instrText>
+          <w:instrText xml:space="preserve"> PAGEREF _Toc243219218 \h </w:instrText>
         </w:r>
         <w:r>
           <w:rPr>
@@ -1464,7 +1464,7 @@
           <w:lang w:eastAsia="pt-BR"/>
         </w:rPr>
       </w:pPr>
-      <w:hyperlink w:anchor="_Toc242969945" w:history="1">
+      <w:hyperlink w:anchor="_Toc243219219" w:history="1">
         <w:r>
           <w:rPr>
             <w:rStyle w:val="Hyperlink"/>
@@ -1487,7 +1487,7 @@
           <w:rPr>
             <w:webHidden/>
           </w:rPr>
-          <w:instrText xml:space="preserve"> PAGEREF _Toc242969945 \h </w:instrText>
+          <w:instrText xml:space="preserve"> PAGEREF _Toc243219219 \h </w:instrText>
         </w:r>
         <w:r>
           <w:rPr>
@@ -1522,7 +1522,7 @@
           <w:lang w:eastAsia="pt-BR"/>
         </w:rPr>
       </w:pPr>
-      <w:hyperlink w:anchor="_Toc242969946" w:history="1">
+      <w:hyperlink w:anchor="_Toc243219220" w:history="1">
         <w:r>
           <w:rPr>
             <w:rStyle w:val="Hyperlink"/>
@@ -1545,7 +1545,7 @@
           <w:rPr>
             <w:webHidden/>
           </w:rPr>
-          <w:instrText xml:space="preserve"> PAGEREF _Toc242969946 \h </w:instrText>
+          <w:instrText xml:space="preserve"> PAGEREF _Toc243219220 \h </w:instrText>
         </w:r>
         <w:r>
           <w:rPr>
@@ -1580,7 +1580,7 @@
           <w:lang w:eastAsia="pt-BR"/>
         </w:rPr>
       </w:pPr>
-      <w:hyperlink w:anchor="_Toc242969947" w:history="1">
+      <w:hyperlink w:anchor="_Toc243219221" w:history="1">
         <w:r>
           <w:rPr>
             <w:rStyle w:val="Hyperlink"/>
@@ -1603,7 +1603,7 @@
           <w:rPr>
             <w:webHidden/>
           </w:rPr>
-          <w:instrText xml:space="preserve"> PAGEREF _Toc242969947 \h </w:instrText>
+          <w:instrText xml:space="preserve"> PAGEREF _Toc243219221 \h </w:instrText>
         </w:r>
         <w:r>
           <w:rPr>
@@ -1638,7 +1638,7 @@
           <w:lang w:eastAsia="pt-BR"/>
         </w:rPr>
       </w:pPr>
-      <w:hyperlink w:anchor="_Toc242969948" w:history="1">
+      <w:hyperlink w:anchor="_Toc243219222" w:history="1">
         <w:r>
           <w:rPr>
             <w:rStyle w:val="Hyperlink"/>
@@ -1661,7 +1661,7 @@
           <w:rPr>
             <w:webHidden/>
           </w:rPr>
-          <w:instrText xml:space="preserve"> PAGEREF _Toc242969948 \h </w:instrText>
+          <w:instrText xml:space="preserve"> PAGEREF _Toc243219222 \h </w:instrText>
         </w:r>
         <w:r>
           <w:rPr>
@@ -1696,7 +1696,7 @@
           <w:lang w:eastAsia="pt-BR"/>
         </w:rPr>
       </w:pPr>
-      <w:hyperlink w:anchor="_Toc242969949" w:history="1">
+      <w:hyperlink w:anchor="_Toc243219223" w:history="1">
         <w:r>
           <w:rPr>
             <w:rStyle w:val="Hyperlink"/>
@@ -1719,7 +1719,7 @@
           <w:rPr>
             <w:webHidden/>
           </w:rPr>
-          <w:instrText xml:space="preserve"> PAGEREF _Toc242969949 \h </w:instrText>
+          <w:instrText xml:space="preserve"> PAGEREF _Toc243219223 \h </w:instrText>
         </w:r>
         <w:r>
           <w:rPr>
@@ -1754,7 +1754,7 @@
           <w:lang w:eastAsia="pt-BR"/>
         </w:rPr>
       </w:pPr>
-      <w:hyperlink w:anchor="_Toc242969950" w:history="1">
+      <w:hyperlink w:anchor="_Toc243219224" w:history="1">
         <w:r>
           <w:rPr>
             <w:rStyle w:val="Hyperlink"/>
@@ -1777,7 +1777,7 @@
           <w:rPr>
             <w:webHidden/>
           </w:rPr>
-          <w:instrText xml:space="preserve"> PAGEREF _Toc242969950 \h </w:instrText>
+          <w:instrText xml:space="preserve"> PAGEREF _Toc243219224 \h </w:instrText>
         </w:r>
         <w:r>
           <w:rPr>
@@ -1812,7 +1812,7 @@
           <w:lang w:eastAsia="pt-BR"/>
         </w:rPr>
       </w:pPr>
-      <w:hyperlink w:anchor="_Toc242969951" w:history="1">
+      <w:hyperlink w:anchor="_Toc243219225" w:history="1">
         <w:r>
           <w:rPr>
             <w:rStyle w:val="Hyperlink"/>
@@ -1835,7 +1835,7 @@
           <w:rPr>
             <w:webHidden/>
           </w:rPr>
-          <w:instrText xml:space="preserve"> PAGEREF _Toc242969951 \h </w:instrText>
+          <w:instrText xml:space="preserve"> PAGEREF _Toc243219225 \h </w:instrText>
         </w:r>
         <w:r>
           <w:rPr>
@@ -1872,7 +1872,7 @@
           <w:lang w:eastAsia="pt-BR"/>
         </w:rPr>
       </w:pPr>
-      <w:hyperlink w:anchor="_Toc242969952" w:history="1">
+      <w:hyperlink w:anchor="_Toc243219226" w:history="1">
         <w:r>
           <w:rPr>
             <w:rStyle w:val="Hyperlink"/>
@@ -1895,7 +1895,7 @@
           <w:rPr>
             <w:webHidden/>
           </w:rPr>
-          <w:instrText xml:space="preserve"> PAGEREF _Toc242969952 \h </w:instrText>
+          <w:instrText xml:space="preserve"> PAGEREF _Toc243219226 \h </w:instrText>
         </w:r>
         <w:r>
           <w:rPr>
@@ -1930,7 +1930,7 @@
           <w:lang w:eastAsia="pt-BR"/>
         </w:rPr>
       </w:pPr>
-      <w:hyperlink w:anchor="_Toc242969953" w:history="1">
+      <w:hyperlink w:anchor="_Toc243219227" w:history="1">
         <w:r>
           <w:rPr>
             <w:rStyle w:val="Hyperlink"/>
@@ -1953,7 +1953,7 @@
           <w:rPr>
             <w:webHidden/>
           </w:rPr>
-          <w:instrText xml:space="preserve"> PAGEREF _Toc242969953 \h </w:instrText>
+          <w:instrText xml:space="preserve"> PAGEREF _Toc243219227 \h </w:instrText>
         </w:r>
         <w:r>
           <w:rPr>
@@ -1988,7 +1988,7 @@
           <w:lang w:eastAsia="pt-BR"/>
         </w:rPr>
       </w:pPr>
-      <w:hyperlink w:anchor="_Toc242969954" w:history="1">
+      <w:hyperlink w:anchor="_Toc243219228" w:history="1">
         <w:r>
           <w:rPr>
             <w:rStyle w:val="Hyperlink"/>
@@ -2011,7 +2011,7 @@
           <w:rPr>
             <w:webHidden/>
           </w:rPr>
-          <w:instrText xml:space="preserve"> PAGEREF _Toc242969954 \h </w:instrText>
+          <w:instrText xml:space="preserve"> PAGEREF _Toc243219228 \h </w:instrText>
         </w:r>
         <w:r>
           <w:rPr>
@@ -2046,7 +2046,7 @@
           <w:lang w:eastAsia="pt-BR"/>
         </w:rPr>
       </w:pPr>
-      <w:hyperlink w:anchor="_Toc242969955" w:history="1">
+      <w:hyperlink w:anchor="_Toc243219229" w:history="1">
         <w:r>
           <w:rPr>
             <w:rStyle w:val="Hyperlink"/>
@@ -2069,7 +2069,7 @@
           <w:rPr>
             <w:webHidden/>
           </w:rPr>
-          <w:instrText xml:space="preserve"> PAGEREF _Toc242969955 \h </w:instrText>
+          <w:instrText xml:space="preserve"> PAGEREF _Toc243219229 \h </w:instrText>
         </w:r>
         <w:r>
           <w:rPr>
@@ -2106,7 +2106,7 @@
           <w:lang w:eastAsia="pt-BR"/>
         </w:rPr>
       </w:pPr>
-      <w:hyperlink w:anchor="_Toc242969956" w:history="1">
+      <w:hyperlink w:anchor="_Toc243219230" w:history="1">
         <w:r>
           <w:rPr>
             <w:rStyle w:val="Hyperlink"/>
@@ -2129,7 +2129,7 @@
           <w:rPr>
             <w:webHidden/>
           </w:rPr>
-          <w:instrText xml:space="preserve"> PAGEREF _Toc242969956 \h </w:instrText>
+          <w:instrText xml:space="preserve"> PAGEREF _Toc243219230 \h </w:instrText>
         </w:r>
         <w:r>
           <w:rPr>
@@ -2164,7 +2164,7 @@
           <w:lang w:eastAsia="pt-BR"/>
         </w:rPr>
       </w:pPr>
-      <w:hyperlink w:anchor="_Toc242969957" w:history="1">
+      <w:hyperlink w:anchor="_Toc243219231" w:history="1">
         <w:r>
           <w:rPr>
             <w:rStyle w:val="Hyperlink"/>
@@ -2187,7 +2187,7 @@
           <w:rPr>
             <w:webHidden/>
           </w:rPr>
-          <w:instrText xml:space="preserve"> PAGEREF _Toc242969957 \h </w:instrText>
+          <w:instrText xml:space="preserve"> PAGEREF _Toc243219231 \h </w:instrText>
         </w:r>
         <w:r>
           <w:rPr>
@@ -2222,7 +2222,7 @@
           <w:lang w:eastAsia="pt-BR"/>
         </w:rPr>
       </w:pPr>
-      <w:hyperlink w:anchor="_Toc242969958" w:history="1">
+      <w:hyperlink w:anchor="_Toc243219232" w:history="1">
         <w:r>
           <w:rPr>
             <w:rStyle w:val="Hyperlink"/>
@@ -2245,7 +2245,7 @@
           <w:rPr>
             <w:webHidden/>
           </w:rPr>
-          <w:instrText xml:space="preserve"> PAGEREF _Toc242969958 \h </w:instrText>
+          <w:instrText xml:space="preserve"> PAGEREF _Toc243219232 \h </w:instrText>
         </w:r>
         <w:r>
           <w:rPr>
@@ -2280,7 +2280,7 @@
           <w:lang w:eastAsia="pt-BR"/>
         </w:rPr>
       </w:pPr>
-      <w:hyperlink w:anchor="_Toc242969959" w:history="1">
+      <w:hyperlink w:anchor="_Toc243219233" w:history="1">
         <w:r>
           <w:rPr>
             <w:rStyle w:val="Hyperlink"/>
@@ -2303,7 +2303,7 @@
           <w:rPr>
             <w:webHidden/>
           </w:rPr>
-          <w:instrText xml:space="preserve"> PAGEREF _Toc242969959 \h </w:instrText>
+          <w:instrText xml:space="preserve"> PAGEREF _Toc243219233 \h </w:instrText>
         </w:r>
         <w:r>
           <w:rPr>
@@ -2338,7 +2338,7 @@
           <w:lang w:eastAsia="pt-BR"/>
         </w:rPr>
       </w:pPr>
-      <w:hyperlink w:anchor="_Toc242969960" w:history="1">
+      <w:hyperlink w:anchor="_Toc243219234" w:history="1">
         <w:r>
           <w:rPr>
             <w:rStyle w:val="Hyperlink"/>
@@ -2361,7 +2361,7 @@
           <w:rPr>
             <w:webHidden/>
           </w:rPr>
-          <w:instrText xml:space="preserve"> PAGEREF _Toc242969960 \h </w:instrText>
+          <w:instrText xml:space="preserve"> PAGEREF _Toc243219234 \h </w:instrText>
         </w:r>
         <w:r>
           <w:rPr>
@@ -2396,7 +2396,7 @@
           <w:lang w:eastAsia="pt-BR"/>
         </w:rPr>
       </w:pPr>
-      <w:hyperlink w:anchor="_Toc242969961" w:history="1">
+      <w:hyperlink w:anchor="_Toc243219235" w:history="1">
         <w:r>
           <w:rPr>
             <w:rStyle w:val="Hyperlink"/>
@@ -2419,7 +2419,7 @@
           <w:rPr>
             <w:webHidden/>
           </w:rPr>
-          <w:instrText xml:space="preserve"> PAGEREF _Toc242969961 \h </w:instrText>
+          <w:instrText xml:space="preserve"> PAGEREF _Toc243219235 \h </w:instrText>
         </w:r>
         <w:r>
           <w:rPr>
@@ -2454,7 +2454,7 @@
           <w:lang w:eastAsia="pt-BR"/>
         </w:rPr>
       </w:pPr>
-      <w:hyperlink w:anchor="_Toc242969962" w:history="1">
+      <w:hyperlink w:anchor="_Toc243219236" w:history="1">
         <w:r>
           <w:rPr>
             <w:rStyle w:val="Hyperlink"/>
@@ -2477,7 +2477,7 @@
           <w:rPr>
             <w:webHidden/>
           </w:rPr>
-          <w:instrText xml:space="preserve"> PAGEREF _Toc242969962 \h </w:instrText>
+          <w:instrText xml:space="preserve"> PAGEREF _Toc243219236 \h </w:instrText>
         </w:r>
         <w:r>
           <w:rPr>
@@ -2514,7 +2514,7 @@
           <w:lang w:eastAsia="pt-BR"/>
         </w:rPr>
       </w:pPr>
-      <w:hyperlink w:anchor="_Toc242969963" w:history="1">
+      <w:hyperlink w:anchor="_Toc243219237" w:history="1">
         <w:r>
           <w:rPr>
             <w:rStyle w:val="Hyperlink"/>
@@ -2537,7 +2537,7 @@
           <w:rPr>
             <w:webHidden/>
           </w:rPr>
-          <w:instrText xml:space="preserve"> PAGEREF _Toc242969963 \h </w:instrText>
+          <w:instrText xml:space="preserve"> PAGEREF _Toc243219237 \h </w:instrText>
         </w:r>
         <w:r>
           <w:rPr>
@@ -2574,7 +2574,7 @@
           <w:lang w:eastAsia="pt-BR"/>
         </w:rPr>
       </w:pPr>
-      <w:hyperlink w:anchor="_Toc242969964" w:history="1">
+      <w:hyperlink w:anchor="_Toc243219238" w:history="1">
         <w:r>
           <w:rPr>
             <w:rStyle w:val="Hyperlink"/>
@@ -2597,7 +2597,7 @@
           <w:rPr>
             <w:webHidden/>
           </w:rPr>
-          <w:instrText xml:space="preserve"> PAGEREF _Toc242969964 \h </w:instrText>
+          <w:instrText xml:space="preserve"> PAGEREF _Toc243219238 \h </w:instrText>
         </w:r>
         <w:r>
           <w:rPr>
@@ -2632,7 +2632,7 @@
           <w:lang w:eastAsia="pt-BR"/>
         </w:rPr>
       </w:pPr>
-      <w:hyperlink w:anchor="_Toc242969965" w:history="1">
+      <w:hyperlink w:anchor="_Toc243219239" w:history="1">
         <w:r>
           <w:rPr>
             <w:rStyle w:val="Hyperlink"/>
@@ -2655,7 +2655,7 @@
           <w:rPr>
             <w:webHidden/>
           </w:rPr>
-          <w:instrText xml:space="preserve"> PAGEREF _Toc242969965 \h </w:instrText>
+          <w:instrText xml:space="preserve"> PAGEREF _Toc243219239 \h </w:instrText>
         </w:r>
         <w:r>
           <w:rPr>
@@ -2690,7 +2690,7 @@
           <w:lang w:eastAsia="pt-BR"/>
         </w:rPr>
       </w:pPr>
-      <w:hyperlink w:anchor="_Toc242969966" w:history="1">
+      <w:hyperlink w:anchor="_Toc243219240" w:history="1">
         <w:r>
           <w:rPr>
             <w:rStyle w:val="Hyperlink"/>
@@ -2713,7 +2713,7 @@
           <w:rPr>
             <w:webHidden/>
           </w:rPr>
-          <w:instrText xml:space="preserve"> PAGEREF _Toc242969966 \h </w:instrText>
+          <w:instrText xml:space="preserve"> PAGEREF _Toc243219240 \h </w:instrText>
         </w:r>
         <w:r>
           <w:rPr>
@@ -2748,7 +2748,7 @@
           <w:lang w:eastAsia="pt-BR"/>
         </w:rPr>
       </w:pPr>
-      <w:hyperlink w:anchor="_Toc242969967" w:history="1">
+      <w:hyperlink w:anchor="_Toc243219241" w:history="1">
         <w:r>
           <w:rPr>
             <w:rStyle w:val="Hyperlink"/>
@@ -2771,7 +2771,7 @@
           <w:rPr>
             <w:webHidden/>
           </w:rPr>
-          <w:instrText xml:space="preserve"> PAGEREF _Toc242969967 \h </w:instrText>
+          <w:instrText xml:space="preserve"> PAGEREF _Toc243219241 \h </w:instrText>
         </w:r>
         <w:r>
           <w:rPr>
@@ -2806,7 +2806,7 @@
           <w:lang w:eastAsia="pt-BR"/>
         </w:rPr>
       </w:pPr>
-      <w:hyperlink w:anchor="_Toc242969968" w:history="1">
+      <w:hyperlink w:anchor="_Toc243219242" w:history="1">
         <w:r>
           <w:rPr>
             <w:rStyle w:val="Hyperlink"/>
@@ -2829,7 +2829,7 @@
           <w:rPr>
             <w:webHidden/>
           </w:rPr>
-          <w:instrText xml:space="preserve"> PAGEREF _Toc242969968 \h </w:instrText>
+          <w:instrText xml:space="preserve"> PAGEREF _Toc243219242 \h </w:instrText>
         </w:r>
         <w:r>
           <w:rPr>
@@ -2864,7 +2864,7 @@
           <w:lang w:eastAsia="pt-BR"/>
         </w:rPr>
       </w:pPr>
-      <w:hyperlink w:anchor="_Toc242969969" w:history="1">
+      <w:hyperlink w:anchor="_Toc243219243" w:history="1">
         <w:r>
           <w:rPr>
             <w:rStyle w:val="Hyperlink"/>
@@ -2887,7 +2887,7 @@
           <w:rPr>
             <w:webHidden/>
           </w:rPr>
-          <w:instrText xml:space="preserve"> PAGEREF _Toc242969969 \h </w:instrText>
+          <w:instrText xml:space="preserve"> PAGEREF _Toc243219243 \h </w:instrText>
         </w:r>
         <w:r>
           <w:rPr>
@@ -2922,7 +2922,7 @@
           <w:lang w:eastAsia="pt-BR"/>
         </w:rPr>
       </w:pPr>
-      <w:hyperlink w:anchor="_Toc242969970" w:history="1">
+      <w:hyperlink w:anchor="_Toc243219244" w:history="1">
         <w:r>
           <w:rPr>
             <w:rStyle w:val="Hyperlink"/>
@@ -2945,7 +2945,7 @@
           <w:rPr>
             <w:webHidden/>
           </w:rPr>
-          <w:instrText xml:space="preserve"> PAGEREF _Toc242969970 \h </w:instrText>
+          <w:instrText xml:space="preserve"> PAGEREF _Toc243219244 \h </w:instrText>
         </w:r>
         <w:r>
           <w:rPr>
@@ -2982,7 +2982,7 @@
           <w:lang w:eastAsia="pt-BR"/>
         </w:rPr>
       </w:pPr>
-      <w:hyperlink w:anchor="_Toc242969971" w:history="1">
+      <w:hyperlink w:anchor="_Toc243219245" w:history="1">
         <w:r>
           <w:rPr>
             <w:rStyle w:val="Hyperlink"/>
@@ -3005,7 +3005,7 @@
           <w:rPr>
             <w:webHidden/>
           </w:rPr>
-          <w:instrText xml:space="preserve"> PAGEREF _Toc242969971 \h </w:instrText>
+          <w:instrText xml:space="preserve"> PAGEREF _Toc243219245 \h </w:instrText>
         </w:r>
         <w:r>
           <w:rPr>
@@ -3022,7 +3022,7 @@
           <w:rPr>
             <w:webHidden/>
           </w:rPr>
-          <w:t>54</w:t>
+          <w:t>55</w:t>
         </w:r>
         <w:r>
           <w:rPr>
@@ -3042,7 +3042,7 @@
           <w:lang w:eastAsia="pt-BR"/>
         </w:rPr>
       </w:pPr>
-      <w:hyperlink w:anchor="_Toc242969972" w:history="1">
+      <w:hyperlink w:anchor="_Toc243219246" w:history="1">
         <w:r>
           <w:rPr>
             <w:rStyle w:val="Hyperlink"/>
@@ -3065,7 +3065,7 @@
           <w:rPr>
             <w:webHidden/>
           </w:rPr>
-          <w:instrText xml:space="preserve"> PAGEREF _Toc242969972 \h </w:instrText>
+          <w:instrText xml:space="preserve"> PAGEREF _Toc243219246 \h </w:instrText>
         </w:r>
         <w:r>
           <w:rPr>
@@ -3082,7 +3082,7 @@
           <w:rPr>
             <w:webHidden/>
           </w:rPr>
-          <w:t>57</w:t>
+          <w:t>58</w:t>
         </w:r>
         <w:r>
           <w:rPr>
@@ -3100,7 +3100,7 @@
           <w:lang w:eastAsia="pt-BR"/>
         </w:rPr>
       </w:pPr>
-      <w:hyperlink w:anchor="_Toc242969973" w:history="1">
+      <w:hyperlink w:anchor="_Toc243219247" w:history="1">
         <w:r>
           <w:rPr>
             <w:rStyle w:val="Hyperlink"/>
@@ -3123,7 +3123,7 @@
           <w:rPr>
             <w:webHidden/>
           </w:rPr>
-          <w:instrText xml:space="preserve"> PAGEREF _Toc242969973 \h </w:instrText>
+          <w:instrText xml:space="preserve"> PAGEREF _Toc243219247 \h </w:instrText>
         </w:r>
         <w:r>
           <w:rPr>
@@ -3140,7 +3140,7 @@
           <w:rPr>
             <w:webHidden/>
           </w:rPr>
-          <w:t>57</w:t>
+          <w:t>58</w:t>
         </w:r>
         <w:r>
           <w:rPr>
@@ -3158,7 +3158,7 @@
           <w:lang w:eastAsia="pt-BR"/>
         </w:rPr>
       </w:pPr>
-      <w:hyperlink w:anchor="_Toc242969974" w:history="1">
+      <w:hyperlink w:anchor="_Toc243219248" w:history="1">
         <w:r>
           <w:rPr>
             <w:rStyle w:val="Hyperlink"/>
@@ -3181,7 +3181,7 @@
           <w:rPr>
             <w:webHidden/>
           </w:rPr>
-          <w:instrText xml:space="preserve"> PAGEREF _Toc242969974 \h </w:instrText>
+          <w:instrText xml:space="preserve"> PAGEREF _Toc243219248 \h </w:instrText>
         </w:r>
         <w:r>
           <w:rPr>
@@ -3198,7 +3198,7 @@
           <w:rPr>
             <w:webHidden/>
           </w:rPr>
-          <w:t>58</w:t>
+          <w:t>59</w:t>
         </w:r>
         <w:r>
           <w:rPr>
@@ -3216,7 +3216,7 @@
           <w:lang w:eastAsia="pt-BR"/>
         </w:rPr>
       </w:pPr>
-      <w:hyperlink w:anchor="_Toc242969975" w:history="1">
+      <w:hyperlink w:anchor="_Toc243219249" w:history="1">
         <w:r>
           <w:rPr>
             <w:rStyle w:val="Hyperlink"/>
@@ -3239,7 +3239,7 @@
           <w:rPr>
             <w:webHidden/>
           </w:rPr>
-          <w:instrText xml:space="preserve"> PAGEREF _Toc242969975 \h </w:instrText>
+          <w:instrText xml:space="preserve"> PAGEREF _Toc243219249 \h </w:instrText>
         </w:r>
         <w:r>
           <w:rPr>
@@ -3256,7 +3256,7 @@
           <w:rPr>
             <w:webHidden/>
           </w:rPr>
-          <w:t>58</w:t>
+          <w:t>59</w:t>
         </w:r>
         <w:r>
           <w:rPr>
@@ -3274,7 +3274,7 @@
           <w:lang w:eastAsia="pt-BR"/>
         </w:rPr>
       </w:pPr>
-      <w:hyperlink w:anchor="_Toc242969976" w:history="1">
+      <w:hyperlink w:anchor="_Toc243219250" w:history="1">
         <w:r>
           <w:rPr>
             <w:rStyle w:val="Hyperlink"/>
@@ -3297,7 +3297,7 @@
           <w:rPr>
             <w:webHidden/>
           </w:rPr>
-          <w:instrText xml:space="preserve"> PAGEREF _Toc242969976 \h </w:instrText>
+          <w:instrText xml:space="preserve"> PAGEREF _Toc243219250 \h </w:instrText>
         </w:r>
         <w:r>
           <w:rPr>
@@ -3314,7 +3314,7 @@
           <w:rPr>
             <w:webHidden/>
           </w:rPr>
-          <w:t>60</w:t>
+          <w:t>61</w:t>
         </w:r>
         <w:r>
           <w:rPr>
@@ -3346,7 +3346,7 @@
       <w:pPr>
         <w:pStyle w:val="Ttulo1"/>
       </w:pPr>
-      <w:bookmarkStart w:id="0" w:name="_Toc242969924"/>
+      <w:bookmarkStart w:id="0" w:name="_Toc243219198"/>
       <w:r>
         <w:lastRenderedPageBreak/>
         <w:t>INTRODUÇÃO</w:t>
@@ -3401,7 +3401,7 @@
       <w:pPr>
         <w:pStyle w:val="Ttulo2"/>
       </w:pPr>
-      <w:bookmarkStart w:id="1" w:name="_Toc242969925"/>
+      <w:bookmarkStart w:id="1" w:name="_Toc243219199"/>
       <w:r>
         <w:t>Convenções Adotadas</w:t>
       </w:r>
@@ -3460,7 +3460,7 @@
       <w:pPr>
         <w:pStyle w:val="Ttulo1"/>
       </w:pPr>
-      <w:bookmarkStart w:id="2" w:name="_Toc242969926"/>
+      <w:bookmarkStart w:id="2" w:name="_Toc243219200"/>
       <w:r>
         <w:t>VISÃO GERAL</w:t>
       </w:r>
@@ -3565,7 +3565,7 @@
       <w:pPr>
         <w:pStyle w:val="Ttulo2"/>
       </w:pPr>
-      <w:bookmarkStart w:id="3" w:name="_Toc242969927"/>
+      <w:bookmarkStart w:id="3" w:name="_Toc243219201"/>
       <w:r>
         <w:t>Componentes da Solução</w:t>
       </w:r>
@@ -3665,7 +3665,7 @@
       <w:pPr>
         <w:pStyle w:val="Ttulo2"/>
       </w:pPr>
-      <w:bookmarkStart w:id="4" w:name="_Toc242969928"/>
+      <w:bookmarkStart w:id="4" w:name="_Toc243219202"/>
       <w:r>
         <w:t>Tecnologias</w:t>
       </w:r>
@@ -4637,7 +4637,7 @@
               <w:jc w:val="center"/>
             </w:pPr>
             <w:r>
-              <w:t>5.0, 10 e 3.9</w:t>
+              <w:t>5.0, 9 e 3.9</w:t>
             </w:r>
           </w:p>
         </w:tc>
@@ -4778,7 +4778,7 @@
         <w:spacing w:before="240"/>
       </w:pPr>
       <w:r>
-        <w:t xml:space="preserve">Três dessas versões foram definidas por compatibilidade. O Node.js 24 é a versão com suporte de longo prazo, adotada como padrão pela Vercel e suportada pelo Vitest 5. O React 19 é a linha atual, suportada pelo Next.js 16. O TypeScript permanece na linha 6.0, e não na 7.0, porque as regras de análise estática para TypeScript utilizadas pela configuração de ESLint do Next.js ainda não suportam a linha 7. As versões exatas de todas as dependências ficam registradas no arquivo </w:t>
+        <w:t xml:space="preserve">Quatro dessas versões foram definidas por compatibilidade. O Node.js 24 é a versão com suporte de longo prazo, adotada como padrão pela Vercel e suportada pelo Vitest 5. O React 19 é a linha atual, suportada pelo Next.js 16. O TypeScript permanece na linha 6.0, e não na 7.0, porque as regras de análise estática para TypeScript utilizadas pela configuração de ESLint do Next.js ainda não suportam a linha 7. O ESLint permanece na linha 9, e não na 10, porque essa mesma configuração do Next.js ainda não aceita a linha 10; a escolha é revista a cada atualização do Next.js. As versões exatas de todas as dependências ficam registradas no arquivo </w:t>
       </w:r>
       <w:r>
         <w:rPr>
@@ -4796,7 +4796,7 @@
       <w:pPr>
         <w:pStyle w:val="Ttulo2"/>
       </w:pPr>
-      <w:bookmarkStart w:id="5" w:name="_Toc242969929"/>
+      <w:bookmarkStart w:id="5" w:name="_Toc243219203"/>
       <w:r>
         <w:t>Princípios de Arquitetura</w:t>
       </w:r>
@@ -4917,7 +4917,7 @@
       <w:pPr>
         <w:pStyle w:val="Ttulo2"/>
       </w:pPr>
-      <w:bookmarkStart w:id="6" w:name="_Toc242969930"/>
+      <w:bookmarkStart w:id="6" w:name="_Toc243219204"/>
       <w:r>
         <w:t>Padrões de Código</w:t>
       </w:r>
@@ -4945,7 +4945,7 @@
       <w:pPr>
         <w:pStyle w:val="Ttulo3"/>
       </w:pPr>
-      <w:bookmarkStart w:id="7" w:name="_Toc242969931"/>
+      <w:bookmarkStart w:id="7" w:name="_Toc243219205"/>
       <w:r>
         <w:t>Nomenclatura</w:t>
       </w:r>
@@ -5717,7 +5717,7 @@
       <w:pPr>
         <w:pStyle w:val="Ttulo3"/>
       </w:pPr>
-      <w:bookmarkStart w:id="8" w:name="_Toc242969932"/>
+      <w:bookmarkStart w:id="8" w:name="_Toc243219206"/>
       <w:r>
         <w:t>Funções e Módulos</w:t>
       </w:r>
@@ -5877,7 +5877,7 @@
       <w:pPr>
         <w:pStyle w:val="Ttulo3"/>
       </w:pPr>
-      <w:bookmarkStart w:id="9" w:name="_Toc242969933"/>
+      <w:bookmarkStart w:id="9" w:name="_Toc243219207"/>
       <w:r>
         <w:t>Tipos, Constantes e Valores Ausentes</w:t>
       </w:r>
@@ -6008,7 +6008,7 @@
       <w:pPr>
         <w:pStyle w:val="Ttulo3"/>
       </w:pPr>
-      <w:bookmarkStart w:id="10" w:name="_Toc242969934"/>
+      <w:bookmarkStart w:id="10" w:name="_Toc243219208"/>
       <w:r>
         <w:t>Comentários e Formatação</w:t>
       </w:r>
@@ -6068,14 +6068,14 @@
         </w:numPr>
       </w:pPr>
       <w:r>
-        <w:t>a formatação é aplicada automaticamente pelo Prettier, com a configuração do repositório, e verificada no CI; a análise estática usa a configuração de ESLint do Next.js. Assim, a revisão trata do conteúdo, e não do estilo.</w:t>
+        <w:t>a formatação do código e dos arquivos de configuração é aplicada automaticamente pelo Prettier, com a configuração do repositório, e verificada no CI; os textos em Markdown ficam de fora. A análise estática usa a configuração de ESLint do Next.js. Assim, a revisão trata do conteúdo, e não do estilo.</w:t>
       </w:r>
     </w:p>
     <w:p>
       <w:pPr>
         <w:pStyle w:val="Ttulo1"/>
       </w:pPr>
-      <w:bookmarkStart w:id="11" w:name="_Toc242969935"/>
+      <w:bookmarkStart w:id="11" w:name="_Toc243219209"/>
       <w:r>
         <w:t>FRONTEND</w:t>
       </w:r>
@@ -6113,7 +6113,7 @@
       <w:pPr>
         <w:pStyle w:val="Ttulo2"/>
       </w:pPr>
-      <w:bookmarkStart w:id="12" w:name="_Toc242969936"/>
+      <w:bookmarkStart w:id="12" w:name="_Toc243219210"/>
       <w:r>
         <w:t>Estrutura</w:t>
       </w:r>
@@ -6368,6 +6368,14 @@
       </w:pPr>
       <w:r>
         <w:t>compose.yaml                execução da aplicação com docker compose</w:t>
+      </w:r>
+    </w:p>
+    <w:p>
+      <w:pPr>
+        <w:pStyle w:val="Cdigo"/>
+      </w:pPr>
+      <w:r>
+        <w:t>.dockerignore               o que fica fora da imagem (seção 8.6)</w:t>
       </w:r>
     </w:p>
     <w:p>
@@ -6455,7 +6463,7 @@
       <w:pPr>
         <w:pStyle w:val="Ttulo2"/>
       </w:pPr>
-      <w:bookmarkStart w:id="13" w:name="_Toc242969937"/>
+      <w:bookmarkStart w:id="13" w:name="_Toc243219211"/>
       <w:r>
         <w:t>Telas e Rotas</w:t>
       </w:r>
@@ -8426,7 +8434,7 @@
       <w:pPr>
         <w:pStyle w:val="Ttulo2"/>
       </w:pPr>
-      <w:bookmarkStart w:id="14" w:name="_Toc242969938"/>
+      <w:bookmarkStart w:id="14" w:name="_Toc243219212"/>
       <w:r>
         <w:t>Componentes</w:t>
       </w:r>
@@ -8858,7 +8866,7 @@
       <w:pPr>
         <w:pStyle w:val="Ttulo2"/>
       </w:pPr>
-      <w:bookmarkStart w:id="15" w:name="_Toc242969939"/>
+      <w:bookmarkStart w:id="15" w:name="_Toc243219213"/>
       <w:r>
         <w:t>Comunicação com a API</w:t>
       </w:r>
@@ -9085,7 +9093,7 @@
       <w:pPr>
         <w:pStyle w:val="Ttulo2"/>
       </w:pPr>
-      <w:bookmarkStart w:id="16" w:name="_Toc242969940"/>
+      <w:bookmarkStart w:id="16" w:name="_Toc243219214"/>
       <w:r>
         <w:t>Renderização, Estado e Desempenho</w:t>
       </w:r>
@@ -9095,7 +9103,7 @@
       <w:pPr>
         <w:pStyle w:val="Ttulo3"/>
       </w:pPr>
-      <w:bookmarkStart w:id="17" w:name="_Toc242969941"/>
+      <w:bookmarkStart w:id="17" w:name="_Toc243219215"/>
       <w:r>
         <w:t>Renderização</w:t>
       </w:r>
@@ -9133,7 +9141,7 @@
       <w:pPr>
         <w:pStyle w:val="Ttulo3"/>
       </w:pPr>
-      <w:bookmarkStart w:id="18" w:name="_Toc242969942"/>
+      <w:bookmarkStart w:id="18" w:name="_Toc243219216"/>
       <w:r>
         <w:t>Estado e Formulários</w:t>
       </w:r>
@@ -9266,7 +9274,7 @@
       <w:pPr>
         <w:pStyle w:val="Ttulo3"/>
       </w:pPr>
-      <w:bookmarkStart w:id="19" w:name="_Toc242969943"/>
+      <w:bookmarkStart w:id="19" w:name="_Toc243219217"/>
       <w:r>
         <w:t>Desempenho</w:t>
       </w:r>
@@ -9375,7 +9383,7 @@
       <w:pPr>
         <w:pStyle w:val="Ttulo3"/>
       </w:pPr>
-      <w:bookmarkStart w:id="20" w:name="_Toc242969944"/>
+      <w:bookmarkStart w:id="20" w:name="_Toc243219218"/>
       <w:r>
         <w:t>Acessibilidade e Identidade Visual</w:t>
       </w:r>
@@ -9520,7 +9528,7 @@
       <w:pPr>
         <w:pStyle w:val="Ttulo1"/>
       </w:pPr>
-      <w:bookmarkStart w:id="21" w:name="_Toc242969945"/>
+      <w:bookmarkStart w:id="21" w:name="_Toc243219219"/>
       <w:r>
         <w:t>BACKEND</w:t>
       </w:r>
@@ -9548,7 +9556,7 @@
       <w:pPr>
         <w:pStyle w:val="Ttulo2"/>
       </w:pPr>
-      <w:bookmarkStart w:id="22" w:name="_Toc242969946"/>
+      <w:bookmarkStart w:id="22" w:name="_Toc243219220"/>
       <w:r>
         <w:t>Camadas</w:t>
       </w:r>
@@ -10127,7 +10135,7 @@
       <w:pPr>
         <w:pStyle w:val="Ttulo2"/>
       </w:pPr>
-      <w:bookmarkStart w:id="23" w:name="_Toc242969947"/>
+      <w:bookmarkStart w:id="23" w:name="_Toc243219221"/>
       <w:r>
         <w:t>Módulos</w:t>
       </w:r>
@@ -11322,7 +11330,7 @@
       <w:pPr>
         <w:pStyle w:val="Ttulo2"/>
       </w:pPr>
-      <w:bookmarkStart w:id="24" w:name="_Toc242969948"/>
+      <w:bookmarkStart w:id="24" w:name="_Toc243219222"/>
       <w:r>
         <w:t>Autenticação e Autorização</w:t>
       </w:r>
@@ -11332,7 +11340,7 @@
       <w:pPr>
         <w:pStyle w:val="Ttulo3"/>
       </w:pPr>
-      <w:bookmarkStart w:id="25" w:name="_Toc242969949"/>
+      <w:bookmarkStart w:id="25" w:name="_Toc243219223"/>
       <w:r>
         <w:t>Autenticação</w:t>
       </w:r>
@@ -11580,7 +11588,7 @@
       <w:pPr>
         <w:pStyle w:val="Ttulo3"/>
       </w:pPr>
-      <w:bookmarkStart w:id="26" w:name="_Toc242969950"/>
+      <w:bookmarkStart w:id="26" w:name="_Toc243219224"/>
       <w:r>
         <w:t>Perfis e Contas</w:t>
       </w:r>
@@ -12194,7 +12202,7 @@
       <w:pPr>
         <w:pStyle w:val="Ttulo3"/>
       </w:pPr>
-      <w:bookmarkStart w:id="27" w:name="_Toc242969951"/>
+      <w:bookmarkStart w:id="27" w:name="_Toc243219225"/>
       <w:r>
         <w:t>Autorização</w:t>
       </w:r>
@@ -12839,7 +12847,7 @@
       <w:pPr>
         <w:pStyle w:val="Ttulo1"/>
       </w:pPr>
-      <w:bookmarkStart w:id="28" w:name="_Toc242969952"/>
+      <w:bookmarkStart w:id="28" w:name="_Toc243219226"/>
       <w:r>
         <w:t>BANCO DE DADOS</w:t>
       </w:r>
@@ -12947,7 +12955,7 @@
       <w:pPr>
         <w:pStyle w:val="Ttulo2"/>
       </w:pPr>
-      <w:bookmarkStart w:id="29" w:name="_Toc242969953"/>
+      <w:bookmarkStart w:id="29" w:name="_Toc243219227"/>
       <w:r>
         <w:t>Modelo Entidade-Relacionamento</w:t>
       </w:r>
@@ -13282,7 +13290,7 @@
       <w:pPr>
         <w:pStyle w:val="Ttulo2"/>
       </w:pPr>
-      <w:bookmarkStart w:id="30" w:name="_Toc242969954"/>
+      <w:bookmarkStart w:id="30" w:name="_Toc243219228"/>
       <w:r>
         <w:t>Tabelas</w:t>
       </w:r>
@@ -25867,7 +25875,7 @@
       <w:pPr>
         <w:pStyle w:val="Ttulo2"/>
       </w:pPr>
-      <w:bookmarkStart w:id="31" w:name="_Toc242969955"/>
+      <w:bookmarkStart w:id="31" w:name="_Toc243219229"/>
       <w:r>
         <w:t>Relacionamentos</w:t>
       </w:r>
@@ -26954,7 +26962,7 @@
       <w:pPr>
         <w:pStyle w:val="Ttulo1"/>
       </w:pPr>
-      <w:bookmarkStart w:id="32" w:name="_Toc242969956"/>
+      <w:bookmarkStart w:id="32" w:name="_Toc243219230"/>
       <w:r>
         <w:t>API</w:t>
       </w:r>
@@ -26992,7 +27000,7 @@
       <w:pPr>
         <w:pStyle w:val="Ttulo2"/>
       </w:pPr>
-      <w:bookmarkStart w:id="33" w:name="_Toc242969957"/>
+      <w:bookmarkStart w:id="33" w:name="_Toc243219231"/>
       <w:r>
         <w:t>Desenho Geral</w:t>
       </w:r>
@@ -27779,7 +27787,7 @@
       <w:pPr>
         <w:pStyle w:val="Ttulo2"/>
       </w:pPr>
-      <w:bookmarkStart w:id="34" w:name="_Toc242969958"/>
+      <w:bookmarkStart w:id="34" w:name="_Toc243219232"/>
       <w:r>
         <w:t>Validação dos Dados</w:t>
       </w:r>
@@ -27913,7 +27921,7 @@
       <w:pPr>
         <w:pStyle w:val="Ttulo2"/>
       </w:pPr>
-      <w:bookmarkStart w:id="35" w:name="_Toc242969959"/>
+      <w:bookmarkStart w:id="35" w:name="_Toc243219233"/>
       <w:r>
         <w:t>Paginação</w:t>
       </w:r>
@@ -28591,7 +28599,7 @@
       <w:pPr>
         <w:pStyle w:val="Ttulo2"/>
       </w:pPr>
-      <w:bookmarkStart w:id="36" w:name="_Toc242969960"/>
+      <w:bookmarkStart w:id="36" w:name="_Toc243219234"/>
       <w:r>
         <w:t>Respostas e Erros</w:t>
       </w:r>
@@ -30459,7 +30467,7 @@
       <w:pPr>
         <w:pStyle w:val="Ttulo2"/>
       </w:pPr>
-      <w:bookmarkStart w:id="37" w:name="_Toc242969961"/>
+      <w:bookmarkStart w:id="37" w:name="_Toc243219235"/>
       <w:r>
         <w:t>Controle de Concorrência</w:t>
       </w:r>
@@ -30572,7 +30580,7 @@
       <w:pPr>
         <w:pStyle w:val="Ttulo2"/>
       </w:pPr>
-      <w:bookmarkStart w:id="38" w:name="_Toc242969962"/>
+      <w:bookmarkStart w:id="38" w:name="_Toc243219236"/>
       <w:r>
         <w:t>Contrato Detalhado (Apêndice A)</w:t>
       </w:r>
@@ -30590,7 +30598,7 @@
       <w:pPr>
         <w:pStyle w:val="Ttulo1"/>
       </w:pPr>
-      <w:bookmarkStart w:id="39" w:name="_Toc242969963"/>
+      <w:bookmarkStart w:id="39" w:name="_Toc243219237"/>
       <w:r>
         <w:t>SEGURANÇA (IMPLEMENTAÇÃO)</w:t>
       </w:r>
@@ -32154,7 +32162,7 @@
       <w:pPr>
         <w:pStyle w:val="Ttulo1"/>
       </w:pPr>
-      <w:bookmarkStart w:id="40" w:name="_Toc242969964"/>
+      <w:bookmarkStart w:id="40" w:name="_Toc243219238"/>
       <w:r>
         <w:t>INFRAESTRUTURA E DEPLOY</w:t>
       </w:r>
@@ -32172,7 +32180,7 @@
       <w:pPr>
         <w:pStyle w:val="Ttulo2"/>
       </w:pPr>
-      <w:bookmarkStart w:id="41" w:name="_Toc242969965"/>
+      <w:bookmarkStart w:id="41" w:name="_Toc243219239"/>
       <w:r>
         <w:t>Ambientes</w:t>
       </w:r>
@@ -32513,7 +32521,7 @@
       <w:pPr>
         <w:pStyle w:val="Ttulo2"/>
       </w:pPr>
-      <w:bookmarkStart w:id="42" w:name="_Toc242969966"/>
+      <w:bookmarkStart w:id="42" w:name="_Toc243219240"/>
       <w:r>
         <w:t>Variáveis de Ambiente</w:t>
       </w:r>
@@ -32569,7 +32577,7 @@
         </w:r>
       </w:hyperlink>
       <w:r>
-        <w:t>).</w:t>
+        <w:t>). O código lê as variáveis durante a execução, a cada requisição, e nunca durante a construção: a Vercel as fornece também na compilação, mas a imagem do contêiner é construída sem elas (seção 8.6).</w:t>
       </w:r>
     </w:p>
     <w:p>
@@ -33053,7 +33061,7 @@
       <w:pPr>
         <w:pStyle w:val="Ttulo2"/>
       </w:pPr>
-      <w:bookmarkStart w:id="43" w:name="_Toc242969967"/>
+      <w:bookmarkStart w:id="43" w:name="_Toc243219241"/>
       <w:r>
         <w:t>Banco de Dados e Dados Iniciais</w:t>
       </w:r>
@@ -33208,7 +33216,7 @@
       <w:pPr>
         <w:pStyle w:val="Ttulo2"/>
       </w:pPr>
-      <w:bookmarkStart w:id="44" w:name="_Toc242969968"/>
+      <w:bookmarkStart w:id="44" w:name="_Toc243219242"/>
       <w:r>
         <w:t>Publicação</w:t>
       </w:r>
@@ -33583,7 +33591,7 @@
       <w:pPr>
         <w:pStyle w:val="Ttulo2"/>
       </w:pPr>
-      <w:bookmarkStart w:id="45" w:name="_Toc242969969"/>
+      <w:bookmarkStart w:id="45" w:name="_Toc243219243"/>
       <w:r>
         <w:t>Integração Contínua</w:t>
       </w:r>
@@ -33684,7 +33692,18 @@
         </w:numPr>
       </w:pPr>
       <w:r>
-        <w:t>checagem de tipos pelo compilador do TypeScript (</w:t>
+        <w:t xml:space="preserve">geração dos tipos das rotas pelo </w:t>
+      </w:r>
+      <w:r>
+        <w:rPr>
+          <w:rFonts w:ascii="Courier New" w:hAnsi="Courier New" w:cs="Courier New"/>
+          <w:sz w:val="22"/>
+          <w:szCs w:val="22"/>
+        </w:rPr>
+        <w:t>next typegen</w:t>
+      </w:r>
+      <w:r>
+        <w:t xml:space="preserve"> e checagem de tipos pelo compilador do TypeScript (</w:t>
       </w:r>
       <w:r>
         <w:rPr>
@@ -33760,7 +33779,39 @@
         <w:t>pull request</w:t>
       </w:r>
       <w:r>
-        <w:t xml:space="preserve"> fica impedido de ser incorporado. O CI não usa chaves nem acessa o banco: os testes cobrem as funções puras do </w:t>
+        <w:t xml:space="preserve"> fica impedido de ser incorporado. Todas as etapas formam um único </w:t>
+      </w:r>
+      <w:r>
+        <w:rPr>
+          <w:i/>
+          <w:iCs/>
+        </w:rPr>
+        <w:t>job</w:t>
+      </w:r>
+      <w:r>
+        <w:t xml:space="preserve">, </w:t>
+      </w:r>
+      <w:r>
+        <w:rPr>
+          <w:rFonts w:ascii="Courier New" w:hAnsi="Courier New" w:cs="Courier New"/>
+          <w:sz w:val="22"/>
+          <w:szCs w:val="22"/>
+        </w:rPr>
+        <w:t>check</w:t>
+      </w:r>
+      <w:r>
+        <w:t xml:space="preserve">, que é a verificação exigida pela proteção da </w:t>
+      </w:r>
+      <w:r>
+        <w:rPr>
+          <w:rFonts w:ascii="Courier New" w:hAnsi="Courier New" w:cs="Courier New"/>
+          <w:sz w:val="22"/>
+          <w:szCs w:val="22"/>
+        </w:rPr>
+        <w:t>main</w:t>
+      </w:r>
+      <w:r>
+        <w:t xml:space="preserve"> (seção 8.4). O CI não usa chaves nem acessa o banco: os testes cobrem as funções puras do </w:t>
       </w:r>
       <w:r>
         <w:rPr>
@@ -33806,7 +33857,7 @@
       <w:pPr>
         <w:pStyle w:val="Ttulo2"/>
       </w:pPr>
-      <w:bookmarkStart w:id="46" w:name="_Toc242969970"/>
+      <w:bookmarkStart w:id="46" w:name="_Toc243219244"/>
       <w:r>
         <w:t>Execução em Contêiner</w:t>
       </w:r>
@@ -33920,7 +33971,7 @@
         <w:t>node_modules</w:t>
       </w:r>
       <w:r>
-        <w:t xml:space="preserve">, </w:t>
+        <w:t xml:space="preserve"> e </w:t>
       </w:r>
       <w:r>
         <w:rPr>
@@ -33931,7 +33982,7 @@
         <w:t>.next</w:t>
       </w:r>
       <w:r>
-        <w:t xml:space="preserve"> e </w:t>
+        <w:t xml:space="preserve"> de qualquer pasta, além do </w:t>
       </w:r>
       <w:r>
         <w:rPr>
@@ -33942,6 +33993,28 @@
         <w:t>.git</w:t>
       </w:r>
       <w:r>
+        <w:t xml:space="preserve">, da pasta </w:t>
+      </w:r>
+      <w:r>
+        <w:rPr>
+          <w:rFonts w:ascii="Courier New" w:hAnsi="Courier New" w:cs="Courier New"/>
+          <w:sz w:val="22"/>
+          <w:szCs w:val="22"/>
+        </w:rPr>
+        <w:t>.claude</w:t>
+      </w:r>
+      <w:r>
+        <w:t xml:space="preserve">, onde ficam as cópias de trabalho do Claude Code, e da pasta </w:t>
+      </w:r>
+      <w:r>
+        <w:rPr>
+          <w:rFonts w:ascii="Courier New" w:hAnsi="Courier New" w:cs="Courier New"/>
+          <w:sz w:val="22"/>
+          <w:szCs w:val="22"/>
+        </w:rPr>
+        <w:t>documentos-formais</w:t>
+      </w:r>
+      <w:r>
         <w:t>, de modo que nenhuma chave é copiada para ela (</w:t>
       </w:r>
       <w:hyperlink r:id="rId189" w:anchor="RS016" w:history="1">
@@ -34001,9 +34074,34 @@
     <w:p>
       <w:pPr>
         <w:pStyle w:val="Texto"/>
-      </w:pPr>
-      <w:r>
-        <w:t xml:space="preserve">Com o Docker instalado e o </w:t>
+        <w:keepNext/>
+      </w:pPr>
+      <w:r>
+        <w:t>Para executar a aplicação em contêiner:</w:t>
+      </w:r>
+    </w:p>
+    <w:p>
+      <w:pPr>
+        <w:pStyle w:val="Texto"/>
+        <w:numPr>
+          <w:ilvl w:val="0"/>
+          <w:numId w:val="23"/>
+        </w:numPr>
+      </w:pPr>
+      <w:r>
+        <w:t>instalar o Docker Desktop (Docker 29 e Docker Compose 5) e mantê-lo aberto;</w:t>
+      </w:r>
+    </w:p>
+    <w:p>
+      <w:pPr>
+        <w:pStyle w:val="Texto"/>
+        <w:numPr>
+          <w:ilvl w:val="0"/>
+          <w:numId w:val="23"/>
+        </w:numPr>
+      </w:pPr>
+      <w:r>
+        <w:t xml:space="preserve">ter na pasta do projeto o </w:t>
       </w:r>
       <w:r>
         <w:rPr>
@@ -34014,7 +34112,30 @@
         <w:t>.env.local</w:t>
       </w:r>
       <w:r>
-        <w:t xml:space="preserve"> preenchido, a aplicação é executada com </w:t>
+        <w:t xml:space="preserve">, copiado do </w:t>
+      </w:r>
+      <w:r>
+        <w:rPr>
+          <w:rFonts w:ascii="Courier New" w:hAnsi="Courier New" w:cs="Courier New"/>
+          <w:sz w:val="22"/>
+          <w:szCs w:val="22"/>
+        </w:rPr>
+        <w:t>.env.example</w:t>
+      </w:r>
+      <w:r>
+        <w:t xml:space="preserve"> e preenchido com os valores do Quadro 37; sem ele, o Compose interrompe a execução;</w:t>
+      </w:r>
+    </w:p>
+    <w:p>
+      <w:pPr>
+        <w:pStyle w:val="Texto"/>
+        <w:numPr>
+          <w:ilvl w:val="0"/>
+          <w:numId w:val="23"/>
+        </w:numPr>
+      </w:pPr>
+      <w:r>
+        <w:t xml:space="preserve">executar </w:t>
       </w:r>
       <w:r>
         <w:rPr>
@@ -34025,7 +34146,82 @@
         <w:t>docker compose up --build</w:t>
       </w:r>
       <w:r>
-        <w:t xml:space="preserve">. O desenvolvimento do dia a dia continua com </w:t>
+        <w:t xml:space="preserve">, que constrói a imagem com o código atual e publica a aplicação em </w:t>
+      </w:r>
+      <w:r>
+        <w:rPr>
+          <w:rFonts w:ascii="Courier New" w:hAnsi="Courier New" w:cs="Courier New"/>
+          <w:sz w:val="22"/>
+          <w:szCs w:val="22"/>
+        </w:rPr>
+        <w:t>http://localhost:3000</w:t>
+      </w:r>
+      <w:r>
+        <w:t xml:space="preserve">; sem o </w:t>
+      </w:r>
+      <w:r>
+        <w:rPr>
+          <w:rFonts w:ascii="Courier New" w:hAnsi="Courier New" w:cs="Courier New"/>
+          <w:sz w:val="22"/>
+          <w:szCs w:val="22"/>
+        </w:rPr>
+        <w:t>--build</w:t>
+      </w:r>
+      <w:r>
+        <w:t>, o Compose reaproveita a imagem anterior;</w:t>
+      </w:r>
+    </w:p>
+    <w:p>
+      <w:pPr>
+        <w:pStyle w:val="Texto"/>
+        <w:numPr>
+          <w:ilvl w:val="0"/>
+          <w:numId w:val="23"/>
+        </w:numPr>
+      </w:pPr>
+      <w:r>
+        <w:t xml:space="preserve">encerrar com </w:t>
+      </w:r>
+      <w:r>
+        <w:rPr>
+          <w:rFonts w:ascii="Courier New" w:hAnsi="Courier New" w:cs="Courier New"/>
+          <w:sz w:val="22"/>
+          <w:szCs w:val="22"/>
+        </w:rPr>
+        <w:t>Ctrl+C</w:t>
+      </w:r>
+      <w:r>
+        <w:t xml:space="preserve"> ou, se a aplicação foi iniciada em segundo plano com a opção </w:t>
+      </w:r>
+      <w:r>
+        <w:rPr>
+          <w:rFonts w:ascii="Courier New" w:hAnsi="Courier New" w:cs="Courier New"/>
+          <w:sz w:val="22"/>
+          <w:szCs w:val="22"/>
+        </w:rPr>
+        <w:t>-d</w:t>
+      </w:r>
+      <w:r>
+        <w:t xml:space="preserve">, com </w:t>
+      </w:r>
+      <w:r>
+        <w:rPr>
+          <w:rFonts w:ascii="Courier New" w:hAnsi="Courier New" w:cs="Courier New"/>
+          <w:sz w:val="22"/>
+          <w:szCs w:val="22"/>
+        </w:rPr>
+        <w:t>docker compose down</w:t>
+      </w:r>
+      <w:r>
+        <w:t>.</w:t>
+      </w:r>
+    </w:p>
+    <w:p>
+      <w:pPr>
+        <w:pStyle w:val="Texto"/>
+      </w:pPr>
+      <w:r>
+        <w:t xml:space="preserve">A porta 3000 é a mesma do </w:t>
       </w:r>
       <w:r>
         <w:rPr>
@@ -34036,14 +34232,36 @@
         <w:t>npm run dev</w:t>
       </w:r>
       <w:r>
-        <w:t>, que recarrega as páginas a cada alteração, e a imagem não é publicada em nenhum registro de contêineres.</w:t>
+        <w:t xml:space="preserve">, então os dois não são executados ao mesmo tempo. O desenvolvimento do dia a dia continua com </w:t>
+      </w:r>
+      <w:r>
+        <w:rPr>
+          <w:rFonts w:ascii="Courier New" w:hAnsi="Courier New" w:cs="Courier New"/>
+          <w:sz w:val="22"/>
+          <w:szCs w:val="22"/>
+        </w:rPr>
+        <w:t>npm run dev</w:t>
+      </w:r>
+      <w:r>
+        <w:t xml:space="preserve">, que recarrega as páginas a cada alteração. A imagem não é publicada em nenhum registro de contêineres, e o CI não a constrói: um erro no </w:t>
+      </w:r>
+      <w:r>
+        <w:rPr>
+          <w:rFonts w:ascii="Courier New" w:hAnsi="Courier New" w:cs="Courier New"/>
+          <w:sz w:val="22"/>
+          <w:szCs w:val="22"/>
+        </w:rPr>
+        <w:t>Dockerfile</w:t>
+      </w:r>
+      <w:r>
+        <w:t xml:space="preserve"> só aparece quando o comando é executado.</w:t>
       </w:r>
     </w:p>
     <w:p>
       <w:pPr>
         <w:pStyle w:val="Ttulo1"/>
       </w:pPr>
-      <w:bookmarkStart w:id="47" w:name="_Toc242969971"/>
+      <w:bookmarkStart w:id="47" w:name="_Toc243219245"/>
       <w:r>
         <w:t>DECISÕES TÉCNICAS E JUSTIFICATIVAS</w:t>
       </w:r>
@@ -35854,6 +36072,50 @@
               <w:pStyle w:val="TextodeTabela"/>
             </w:pPr>
             <w:r>
+              <w:t>ESLint 9 com a configuração do Next.js</w:t>
+            </w:r>
+          </w:p>
+        </w:tc>
+        <w:tc>
+          <w:tcPr>
+            <w:tcW w:w="2300" w:type="dxa"/>
+          </w:tcPr>
+          <w:p>
+            <w:pPr>
+              <w:pStyle w:val="TextodeTabela"/>
+            </w:pPr>
+            <w:r>
+              <w:t>ESLint 10, com avisos de dependência ou sem a configuração do Next.js</w:t>
+            </w:r>
+          </w:p>
+        </w:tc>
+        <w:tc>
+          <w:tcPr>
+            <w:tcW w:w="4371" w:type="dxa"/>
+          </w:tcPr>
+          <w:p>
+            <w:pPr>
+              <w:pStyle w:val="TextodeTabela"/>
+            </w:pPr>
+            <w:r>
+              <w:t>A configuração de ESLint do Next.js ainda não aceita a linha 10, e sem ela se perdem as regras exigidas pelos padrões de código; a escolha é revista a cada atualização do Next.js.</w:t>
+            </w:r>
+          </w:p>
+        </w:tc>
+      </w:tr>
+      <w:tr>
+        <w:trPr>
+          <w:cantSplit/>
+        </w:trPr>
+        <w:tc>
+          <w:tcPr>
+            <w:tcW w:w="2400" w:type="dxa"/>
+          </w:tcPr>
+          <w:p>
+            <w:pPr>
+              <w:pStyle w:val="TextodeTabela"/>
+            </w:pPr>
+            <w:r>
               <w:t>Docker para executar a aplicação em contêiner</w:t>
             </w:r>
           </w:p>
@@ -35895,7 +36157,7 @@
         </w:numPr>
         <w:jc w:val="center"/>
       </w:pPr>
-      <w:bookmarkStart w:id="48" w:name="_Toc242969972"/>
+      <w:bookmarkStart w:id="48" w:name="_Toc243219246"/>
       <w:r>
         <w:t>APÊNDICE A – CONTRATO DETALHADO DA API</w:t>
       </w:r>
@@ -36002,7 +36264,7 @@
           <w:numId w:val="0"/>
         </w:numPr>
       </w:pPr>
-      <w:bookmarkStart w:id="49" w:name="_Toc242969973"/>
+      <w:bookmarkStart w:id="49" w:name="_Toc243219247"/>
       <w:r>
         <w:t>Autenticação</w:t>
       </w:r>
@@ -36680,7 +36942,7 @@
           <w:numId w:val="0"/>
         </w:numPr>
       </w:pPr>
-      <w:bookmarkStart w:id="50" w:name="_Toc242969974"/>
+      <w:bookmarkStart w:id="50" w:name="_Toc243219248"/>
       <w:r>
         <w:t>Rotas Públicas</w:t>
       </w:r>
@@ -36995,7 +37257,7 @@
           <w:numId w:val="0"/>
         </w:numPr>
       </w:pPr>
-      <w:bookmarkStart w:id="51" w:name="_Toc242969975"/>
+      <w:bookmarkStart w:id="51" w:name="_Toc243219249"/>
       <w:r>
         <w:t>Rotas do Cliente</w:t>
       </w:r>
@@ -38654,7 +38916,7 @@
           <w:numId w:val="0"/>
         </w:numPr>
       </w:pPr>
-      <w:bookmarkStart w:id="52" w:name="_Toc242969976"/>
+      <w:bookmarkStart w:id="52" w:name="_Toc243219250"/>
       <w:r>
         <w:t>Rotas do Painel</w:t>
       </w:r>
@@ -44021,6 +44283,12 @@
     </w:lvlOverride>
   </w:num>
   <w:num w:numId="22" w16cid:durableId="1556356601">
+    <w:abstractNumId w:val="1"/>
+    <w:lvlOverride w:ilvl="0">
+      <w:startOverride w:val="1"/>
+    </w:lvlOverride>
+  </w:num>
+  <w:num w:numId="23" w16cid:durableId="99761331">
     <w:abstractNumId w:val="1"/>
     <w:lvlOverride w:ilvl="0">
       <w:startOverride w:val="1"/>

</xml_diff>

<commit_message>
docs(formal): update the architecture document after #15 and #17
Supabase CLI in the technologies table, accounts created already
confirmed, the initial migration and one migration per write
function, the rules the database guarantees, setup without the
Supabase panel, the local migration check, wireframes in the
.dockerignore and decisions 0042 to 0044.

Co-Authored-By: Claude Opus 5.5 <noreply@anthropic.com>
</commit_message>
<xml_diff>
--- a/documentos-formais/ArquiteturaDoSoftware.docx
+++ b/documentos-formais/ArquiteturaDoSoftware.docx
@@ -240,7 +240,7 @@
       <w:r>
         <w:fldChar w:fldCharType="separate"/>
       </w:r>
-      <w:hyperlink w:anchor="_Toc243219198" w:history="1">
+      <w:hyperlink w:anchor="_Toc243257931" w:history="1">
         <w:r>
           <w:rPr>
             <w:rStyle w:val="Hyperlink"/>
@@ -263,7 +263,7 @@
           <w:rPr>
             <w:webHidden/>
           </w:rPr>
-          <w:instrText xml:space="preserve"> PAGEREF _Toc243219198 \h </w:instrText>
+          <w:instrText xml:space="preserve"> PAGEREF _Toc243257931 \h </w:instrText>
         </w:r>
         <w:r>
           <w:rPr>
@@ -298,7 +298,7 @@
           <w:lang w:eastAsia="pt-BR"/>
         </w:rPr>
       </w:pPr>
-      <w:hyperlink w:anchor="_Toc243219199" w:history="1">
+      <w:hyperlink w:anchor="_Toc243257932" w:history="1">
         <w:r>
           <w:rPr>
             <w:rStyle w:val="Hyperlink"/>
@@ -321,7 +321,7 @@
           <w:rPr>
             <w:webHidden/>
           </w:rPr>
-          <w:instrText xml:space="preserve"> PAGEREF _Toc243219199 \h </w:instrText>
+          <w:instrText xml:space="preserve"> PAGEREF _Toc243257932 \h </w:instrText>
         </w:r>
         <w:r>
           <w:rPr>
@@ -358,7 +358,7 @@
           <w:lang w:eastAsia="pt-BR"/>
         </w:rPr>
       </w:pPr>
-      <w:hyperlink w:anchor="_Toc243219200" w:history="1">
+      <w:hyperlink w:anchor="_Toc243257933" w:history="1">
         <w:r>
           <w:rPr>
             <w:rStyle w:val="Hyperlink"/>
@@ -381,7 +381,7 @@
           <w:rPr>
             <w:webHidden/>
           </w:rPr>
-          <w:instrText xml:space="preserve"> PAGEREF _Toc243219200 \h </w:instrText>
+          <w:instrText xml:space="preserve"> PAGEREF _Toc243257933 \h </w:instrText>
         </w:r>
         <w:r>
           <w:rPr>
@@ -416,7 +416,7 @@
           <w:lang w:eastAsia="pt-BR"/>
         </w:rPr>
       </w:pPr>
-      <w:hyperlink w:anchor="_Toc243219201" w:history="1">
+      <w:hyperlink w:anchor="_Toc243257934" w:history="1">
         <w:r>
           <w:rPr>
             <w:rStyle w:val="Hyperlink"/>
@@ -439,7 +439,7 @@
           <w:rPr>
             <w:webHidden/>
           </w:rPr>
-          <w:instrText xml:space="preserve"> PAGEREF _Toc243219201 \h </w:instrText>
+          <w:instrText xml:space="preserve"> PAGEREF _Toc243257934 \h </w:instrText>
         </w:r>
         <w:r>
           <w:rPr>
@@ -474,7 +474,7 @@
           <w:lang w:eastAsia="pt-BR"/>
         </w:rPr>
       </w:pPr>
-      <w:hyperlink w:anchor="_Toc243219202" w:history="1">
+      <w:hyperlink w:anchor="_Toc243257935" w:history="1">
         <w:r>
           <w:rPr>
             <w:rStyle w:val="Hyperlink"/>
@@ -497,7 +497,7 @@
           <w:rPr>
             <w:webHidden/>
           </w:rPr>
-          <w:instrText xml:space="preserve"> PAGEREF _Toc243219202 \h </w:instrText>
+          <w:instrText xml:space="preserve"> PAGEREF _Toc243257935 \h </w:instrText>
         </w:r>
         <w:r>
           <w:rPr>
@@ -532,7 +532,7 @@
           <w:lang w:eastAsia="pt-BR"/>
         </w:rPr>
       </w:pPr>
-      <w:hyperlink w:anchor="_Toc243219203" w:history="1">
+      <w:hyperlink w:anchor="_Toc243257936" w:history="1">
         <w:r>
           <w:rPr>
             <w:rStyle w:val="Hyperlink"/>
@@ -555,7 +555,7 @@
           <w:rPr>
             <w:webHidden/>
           </w:rPr>
-          <w:instrText xml:space="preserve"> PAGEREF _Toc243219203 \h </w:instrText>
+          <w:instrText xml:space="preserve"> PAGEREF _Toc243257936 \h </w:instrText>
         </w:r>
         <w:r>
           <w:rPr>
@@ -590,7 +590,7 @@
           <w:lang w:eastAsia="pt-BR"/>
         </w:rPr>
       </w:pPr>
-      <w:hyperlink w:anchor="_Toc243219204" w:history="1">
+      <w:hyperlink w:anchor="_Toc243257937" w:history="1">
         <w:r>
           <w:rPr>
             <w:rStyle w:val="Hyperlink"/>
@@ -613,7 +613,7 @@
           <w:rPr>
             <w:webHidden/>
           </w:rPr>
-          <w:instrText xml:space="preserve"> PAGEREF _Toc243219204 \h </w:instrText>
+          <w:instrText xml:space="preserve"> PAGEREF _Toc243257937 \h </w:instrText>
         </w:r>
         <w:r>
           <w:rPr>
@@ -648,7 +648,7 @@
           <w:lang w:eastAsia="pt-BR"/>
         </w:rPr>
       </w:pPr>
-      <w:hyperlink w:anchor="_Toc243219205" w:history="1">
+      <w:hyperlink w:anchor="_Toc243257938" w:history="1">
         <w:r>
           <w:rPr>
             <w:rStyle w:val="Hyperlink"/>
@@ -671,7 +671,7 @@
           <w:rPr>
             <w:webHidden/>
           </w:rPr>
-          <w:instrText xml:space="preserve"> PAGEREF _Toc243219205 \h </w:instrText>
+          <w:instrText xml:space="preserve"> PAGEREF _Toc243257938 \h </w:instrText>
         </w:r>
         <w:r>
           <w:rPr>
@@ -688,7 +688,7 @@
           <w:rPr>
             <w:webHidden/>
           </w:rPr>
-          <w:t>7</w:t>
+          <w:t>8</w:t>
         </w:r>
         <w:r>
           <w:rPr>
@@ -706,7 +706,7 @@
           <w:lang w:eastAsia="pt-BR"/>
         </w:rPr>
       </w:pPr>
-      <w:hyperlink w:anchor="_Toc243219206" w:history="1">
+      <w:hyperlink w:anchor="_Toc243257939" w:history="1">
         <w:r>
           <w:rPr>
             <w:rStyle w:val="Hyperlink"/>
@@ -729,7 +729,7 @@
           <w:rPr>
             <w:webHidden/>
           </w:rPr>
-          <w:instrText xml:space="preserve"> PAGEREF _Toc243219206 \h </w:instrText>
+          <w:instrText xml:space="preserve"> PAGEREF _Toc243257939 \h </w:instrText>
         </w:r>
         <w:r>
           <w:rPr>
@@ -764,7 +764,7 @@
           <w:lang w:eastAsia="pt-BR"/>
         </w:rPr>
       </w:pPr>
-      <w:hyperlink w:anchor="_Toc243219207" w:history="1">
+      <w:hyperlink w:anchor="_Toc243257940" w:history="1">
         <w:r>
           <w:rPr>
             <w:rStyle w:val="Hyperlink"/>
@@ -787,7 +787,7 @@
           <w:rPr>
             <w:webHidden/>
           </w:rPr>
-          <w:instrText xml:space="preserve"> PAGEREF _Toc243219207 \h </w:instrText>
+          <w:instrText xml:space="preserve"> PAGEREF _Toc243257940 \h </w:instrText>
         </w:r>
         <w:r>
           <w:rPr>
@@ -822,7 +822,7 @@
           <w:lang w:eastAsia="pt-BR"/>
         </w:rPr>
       </w:pPr>
-      <w:hyperlink w:anchor="_Toc243219208" w:history="1">
+      <w:hyperlink w:anchor="_Toc243257941" w:history="1">
         <w:r>
           <w:rPr>
             <w:rStyle w:val="Hyperlink"/>
@@ -845,7 +845,7 @@
           <w:rPr>
             <w:webHidden/>
           </w:rPr>
-          <w:instrText xml:space="preserve"> PAGEREF _Toc243219208 \h </w:instrText>
+          <w:instrText xml:space="preserve"> PAGEREF _Toc243257941 \h </w:instrText>
         </w:r>
         <w:r>
           <w:rPr>
@@ -882,7 +882,7 @@
           <w:lang w:eastAsia="pt-BR"/>
         </w:rPr>
       </w:pPr>
-      <w:hyperlink w:anchor="_Toc243219209" w:history="1">
+      <w:hyperlink w:anchor="_Toc243257942" w:history="1">
         <w:r>
           <w:rPr>
             <w:rStyle w:val="Hyperlink"/>
@@ -905,7 +905,7 @@
           <w:rPr>
             <w:webHidden/>
           </w:rPr>
-          <w:instrText xml:space="preserve"> PAGEREF _Toc243219209 \h </w:instrText>
+          <w:instrText xml:space="preserve"> PAGEREF _Toc243257942 \h </w:instrText>
         </w:r>
         <w:r>
           <w:rPr>
@@ -940,7 +940,7 @@
           <w:lang w:eastAsia="pt-BR"/>
         </w:rPr>
       </w:pPr>
-      <w:hyperlink w:anchor="_Toc243219210" w:history="1">
+      <w:hyperlink w:anchor="_Toc243257943" w:history="1">
         <w:r>
           <w:rPr>
             <w:rStyle w:val="Hyperlink"/>
@@ -963,7 +963,7 @@
           <w:rPr>
             <w:webHidden/>
           </w:rPr>
-          <w:instrText xml:space="preserve"> PAGEREF _Toc243219210 \h </w:instrText>
+          <w:instrText xml:space="preserve"> PAGEREF _Toc243257943 \h </w:instrText>
         </w:r>
         <w:r>
           <w:rPr>
@@ -998,7 +998,7 @@
           <w:lang w:eastAsia="pt-BR"/>
         </w:rPr>
       </w:pPr>
-      <w:hyperlink w:anchor="_Toc243219211" w:history="1">
+      <w:hyperlink w:anchor="_Toc243257944" w:history="1">
         <w:r>
           <w:rPr>
             <w:rStyle w:val="Hyperlink"/>
@@ -1021,7 +1021,7 @@
           <w:rPr>
             <w:webHidden/>
           </w:rPr>
-          <w:instrText xml:space="preserve"> PAGEREF _Toc243219211 \h </w:instrText>
+          <w:instrText xml:space="preserve"> PAGEREF _Toc243257944 \h </w:instrText>
         </w:r>
         <w:r>
           <w:rPr>
@@ -1056,7 +1056,7 @@
           <w:lang w:eastAsia="pt-BR"/>
         </w:rPr>
       </w:pPr>
-      <w:hyperlink w:anchor="_Toc243219212" w:history="1">
+      <w:hyperlink w:anchor="_Toc243257945" w:history="1">
         <w:r>
           <w:rPr>
             <w:rStyle w:val="Hyperlink"/>
@@ -1079,7 +1079,7 @@
           <w:rPr>
             <w:webHidden/>
           </w:rPr>
-          <w:instrText xml:space="preserve"> PAGEREF _Toc243219212 \h </w:instrText>
+          <w:instrText xml:space="preserve"> PAGEREF _Toc243257945 \h </w:instrText>
         </w:r>
         <w:r>
           <w:rPr>
@@ -1114,7 +1114,7 @@
           <w:lang w:eastAsia="pt-BR"/>
         </w:rPr>
       </w:pPr>
-      <w:hyperlink w:anchor="_Toc243219213" w:history="1">
+      <w:hyperlink w:anchor="_Toc243257946" w:history="1">
         <w:r>
           <w:rPr>
             <w:rStyle w:val="Hyperlink"/>
@@ -1137,7 +1137,7 @@
           <w:rPr>
             <w:webHidden/>
           </w:rPr>
-          <w:instrText xml:space="preserve"> PAGEREF _Toc243219213 \h </w:instrText>
+          <w:instrText xml:space="preserve"> PAGEREF _Toc243257946 \h </w:instrText>
         </w:r>
         <w:r>
           <w:rPr>
@@ -1172,7 +1172,7 @@
           <w:lang w:eastAsia="pt-BR"/>
         </w:rPr>
       </w:pPr>
-      <w:hyperlink w:anchor="_Toc243219214" w:history="1">
+      <w:hyperlink w:anchor="_Toc243257947" w:history="1">
         <w:r>
           <w:rPr>
             <w:rStyle w:val="Hyperlink"/>
@@ -1195,7 +1195,7 @@
           <w:rPr>
             <w:webHidden/>
           </w:rPr>
-          <w:instrText xml:space="preserve"> PAGEREF _Toc243219214 \h </w:instrText>
+          <w:instrText xml:space="preserve"> PAGEREF _Toc243257947 \h </w:instrText>
         </w:r>
         <w:r>
           <w:rPr>
@@ -1230,7 +1230,7 @@
           <w:lang w:eastAsia="pt-BR"/>
         </w:rPr>
       </w:pPr>
-      <w:hyperlink w:anchor="_Toc243219215" w:history="1">
+      <w:hyperlink w:anchor="_Toc243257948" w:history="1">
         <w:r>
           <w:rPr>
             <w:rStyle w:val="Hyperlink"/>
@@ -1253,7 +1253,7 @@
           <w:rPr>
             <w:webHidden/>
           </w:rPr>
-          <w:instrText xml:space="preserve"> PAGEREF _Toc243219215 \h </w:instrText>
+          <w:instrText xml:space="preserve"> PAGEREF _Toc243257948 \h </w:instrText>
         </w:r>
         <w:r>
           <w:rPr>
@@ -1288,7 +1288,7 @@
           <w:lang w:eastAsia="pt-BR"/>
         </w:rPr>
       </w:pPr>
-      <w:hyperlink w:anchor="_Toc243219216" w:history="1">
+      <w:hyperlink w:anchor="_Toc243257949" w:history="1">
         <w:r>
           <w:rPr>
             <w:rStyle w:val="Hyperlink"/>
@@ -1311,7 +1311,7 @@
           <w:rPr>
             <w:webHidden/>
           </w:rPr>
-          <w:instrText xml:space="preserve"> PAGEREF _Toc243219216 \h </w:instrText>
+          <w:instrText xml:space="preserve"> PAGEREF _Toc243257949 \h </w:instrText>
         </w:r>
         <w:r>
           <w:rPr>
@@ -1346,7 +1346,7 @@
           <w:lang w:eastAsia="pt-BR"/>
         </w:rPr>
       </w:pPr>
-      <w:hyperlink w:anchor="_Toc243219217" w:history="1">
+      <w:hyperlink w:anchor="_Toc243257950" w:history="1">
         <w:r>
           <w:rPr>
             <w:rStyle w:val="Hyperlink"/>
@@ -1369,7 +1369,7 @@
           <w:rPr>
             <w:webHidden/>
           </w:rPr>
-          <w:instrText xml:space="preserve"> PAGEREF _Toc243219217 \h </w:instrText>
+          <w:instrText xml:space="preserve"> PAGEREF _Toc243257950 \h </w:instrText>
         </w:r>
         <w:r>
           <w:rPr>
@@ -1404,7 +1404,7 @@
           <w:lang w:eastAsia="pt-BR"/>
         </w:rPr>
       </w:pPr>
-      <w:hyperlink w:anchor="_Toc243219218" w:history="1">
+      <w:hyperlink w:anchor="_Toc243257951" w:history="1">
         <w:r>
           <w:rPr>
             <w:rStyle w:val="Hyperlink"/>
@@ -1427,7 +1427,7 @@
           <w:rPr>
             <w:webHidden/>
           </w:rPr>
-          <w:instrText xml:space="preserve"> PAGEREF _Toc243219218 \h </w:instrText>
+          <w:instrText xml:space="preserve"> PAGEREF _Toc243257951 \h </w:instrText>
         </w:r>
         <w:r>
           <w:rPr>
@@ -1464,7 +1464,7 @@
           <w:lang w:eastAsia="pt-BR"/>
         </w:rPr>
       </w:pPr>
-      <w:hyperlink w:anchor="_Toc243219219" w:history="1">
+      <w:hyperlink w:anchor="_Toc243257952" w:history="1">
         <w:r>
           <w:rPr>
             <w:rStyle w:val="Hyperlink"/>
@@ -1487,7 +1487,7 @@
           <w:rPr>
             <w:webHidden/>
           </w:rPr>
-          <w:instrText xml:space="preserve"> PAGEREF _Toc243219219 \h </w:instrText>
+          <w:instrText xml:space="preserve"> PAGEREF _Toc243257952 \h </w:instrText>
         </w:r>
         <w:r>
           <w:rPr>
@@ -1522,7 +1522,7 @@
           <w:lang w:eastAsia="pt-BR"/>
         </w:rPr>
       </w:pPr>
-      <w:hyperlink w:anchor="_Toc243219220" w:history="1">
+      <w:hyperlink w:anchor="_Toc243257953" w:history="1">
         <w:r>
           <w:rPr>
             <w:rStyle w:val="Hyperlink"/>
@@ -1545,7 +1545,7 @@
           <w:rPr>
             <w:webHidden/>
           </w:rPr>
-          <w:instrText xml:space="preserve"> PAGEREF _Toc243219220 \h </w:instrText>
+          <w:instrText xml:space="preserve"> PAGEREF _Toc243257953 \h </w:instrText>
         </w:r>
         <w:r>
           <w:rPr>
@@ -1580,7 +1580,7 @@
           <w:lang w:eastAsia="pt-BR"/>
         </w:rPr>
       </w:pPr>
-      <w:hyperlink w:anchor="_Toc243219221" w:history="1">
+      <w:hyperlink w:anchor="_Toc243257954" w:history="1">
         <w:r>
           <w:rPr>
             <w:rStyle w:val="Hyperlink"/>
@@ -1603,7 +1603,7 @@
           <w:rPr>
             <w:webHidden/>
           </w:rPr>
-          <w:instrText xml:space="preserve"> PAGEREF _Toc243219221 \h </w:instrText>
+          <w:instrText xml:space="preserve"> PAGEREF _Toc243257954 \h </w:instrText>
         </w:r>
         <w:r>
           <w:rPr>
@@ -1638,7 +1638,7 @@
           <w:lang w:eastAsia="pt-BR"/>
         </w:rPr>
       </w:pPr>
-      <w:hyperlink w:anchor="_Toc243219222" w:history="1">
+      <w:hyperlink w:anchor="_Toc243257955" w:history="1">
         <w:r>
           <w:rPr>
             <w:rStyle w:val="Hyperlink"/>
@@ -1661,7 +1661,7 @@
           <w:rPr>
             <w:webHidden/>
           </w:rPr>
-          <w:instrText xml:space="preserve"> PAGEREF _Toc243219222 \h </w:instrText>
+          <w:instrText xml:space="preserve"> PAGEREF _Toc243257955 \h </w:instrText>
         </w:r>
         <w:r>
           <w:rPr>
@@ -1696,7 +1696,7 @@
           <w:lang w:eastAsia="pt-BR"/>
         </w:rPr>
       </w:pPr>
-      <w:hyperlink w:anchor="_Toc243219223" w:history="1">
+      <w:hyperlink w:anchor="_Toc243257956" w:history="1">
         <w:r>
           <w:rPr>
             <w:rStyle w:val="Hyperlink"/>
@@ -1719,7 +1719,7 @@
           <w:rPr>
             <w:webHidden/>
           </w:rPr>
-          <w:instrText xml:space="preserve"> PAGEREF _Toc243219223 \h </w:instrText>
+          <w:instrText xml:space="preserve"> PAGEREF _Toc243257956 \h </w:instrText>
         </w:r>
         <w:r>
           <w:rPr>
@@ -1754,7 +1754,7 @@
           <w:lang w:eastAsia="pt-BR"/>
         </w:rPr>
       </w:pPr>
-      <w:hyperlink w:anchor="_Toc243219224" w:history="1">
+      <w:hyperlink w:anchor="_Toc243257957" w:history="1">
         <w:r>
           <w:rPr>
             <w:rStyle w:val="Hyperlink"/>
@@ -1777,7 +1777,7 @@
           <w:rPr>
             <w:webHidden/>
           </w:rPr>
-          <w:instrText xml:space="preserve"> PAGEREF _Toc243219224 \h </w:instrText>
+          <w:instrText xml:space="preserve"> PAGEREF _Toc243257957 \h </w:instrText>
         </w:r>
         <w:r>
           <w:rPr>
@@ -1812,7 +1812,7 @@
           <w:lang w:eastAsia="pt-BR"/>
         </w:rPr>
       </w:pPr>
-      <w:hyperlink w:anchor="_Toc243219225" w:history="1">
+      <w:hyperlink w:anchor="_Toc243257958" w:history="1">
         <w:r>
           <w:rPr>
             <w:rStyle w:val="Hyperlink"/>
@@ -1835,7 +1835,7 @@
           <w:rPr>
             <w:webHidden/>
           </w:rPr>
-          <w:instrText xml:space="preserve"> PAGEREF _Toc243219225 \h </w:instrText>
+          <w:instrText xml:space="preserve"> PAGEREF _Toc243257958 \h </w:instrText>
         </w:r>
         <w:r>
           <w:rPr>
@@ -1872,7 +1872,7 @@
           <w:lang w:eastAsia="pt-BR"/>
         </w:rPr>
       </w:pPr>
-      <w:hyperlink w:anchor="_Toc243219226" w:history="1">
+      <w:hyperlink w:anchor="_Toc243257959" w:history="1">
         <w:r>
           <w:rPr>
             <w:rStyle w:val="Hyperlink"/>
@@ -1895,7 +1895,7 @@
           <w:rPr>
             <w:webHidden/>
           </w:rPr>
-          <w:instrText xml:space="preserve"> PAGEREF _Toc243219226 \h </w:instrText>
+          <w:instrText xml:space="preserve"> PAGEREF _Toc243257959 \h </w:instrText>
         </w:r>
         <w:r>
           <w:rPr>
@@ -1930,7 +1930,7 @@
           <w:lang w:eastAsia="pt-BR"/>
         </w:rPr>
       </w:pPr>
-      <w:hyperlink w:anchor="_Toc243219227" w:history="1">
+      <w:hyperlink w:anchor="_Toc243257960" w:history="1">
         <w:r>
           <w:rPr>
             <w:rStyle w:val="Hyperlink"/>
@@ -1953,7 +1953,7 @@
           <w:rPr>
             <w:webHidden/>
           </w:rPr>
-          <w:instrText xml:space="preserve"> PAGEREF _Toc243219227 \h </w:instrText>
+          <w:instrText xml:space="preserve"> PAGEREF _Toc243257960 \h </w:instrText>
         </w:r>
         <w:r>
           <w:rPr>
@@ -1988,7 +1988,7 @@
           <w:lang w:eastAsia="pt-BR"/>
         </w:rPr>
       </w:pPr>
-      <w:hyperlink w:anchor="_Toc243219228" w:history="1">
+      <w:hyperlink w:anchor="_Toc243257961" w:history="1">
         <w:r>
           <w:rPr>
             <w:rStyle w:val="Hyperlink"/>
@@ -2011,7 +2011,7 @@
           <w:rPr>
             <w:webHidden/>
           </w:rPr>
-          <w:instrText xml:space="preserve"> PAGEREF _Toc243219228 \h </w:instrText>
+          <w:instrText xml:space="preserve"> PAGEREF _Toc243257961 \h </w:instrText>
         </w:r>
         <w:r>
           <w:rPr>
@@ -2028,7 +2028,7 @@
           <w:rPr>
             <w:webHidden/>
           </w:rPr>
-          <w:t>26</w:t>
+          <w:t>27</w:t>
         </w:r>
         <w:r>
           <w:rPr>
@@ -2046,7 +2046,7 @@
           <w:lang w:eastAsia="pt-BR"/>
         </w:rPr>
       </w:pPr>
-      <w:hyperlink w:anchor="_Toc243219229" w:history="1">
+      <w:hyperlink w:anchor="_Toc243257962" w:history="1">
         <w:r>
           <w:rPr>
             <w:rStyle w:val="Hyperlink"/>
@@ -2069,7 +2069,7 @@
           <w:rPr>
             <w:webHidden/>
           </w:rPr>
-          <w:instrText xml:space="preserve"> PAGEREF _Toc243219229 \h </w:instrText>
+          <w:instrText xml:space="preserve"> PAGEREF _Toc243257962 \h </w:instrText>
         </w:r>
         <w:r>
           <w:rPr>
@@ -2086,7 +2086,7 @@
           <w:rPr>
             <w:webHidden/>
           </w:rPr>
-          <w:t>36</w:t>
+          <w:t>38</w:t>
         </w:r>
         <w:r>
           <w:rPr>
@@ -2106,7 +2106,7 @@
           <w:lang w:eastAsia="pt-BR"/>
         </w:rPr>
       </w:pPr>
-      <w:hyperlink w:anchor="_Toc243219230" w:history="1">
+      <w:hyperlink w:anchor="_Toc243257963" w:history="1">
         <w:r>
           <w:rPr>
             <w:rStyle w:val="Hyperlink"/>
@@ -2129,7 +2129,7 @@
           <w:rPr>
             <w:webHidden/>
           </w:rPr>
-          <w:instrText xml:space="preserve"> PAGEREF _Toc243219230 \h </w:instrText>
+          <w:instrText xml:space="preserve"> PAGEREF _Toc243257963 \h </w:instrText>
         </w:r>
         <w:r>
           <w:rPr>
@@ -2146,7 +2146,7 @@
           <w:rPr>
             <w:webHidden/>
           </w:rPr>
-          <w:t>39</w:t>
+          <w:t>40</w:t>
         </w:r>
         <w:r>
           <w:rPr>
@@ -2164,7 +2164,7 @@
           <w:lang w:eastAsia="pt-BR"/>
         </w:rPr>
       </w:pPr>
-      <w:hyperlink w:anchor="_Toc243219231" w:history="1">
+      <w:hyperlink w:anchor="_Toc243257964" w:history="1">
         <w:r>
           <w:rPr>
             <w:rStyle w:val="Hyperlink"/>
@@ -2187,7 +2187,7 @@
           <w:rPr>
             <w:webHidden/>
           </w:rPr>
-          <w:instrText xml:space="preserve"> PAGEREF _Toc243219231 \h </w:instrText>
+          <w:instrText xml:space="preserve"> PAGEREF _Toc243257964 \h </w:instrText>
         </w:r>
         <w:r>
           <w:rPr>
@@ -2204,7 +2204,7 @@
           <w:rPr>
             <w:webHidden/>
           </w:rPr>
-          <w:t>39</w:t>
+          <w:t>40</w:t>
         </w:r>
         <w:r>
           <w:rPr>
@@ -2222,7 +2222,7 @@
           <w:lang w:eastAsia="pt-BR"/>
         </w:rPr>
       </w:pPr>
-      <w:hyperlink w:anchor="_Toc243219232" w:history="1">
+      <w:hyperlink w:anchor="_Toc243257965" w:history="1">
         <w:r>
           <w:rPr>
             <w:rStyle w:val="Hyperlink"/>
@@ -2245,7 +2245,7 @@
           <w:rPr>
             <w:webHidden/>
           </w:rPr>
-          <w:instrText xml:space="preserve"> PAGEREF _Toc243219232 \h </w:instrText>
+          <w:instrText xml:space="preserve"> PAGEREF _Toc243257965 \h </w:instrText>
         </w:r>
         <w:r>
           <w:rPr>
@@ -2262,7 +2262,7 @@
           <w:rPr>
             <w:webHidden/>
           </w:rPr>
-          <w:t>40</w:t>
+          <w:t>41</w:t>
         </w:r>
         <w:r>
           <w:rPr>
@@ -2280,7 +2280,7 @@
           <w:lang w:eastAsia="pt-BR"/>
         </w:rPr>
       </w:pPr>
-      <w:hyperlink w:anchor="_Toc243219233" w:history="1">
+      <w:hyperlink w:anchor="_Toc243257966" w:history="1">
         <w:r>
           <w:rPr>
             <w:rStyle w:val="Hyperlink"/>
@@ -2303,7 +2303,7 @@
           <w:rPr>
             <w:webHidden/>
           </w:rPr>
-          <w:instrText xml:space="preserve"> PAGEREF _Toc243219233 \h </w:instrText>
+          <w:instrText xml:space="preserve"> PAGEREF _Toc243257966 \h </w:instrText>
         </w:r>
         <w:r>
           <w:rPr>
@@ -2320,7 +2320,7 @@
           <w:rPr>
             <w:webHidden/>
           </w:rPr>
-          <w:t>41</w:t>
+          <w:t>42</w:t>
         </w:r>
         <w:r>
           <w:rPr>
@@ -2338,7 +2338,7 @@
           <w:lang w:eastAsia="pt-BR"/>
         </w:rPr>
       </w:pPr>
-      <w:hyperlink w:anchor="_Toc243219234" w:history="1">
+      <w:hyperlink w:anchor="_Toc243257967" w:history="1">
         <w:r>
           <w:rPr>
             <w:rStyle w:val="Hyperlink"/>
@@ -2361,7 +2361,7 @@
           <w:rPr>
             <w:webHidden/>
           </w:rPr>
-          <w:instrText xml:space="preserve"> PAGEREF _Toc243219234 \h </w:instrText>
+          <w:instrText xml:space="preserve"> PAGEREF _Toc243257967 \h </w:instrText>
         </w:r>
         <w:r>
           <w:rPr>
@@ -2378,7 +2378,7 @@
           <w:rPr>
             <w:webHidden/>
           </w:rPr>
-          <w:t>42</w:t>
+          <w:t>43</w:t>
         </w:r>
         <w:r>
           <w:rPr>
@@ -2396,7 +2396,7 @@
           <w:lang w:eastAsia="pt-BR"/>
         </w:rPr>
       </w:pPr>
-      <w:hyperlink w:anchor="_Toc243219235" w:history="1">
+      <w:hyperlink w:anchor="_Toc243257968" w:history="1">
         <w:r>
           <w:rPr>
             <w:rStyle w:val="Hyperlink"/>
@@ -2419,7 +2419,7 @@
           <w:rPr>
             <w:webHidden/>
           </w:rPr>
-          <w:instrText xml:space="preserve"> PAGEREF _Toc243219235 \h </w:instrText>
+          <w:instrText xml:space="preserve"> PAGEREF _Toc243257968 \h </w:instrText>
         </w:r>
         <w:r>
           <w:rPr>
@@ -2436,7 +2436,7 @@
           <w:rPr>
             <w:webHidden/>
           </w:rPr>
-          <w:t>44</w:t>
+          <w:t>45</w:t>
         </w:r>
         <w:r>
           <w:rPr>
@@ -2454,7 +2454,7 @@
           <w:lang w:eastAsia="pt-BR"/>
         </w:rPr>
       </w:pPr>
-      <w:hyperlink w:anchor="_Toc243219236" w:history="1">
+      <w:hyperlink w:anchor="_Toc243257969" w:history="1">
         <w:r>
           <w:rPr>
             <w:rStyle w:val="Hyperlink"/>
@@ -2477,7 +2477,7 @@
           <w:rPr>
             <w:webHidden/>
           </w:rPr>
-          <w:instrText xml:space="preserve"> PAGEREF _Toc243219236 \h </w:instrText>
+          <w:instrText xml:space="preserve"> PAGEREF _Toc243257969 \h </w:instrText>
         </w:r>
         <w:r>
           <w:rPr>
@@ -2494,7 +2494,7 @@
           <w:rPr>
             <w:webHidden/>
           </w:rPr>
-          <w:t>45</w:t>
+          <w:t>46</w:t>
         </w:r>
         <w:r>
           <w:rPr>
@@ -2514,7 +2514,7 @@
           <w:lang w:eastAsia="pt-BR"/>
         </w:rPr>
       </w:pPr>
-      <w:hyperlink w:anchor="_Toc243219237" w:history="1">
+      <w:hyperlink w:anchor="_Toc243257970" w:history="1">
         <w:r>
           <w:rPr>
             <w:rStyle w:val="Hyperlink"/>
@@ -2537,7 +2537,7 @@
           <w:rPr>
             <w:webHidden/>
           </w:rPr>
-          <w:instrText xml:space="preserve"> PAGEREF _Toc243219237 \h </w:instrText>
+          <w:instrText xml:space="preserve"> PAGEREF _Toc243257970 \h </w:instrText>
         </w:r>
         <w:r>
           <w:rPr>
@@ -2554,7 +2554,7 @@
           <w:rPr>
             <w:webHidden/>
           </w:rPr>
-          <w:t>46</w:t>
+          <w:t>47</w:t>
         </w:r>
         <w:r>
           <w:rPr>
@@ -2574,7 +2574,7 @@
           <w:lang w:eastAsia="pt-BR"/>
         </w:rPr>
       </w:pPr>
-      <w:hyperlink w:anchor="_Toc243219238" w:history="1">
+      <w:hyperlink w:anchor="_Toc243257971" w:history="1">
         <w:r>
           <w:rPr>
             <w:rStyle w:val="Hyperlink"/>
@@ -2597,7 +2597,7 @@
           <w:rPr>
             <w:webHidden/>
           </w:rPr>
-          <w:instrText xml:space="preserve"> PAGEREF _Toc243219238 \h </w:instrText>
+          <w:instrText xml:space="preserve"> PAGEREF _Toc243257971 \h </w:instrText>
         </w:r>
         <w:r>
           <w:rPr>
@@ -2614,7 +2614,7 @@
           <w:rPr>
             <w:webHidden/>
           </w:rPr>
-          <w:t>49</w:t>
+          <w:t>50</w:t>
         </w:r>
         <w:r>
           <w:rPr>
@@ -2632,7 +2632,7 @@
           <w:lang w:eastAsia="pt-BR"/>
         </w:rPr>
       </w:pPr>
-      <w:hyperlink w:anchor="_Toc243219239" w:history="1">
+      <w:hyperlink w:anchor="_Toc243257972" w:history="1">
         <w:r>
           <w:rPr>
             <w:rStyle w:val="Hyperlink"/>
@@ -2655,7 +2655,7 @@
           <w:rPr>
             <w:webHidden/>
           </w:rPr>
-          <w:instrText xml:space="preserve"> PAGEREF _Toc243219239 \h </w:instrText>
+          <w:instrText xml:space="preserve"> PAGEREF _Toc243257972 \h </w:instrText>
         </w:r>
         <w:r>
           <w:rPr>
@@ -2672,7 +2672,7 @@
           <w:rPr>
             <w:webHidden/>
           </w:rPr>
-          <w:t>49</w:t>
+          <w:t>50</w:t>
         </w:r>
         <w:r>
           <w:rPr>
@@ -2690,7 +2690,7 @@
           <w:lang w:eastAsia="pt-BR"/>
         </w:rPr>
       </w:pPr>
-      <w:hyperlink w:anchor="_Toc243219240" w:history="1">
+      <w:hyperlink w:anchor="_Toc243257973" w:history="1">
         <w:r>
           <w:rPr>
             <w:rStyle w:val="Hyperlink"/>
@@ -2713,7 +2713,7 @@
           <w:rPr>
             <w:webHidden/>
           </w:rPr>
-          <w:instrText xml:space="preserve"> PAGEREF _Toc243219240 \h </w:instrText>
+          <w:instrText xml:space="preserve"> PAGEREF _Toc243257973 \h </w:instrText>
         </w:r>
         <w:r>
           <w:rPr>
@@ -2730,7 +2730,7 @@
           <w:rPr>
             <w:webHidden/>
           </w:rPr>
-          <w:t>49</w:t>
+          <w:t>50</w:t>
         </w:r>
         <w:r>
           <w:rPr>
@@ -2748,7 +2748,7 @@
           <w:lang w:eastAsia="pt-BR"/>
         </w:rPr>
       </w:pPr>
-      <w:hyperlink w:anchor="_Toc243219241" w:history="1">
+      <w:hyperlink w:anchor="_Toc243257974" w:history="1">
         <w:r>
           <w:rPr>
             <w:rStyle w:val="Hyperlink"/>
@@ -2771,7 +2771,7 @@
           <w:rPr>
             <w:webHidden/>
           </w:rPr>
-          <w:instrText xml:space="preserve"> PAGEREF _Toc243219241 \h </w:instrText>
+          <w:instrText xml:space="preserve"> PAGEREF _Toc243257974 \h </w:instrText>
         </w:r>
         <w:r>
           <w:rPr>
@@ -2788,7 +2788,7 @@
           <w:rPr>
             <w:webHidden/>
           </w:rPr>
-          <w:t>50</w:t>
+          <w:t>51</w:t>
         </w:r>
         <w:r>
           <w:rPr>
@@ -2806,7 +2806,7 @@
           <w:lang w:eastAsia="pt-BR"/>
         </w:rPr>
       </w:pPr>
-      <w:hyperlink w:anchor="_Toc243219242" w:history="1">
+      <w:hyperlink w:anchor="_Toc243257975" w:history="1">
         <w:r>
           <w:rPr>
             <w:rStyle w:val="Hyperlink"/>
@@ -2829,7 +2829,7 @@
           <w:rPr>
             <w:webHidden/>
           </w:rPr>
-          <w:instrText xml:space="preserve"> PAGEREF _Toc243219242 \h </w:instrText>
+          <w:instrText xml:space="preserve"> PAGEREF _Toc243257975 \h </w:instrText>
         </w:r>
         <w:r>
           <w:rPr>
@@ -2846,7 +2846,7 @@
           <w:rPr>
             <w:webHidden/>
           </w:rPr>
-          <w:t>51</w:t>
+          <w:t>52</w:t>
         </w:r>
         <w:r>
           <w:rPr>
@@ -2864,7 +2864,7 @@
           <w:lang w:eastAsia="pt-BR"/>
         </w:rPr>
       </w:pPr>
-      <w:hyperlink w:anchor="_Toc243219243" w:history="1">
+      <w:hyperlink w:anchor="_Toc243257976" w:history="1">
         <w:r>
           <w:rPr>
             <w:rStyle w:val="Hyperlink"/>
@@ -2887,7 +2887,7 @@
           <w:rPr>
             <w:webHidden/>
           </w:rPr>
-          <w:instrText xml:space="preserve"> PAGEREF _Toc243219243 \h </w:instrText>
+          <w:instrText xml:space="preserve"> PAGEREF _Toc243257976 \h </w:instrText>
         </w:r>
         <w:r>
           <w:rPr>
@@ -2904,7 +2904,7 @@
           <w:rPr>
             <w:webHidden/>
           </w:rPr>
-          <w:t>52</w:t>
+          <w:t>53</w:t>
         </w:r>
         <w:r>
           <w:rPr>
@@ -2922,7 +2922,7 @@
           <w:lang w:eastAsia="pt-BR"/>
         </w:rPr>
       </w:pPr>
-      <w:hyperlink w:anchor="_Toc243219244" w:history="1">
+      <w:hyperlink w:anchor="_Toc243257977" w:history="1">
         <w:r>
           <w:rPr>
             <w:rStyle w:val="Hyperlink"/>
@@ -2945,7 +2945,7 @@
           <w:rPr>
             <w:webHidden/>
           </w:rPr>
-          <w:instrText xml:space="preserve"> PAGEREF _Toc243219244 \h </w:instrText>
+          <w:instrText xml:space="preserve"> PAGEREF _Toc243257977 \h </w:instrText>
         </w:r>
         <w:r>
           <w:rPr>
@@ -2962,7 +2962,7 @@
           <w:rPr>
             <w:webHidden/>
           </w:rPr>
-          <w:t>53</w:t>
+          <w:t>54</w:t>
         </w:r>
         <w:r>
           <w:rPr>
@@ -2982,7 +2982,7 @@
           <w:lang w:eastAsia="pt-BR"/>
         </w:rPr>
       </w:pPr>
-      <w:hyperlink w:anchor="_Toc243219245" w:history="1">
+      <w:hyperlink w:anchor="_Toc243257978" w:history="1">
         <w:r>
           <w:rPr>
             <w:rStyle w:val="Hyperlink"/>
@@ -3005,7 +3005,7 @@
           <w:rPr>
             <w:webHidden/>
           </w:rPr>
-          <w:instrText xml:space="preserve"> PAGEREF _Toc243219245 \h </w:instrText>
+          <w:instrText xml:space="preserve"> PAGEREF _Toc243257978 \h </w:instrText>
         </w:r>
         <w:r>
           <w:rPr>
@@ -3022,7 +3022,7 @@
           <w:rPr>
             <w:webHidden/>
           </w:rPr>
-          <w:t>55</w:t>
+          <w:t>56</w:t>
         </w:r>
         <w:r>
           <w:rPr>
@@ -3042,7 +3042,7 @@
           <w:lang w:eastAsia="pt-BR"/>
         </w:rPr>
       </w:pPr>
-      <w:hyperlink w:anchor="_Toc243219246" w:history="1">
+      <w:hyperlink w:anchor="_Toc243257979" w:history="1">
         <w:r>
           <w:rPr>
             <w:rStyle w:val="Hyperlink"/>
@@ -3065,7 +3065,7 @@
           <w:rPr>
             <w:webHidden/>
           </w:rPr>
-          <w:instrText xml:space="preserve"> PAGEREF _Toc243219246 \h </w:instrText>
+          <w:instrText xml:space="preserve"> PAGEREF _Toc243257979 \h </w:instrText>
         </w:r>
         <w:r>
           <w:rPr>
@@ -3082,7 +3082,7 @@
           <w:rPr>
             <w:webHidden/>
           </w:rPr>
-          <w:t>58</w:t>
+          <w:t>60</w:t>
         </w:r>
         <w:r>
           <w:rPr>
@@ -3100,7 +3100,7 @@
           <w:lang w:eastAsia="pt-BR"/>
         </w:rPr>
       </w:pPr>
-      <w:hyperlink w:anchor="_Toc243219247" w:history="1">
+      <w:hyperlink w:anchor="_Toc243257980" w:history="1">
         <w:r>
           <w:rPr>
             <w:rStyle w:val="Hyperlink"/>
@@ -3123,7 +3123,7 @@
           <w:rPr>
             <w:webHidden/>
           </w:rPr>
-          <w:instrText xml:space="preserve"> PAGEREF _Toc243219247 \h </w:instrText>
+          <w:instrText xml:space="preserve"> PAGEREF _Toc243257980 \h </w:instrText>
         </w:r>
         <w:r>
           <w:rPr>
@@ -3140,7 +3140,7 @@
           <w:rPr>
             <w:webHidden/>
           </w:rPr>
-          <w:t>58</w:t>
+          <w:t>60</w:t>
         </w:r>
         <w:r>
           <w:rPr>
@@ -3158,7 +3158,7 @@
           <w:lang w:eastAsia="pt-BR"/>
         </w:rPr>
       </w:pPr>
-      <w:hyperlink w:anchor="_Toc243219248" w:history="1">
+      <w:hyperlink w:anchor="_Toc243257981" w:history="1">
         <w:r>
           <w:rPr>
             <w:rStyle w:val="Hyperlink"/>
@@ -3181,7 +3181,7 @@
           <w:rPr>
             <w:webHidden/>
           </w:rPr>
-          <w:instrText xml:space="preserve"> PAGEREF _Toc243219248 \h </w:instrText>
+          <w:instrText xml:space="preserve"> PAGEREF _Toc243257981 \h </w:instrText>
         </w:r>
         <w:r>
           <w:rPr>
@@ -3198,7 +3198,7 @@
           <w:rPr>
             <w:webHidden/>
           </w:rPr>
-          <w:t>59</w:t>
+          <w:t>61</w:t>
         </w:r>
         <w:r>
           <w:rPr>
@@ -3216,7 +3216,7 @@
           <w:lang w:eastAsia="pt-BR"/>
         </w:rPr>
       </w:pPr>
-      <w:hyperlink w:anchor="_Toc243219249" w:history="1">
+      <w:hyperlink w:anchor="_Toc243257982" w:history="1">
         <w:r>
           <w:rPr>
             <w:rStyle w:val="Hyperlink"/>
@@ -3239,7 +3239,7 @@
           <w:rPr>
             <w:webHidden/>
           </w:rPr>
-          <w:instrText xml:space="preserve"> PAGEREF _Toc243219249 \h </w:instrText>
+          <w:instrText xml:space="preserve"> PAGEREF _Toc243257982 \h </w:instrText>
         </w:r>
         <w:r>
           <w:rPr>
@@ -3256,7 +3256,7 @@
           <w:rPr>
             <w:webHidden/>
           </w:rPr>
-          <w:t>59</w:t>
+          <w:t>61</w:t>
         </w:r>
         <w:r>
           <w:rPr>
@@ -3274,7 +3274,7 @@
           <w:lang w:eastAsia="pt-BR"/>
         </w:rPr>
       </w:pPr>
-      <w:hyperlink w:anchor="_Toc243219250" w:history="1">
+      <w:hyperlink w:anchor="_Toc243257983" w:history="1">
         <w:r>
           <w:rPr>
             <w:rStyle w:val="Hyperlink"/>
@@ -3297,7 +3297,7 @@
           <w:rPr>
             <w:webHidden/>
           </w:rPr>
-          <w:instrText xml:space="preserve"> PAGEREF _Toc243219250 \h </w:instrText>
+          <w:instrText xml:space="preserve"> PAGEREF _Toc243257983 \h </w:instrText>
         </w:r>
         <w:r>
           <w:rPr>
@@ -3314,7 +3314,7 @@
           <w:rPr>
             <w:webHidden/>
           </w:rPr>
-          <w:t>61</w:t>
+          <w:t>63</w:t>
         </w:r>
         <w:r>
           <w:rPr>
@@ -3346,7 +3346,7 @@
       <w:pPr>
         <w:pStyle w:val="Ttulo1"/>
       </w:pPr>
-      <w:bookmarkStart w:id="0" w:name="_Toc243219198"/>
+      <w:bookmarkStart w:id="0" w:name="_Toc243257931"/>
       <w:r>
         <w:lastRenderedPageBreak/>
         <w:t>INTRODUÇÃO</w:t>
@@ -3401,7 +3401,7 @@
       <w:pPr>
         <w:pStyle w:val="Ttulo2"/>
       </w:pPr>
-      <w:bookmarkStart w:id="1" w:name="_Toc243219199"/>
+      <w:bookmarkStart w:id="1" w:name="_Toc243257932"/>
       <w:r>
         <w:t>Convenções Adotadas</w:t>
       </w:r>
@@ -3460,8 +3460,9 @@
       <w:pPr>
         <w:pStyle w:val="Ttulo1"/>
       </w:pPr>
-      <w:bookmarkStart w:id="2" w:name="_Toc243219200"/>
-      <w:r>
+      <w:bookmarkStart w:id="2" w:name="_Toc243257933"/>
+      <w:r>
+        <w:lastRenderedPageBreak/>
         <w:t>VISÃO GERAL</w:t>
       </w:r>
       <w:bookmarkEnd w:id="2"/>
@@ -3565,7 +3566,7 @@
       <w:pPr>
         <w:pStyle w:val="Ttulo2"/>
       </w:pPr>
-      <w:bookmarkStart w:id="3" w:name="_Toc243219201"/>
+      <w:bookmarkStart w:id="3" w:name="_Toc243257934"/>
       <w:r>
         <w:t>Componentes da Solução</w:t>
       </w:r>
@@ -3665,8 +3666,9 @@
       <w:pPr>
         <w:pStyle w:val="Ttulo2"/>
       </w:pPr>
-      <w:bookmarkStart w:id="4" w:name="_Toc243219202"/>
-      <w:r>
+      <w:bookmarkStart w:id="4" w:name="_Toc243257935"/>
+      <w:r>
+        <w:lastRenderedPageBreak/>
         <w:t>Tecnologias</w:t>
       </w:r>
       <w:bookmarkEnd w:id="4"/>
@@ -4610,7 +4612,10 @@
               <w:pStyle w:val="TextodeTabela"/>
             </w:pPr>
             <w:r>
-              <w:t>Testes e qualidade</w:t>
+              <w:rPr>
+                <w:i/>
+              </w:rPr>
+              <w:t>Migrations</w:t>
             </w:r>
           </w:p>
         </w:tc>
@@ -4623,7 +4628,7 @@
               <w:pStyle w:val="TextodeTabela"/>
             </w:pPr>
             <w:r>
-              <w:t>Vitest, ESLint e Prettier</w:t>
+              <w:t>Supabase CLI</w:t>
             </w:r>
           </w:p>
         </w:tc>
@@ -4637,7 +4642,7 @@
               <w:jc w:val="center"/>
             </w:pPr>
             <w:r>
-              <w:t>5.0, 9 e 3.9</w:t>
+              <w:t>2.120</w:t>
             </w:r>
           </w:p>
         </w:tc>
@@ -4650,7 +4655,16 @@
               <w:pStyle w:val="TextodeTabela"/>
             </w:pPr>
             <w:r>
-              <w:t>Testes das regras de negócio, análise estática e formatação automática do código.</w:t>
+              <w:t xml:space="preserve">Conferência das </w:t>
+            </w:r>
+            <w:r>
+              <w:rPr>
+                <w:i/>
+              </w:rPr>
+              <w:t>migrations</w:t>
+            </w:r>
+            <w:r>
+              <w:t xml:space="preserve"> num banco local, no Docker, e aplicação delas no projeto.</w:t>
             </w:r>
           </w:p>
         </w:tc>
@@ -4668,7 +4682,7 @@
               <w:pStyle w:val="TextodeTabela"/>
             </w:pPr>
             <w:r>
-              <w:t>Versionamento</w:t>
+              <w:t>Testes e qualidade</w:t>
             </w:r>
           </w:p>
         </w:tc>
@@ -4681,7 +4695,7 @@
               <w:pStyle w:val="TextodeTabela"/>
             </w:pPr>
             <w:r>
-              <w:t>Git, GitHub e GitHub Actions</w:t>
+              <w:t>Vitest, ESLint e Prettier</w:t>
             </w:r>
           </w:p>
         </w:tc>
@@ -4695,7 +4709,7 @@
               <w:jc w:val="center"/>
             </w:pPr>
             <w:r>
-              <w:t>Serviço</w:t>
+              <w:t>5.0, 9 e 3.9</w:t>
             </w:r>
           </w:p>
         </w:tc>
@@ -4708,7 +4722,7 @@
               <w:pStyle w:val="TextodeTabela"/>
             </w:pPr>
             <w:r>
-              <w:t>Repositório do código e verificação automática a cada alteração.</w:t>
+              <w:t>Testes das regras de negócio, análise estática e formatação automática do código.</w:t>
             </w:r>
           </w:p>
         </w:tc>
@@ -4726,6 +4740,64 @@
               <w:pStyle w:val="TextodeTabela"/>
             </w:pPr>
             <w:r>
+              <w:t>Versionamento</w:t>
+            </w:r>
+          </w:p>
+        </w:tc>
+        <w:tc>
+          <w:tcPr>
+            <w:tcW w:w="2500" w:type="dxa"/>
+          </w:tcPr>
+          <w:p>
+            <w:pPr>
+              <w:pStyle w:val="TextodeTabela"/>
+            </w:pPr>
+            <w:r>
+              <w:t>Git, GitHub e GitHub Actions</w:t>
+            </w:r>
+          </w:p>
+        </w:tc>
+        <w:tc>
+          <w:tcPr>
+            <w:tcW w:w="1300" w:type="dxa"/>
+          </w:tcPr>
+          <w:p>
+            <w:pPr>
+              <w:pStyle w:val="TextodeTabela"/>
+              <w:jc w:val="center"/>
+            </w:pPr>
+            <w:r>
+              <w:t>Serviço</w:t>
+            </w:r>
+          </w:p>
+        </w:tc>
+        <w:tc>
+          <w:tcPr>
+            <w:tcW w:w="3371" w:type="dxa"/>
+          </w:tcPr>
+          <w:p>
+            <w:pPr>
+              <w:pStyle w:val="TextodeTabela"/>
+            </w:pPr>
+            <w:r>
+              <w:t>Repositório do código e verificação automática a cada alteração.</w:t>
+            </w:r>
+          </w:p>
+        </w:tc>
+      </w:tr>
+      <w:tr>
+        <w:trPr>
+          <w:cantSplit/>
+        </w:trPr>
+        <w:tc>
+          <w:tcPr>
+            <w:tcW w:w="1900" w:type="dxa"/>
+          </w:tcPr>
+          <w:p>
+            <w:pPr>
+              <w:pStyle w:val="TextodeTabela"/>
+            </w:pPr>
+            <w:r>
               <w:t>Hospedagem</w:t>
             </w:r>
           </w:p>
@@ -4778,6 +4850,7 @@
         <w:spacing w:before="240"/>
       </w:pPr>
       <w:r>
+        <w:lastRenderedPageBreak/>
         <w:t xml:space="preserve">Quatro dessas versões foram definidas por compatibilidade. O Node.js 24 é a versão com suporte de longo prazo, adotada como padrão pela Vercel e suportada pelo Vitest 5. O React 19 é a linha atual, suportada pelo Next.js 16. O TypeScript permanece na linha 6.0, e não na 7.0, porque as regras de análise estática para TypeScript utilizadas pela configuração de ESLint do Next.js ainda não suportam a linha 7. O ESLint permanece na linha 9, e não na 10, porque essa mesma configuração do Next.js ainda não aceita a linha 10; a escolha é revista a cada atualização do Next.js. As versões exatas de todas as dependências ficam registradas no arquivo </w:t>
       </w:r>
       <w:r>
@@ -4796,7 +4869,7 @@
       <w:pPr>
         <w:pStyle w:val="Ttulo2"/>
       </w:pPr>
-      <w:bookmarkStart w:id="5" w:name="_Toc243219203"/>
+      <w:bookmarkStart w:id="5" w:name="_Toc243257936"/>
       <w:r>
         <w:t>Princípios de Arquitetura</w:t>
       </w:r>
@@ -4917,7 +4990,7 @@
       <w:pPr>
         <w:pStyle w:val="Ttulo2"/>
       </w:pPr>
-      <w:bookmarkStart w:id="6" w:name="_Toc243219204"/>
+      <w:bookmarkStart w:id="6" w:name="_Toc243257937"/>
       <w:r>
         <w:t>Padrões de Código</w:t>
       </w:r>
@@ -4945,8 +5018,9 @@
       <w:pPr>
         <w:pStyle w:val="Ttulo3"/>
       </w:pPr>
-      <w:bookmarkStart w:id="7" w:name="_Toc243219205"/>
-      <w:r>
+      <w:bookmarkStart w:id="7" w:name="_Toc243257938"/>
+      <w:r>
+        <w:lastRenderedPageBreak/>
         <w:t>Nomenclatura</w:t>
       </w:r>
       <w:bookmarkEnd w:id="7"/>
@@ -5717,7 +5791,7 @@
       <w:pPr>
         <w:pStyle w:val="Ttulo3"/>
       </w:pPr>
-      <w:bookmarkStart w:id="8" w:name="_Toc243219206"/>
+      <w:bookmarkStart w:id="8" w:name="_Toc243257939"/>
       <w:r>
         <w:t>Funções e Módulos</w:t>
       </w:r>
@@ -5766,6 +5840,7 @@
         </w:numPr>
       </w:pPr>
       <w:r>
+        <w:lastRenderedPageBreak/>
         <w:t>as funções são curtas: uma função que não cabe em uma tela é sinal de que faz mais de uma coisa e deve ser dividida. Funções com mais de três parâmetros recebem um objeto com campos nomeados;</w:t>
       </w:r>
     </w:p>
@@ -5877,7 +5952,7 @@
       <w:pPr>
         <w:pStyle w:val="Ttulo3"/>
       </w:pPr>
-      <w:bookmarkStart w:id="9" w:name="_Toc243219207"/>
+      <w:bookmarkStart w:id="9" w:name="_Toc243257940"/>
       <w:r>
         <w:t>Tipos, Constantes e Valores Ausentes</w:t>
       </w:r>
@@ -6008,8 +6083,9 @@
       <w:pPr>
         <w:pStyle w:val="Ttulo3"/>
       </w:pPr>
-      <w:bookmarkStart w:id="10" w:name="_Toc243219208"/>
-      <w:r>
+      <w:bookmarkStart w:id="10" w:name="_Toc243257941"/>
+      <w:r>
+        <w:lastRenderedPageBreak/>
         <w:t>Comentários e Formatação</w:t>
       </w:r>
       <w:bookmarkEnd w:id="10"/>
@@ -6075,8 +6151,9 @@
       <w:pPr>
         <w:pStyle w:val="Ttulo1"/>
       </w:pPr>
-      <w:bookmarkStart w:id="11" w:name="_Toc243219209"/>
-      <w:r>
+      <w:bookmarkStart w:id="11" w:name="_Toc243257942"/>
+      <w:r>
+        <w:lastRenderedPageBreak/>
         <w:t>FRONTEND</w:t>
       </w:r>
       <w:bookmarkEnd w:id="11"/>
@@ -6113,7 +6190,7 @@
       <w:pPr>
         <w:pStyle w:val="Ttulo2"/>
       </w:pPr>
-      <w:bookmarkStart w:id="12" w:name="_Toc243219210"/>
+      <w:bookmarkStart w:id="12" w:name="_Toc243257943"/>
       <w:r>
         <w:t>Estrutura</w:t>
       </w:r>
@@ -6456,14 +6533,18 @@
         </w:r>
       </w:hyperlink>
       <w:r>
-        <w:t>); as funções de exibição de valores, telefones, placas, CNPJ e datas; o catálogo de códigos de erro e de mensagens ao usuário; e os tipos das respostas. Assim, cada regra de formato e cada mensagem existe em um só lugar.</w:t>
+        <w:t xml:space="preserve">); as funções de exibição de valores, telefones, placas, CNPJ e datas; o catálogo de </w:t>
+      </w:r>
+      <w:r>
+        <w:lastRenderedPageBreak/>
+        <w:t>códigos de erro e de mensagens ao usuário; e os tipos das respostas. Assim, cada regra de formato e cada mensagem existe em um só lugar.</w:t>
       </w:r>
     </w:p>
     <w:p>
       <w:pPr>
         <w:pStyle w:val="Ttulo2"/>
       </w:pPr>
-      <w:bookmarkStart w:id="13" w:name="_Toc243219211"/>
+      <w:bookmarkStart w:id="13" w:name="_Toc243257944"/>
       <w:r>
         <w:t>Telas e Rotas</w:t>
       </w:r>
@@ -7923,6 +8004,7 @@
         <w:spacing w:before="240"/>
       </w:pPr>
       <w:r>
+        <w:lastRenderedPageBreak/>
         <w:t xml:space="preserve">A página de </w:t>
       </w:r>
       <w:r>
@@ -8434,7 +8516,7 @@
       <w:pPr>
         <w:pStyle w:val="Ttulo2"/>
       </w:pPr>
-      <w:bookmarkStart w:id="14" w:name="_Toc243219212"/>
+      <w:bookmarkStart w:id="14" w:name="_Toc243257945"/>
       <w:r>
         <w:t>Componentes</w:t>
       </w:r>
@@ -8657,6 +8739,7 @@
               <w:pStyle w:val="TextodeTabela"/>
             </w:pPr>
             <w:r>
+              <w:lastRenderedPageBreak/>
               <w:t>Comuns (</w:t>
             </w:r>
             <w:r>
@@ -8866,7 +8949,7 @@
       <w:pPr>
         <w:pStyle w:val="Ttulo2"/>
       </w:pPr>
-      <w:bookmarkStart w:id="15" w:name="_Toc243219213"/>
+      <w:bookmarkStart w:id="15" w:name="_Toc243257946"/>
       <w:r>
         <w:t>Comunicação com a API</w:t>
       </w:r>
@@ -9045,6 +9128,7 @@
         </w:numPr>
       </w:pPr>
       <w:r>
+        <w:lastRenderedPageBreak/>
         <w:t>durante a chamada, o componente exibe o estado de carregamento e mantém o botão de envio desativado, o que evita uma gravação em dobro por clique repetido, e, ao final, exibe um aviso de sucesso ou de falha; o cliente HTTP nunca repete automaticamente uma requisição de gravação.</w:t>
       </w:r>
     </w:p>
@@ -9093,7 +9177,7 @@
       <w:pPr>
         <w:pStyle w:val="Ttulo2"/>
       </w:pPr>
-      <w:bookmarkStart w:id="16" w:name="_Toc243219214"/>
+      <w:bookmarkStart w:id="16" w:name="_Toc243257947"/>
       <w:r>
         <w:t>Renderização, Estado e Desempenho</w:t>
       </w:r>
@@ -9103,7 +9187,7 @@
       <w:pPr>
         <w:pStyle w:val="Ttulo3"/>
       </w:pPr>
-      <w:bookmarkStart w:id="17" w:name="_Toc243219215"/>
+      <w:bookmarkStart w:id="17" w:name="_Toc243257948"/>
       <w:r>
         <w:t>Renderização</w:t>
       </w:r>
@@ -9141,7 +9225,7 @@
       <w:pPr>
         <w:pStyle w:val="Ttulo3"/>
       </w:pPr>
-      <w:bookmarkStart w:id="18" w:name="_Toc243219216"/>
+      <w:bookmarkStart w:id="18" w:name="_Toc243257949"/>
       <w:r>
         <w:t>Estado e Formulários</w:t>
       </w:r>
@@ -9256,6 +9340,7 @@
         </w:numPr>
       </w:pPr>
       <w:r>
+        <w:lastRenderedPageBreak/>
         <w:t xml:space="preserve">a lógica reutilizada por vários componentes, como a listagem paginada com busca e filtros e a chamada à API com o estado de carregamento, fica em hooks próprios, em </w:t>
       </w:r>
       <w:r>
@@ -9274,7 +9359,7 @@
       <w:pPr>
         <w:pStyle w:val="Ttulo3"/>
       </w:pPr>
-      <w:bookmarkStart w:id="19" w:name="_Toc243219217"/>
+      <w:bookmarkStart w:id="19" w:name="_Toc243257950"/>
       <w:r>
         <w:t>Desempenho</w:t>
       </w:r>
@@ -9383,7 +9468,7 @@
       <w:pPr>
         <w:pStyle w:val="Ttulo3"/>
       </w:pPr>
-      <w:bookmarkStart w:id="20" w:name="_Toc243219218"/>
+      <w:bookmarkStart w:id="20" w:name="_Toc243257951"/>
       <w:r>
         <w:t>Acessibilidade e Identidade Visual</w:t>
       </w:r>
@@ -9498,6 +9583,7 @@
         </w:numPr>
       </w:pPr>
       <w:r>
+        <w:lastRenderedPageBreak/>
         <w:t>as cores garantem contraste mínimo de 4,5:1 para o texto, e nenhuma informação depende só da cor, como o status do agendamento, que também é escrito;</w:t>
       </w:r>
     </w:p>
@@ -9528,8 +9614,9 @@
       <w:pPr>
         <w:pStyle w:val="Ttulo1"/>
       </w:pPr>
-      <w:bookmarkStart w:id="21" w:name="_Toc243219219"/>
-      <w:r>
+      <w:bookmarkStart w:id="21" w:name="_Toc243257952"/>
+      <w:r>
+        <w:lastRenderedPageBreak/>
         <w:t>BACKEND</w:t>
       </w:r>
       <w:bookmarkEnd w:id="21"/>
@@ -9556,7 +9643,7 @@
       <w:pPr>
         <w:pStyle w:val="Ttulo2"/>
       </w:pPr>
-      <w:bookmarkStart w:id="22" w:name="_Toc243219220"/>
+      <w:bookmarkStart w:id="22" w:name="_Toc243257953"/>
       <w:r>
         <w:t>Camadas</w:t>
       </w:r>
@@ -10092,6 +10179,7 @@
         </w:numPr>
       </w:pPr>
       <w:r>
+        <w:lastRenderedPageBreak/>
         <w:t>a rota chama o serviço, informando os dados validados e o usuário autenticado;</w:t>
       </w:r>
     </w:p>
@@ -10135,7 +10223,7 @@
       <w:pPr>
         <w:pStyle w:val="Ttulo2"/>
       </w:pPr>
-      <w:bookmarkStart w:id="23" w:name="_Toc243219221"/>
+      <w:bookmarkStart w:id="23" w:name="_Toc243257954"/>
       <w:r>
         <w:t>Módulos</w:t>
       </w:r>
@@ -11014,6 +11102,7 @@
         <w:spacing w:before="240"/>
       </w:pPr>
       <w:r>
+        <w:lastRenderedPageBreak/>
         <w:t xml:space="preserve">Quatro conjuntos de regras do módulo </w:t>
       </w:r>
       <w:r>
@@ -11330,8 +11419,9 @@
       <w:pPr>
         <w:pStyle w:val="Ttulo2"/>
       </w:pPr>
-      <w:bookmarkStart w:id="24" w:name="_Toc243219222"/>
-      <w:r>
+      <w:bookmarkStart w:id="24" w:name="_Toc243257955"/>
+      <w:r>
+        <w:lastRenderedPageBreak/>
         <w:t>Autenticação e Autorização</w:t>
       </w:r>
       <w:bookmarkEnd w:id="24"/>
@@ -11340,7 +11430,7 @@
       <w:pPr>
         <w:pStyle w:val="Ttulo3"/>
       </w:pPr>
-      <w:bookmarkStart w:id="25" w:name="_Toc243219223"/>
+      <w:bookmarkStart w:id="25" w:name="_Toc243257956"/>
       <w:r>
         <w:t>Autenticação</w:t>
       </w:r>
@@ -11588,7 +11678,7 @@
       <w:pPr>
         <w:pStyle w:val="Ttulo3"/>
       </w:pPr>
-      <w:bookmarkStart w:id="26" w:name="_Toc243219224"/>
+      <w:bookmarkStart w:id="26" w:name="_Toc243257957"/>
       <w:r>
         <w:t>Perfis e Contas</w:t>
       </w:r>
@@ -11643,7 +11733,27 @@
         </w:r>
       </w:hyperlink>
       <w:r>
-        <w:t>). O Quadro 9 relaciona os perfis aos atores definidos na análise.</w:t>
+        <w:t xml:space="preserve">). </w:t>
+      </w:r>
+      <w:r>
+        <w:t>Toda conta é criada pelo servidor com a chave de serviço, pela API administrativa do Supabase Auth (</w:t>
+      </w:r>
+      <w:r>
+        <w:rPr>
+          <w:rFonts w:ascii="Courier New" w:hAnsi="Courier New" w:cs="Courier New"/>
+          <w:sz w:val="22"/>
+        </w:rPr>
+        <w:t>auth.admin.createUser</w:t>
+      </w:r>
+      <w:r>
+        <w:t xml:space="preserve">), já com o e-mail confirmado: a aplicação </w:t>
+      </w:r>
+      <w:r>
+        <w:lastRenderedPageBreak/>
+        <w:t xml:space="preserve">não usa o cadastro público do Supabase Auth, nenhum e-mail é enviado e não há confirmação de e-mail. </w:t>
+      </w:r>
+      <w:r>
+        <w:t>O Quadro 9 relaciona os perfis aos atores definidos na análise.</w:t>
       </w:r>
     </w:p>
     <w:p>
@@ -12202,7 +12312,7 @@
       <w:pPr>
         <w:pStyle w:val="Ttulo3"/>
       </w:pPr>
-      <w:bookmarkStart w:id="27" w:name="_Toc243219225"/>
+      <w:bookmarkStart w:id="27" w:name="_Toc243257958"/>
       <w:r>
         <w:t>Autorização</w:t>
       </w:r>
@@ -12309,7 +12419,11 @@
         <w:t>src/shared</w:t>
       </w:r>
       <w:r>
-        <w:t xml:space="preserve">. O Quadro 10 relaciona as permissões às páginas e aos grupos de rotas. A barra de navegação do painel é montada com a lista de permissões devolvida por </w:t>
+        <w:t xml:space="preserve">. O Quadro 10 relaciona as permissões às páginas e aos grupos de rotas. </w:t>
+      </w:r>
+      <w:r>
+        <w:lastRenderedPageBreak/>
+        <w:t xml:space="preserve">A barra de navegação do painel é montada com a lista de permissões devolvida por </w:t>
       </w:r>
       <w:r>
         <w:rPr>
@@ -12847,8 +12961,9 @@
       <w:pPr>
         <w:pStyle w:val="Ttulo1"/>
       </w:pPr>
-      <w:bookmarkStart w:id="28" w:name="_Toc243219226"/>
-      <w:r>
+      <w:bookmarkStart w:id="28" w:name="_Toc243257959"/>
+      <w:r>
+        <w:lastRenderedPageBreak/>
         <w:t>BANCO DE DADOS</w:t>
       </w:r>
       <w:bookmarkEnd w:id="28"/>
@@ -12858,39 +12973,61 @@
         <w:pStyle w:val="Texto"/>
       </w:pPr>
       <w:r>
-        <w:t xml:space="preserve">O banco de dados é um PostgreSQL gerenciado pelo Supabase. Toda a estrutura é criada por um único arquivo de </w:t>
+        <w:t xml:space="preserve">O banco de dados é um PostgreSQL gerenciado pelo Supabase. </w:t>
+      </w:r>
+      <w:r>
+        <w:t xml:space="preserve">A estrutura é criada por </w:t>
       </w:r>
       <w:r>
         <w:rPr>
           <w:i/>
-          <w:iCs/>
         </w:rPr>
-        <w:t>migration</w:t>
-      </w:r>
-      <w:r>
-        <w:t xml:space="preserve">, versionado no repositório em </w:t>
+        <w:t>migrations</w:t>
+      </w:r>
+      <w:r>
+        <w:t xml:space="preserve"> versionadas no repositório em </w:t>
       </w:r>
       <w:r>
         <w:rPr>
           <w:rFonts w:ascii="Courier New" w:hAnsi="Courier New" w:cs="Courier New"/>
           <w:sz w:val="22"/>
-          <w:szCs w:val="22"/>
         </w:rPr>
         <w:t>supabase/migrations/</w:t>
       </w:r>
       <w:r>
-        <w:t xml:space="preserve">, e os dados iniciais ficam em </w:t>
+        <w:t xml:space="preserve">: a inicial cria os tipos, as tabelas, as restrições, os gatilhos, os índices, a segurança em nível de linha e o repositório de arquivos </w:t>
       </w:r>
       <w:r>
         <w:rPr>
           <w:rFonts w:ascii="Courier New" w:hAnsi="Courier New" w:cs="Courier New"/>
           <w:sz w:val="22"/>
-          <w:szCs w:val="22"/>
+        </w:rPr>
+        <w:t>service-images</w:t>
+      </w:r>
+      <w:r>
+        <w:t xml:space="preserve">, e cada função de gravação em várias tabelas entra depois, em </w:t>
+      </w:r>
+      <w:r>
+        <w:rPr>
+          <w:i/>
+        </w:rPr>
+        <w:t>migration</w:t>
+      </w:r>
+      <w:r>
+        <w:t xml:space="preserve"> própria, com a funcionalidade que a chama. Os dados iniciais ficam em </w:t>
+      </w:r>
+      <w:r>
+        <w:rPr>
+          <w:rFonts w:ascii="Courier New" w:hAnsi="Courier New" w:cs="Courier New"/>
+          <w:sz w:val="22"/>
         </w:rPr>
         <w:t>supabase/seed.sql</w:t>
       </w:r>
       <w:r>
-        <w:t xml:space="preserve">. As tabelas e as colunas são nomeadas em inglês, no padrão </w:t>
+        <w:t>.</w:t>
+      </w:r>
+      <w:r>
+        <w:t xml:space="preserve"> As tabelas e as colunas são nomeadas em inglês, no padrão </w:t>
       </w:r>
       <w:r>
         <w:rPr>
@@ -12921,6 +13058,29 @@
       <w:r>
         <w:t>, que usa a chave de serviço guardada no servidor, lê e grava os dados.</w:t>
       </w:r>
+      <w:r>
+        <w:t xml:space="preserve"> Além disso, os papéis </w:t>
+      </w:r>
+      <w:r>
+        <w:rPr>
+          <w:rFonts w:ascii="Courier New" w:hAnsi="Courier New" w:cs="Courier New"/>
+          <w:sz w:val="22"/>
+        </w:rPr>
+        <w:t>anon</w:t>
+      </w:r>
+      <w:r>
+        <w:t xml:space="preserve"> e </w:t>
+      </w:r>
+      <w:r>
+        <w:rPr>
+          <w:rFonts w:ascii="Courier New" w:hAnsi="Courier New" w:cs="Courier New"/>
+          <w:sz w:val="22"/>
+        </w:rPr>
+        <w:t>authenticated</w:t>
+      </w:r>
+      <w:r>
+        <w:t xml:space="preserve"> do Supabase, usados pelas chaves públicas, não têm nenhum privilégio nas tabelas e funções; só o papel de serviço tem, e toda função nova revoga a execução desses papéis.</w:t>
+      </w:r>
     </w:p>
     <w:p>
       <w:pPr>
@@ -12955,7 +13115,7 @@
       <w:pPr>
         <w:pStyle w:val="Ttulo2"/>
       </w:pPr>
-      <w:bookmarkStart w:id="29" w:name="_Toc243219227"/>
+      <w:bookmarkStart w:id="29" w:name="_Toc243257960"/>
       <w:r>
         <w:t>Modelo Entidade-Relacionamento</w:t>
       </w:r>
@@ -13207,6 +13367,7 @@
         <w:pStyle w:val="Texto"/>
       </w:pPr>
       <w:r>
+        <w:lastRenderedPageBreak/>
         <w:t>O modelo é normalizado até a terceira forma normal: cada informação é gravada em um único lugar. Os dados copiados no agendamento não contrariam essa regra, pois registram uma informação diferente da do cadastro: o nome, o valor, a duração e os dados do veículo vigentes no momento da ordem de serviço, que podem mudar depois no cadastro sem alterar o que foi contratado (</w:t>
       </w:r>
       <w:hyperlink r:id="rId120" w:anchor="RN037" w:history="1">
@@ -13226,6 +13387,7 @@
         <w:pStyle w:val="Legenda"/>
       </w:pPr>
       <w:r>
+        <w:lastRenderedPageBreak/>
         <w:t xml:space="preserve">Figura </w:t>
       </w:r>
       <w:fldSimple w:instr=" SEQ Figura \* ARABIC ">
@@ -13290,8 +13452,9 @@
       <w:pPr>
         <w:pStyle w:val="Ttulo2"/>
       </w:pPr>
-      <w:bookmarkStart w:id="30" w:name="_Toc243219228"/>
-      <w:r>
+      <w:bookmarkStart w:id="30" w:name="_Toc243257961"/>
+      <w:r>
+        <w:lastRenderedPageBreak/>
         <w:t>Tabelas</w:t>
       </w:r>
       <w:bookmarkEnd w:id="30"/>
@@ -14601,7 +14764,11 @@
         <w:t>created_at</w:t>
       </w:r>
       <w:r>
-        <w:t xml:space="preserve">, preenchida automaticamente. Valores monetários usam </w:t>
+        <w:t xml:space="preserve">, preenchida automaticamente. </w:t>
+      </w:r>
+      <w:r>
+        <w:lastRenderedPageBreak/>
+        <w:t xml:space="preserve">Valores monetários usam </w:t>
       </w:r>
       <w:r>
         <w:rPr>
@@ -15104,6 +15271,9 @@
             <w:r>
               <w:t>Único entre clientes não excluídos</w:t>
             </w:r>
+            <w:r>
+              <w:t>; em minúsculas</w:t>
+            </w:r>
           </w:p>
         </w:tc>
         <w:tc>
@@ -15783,6 +15953,7 @@
                 <w:sz w:val="18"/>
                 <w:szCs w:val="18"/>
               </w:rPr>
+              <w:lastRenderedPageBreak/>
               <w:t>email</w:t>
             </w:r>
           </w:p>
@@ -15815,6 +15986,9 @@
             </w:pPr>
             <w:r>
               <w:t>Único</w:t>
+            </w:r>
+            <w:r>
+              <w:t>; em minúsculas</w:t>
             </w:r>
           </w:p>
         </w:tc>
@@ -16049,6 +16223,9 @@
             </w:pPr>
             <w:r>
               <w:t>Padrão: falso</w:t>
+            </w:r>
+            <w:r>
+              <w:t>; no máximo uma conta</w:t>
             </w:r>
           </w:p>
         </w:tc>
@@ -16562,6 +16739,9 @@
             <w:r>
               <w:t>Único</w:t>
             </w:r>
+            <w:r>
+              <w:t>, sem diferenciar maiúsculas</w:t>
+            </w:r>
           </w:p>
         </w:tc>
         <w:tc>
@@ -17082,6 +17262,7 @@
         <w:pStyle w:val="Legenda"/>
       </w:pPr>
       <w:r>
+        <w:lastRenderedPageBreak/>
         <w:t xml:space="preserve">Quadro </w:t>
       </w:r>
       <w:fldSimple w:instr=" SEQ Quadro \* ARABIC ">
@@ -17491,6 +17672,9 @@
             <w:r>
               <w:t>Única</w:t>
             </w:r>
+            <w:r>
+              <w:t>; em maiúsculas, sem hífen, no padrão Mercosul ou no antigo</w:t>
+            </w:r>
           </w:p>
         </w:tc>
         <w:tc>
@@ -18414,6 +18598,9 @@
             <w:r>
               <w:t>Único</w:t>
             </w:r>
+            <w:r>
+              <w:t>, sem diferenciar maiúsculas</w:t>
+            </w:r>
           </w:p>
         </w:tc>
         <w:tc>
@@ -18590,6 +18777,7 @@
                 <w:sz w:val="18"/>
                 <w:szCs w:val="18"/>
               </w:rPr>
+              <w:lastRenderedPageBreak/>
               <w:t>updated_at</w:t>
             </w:r>
           </w:p>
@@ -19057,6 +19245,9 @@
             <w:r>
               <w:t>Único entre serviços não excluídos</w:t>
             </w:r>
+            <w:r>
+              <w:t>, sem diferenciar maiúsculas</w:t>
+            </w:r>
           </w:p>
         </w:tc>
         <w:tc>
@@ -19946,6 +20137,7 @@
                 <w:sz w:val="18"/>
                 <w:szCs w:val="18"/>
               </w:rPr>
+              <w:lastRenderedPageBreak/>
               <w:t>price</w:t>
             </w:r>
           </w:p>
@@ -21166,6 +21358,7 @@
                 <w:sz w:val="18"/>
                 <w:szCs w:val="18"/>
               </w:rPr>
+              <w:lastRenderedPageBreak/>
               <w:t>fee_percent</w:t>
             </w:r>
           </w:p>
@@ -22493,6 +22686,7 @@
                 <w:sz w:val="18"/>
                 <w:szCs w:val="18"/>
               </w:rPr>
+              <w:lastRenderedPageBreak/>
               <w:t>service_name</w:t>
             </w:r>
           </w:p>
@@ -23989,6 +24183,7 @@
                 <w:sz w:val="18"/>
                 <w:szCs w:val="18"/>
               </w:rPr>
+              <w:lastRenderedPageBreak/>
               <w:t>break_starts_at</w:t>
             </w:r>
           </w:p>
@@ -24741,6 +24936,9 @@
             <w:r>
               <w:t>PK</w:t>
             </w:r>
+            <w:r>
+              <w:t>; em minúsculas</w:t>
+            </w:r>
           </w:p>
         </w:tc>
         <w:tc>
@@ -25025,6 +25223,28 @@
         <w:rPr>
           <w:rFonts w:ascii="Courier New" w:hAnsi="Courier New" w:cs="Courier New"/>
           <w:sz w:val="22"/>
+        </w:rPr>
+        <w:t>staff</w:t>
+      </w:r>
+      <w:r>
+        <w:t>, há no máximo uma conta de administrador;</w:t>
+      </w:r>
+    </w:p>
+    <w:p>
+      <w:pPr>
+        <w:pStyle w:val="Texto"/>
+        <w:numPr>
+          <w:ilvl w:val="0"/>
+          <w:numId w:val="14"/>
+        </w:numPr>
+      </w:pPr>
+      <w:r>
+        <w:t xml:space="preserve">em </w:t>
+      </w:r>
+      <w:r>
+        <w:rPr>
+          <w:rFonts w:ascii="Courier New" w:hAnsi="Courier New" w:cs="Courier New"/>
+          <w:sz w:val="22"/>
           <w:szCs w:val="22"/>
         </w:rPr>
         <w:t>services</w:t>
@@ -25053,6 +25273,7 @@
         </w:numPr>
       </w:pPr>
       <w:r>
+        <w:lastRenderedPageBreak/>
         <w:t xml:space="preserve">em </w:t>
       </w:r>
       <w:r>
@@ -25082,6 +25303,38 @@
         <w:rPr>
           <w:rFonts w:ascii="Courier New" w:hAnsi="Courier New" w:cs="Courier New"/>
           <w:sz w:val="22"/>
+        </w:rPr>
+        <w:t>service_prices</w:t>
+      </w:r>
+      <w:r>
+        <w:t xml:space="preserve">, um serviço com valor por porte tem exatamente os quatro valores, e um serviço de valor fixo não tem nenhum; a conferência é feita no fim da transação, por isso o serviço e os seus valores são gravados juntos, pela função </w:t>
+      </w:r>
+      <w:r>
+        <w:rPr>
+          <w:rFonts w:ascii="Courier New" w:hAnsi="Courier New" w:cs="Courier New"/>
+          <w:sz w:val="22"/>
+        </w:rPr>
+        <w:t>save_service</w:t>
+      </w:r>
+      <w:r>
+        <w:t>;</w:t>
+      </w:r>
+    </w:p>
+    <w:p>
+      <w:pPr>
+        <w:pStyle w:val="Texto"/>
+        <w:numPr>
+          <w:ilvl w:val="0"/>
+          <w:numId w:val="14"/>
+        </w:numPr>
+      </w:pPr>
+      <w:r>
+        <w:t xml:space="preserve">em </w:t>
+      </w:r>
+      <w:r>
+        <w:rPr>
+          <w:rFonts w:ascii="Courier New" w:hAnsi="Courier New" w:cs="Courier New"/>
+          <w:sz w:val="22"/>
           <w:szCs w:val="22"/>
         </w:rPr>
         <w:t>appointments</w:t>
@@ -25177,15 +25430,75 @@
         </w:numPr>
       </w:pPr>
       <w:r>
-        <w:t>os valores de serviço e de agendamento são maiores que zero, exceto o total, que pode ser zero quando houver desconto de 100%.</w:t>
+        <w:t xml:space="preserve">a placa é gravada em maiúsculas e sem hífen, no padrão Mercosul ou no antigo, e o e-mail de </w:t>
+      </w:r>
+      <w:r>
+        <w:rPr>
+          <w:rFonts w:ascii="Courier New" w:hAnsi="Courier New" w:cs="Courier New"/>
+          <w:sz w:val="22"/>
+        </w:rPr>
+        <w:t>clients</w:t>
+      </w:r>
+      <w:r>
+        <w:t xml:space="preserve">, </w:t>
+      </w:r>
+      <w:r>
+        <w:rPr>
+          <w:rFonts w:ascii="Courier New" w:hAnsi="Courier New" w:cs="Courier New"/>
+          <w:sz w:val="22"/>
+        </w:rPr>
+        <w:t>staff</w:t>
+      </w:r>
+      <w:r>
+        <w:t xml:space="preserve"> e </w:t>
+      </w:r>
+      <w:r>
+        <w:rPr>
+          <w:rFonts w:ascii="Courier New" w:hAnsi="Courier New" w:cs="Courier New"/>
+          <w:sz w:val="22"/>
+        </w:rPr>
+        <w:t>login_attempts</w:t>
+      </w:r>
+      <w:r>
+        <w:t>, em minúsculas e sem espaços;</w:t>
       </w:r>
     </w:p>
     <w:p>
       <w:pPr>
         <w:pStyle w:val="Texto"/>
-      </w:pPr>
-      <w:r>
-        <w:t xml:space="preserve">As regras que envolvem mais de uma linha, como a dos tipos no vínculo entre serviço principal e adicional e a que impede a alteração do tipo do serviço, são garantidas por gatilhos; as demais, por restrições </w:t>
+        <w:numPr>
+          <w:ilvl w:val="0"/>
+          <w:numId w:val="14"/>
+        </w:numPr>
+      </w:pPr>
+      <w:r>
+        <w:t>os nomes de cargo, de categoria e de serviço não excluído não se repetem, sem diferenciar maiúsculas e minúsculas;</w:t>
+      </w:r>
+    </w:p>
+    <w:p>
+      <w:pPr>
+        <w:pStyle w:val="Texto"/>
+        <w:numPr>
+          <w:ilvl w:val="0"/>
+          <w:numId w:val="14"/>
+        </w:numPr>
+      </w:pPr>
+      <w:r>
+        <w:t>os valores de serviço e de agendamento são maiores que zero, exceto o total, que pode ser zero quando houver desconto de 100%.</w:t>
+      </w:r>
+    </w:p>
+    <w:p>
+      <w:pPr>
+        <w:pStyle w:val="Texto"/>
+      </w:pPr>
+      <w:r>
+        <w:t>As regras que envolvem mais de uma linha, como a dos tipos no vínculo entre serviço principal e adicional</w:t>
+      </w:r>
+      <w:r>
+        <w:t>, a dos quatro valores do serviço por porte</w:t>
+      </w:r>
+      <w:r>
+        <w:t xml:space="preserve"> e a que impede a alteração do tipo do serviço, são garantidas por gatilhos; as demais, por restrições </w:t>
       </w:r>
       <w:r>
         <w:rPr>
@@ -25196,7 +25509,33 @@
         <w:t>CHECK</w:t>
       </w:r>
       <w:r>
-        <w:t xml:space="preserve">. A </w:t>
+        <w:t>.</w:t>
+      </w:r>
+      <w:r>
+        <w:t xml:space="preserve"> Os gatilhos são nomeados com </w:t>
+      </w:r>
+      <w:r>
+        <w:rPr>
+          <w:rFonts w:ascii="Courier New" w:hAnsi="Courier New" w:cs="Courier New"/>
+          <w:sz w:val="22"/>
+        </w:rPr>
+        <w:t>trg_</w:t>
+      </w:r>
+      <w:r>
+        <w:t xml:space="preserve"> seguido da tabela e da regra, e o que recusa uma gravação levanta a violação com o nome </w:t>
+      </w:r>
+      <w:r>
+        <w:rPr>
+          <w:rFonts w:ascii="Courier New" w:hAnsi="Courier New" w:cs="Courier New"/>
+          <w:sz w:val="22"/>
+        </w:rPr>
+        <w:t>ck_</w:t>
+      </w:r>
+      <w:r>
+        <w:t xml:space="preserve"> da regra, que o repositório converte como as demais restrições.</w:t>
+      </w:r>
+      <w:r>
+        <w:t xml:space="preserve"> A </w:t>
       </w:r>
       <w:r>
         <w:rPr>
@@ -25336,6 +25675,7 @@
           <w:sz w:val="22"/>
           <w:szCs w:val="22"/>
         </w:rPr>
+        <w:lastRenderedPageBreak/>
         <w:t>link_vehicle</w:t>
       </w:r>
       <w:r>
@@ -25346,6 +25686,18 @@
       <w:pPr>
         <w:pStyle w:val="Texto"/>
       </w:pPr>
+      <w:r>
+        <w:t xml:space="preserve">Cada função entra em </w:t>
+      </w:r>
+      <w:r>
+        <w:rPr>
+          <w:i/>
+        </w:rPr>
+        <w:t>migration</w:t>
+      </w:r>
+      <w:r>
+        <w:t xml:space="preserve"> própria, na tarefa da funcionalidade que a chama, com os parâmetros definidos pelo serviço dessa tarefa. </w:t>
+      </w:r>
       <w:r>
         <w:t xml:space="preserve">As funções são curtas e não fazem chamadas externas: o envio de imagens ao Storage e a criação de contas no Supabase Auth ficam fora delas. Adota-se o nível de isolamento padrão do PostgreSQL, </w:t>
       </w:r>
@@ -25875,8 +26227,9 @@
       <w:pPr>
         <w:pStyle w:val="Ttulo2"/>
       </w:pPr>
-      <w:bookmarkStart w:id="31" w:name="_Toc243219229"/>
-      <w:r>
+      <w:bookmarkStart w:id="31" w:name="_Toc243257962"/>
+      <w:r>
+        <w:lastRenderedPageBreak/>
         <w:t>Relacionamentos</w:t>
       </w:r>
       <w:bookmarkEnd w:id="31"/>
@@ -26852,7 +27205,11 @@
         <w:t>deleted_at</w:t>
       </w:r>
       <w:r>
-        <w:t xml:space="preserve">, deixa de aparecer nas listagens e de poder ser usado em novos agendamentos, mas permanece no banco, e os agendamentos anteriores e os indicadores do </w:t>
+        <w:t xml:space="preserve">, deixa de aparecer nas listagens e de poder ser usado em novos agendamentos, mas permanece no banco, e os agendamentos anteriores e os </w:t>
+      </w:r>
+      <w:r>
+        <w:lastRenderedPageBreak/>
+        <w:t xml:space="preserve">indicadores do </w:t>
       </w:r>
       <w:r>
         <w:rPr>
@@ -26962,8 +27319,9 @@
       <w:pPr>
         <w:pStyle w:val="Ttulo1"/>
       </w:pPr>
-      <w:bookmarkStart w:id="32" w:name="_Toc243219230"/>
-      <w:r>
+      <w:bookmarkStart w:id="32" w:name="_Toc243257963"/>
+      <w:r>
+        <w:lastRenderedPageBreak/>
         <w:t>API</w:t>
       </w:r>
       <w:bookmarkEnd w:id="32"/>
@@ -27000,7 +27358,7 @@
       <w:pPr>
         <w:pStyle w:val="Ttulo2"/>
       </w:pPr>
-      <w:bookmarkStart w:id="33" w:name="_Toc243219231"/>
+      <w:bookmarkStart w:id="33" w:name="_Toc243257964"/>
       <w:r>
         <w:t>Desenho Geral</w:t>
       </w:r>
@@ -27312,6 +27670,7 @@
         <w:keepNext/>
       </w:pPr>
       <w:r>
+        <w:lastRenderedPageBreak/>
         <w:t>As rotas são agrupadas pelo tipo de acesso, conforme o Quadro 31.</w:t>
       </w:r>
     </w:p>
@@ -27787,7 +28146,7 @@
       <w:pPr>
         <w:pStyle w:val="Ttulo2"/>
       </w:pPr>
-      <w:bookmarkStart w:id="34" w:name="_Toc243219232"/>
+      <w:bookmarkStart w:id="34" w:name="_Toc243257965"/>
       <w:r>
         <w:t>Validação dos Dados</w:t>
       </w:r>
@@ -27855,6 +28214,7 @@
         </w:numPr>
       </w:pPr>
       <w:r>
+        <w:lastRenderedPageBreak/>
         <w:t>os identificadores nos caminhos devem ser UUIDs válidos; um identificador inválido recebe a mesma resposta 404 de um registro inexistente;</w:t>
       </w:r>
     </w:p>
@@ -27921,7 +28281,7 @@
       <w:pPr>
         <w:pStyle w:val="Ttulo2"/>
       </w:pPr>
-      <w:bookmarkStart w:id="35" w:name="_Toc243219233"/>
+      <w:bookmarkStart w:id="35" w:name="_Toc243257966"/>
       <w:r>
         <w:t>Paginação</w:t>
       </w:r>
@@ -28538,6 +28898,7 @@
         <w:spacing w:before="240"/>
       </w:pPr>
       <w:r>
+        <w:lastRenderedPageBreak/>
         <w:t>Não são paginadas apenas as listas de tamanho fixo: os sete dias da semana, as quatro formas de pagamento e os serviços de um mesmo agendamento. As listagens respondem no formato a seguir.</w:t>
       </w:r>
     </w:p>
@@ -28599,7 +28960,7 @@
       <w:pPr>
         <w:pStyle w:val="Ttulo2"/>
       </w:pPr>
-      <w:bookmarkStart w:id="36" w:name="_Toc243219234"/>
+      <w:bookmarkStart w:id="36" w:name="_Toc243257967"/>
       <w:r>
         <w:t>Respostas e Erros</w:t>
       </w:r>
@@ -28843,7 +29204,11 @@
         <w:t>requestId</w:t>
       </w:r>
       <w:r>
-        <w:t xml:space="preserve"> trazem as mensagens de cada campo e o identificador do registro. O formato é exemplificado a seguir, e os códigos utilizados estão no Quadro 33.</w:t>
+        <w:t xml:space="preserve"> trazem as mensagens de cada campo e o identificador </w:t>
+      </w:r>
+      <w:r>
+        <w:lastRenderedPageBreak/>
+        <w:t>do registro. O formato é exemplificado a seguir, e os códigos utilizados estão no Quadro 33.</w:t>
       </w:r>
     </w:p>
     <w:p>
@@ -30007,6 +30372,7 @@
         <w:spacing w:before="240"/>
       </w:pPr>
       <w:r>
+        <w:lastRenderedPageBreak/>
         <w:t>No código, os erros seguem três regras:</w:t>
       </w:r>
     </w:p>
@@ -30467,7 +30833,7 @@
       <w:pPr>
         <w:pStyle w:val="Ttulo2"/>
       </w:pPr>
-      <w:bookmarkStart w:id="37" w:name="_Toc243219235"/>
+      <w:bookmarkStart w:id="37" w:name="_Toc243257968"/>
       <w:r>
         <w:t>Controle de Concorrência</w:t>
       </w:r>
@@ -30522,7 +30888,11 @@
         <w:t>updatedAt</w:t>
       </w:r>
       <w:r>
-        <w:t xml:space="preserve">, em uma única instrução no banco. Se outra pessoa tiver alterado o registro nesse intervalo, nada é gravado e a resposta é 409 </w:t>
+        <w:t xml:space="preserve">, em uma única instrução no banco. Se </w:t>
+      </w:r>
+      <w:r>
+        <w:lastRenderedPageBreak/>
+        <w:t xml:space="preserve">outra pessoa tiver alterado o registro nesse intervalo, nada é gravado e a resposta é 409 </w:t>
       </w:r>
       <w:r>
         <w:rPr>
@@ -30580,7 +30950,7 @@
       <w:pPr>
         <w:pStyle w:val="Ttulo2"/>
       </w:pPr>
-      <w:bookmarkStart w:id="38" w:name="_Toc243219236"/>
+      <w:bookmarkStart w:id="38" w:name="_Toc243257969"/>
       <w:r>
         <w:t>Contrato Detalhado (Apêndice A)</w:t>
       </w:r>
@@ -30598,8 +30968,9 @@
       <w:pPr>
         <w:pStyle w:val="Ttulo1"/>
       </w:pPr>
-      <w:bookmarkStart w:id="39" w:name="_Toc243219237"/>
-      <w:r>
+      <w:bookmarkStart w:id="39" w:name="_Toc243257970"/>
+      <w:r>
+        <w:lastRenderedPageBreak/>
         <w:t>SEGURANÇA (IMPLEMENTAÇÃO)</w:t>
       </w:r>
       <w:bookmarkEnd w:id="39"/>
@@ -30939,7 +31310,19 @@
               <w:t>src/shared/validation</w:t>
             </w:r>
             <w:r>
-              <w:t xml:space="preserve"> exige de 8 a 72 caracteres, com letra maiúscula, número e caractere especial, em todos os formulários e rotas; 72 é o tamanho máximo tratado pelo algoritmo bcrypt. O mínimo de 8 também é configurado no Supabase Auth.</w:t>
+              <w:t xml:space="preserve"> exige de 8 a 72 caracteres, com letra maiúscula, número e caractere especial, em todos os formulários e rotas; 72 é o tamanho máximo tratado pelo algoritmo bcrypt. </w:t>
+            </w:r>
+            <w:r>
+              <w:t xml:space="preserve">O Supabase Auth fica com a configuração padrão; o esquema é aplicado no servidor antes de toda chamada que define senha, inclusive no </w:t>
+            </w:r>
+            <w:r>
+              <w:rPr>
+                <w:i/>
+              </w:rPr>
+              <w:t>script</w:t>
+            </w:r>
+            <w:r>
+              <w:t xml:space="preserve"> da conta de administrador.</w:t>
             </w:r>
           </w:p>
         </w:tc>
@@ -32127,7 +32510,11 @@
         <w:t>src/server</w:t>
       </w:r>
       <w:r>
-        <w:t>, o fluxo do GitHub Actions tem somente permissão de leitura do repositório e não recebe nenhuma chave, e cada funcionário acessa apenas as páginas do seu cargo.</w:t>
+        <w:t xml:space="preserve">, o fluxo do GitHub </w:t>
+      </w:r>
+      <w:r>
+        <w:lastRenderedPageBreak/>
+        <w:t>Actions tem somente permissão de leitura do repositório e não recebe nenhuma chave, e cada funcionário acessa apenas as páginas do seu cargo.</w:t>
       </w:r>
     </w:p>
     <w:p>
@@ -32162,8 +32549,9 @@
       <w:pPr>
         <w:pStyle w:val="Ttulo1"/>
       </w:pPr>
-      <w:bookmarkStart w:id="40" w:name="_Toc243219238"/>
-      <w:r>
+      <w:bookmarkStart w:id="40" w:name="_Toc243257971"/>
+      <w:r>
+        <w:lastRenderedPageBreak/>
         <w:t>INFRAESTRUTURA E DEPLOY</w:t>
       </w:r>
       <w:bookmarkEnd w:id="40"/>
@@ -32180,7 +32568,7 @@
       <w:pPr>
         <w:pStyle w:val="Ttulo2"/>
       </w:pPr>
-      <w:bookmarkStart w:id="41" w:name="_Toc243219239"/>
+      <w:bookmarkStart w:id="41" w:name="_Toc243257972"/>
       <w:r>
         <w:t>Ambientes</w:t>
       </w:r>
@@ -32521,7 +32909,7 @@
       <w:pPr>
         <w:pStyle w:val="Ttulo2"/>
       </w:pPr>
-      <w:bookmarkStart w:id="42" w:name="_Toc243219240"/>
+      <w:bookmarkStart w:id="42" w:name="_Toc243257973"/>
       <w:r>
         <w:t>Variáveis de Ambiente</w:t>
       </w:r>
@@ -32577,7 +32965,11 @@
         </w:r>
       </w:hyperlink>
       <w:r>
-        <w:t>). O código lê as variáveis durante a execução, a cada requisição, e nunca durante a construção: a Vercel as fornece também na compilação, mas a imagem do contêiner é construída sem elas (seção 8.6).</w:t>
+        <w:t xml:space="preserve">). O código lê as variáveis durante a execução, a cada requisição, e nunca durante a construção: a </w:t>
+      </w:r>
+      <w:r>
+        <w:lastRenderedPageBreak/>
+        <w:t>Vercel as fornece também na compilação, mas a imagem do contêiner é construída sem elas (seção 8.6).</w:t>
       </w:r>
     </w:p>
     <w:p>
@@ -33061,7 +33453,7 @@
       <w:pPr>
         <w:pStyle w:val="Ttulo2"/>
       </w:pPr>
-      <w:bookmarkStart w:id="43" w:name="_Toc243219241"/>
+      <w:bookmarkStart w:id="43" w:name="_Toc243257974"/>
       <w:r>
         <w:t>Banco de Dados e Dados Iniciais</w:t>
       </w:r>
@@ -33085,17 +33477,35 @@
         </w:numPr>
       </w:pPr>
       <w:r>
-        <w:t xml:space="preserve">aplicação da </w:t>
+        <w:t xml:space="preserve">aplicação das </w:t>
       </w:r>
       <w:r>
         <w:rPr>
           <w:i/>
-          <w:iCs/>
         </w:rPr>
-        <w:t>migration</w:t>
-      </w:r>
-      <w:r>
-        <w:t>, que cria os tipos, as tabelas, as funções e ativa a segurança em nível de linha;</w:t>
+        <w:t>migrations</w:t>
+      </w:r>
+      <w:r>
+        <w:t xml:space="preserve">: a inicial cria os tipos, as tabelas, as restrições, os gatilhos e os índices, ativa a segurança em nível de linha, retira os privilégios das chaves públicas e cria o repositório de arquivos </w:t>
+      </w:r>
+      <w:r>
+        <w:rPr>
+          <w:rFonts w:ascii="Courier New" w:hAnsi="Courier New" w:cs="Courier New"/>
+          <w:sz w:val="22"/>
+        </w:rPr>
+        <w:t>service-images</w:t>
+      </w:r>
+      <w:r>
+        <w:t xml:space="preserve">, com leitura pública, gravação restrita ao </w:t>
+      </w:r>
+      <w:r>
+        <w:rPr>
+          <w:i/>
+        </w:rPr>
+        <w:t>backend</w:t>
+      </w:r>
+      <w:r>
+        <w:t>, limite de 2 MB e os formatos JPEG, PNG e WebP;</w:t>
       </w:r>
     </w:p>
     <w:p>
@@ -33113,12 +33523,30 @@
         <w:rPr>
           <w:rFonts w:ascii="Courier New" w:hAnsi="Courier New" w:cs="Courier New"/>
           <w:sz w:val="22"/>
-          <w:szCs w:val="22"/>
         </w:rPr>
         <w:t>supabase/seed.sql</w:t>
       </w:r>
       <w:r>
-        <w:t>: as quatro formas de pagamento sem ajuste, os sete dias da semana e a linha de dados da empresa;</w:t>
+        <w:t xml:space="preserve">, junto com a </w:t>
+      </w:r>
+      <w:r>
+        <w:rPr>
+          <w:i/>
+        </w:rPr>
+        <w:t>migration</w:t>
+      </w:r>
+      <w:r>
+        <w:t xml:space="preserve">, pelo comando </w:t>
+      </w:r>
+      <w:r>
+        <w:rPr>
+          <w:rFonts w:ascii="Courier New" w:hAnsi="Courier New" w:cs="Courier New"/>
+          <w:sz w:val="22"/>
+        </w:rPr>
+        <w:t>npx supabase db push --include-seed</w:t>
+      </w:r>
+      <w:r>
+        <w:t>: as quatro formas de pagamento sem ajuste; os sete dias da semana, de segunda a sexta das 08:00 às 18:00 com pausa das 12:00 às 13:00, sábado das 08:00 às 12:00 e domingo fechado; e a linha de dados da empresa, com o nome Glow – Estética Automotiva;</w:t>
       </w:r>
     </w:p>
     <w:p>
@@ -33162,7 +33590,13 @@
         <w:t>is_admin</w:t>
       </w:r>
       <w:r>
-        <w:t xml:space="preserve"> verdadeiro.</w:t>
+        <w:t xml:space="preserve"> verdadeiro</w:t>
+      </w:r>
+      <w:r>
+        <w:t>; a conta nasce com o e-mail confirmado</w:t>
+      </w:r>
+      <w:r>
+        <w:t>.</w:t>
       </w:r>
     </w:p>
     <w:p>
@@ -33170,25 +33604,25 @@
         <w:pStyle w:val="Texto"/>
       </w:pPr>
       <w:r>
-        <w:t xml:space="preserve">No painel do Supabase, a confirmação de e-mail é desativada, pois o MVP não envia e-mails, o tamanho mínimo de senha é definido em 8 caracteres e é criado o repositório de arquivos </w:t>
-      </w:r>
-      <w:r>
-        <w:rPr>
-          <w:rFonts w:ascii="Courier New" w:hAnsi="Courier New" w:cs="Courier New"/>
-          <w:sz w:val="22"/>
-          <w:szCs w:val="22"/>
-        </w:rPr>
-        <w:t>service-images</w:t>
-      </w:r>
-      <w:r>
-        <w:t xml:space="preserve">, com leitura pública e gravação restrita ao </w:t>
+        <w:lastRenderedPageBreak/>
+        <w:t>Nada é configurado à mão no painel do Supabase: como o MVP não envia e-mails, as contas são criadas pelo servidor já com o e-mail confirmado, sem confirmação de e-mail; a política de senha é exigida pelos esquemas de validação no servidor (</w:t>
+      </w:r>
+      <w:hyperlink r:id="rId188" w:anchor="RS003" w:history="1">
+        <w:r>
+          <w:rPr>
+            <w:rStyle w:val="Hyperlink"/>
+          </w:rPr>
+          <w:t>RS003</w:t>
+        </w:r>
+      </w:hyperlink>
+      <w:r>
+        <w:t xml:space="preserve">); e o repositório de arquivos vem da </w:t>
       </w:r>
       <w:r>
         <w:rPr>
           <w:i/>
-          <w:iCs/>
         </w:rPr>
-        <w:t>backend</w:t>
+        <w:t>migration</w:t>
       </w:r>
       <w:r>
         <w:t>.</w:t>
@@ -33211,12 +33645,15 @@
       <w:r>
         <w:t xml:space="preserve"> não sejam apresentados vazios.</w:t>
       </w:r>
+      <w:r>
+        <w:t xml:space="preserve"> Ele é carregado à parte, pelo editor de SQL do painel, e pode ser carregado de novo sem duplicar nada: como as datas são relativas ao dia da carga, uma nova carga só acrescenta os dias ainda sem agendamentos.</w:t>
+      </w:r>
     </w:p>
     <w:p>
       <w:pPr>
         <w:pStyle w:val="Ttulo2"/>
       </w:pPr>
-      <w:bookmarkStart w:id="44" w:name="_Toc243219242"/>
+      <w:bookmarkStart w:id="44" w:name="_Toc243257975"/>
       <w:r>
         <w:t>Publicação</w:t>
       </w:r>
@@ -33417,7 +33854,11 @@
         <w:t>pull request</w:t>
       </w:r>
       <w:r>
-        <w:t xml:space="preserve">, e não pelo GitHub Actions. Como o resultado dessa compilação é uma das condições de incorporação, um erro de compilação impede a alteração de chegar à </w:t>
+        <w:t xml:space="preserve">, e não pelo GitHub Actions. Como o resultado dessa compilação é uma das condições </w:t>
+      </w:r>
+      <w:r>
+        <w:lastRenderedPageBreak/>
+        <w:t xml:space="preserve">de incorporação, um erro de compilação impede a alteração de chegar à </w:t>
       </w:r>
       <w:r>
         <w:rPr>
@@ -33467,7 +33908,42 @@
         <w:t>pull request</w:t>
       </w:r>
       <w:r>
-        <w:t xml:space="preserve"> do código que depende dela. A </w:t>
+        <w:t xml:space="preserve"> do código que depende dela. </w:t>
+      </w:r>
+      <w:r>
+        <w:t>Antes de ser aplicada, ela é conferida num banco local descartável, criado pelo Supabase CLI no Docker (</w:t>
+      </w:r>
+      <w:r>
+        <w:rPr>
+          <w:rFonts w:ascii="Courier New" w:hAnsi="Courier New" w:cs="Courier New"/>
+          <w:sz w:val="22"/>
+        </w:rPr>
+        <w:t>npx supabase start</w:t>
+      </w:r>
+      <w:r>
+        <w:t xml:space="preserve">) e recriado com as </w:t>
+      </w:r>
+      <w:r>
+        <w:rPr>
+          <w:i/>
+        </w:rPr>
+        <w:t>migrations</w:t>
+      </w:r>
+      <w:r>
+        <w:t xml:space="preserve"> e os dados iniciais (</w:t>
+      </w:r>
+      <w:r>
+        <w:rPr>
+          <w:rFonts w:ascii="Courier New" w:hAnsi="Courier New" w:cs="Courier New"/>
+          <w:sz w:val="22"/>
+        </w:rPr>
+        <w:t>npx supabase db reset</w:t>
+      </w:r>
+      <w:r>
+        <w:t xml:space="preserve">), sem acesso ao projeto real. </w:t>
+      </w:r>
+      <w:r>
+        <w:t xml:space="preserve">A </w:t>
       </w:r>
       <w:r>
         <w:rPr>
@@ -33591,7 +34067,7 @@
       <w:pPr>
         <w:pStyle w:val="Ttulo2"/>
       </w:pPr>
-      <w:bookmarkStart w:id="45" w:name="_Toc243219243"/>
+      <w:bookmarkStart w:id="45" w:name="_Toc243257976"/>
       <w:r>
         <w:t>Integração Contínua</w:t>
       </w:r>
@@ -33637,7 +34113,7 @@
       <w:r>
         <w:t xml:space="preserve"> (</w:t>
       </w:r>
-      <w:hyperlink r:id="rId188" w:anchor="RNF014" w:history="1">
+      <w:hyperlink r:id="rId189" w:anchor="RNF014" w:history="1">
         <w:r>
           <w:rPr>
             <w:rStyle w:val="Hyperlink"/>
@@ -33657,7 +34133,11 @@
         <w:t>npm ci</w:t>
       </w:r>
       <w:r>
-        <w:t>, que segue exatamente o arquivo de travamento, e reaproveita o cache do npm entre as execuções. As etapas, executadas em sequência, são:</w:t>
+        <w:t xml:space="preserve">, que segue exatamente o arquivo de travamento, e </w:t>
+      </w:r>
+      <w:r>
+        <w:lastRenderedPageBreak/>
+        <w:t>reaproveita o cache do npm entre as execuções. As etapas, executadas em sequência, são:</w:t>
       </w:r>
     </w:p>
     <w:p>
@@ -33857,7 +34337,7 @@
       <w:pPr>
         <w:pStyle w:val="Ttulo2"/>
       </w:pPr>
-      <w:bookmarkStart w:id="46" w:name="_Toc243219244"/>
+      <w:bookmarkStart w:id="46" w:name="_Toc243257977"/>
       <w:r>
         <w:t>Execução em Contêiner</w:t>
       </w:r>
@@ -33916,6 +34396,7 @@
           <w:sz w:val="22"/>
           <w:szCs w:val="22"/>
         </w:rPr>
+        <w:lastRenderedPageBreak/>
         <w:t>next build</w:t>
       </w:r>
       <w:r>
@@ -34004,7 +34485,10 @@
         <w:t>.claude</w:t>
       </w:r>
       <w:r>
-        <w:t xml:space="preserve">, onde ficam as cópias de trabalho do Claude Code, e da pasta </w:t>
+        <w:t xml:space="preserve">, onde ficam as cópias de trabalho do </w:t>
+      </w:r>
+      <w:r>
+        <w:t xml:space="preserve">Claude Code, e das pastas </w:t>
       </w:r>
       <w:r>
         <w:rPr>
@@ -34015,9 +34499,23 @@
         <w:t>documentos-formais</w:t>
       </w:r>
       <w:r>
+        <w:rPr>
+          <w:szCs w:val="22"/>
+        </w:rPr>
+        <w:t xml:space="preserve"> e </w:t>
+      </w:r>
+      <w:r>
+        <w:rPr>
+          <w:rFonts w:ascii="Courier New" w:hAnsi="Courier New" w:cs="Courier New"/>
+          <w:sz w:val="22"/>
+          <w:szCs w:val="22"/>
+        </w:rPr>
+        <w:t>wireframes</w:t>
+      </w:r>
+      <w:r>
         <w:t>, de modo que nenhuma chave é copiada para ela (</w:t>
       </w:r>
-      <w:hyperlink r:id="rId189" w:anchor="RS016" w:history="1">
+      <w:hyperlink r:id="rId190" w:anchor="RS016" w:history="1">
         <w:r>
           <w:rPr>
             <w:rStyle w:val="Hyperlink"/>
@@ -34261,8 +34759,9 @@
       <w:pPr>
         <w:pStyle w:val="Ttulo1"/>
       </w:pPr>
-      <w:bookmarkStart w:id="47" w:name="_Toc243219245"/>
-      <w:r>
+      <w:bookmarkStart w:id="47" w:name="_Toc243257978"/>
+      <w:r>
+        <w:lastRenderedPageBreak/>
         <w:t>DECISÕES TÉCNICAS E JUSTIFICATIVAS</w:t>
       </w:r>
       <w:bookmarkEnd w:id="47"/>
@@ -34880,7 +35379,7 @@
             <w:r>
               <w:t>Impede que uma edição apague a de outro funcionário sem exigir bloqueios; a verificação é feita pelo banco, na própria gravação (</w:t>
             </w:r>
-            <w:hyperlink r:id="rId190" w:anchor="RNF011" w:history="1">
+            <w:hyperlink r:id="rId191" w:anchor="RNF011" w:history="1">
               <w:r>
                 <w:rPr>
                   <w:rStyle w:val="Hyperlink"/>
@@ -34907,6 +35406,7 @@
               <w:pStyle w:val="TextodeTabela"/>
             </w:pPr>
             <w:r>
+              <w:lastRenderedPageBreak/>
               <w:t>Permissões fixas, uma por página do painel</w:t>
             </w:r>
           </w:p>
@@ -34935,7 +35435,7 @@
             <w:r>
               <w:t>Atende à regra definida na análise (</w:t>
             </w:r>
-            <w:hyperlink r:id="rId191" w:anchor="RN025" w:history="1">
+            <w:hyperlink r:id="rId192" w:anchor="RN025" w:history="1">
               <w:r>
                 <w:rPr>
                   <w:rStyle w:val="Hyperlink"/>
@@ -34990,7 +35490,7 @@
             <w:r>
               <w:t>O agendamento permanece como foi feito, como uma ordem de serviço: mudanças de preço, de nome de serviço ou de dados do veículo e do cliente não alteram o histórico nem a receita apurada (</w:t>
             </w:r>
-            <w:hyperlink r:id="rId192" w:anchor="RN037" w:history="1">
+            <w:hyperlink r:id="rId193" w:anchor="RN037" w:history="1">
               <w:r>
                 <w:rPr>
                   <w:rStyle w:val="Hyperlink"/>
@@ -35100,7 +35600,7 @@
             <w:r>
               <w:t>O porte nunca diverge do tipo, e um novo tipo de veículo exige apenas incluir a sua correspondência (</w:t>
             </w:r>
-            <w:hyperlink r:id="rId193" w:anchor="RN002" w:history="1">
+            <w:hyperlink r:id="rId194" w:anchor="RN002" w:history="1">
               <w:r>
                 <w:rPr>
                   <w:rStyle w:val="Hyperlink"/>
@@ -35155,7 +35655,7 @@
             <w:r>
               <w:t>Decisão de escopo do MVP (</w:t>
             </w:r>
-            <w:hyperlink r:id="rId194" w:anchor="RN016" w:history="1">
+            <w:hyperlink r:id="rId195" w:anchor="RN016" w:history="1">
               <w:r>
                 <w:rPr>
                   <w:rStyle w:val="Hyperlink"/>
@@ -35210,7 +35710,7 @@
             <w:r>
               <w:t>Decisão de escopo do MVP; as contas criadas pelo painel recebem senha inicial com troca obrigatória (</w:t>
             </w:r>
-            <w:hyperlink r:id="rId195" w:anchor="RN023" w:history="1">
+            <w:hyperlink r:id="rId196" w:anchor="RN023" w:history="1">
               <w:r>
                 <w:rPr>
                   <w:rStyle w:val="Hyperlink"/>
@@ -35275,7 +35775,7 @@
             <w:r>
               <w:t xml:space="preserve">Atende ao requisito </w:t>
             </w:r>
-            <w:hyperlink r:id="rId196" w:anchor="RS006" w:history="1">
+            <w:hyperlink r:id="rId197" w:anchor="RS006" w:history="1">
               <w:r>
                 <w:rPr>
                   <w:rStyle w:val="Hyperlink"/>
@@ -35384,7 +35884,7 @@
             <w:r>
               <w:t>Um mesmo carro nunca tem dois cadastros diferentes; o cadastro de uma placa existente apenas cria o vínculo, e o histórico do veículo é preservado na troca de proprietário (</w:t>
             </w:r>
-            <w:hyperlink r:id="rId197" w:anchor="RN036" w:history="1">
+            <w:hyperlink r:id="rId198" w:anchor="RN036" w:history="1">
               <w:r>
                 <w:rPr>
                   <w:rStyle w:val="Hyperlink"/>
@@ -35469,7 +35969,7 @@
             <w:r>
               <w:t xml:space="preserve"> (</w:t>
             </w:r>
-            <w:hyperlink r:id="rId198" w:anchor="RN029" w:history="1">
+            <w:hyperlink r:id="rId199" w:anchor="RN029" w:history="1">
               <w:r>
                 <w:rPr>
                   <w:rStyle w:val="Hyperlink"/>
@@ -35578,7 +36078,7 @@
             <w:r>
               <w:t>Impede que o total fique incoerente com os serviços, o porte do veículo e a forma de pagamento (</w:t>
             </w:r>
-            <w:hyperlink r:id="rId199" w:anchor="RN033" w:history="1">
+            <w:hyperlink r:id="rId200" w:anchor="RN033" w:history="1">
               <w:r>
                 <w:rPr>
                   <w:rStyle w:val="Hyperlink"/>
@@ -35643,7 +36143,7 @@
             <w:r>
               <w:t xml:space="preserve"> (</w:t>
             </w:r>
-            <w:hyperlink r:id="rId200" w:anchor="RN030" w:history="1">
+            <w:hyperlink r:id="rId201" w:anchor="RN030" w:history="1">
               <w:r>
                 <w:rPr>
                   <w:rStyle w:val="Hyperlink"/>
@@ -35670,6 +36170,7 @@
               <w:pStyle w:val="TextodeTabela"/>
             </w:pPr>
             <w:r>
+              <w:lastRenderedPageBreak/>
               <w:t>TypeScript 6.0 e Node.js 24 LTS</w:t>
             </w:r>
           </w:p>
@@ -36143,6 +36644,163 @@
             </w:pPr>
             <w:r>
               <w:t>Exigência da disciplina; a aplicação roda da mesma forma em qualquer máquina com o Docker. A publicação continua na Vercel, e o banco, no Supabase.</w:t>
+            </w:r>
+          </w:p>
+        </w:tc>
+      </w:tr>
+      <w:tr>
+        <w:trPr>
+          <w:cantSplit/>
+        </w:trPr>
+        <w:tc>
+          <w:tcPr>
+            <w:tcW w:w="2400" w:type="dxa"/>
+          </w:tcPr>
+          <w:p>
+            <w:pPr>
+              <w:pStyle w:val="TextodeTabela"/>
+            </w:pPr>
+            <w:r>
+              <w:t>Banco sem privilégios para as chaves públicas</w:t>
+            </w:r>
+          </w:p>
+        </w:tc>
+        <w:tc>
+          <w:tcPr>
+            <w:tcW w:w="2300" w:type="dxa"/>
+          </w:tcPr>
+          <w:p>
+            <w:pPr>
+              <w:pStyle w:val="TextodeTabela"/>
+            </w:pPr>
+            <w:r>
+              <w:t>Apenas a segurança em nível de linha, com os privilégios padrão do Supabase</w:t>
+            </w:r>
+          </w:p>
+        </w:tc>
+        <w:tc>
+          <w:tcPr>
+            <w:tcW w:w="4371" w:type="dxa"/>
+          </w:tcPr>
+          <w:p>
+            <w:pPr>
+              <w:pStyle w:val="TextodeTabela"/>
+            </w:pPr>
+            <w:r>
+              <w:t>Segunda barreira para o banco fechado ao navegador: mesmo com a segurança em nível de linha desativada ou uma política criada por engano, a chave pública continua sem acesso; toda função nova revoga a execução desses papéis.</w:t>
+            </w:r>
+          </w:p>
+        </w:tc>
+      </w:tr>
+      <w:tr>
+        <w:trPr>
+          <w:cantSplit/>
+        </w:trPr>
+        <w:tc>
+          <w:tcPr>
+            <w:tcW w:w="2400" w:type="dxa"/>
+          </w:tcPr>
+          <w:p>
+            <w:pPr>
+              <w:pStyle w:val="TextodeTabela"/>
+            </w:pPr>
+            <w:r>
+              <w:lastRenderedPageBreak/>
+              <w:t xml:space="preserve">Supabase CLI fixada no projeto e banco local para conferir as </w:t>
+            </w:r>
+            <w:r>
+              <w:rPr>
+                <w:i/>
+              </w:rPr>
+              <w:t>migrations</w:t>
+            </w:r>
+          </w:p>
+        </w:tc>
+        <w:tc>
+          <w:tcPr>
+            <w:tcW w:w="2300" w:type="dxa"/>
+          </w:tcPr>
+          <w:p>
+            <w:pPr>
+              <w:pStyle w:val="TextodeTabela"/>
+            </w:pPr>
+            <w:r>
+              <w:t>CLI baixada sob demanda, testes de banco versionados ou conferência apenas no projeto real</w:t>
+            </w:r>
+          </w:p>
+        </w:tc>
+        <w:tc>
+          <w:tcPr>
+            <w:tcW w:w="4371" w:type="dxa"/>
+          </w:tcPr>
+          <w:p>
+            <w:pPr>
+              <w:pStyle w:val="TextodeTabela"/>
+            </w:pPr>
+            <w:r>
+              <w:t xml:space="preserve">A </w:t>
+            </w:r>
+            <w:r>
+              <w:rPr>
+                <w:i/>
+              </w:rPr>
+              <w:t>migration</w:t>
+            </w:r>
+            <w:r>
+              <w:t xml:space="preserve"> aplicada não se edita e vale na hora para a produção; num banco local descartável, o erro aparece antes. A versão fixa evita diferenças entre as máquinas da equipe.</w:t>
+            </w:r>
+          </w:p>
+        </w:tc>
+      </w:tr>
+      <w:tr>
+        <w:trPr>
+          <w:cantSplit/>
+        </w:trPr>
+        <w:tc>
+          <w:tcPr>
+            <w:tcW w:w="2400" w:type="dxa"/>
+          </w:tcPr>
+          <w:p>
+            <w:pPr>
+              <w:pStyle w:val="TextodeTabela"/>
+            </w:pPr>
+            <w:r>
+              <w:t>Preparação do Supabase sem configuração manual no painel</w:t>
+            </w:r>
+          </w:p>
+        </w:tc>
+        <w:tc>
+          <w:tcPr>
+            <w:tcW w:w="2300" w:type="dxa"/>
+          </w:tcPr>
+          <w:p>
+            <w:pPr>
+              <w:pStyle w:val="TextodeTabela"/>
+            </w:pPr>
+            <w:r>
+              <w:t>Confirmação de e-mail, senha mínima e repositório de arquivos configurados no painel</w:t>
+            </w:r>
+          </w:p>
+        </w:tc>
+        <w:tc>
+          <w:tcPr>
+            <w:tcW w:w="4371" w:type="dxa"/>
+          </w:tcPr>
+          <w:p>
+            <w:pPr>
+              <w:pStyle w:val="TextodeTabela"/>
+            </w:pPr>
+            <w:r>
+              <w:t xml:space="preserve">Tudo o que o sistema precisa fica versionado: as contas nascem com o e-mail confirmado, pois o MVP não envia e-mails; a senha é exigida pelos esquemas de validação; e o repositório de arquivos vem da </w:t>
+            </w:r>
+            <w:r>
+              <w:rPr>
+                <w:i/>
+              </w:rPr>
+              <w:t>migration</w:t>
+            </w:r>
+            <w:r>
+              <w:t>.</w:t>
             </w:r>
           </w:p>
         </w:tc>
@@ -36157,8 +36815,9 @@
         </w:numPr>
         <w:jc w:val="center"/>
       </w:pPr>
-      <w:bookmarkStart w:id="48" w:name="_Toc243219246"/>
-      <w:r>
+      <w:bookmarkStart w:id="48" w:name="_Toc243257979"/>
+      <w:r>
+        <w:lastRenderedPageBreak/>
         <w:t>APÊNDICE A – CONTRATO DETALHADO DA API</w:t>
       </w:r>
       <w:bookmarkEnd w:id="48"/>
@@ -36264,7 +36923,7 @@
           <w:numId w:val="0"/>
         </w:numPr>
       </w:pPr>
-      <w:bookmarkStart w:id="49" w:name="_Toc243219247"/>
+      <w:bookmarkStart w:id="49" w:name="_Toc243257980"/>
       <w:r>
         <w:t>Autenticação</w:t>
       </w:r>
@@ -36440,7 +37099,7 @@
             <w:r>
               <w:t>Cria a conta de cliente (</w:t>
             </w:r>
-            <w:hyperlink r:id="rId201" w:anchor="UC02" w:history="1">
+            <w:hyperlink r:id="rId202" w:anchor="UC02" w:history="1">
               <w:r>
                 <w:rPr>
                   <w:rStyle w:val="Hyperlink"/>
@@ -36546,7 +37205,7 @@
             <w:r>
               <w:t>Inicia a sessão de cliente ou de funcionário (</w:t>
             </w:r>
-            <w:hyperlink r:id="rId202" w:anchor="UC03" w:history="1">
+            <w:hyperlink r:id="rId203" w:anchor="UC03" w:history="1">
               <w:r>
                 <w:rPr>
                   <w:rStyle w:val="Hyperlink"/>
@@ -36557,7 +37216,7 @@
             <w:r>
               <w:t xml:space="preserve">, </w:t>
             </w:r>
-            <w:hyperlink r:id="rId203" w:anchor="UC08" w:history="1">
+            <w:hyperlink r:id="rId204" w:anchor="UC08" w:history="1">
               <w:r>
                 <w:rPr>
                   <w:rStyle w:val="Hyperlink"/>
@@ -36942,8 +37601,9 @@
           <w:numId w:val="0"/>
         </w:numPr>
       </w:pPr>
-      <w:bookmarkStart w:id="50" w:name="_Toc243219248"/>
-      <w:r>
+      <w:bookmarkStart w:id="50" w:name="_Toc243257981"/>
+      <w:r>
+        <w:lastRenderedPageBreak/>
         <w:t>Rotas Públicas</w:t>
       </w:r>
       <w:bookmarkEnd w:id="50"/>
@@ -37108,7 +37768,7 @@
             <w:r>
               <w:t>Dados institucionais e horários de funcionamento (</w:t>
             </w:r>
-            <w:hyperlink r:id="rId204" w:anchor="RN028" w:history="1">
+            <w:hyperlink r:id="rId205" w:anchor="RN028" w:history="1">
               <w:r>
                 <w:rPr>
                   <w:rStyle w:val="Hyperlink"/>
@@ -37193,7 +37853,7 @@
             <w:r>
               <w:t>Catálogo de serviços principais e complementares ativos (</w:t>
             </w:r>
-            <w:hyperlink r:id="rId205" w:anchor="UC01" w:history="1">
+            <w:hyperlink r:id="rId206" w:anchor="UC01" w:history="1">
               <w:r>
                 <w:rPr>
                   <w:rStyle w:val="Hyperlink"/>
@@ -37257,7 +37917,7 @@
           <w:numId w:val="0"/>
         </w:numPr>
       </w:pPr>
-      <w:bookmarkStart w:id="51" w:name="_Toc243219249"/>
+      <w:bookmarkStart w:id="51" w:name="_Toc243257982"/>
       <w:r>
         <w:t>Rotas do Cliente</w:t>
       </w:r>
@@ -37434,7 +38094,7 @@
             <w:r>
               <w:t>Dados da conta (</w:t>
             </w:r>
-            <w:hyperlink r:id="rId206" w:anchor="UC04" w:history="1">
+            <w:hyperlink r:id="rId207" w:anchor="UC04" w:history="1">
               <w:r>
                 <w:rPr>
                   <w:rStyle w:val="Hyperlink"/>
@@ -37671,96 +38331,6 @@
             </w:pPr>
             <w:r>
               <w:t>Consulta uma placa antes do cadastro (</w:t>
-            </w:r>
-            <w:hyperlink r:id="rId207" w:anchor="UC05" w:history="1">
-              <w:r>
-                <w:rPr>
-                  <w:rStyle w:val="Hyperlink"/>
-                </w:rPr>
-                <w:t>UC05</w:t>
-              </w:r>
-            </w:hyperlink>
-            <w:r>
-              <w:t>).</w:t>
-            </w:r>
-          </w:p>
-        </w:tc>
-        <w:tc>
-          <w:tcPr>
-            <w:tcW w:w="2600" w:type="dxa"/>
-          </w:tcPr>
-          <w:p>
-            <w:pPr>
-              <w:pStyle w:val="TextodeTabela"/>
-            </w:pPr>
-            <w:r>
-              <w:rPr>
-                <w:rFonts w:ascii="Courier New" w:hAnsi="Courier New" w:cs="Courier New"/>
-                <w:sz w:val="16"/>
-                <w:szCs w:val="16"/>
-              </w:rPr>
-              <w:t>plate*</w:t>
-            </w:r>
-          </w:p>
-        </w:tc>
-        <w:tc>
-          <w:tcPr>
-            <w:tcW w:w="2471" w:type="dxa"/>
-          </w:tcPr>
-          <w:p>
-            <w:pPr>
-              <w:pStyle w:val="TextodeTabela"/>
-            </w:pPr>
-            <w:r>
-              <w:rPr>
-                <w:b/>
-                <w:bCs/>
-              </w:rPr>
-              <w:t>200</w:t>
-            </w:r>
-            <w:r>
-              <w:t xml:space="preserve"> tipo, marca, modelo, cor e ano do veículo, se a placa já estiver cadastrada, ou resposta vazia; nunca devolve dados de clientes.</w:t>
-            </w:r>
-          </w:p>
-        </w:tc>
-      </w:tr>
-      <w:tr>
-        <w:trPr>
-          <w:cantSplit/>
-        </w:trPr>
-        <w:tc>
-          <w:tcPr>
-            <w:tcW w:w="4000" w:type="dxa"/>
-          </w:tcPr>
-          <w:p>
-            <w:pPr>
-              <w:pStyle w:val="TextodeTabela"/>
-            </w:pPr>
-            <w:r>
-              <w:rPr>
-                <w:b/>
-                <w:bCs/>
-              </w:rPr>
-              <w:t>POST</w:t>
-            </w:r>
-            <w:r>
-              <w:t xml:space="preserve"> </w:t>
-            </w:r>
-            <w:r>
-              <w:rPr>
-                <w:rFonts w:ascii="Courier New" w:hAnsi="Courier New" w:cs="Courier New"/>
-                <w:sz w:val="16"/>
-                <w:szCs w:val="16"/>
-              </w:rPr>
-              <w:t>/api/me/vehicles</w:t>
-            </w:r>
-          </w:p>
-          <w:p>
-            <w:pPr>
-              <w:pStyle w:val="TextodeTabela"/>
-            </w:pPr>
-            <w:r>
-              <w:t>Cadastra um veículo ou vincula à conta o veículo de uma placa já cadastrada (</w:t>
             </w:r>
             <w:hyperlink r:id="rId208" w:anchor="UC05" w:history="1">
               <w:r>
@@ -37792,25 +38362,6 @@
               <w:t>plate*</w:t>
             </w:r>
           </w:p>
-          <w:p>
-            <w:pPr>
-              <w:pStyle w:val="TextodeTabela"/>
-            </w:pPr>
-            <w:r>
-              <w:t xml:space="preserve">Placa nova: </w:t>
-            </w:r>
-            <w:r>
-              <w:rPr>
-                <w:rFonts w:ascii="Courier New" w:hAnsi="Courier New" w:cs="Courier New"/>
-                <w:sz w:val="16"/>
-                <w:szCs w:val="16"/>
-              </w:rPr>
-              <w:t>type*, brand*, model*, color*, year*</w:t>
-            </w:r>
-            <w:r>
-              <w:t>.</w:t>
-            </w:r>
-          </w:p>
         </w:tc>
         <w:tc>
           <w:tcPr>
@@ -37825,26 +38376,10 @@
                 <w:b/>
                 <w:bCs/>
               </w:rPr>
-              <w:t>201</w:t>
-            </w:r>
-            <w:r>
-              <w:t xml:space="preserve"> veículo criado ou vinculado, com o porte definido.</w:t>
-            </w:r>
-          </w:p>
-          <w:p>
-            <w:pPr>
-              <w:pStyle w:val="TextodeTabela"/>
-            </w:pPr>
-            <w:r>
-              <w:t xml:space="preserve">409 </w:t>
-            </w:r>
-            <w:r>
-              <w:rPr>
-                <w:rFonts w:ascii="Courier New" w:hAnsi="Courier New" w:cs="Courier New"/>
-                <w:sz w:val="16"/>
-                <w:szCs w:val="16"/>
-              </w:rPr>
-              <w:t>VEHICLE_ALREADY_LINKED</w:t>
+              <w:t>200</w:t>
+            </w:r>
+            <w:r>
+              <w:t xml:space="preserve"> tipo, marca, modelo, cor e ano do veículo, se a placa já estiver cadastrada, ou resposta vazia; nunca devolve dados de clientes.</w:t>
             </w:r>
           </w:p>
         </w:tc>
@@ -37866,7 +38401,7 @@
                 <w:b/>
                 <w:bCs/>
               </w:rPr>
-              <w:t>PATCH</w:t>
+              <w:t>POST</w:t>
             </w:r>
             <w:r>
               <w:t xml:space="preserve"> </w:t>
@@ -37877,6 +38412,132 @@
                 <w:sz w:val="16"/>
                 <w:szCs w:val="16"/>
               </w:rPr>
+              <w:t>/api/me/vehicles</w:t>
+            </w:r>
+          </w:p>
+          <w:p>
+            <w:pPr>
+              <w:pStyle w:val="TextodeTabela"/>
+            </w:pPr>
+            <w:r>
+              <w:t>Cadastra um veículo ou vincula à conta o veículo de uma placa já cadastrada (</w:t>
+            </w:r>
+            <w:hyperlink r:id="rId209" w:anchor="UC05" w:history="1">
+              <w:r>
+                <w:rPr>
+                  <w:rStyle w:val="Hyperlink"/>
+                </w:rPr>
+                <w:t>UC05</w:t>
+              </w:r>
+            </w:hyperlink>
+            <w:r>
+              <w:t>).</w:t>
+            </w:r>
+          </w:p>
+        </w:tc>
+        <w:tc>
+          <w:tcPr>
+            <w:tcW w:w="2600" w:type="dxa"/>
+          </w:tcPr>
+          <w:p>
+            <w:pPr>
+              <w:pStyle w:val="TextodeTabela"/>
+            </w:pPr>
+            <w:r>
+              <w:rPr>
+                <w:rFonts w:ascii="Courier New" w:hAnsi="Courier New" w:cs="Courier New"/>
+                <w:sz w:val="16"/>
+                <w:szCs w:val="16"/>
+              </w:rPr>
+              <w:t>plate*</w:t>
+            </w:r>
+          </w:p>
+          <w:p>
+            <w:pPr>
+              <w:pStyle w:val="TextodeTabela"/>
+            </w:pPr>
+            <w:r>
+              <w:t xml:space="preserve">Placa nova: </w:t>
+            </w:r>
+            <w:r>
+              <w:rPr>
+                <w:rFonts w:ascii="Courier New" w:hAnsi="Courier New" w:cs="Courier New"/>
+                <w:sz w:val="16"/>
+                <w:szCs w:val="16"/>
+              </w:rPr>
+              <w:t>type*, brand*, model*, color*, year*</w:t>
+            </w:r>
+            <w:r>
+              <w:t>.</w:t>
+            </w:r>
+          </w:p>
+        </w:tc>
+        <w:tc>
+          <w:tcPr>
+            <w:tcW w:w="2471" w:type="dxa"/>
+          </w:tcPr>
+          <w:p>
+            <w:pPr>
+              <w:pStyle w:val="TextodeTabela"/>
+            </w:pPr>
+            <w:r>
+              <w:rPr>
+                <w:b/>
+                <w:bCs/>
+              </w:rPr>
+              <w:t>201</w:t>
+            </w:r>
+            <w:r>
+              <w:t xml:space="preserve"> veículo criado ou vinculado, com o porte definido.</w:t>
+            </w:r>
+          </w:p>
+          <w:p>
+            <w:pPr>
+              <w:pStyle w:val="TextodeTabela"/>
+            </w:pPr>
+            <w:r>
+              <w:t xml:space="preserve">409 </w:t>
+            </w:r>
+            <w:r>
+              <w:rPr>
+                <w:rFonts w:ascii="Courier New" w:hAnsi="Courier New" w:cs="Courier New"/>
+                <w:sz w:val="16"/>
+                <w:szCs w:val="16"/>
+              </w:rPr>
+              <w:t>VEHICLE_ALREADY_LINKED</w:t>
+            </w:r>
+          </w:p>
+        </w:tc>
+      </w:tr>
+      <w:tr>
+        <w:trPr>
+          <w:cantSplit/>
+        </w:trPr>
+        <w:tc>
+          <w:tcPr>
+            <w:tcW w:w="4000" w:type="dxa"/>
+          </w:tcPr>
+          <w:p>
+            <w:pPr>
+              <w:pStyle w:val="TextodeTabela"/>
+            </w:pPr>
+            <w:r>
+              <w:rPr>
+                <w:b/>
+                <w:bCs/>
+              </w:rPr>
+              <w:lastRenderedPageBreak/>
+              <w:t>PATCH</w:t>
+            </w:r>
+            <w:r>
+              <w:t xml:space="preserve"> </w:t>
+            </w:r>
+            <w:r>
+              <w:rPr>
+                <w:rFonts w:ascii="Courier New" w:hAnsi="Courier New" w:cs="Courier New"/>
+                <w:sz w:val="16"/>
+                <w:szCs w:val="16"/>
+              </w:rPr>
               <w:t>/api/me/vehicles/:id</w:t>
             </w:r>
           </w:p>
@@ -37887,7 +38548,7 @@
             <w:r>
               <w:t>Edita um veículo do cliente (</w:t>
             </w:r>
-            <w:hyperlink r:id="rId209" w:anchor="UC05" w:history="1">
+            <w:hyperlink r:id="rId210" w:anchor="UC05" w:history="1">
               <w:r>
                 <w:rPr>
                   <w:rStyle w:val="Hyperlink"/>
@@ -38306,7 +38967,7 @@
             <w:r>
               <w:t>Registra o agendamento (</w:t>
             </w:r>
-            <w:hyperlink r:id="rId210" w:anchor="UC06" w:history="1">
+            <w:hyperlink r:id="rId211" w:anchor="UC06" w:history="1">
               <w:r>
                 <w:rPr>
                   <w:rStyle w:val="Hyperlink"/>
@@ -38415,7 +39076,7 @@
             <w:r>
               <w:t>Lista os agendamentos (</w:t>
             </w:r>
-            <w:hyperlink r:id="rId211" w:anchor="UC07" w:history="1">
+            <w:hyperlink r:id="rId212" w:anchor="UC07" w:history="1">
               <w:r>
                 <w:rPr>
                   <w:rStyle w:val="Hyperlink"/>
@@ -38615,7 +39276,7 @@
             <w:r>
               <w:t xml:space="preserve"> (</w:t>
             </w:r>
-            <w:hyperlink r:id="rId212" w:anchor="UC26" w:history="1">
+            <w:hyperlink r:id="rId213" w:anchor="UC26" w:history="1">
               <w:r>
                 <w:rPr>
                   <w:rStyle w:val="Hyperlink"/>
@@ -38804,6 +39465,7 @@
                 <w:b/>
                 <w:bCs/>
               </w:rPr>
+              <w:lastRenderedPageBreak/>
               <w:t>POST</w:t>
             </w:r>
             <w:r>
@@ -38825,7 +39487,7 @@
             <w:r>
               <w:t>Reagenda um serviço concluído (</w:t>
             </w:r>
-            <w:hyperlink r:id="rId213" w:anchor="UC25" w:history="1">
+            <w:hyperlink r:id="rId214" w:anchor="UC25" w:history="1">
               <w:r>
                 <w:rPr>
                   <w:rStyle w:val="Hyperlink"/>
@@ -38916,7 +39578,7 @@
           <w:numId w:val="0"/>
         </w:numPr>
       </w:pPr>
-      <w:bookmarkStart w:id="52" w:name="_Toc243219250"/>
+      <w:bookmarkStart w:id="52" w:name="_Toc243257983"/>
       <w:r>
         <w:t>Rotas do Painel</w:t>
       </w:r>
@@ -39130,7 +39792,7 @@
             <w:r>
               <w:t>Indicadores e agenda do dia (</w:t>
             </w:r>
-            <w:hyperlink r:id="rId214" w:anchor="UC09" w:history="1">
+            <w:hyperlink r:id="rId215" w:anchor="UC09" w:history="1">
               <w:r>
                 <w:rPr>
                   <w:rStyle w:val="Hyperlink"/>
@@ -39366,7 +40028,7 @@
             <w:r>
               <w:t>Lista os agendamentos (</w:t>
             </w:r>
-            <w:hyperlink r:id="rId215" w:anchor="UC10" w:history="1">
+            <w:hyperlink r:id="rId216" w:anchor="UC10" w:history="1">
               <w:r>
                 <w:rPr>
                   <w:rStyle w:val="Hyperlink"/>
@@ -39675,6 +40337,7 @@
                 <w:b/>
                 <w:bCs/>
               </w:rPr>
+              <w:lastRenderedPageBreak/>
               <w:t>POST</w:t>
             </w:r>
             <w:r>
@@ -39696,7 +40359,7 @@
             <w:r>
               <w:t>Registra um agendamento para um cliente (</w:t>
             </w:r>
-            <w:hyperlink r:id="rId216" w:anchor="UC11" w:history="1">
+            <w:hyperlink r:id="rId217" w:anchor="UC11" w:history="1">
               <w:r>
                 <w:rPr>
                   <w:rStyle w:val="Hyperlink"/>
@@ -39805,7 +40468,7 @@
             <w:r>
               <w:t>Edita um agendamento em qualquer status (</w:t>
             </w:r>
-            <w:hyperlink r:id="rId217" w:anchor="UC26" w:history="1">
+            <w:hyperlink r:id="rId218" w:anchor="UC26" w:history="1">
               <w:r>
                 <w:rPr>
                   <w:rStyle w:val="Hyperlink"/>
@@ -39913,107 +40576,6 @@
             </w:r>
             <w:r>
               <w:t xml:space="preserve"> (</w:t>
-            </w:r>
-            <w:hyperlink r:id="rId218" w:anchor="UC12" w:history="1">
-              <w:r>
-                <w:rPr>
-                  <w:rStyle w:val="Hyperlink"/>
-                </w:rPr>
-                <w:t>UC12</w:t>
-              </w:r>
-            </w:hyperlink>
-            <w:r>
-              <w:t>).</w:t>
-            </w:r>
-          </w:p>
-        </w:tc>
-        <w:tc>
-          <w:tcPr>
-            <w:tcW w:w="2600" w:type="dxa"/>
-          </w:tcPr>
-          <w:p>
-            <w:pPr>
-              <w:pStyle w:val="TextodeTabela"/>
-            </w:pPr>
-            <w:r>
-              <w:t>Nenhuma.</w:t>
-            </w:r>
-          </w:p>
-        </w:tc>
-        <w:tc>
-          <w:tcPr>
-            <w:tcW w:w="2471" w:type="dxa"/>
-          </w:tcPr>
-          <w:p>
-            <w:pPr>
-              <w:pStyle w:val="TextodeTabela"/>
-            </w:pPr>
-            <w:r>
-              <w:rPr>
-                <w:b/>
-                <w:bCs/>
-              </w:rPr>
-              <w:t>200</w:t>
-            </w:r>
-            <w:r>
-              <w:t xml:space="preserve"> agendamento com o novo status.</w:t>
-            </w:r>
-          </w:p>
-          <w:p>
-            <w:pPr>
-              <w:pStyle w:val="TextodeTabela"/>
-            </w:pPr>
-            <w:r>
-              <w:t xml:space="preserve">409 </w:t>
-            </w:r>
-            <w:r>
-              <w:rPr>
-                <w:rFonts w:ascii="Courier New" w:hAnsi="Courier New" w:cs="Courier New"/>
-                <w:sz w:val="16"/>
-                <w:szCs w:val="16"/>
-              </w:rPr>
-              <w:t>INVALID_STATUS</w:t>
-            </w:r>
-          </w:p>
-        </w:tc>
-      </w:tr>
-      <w:tr>
-        <w:trPr>
-          <w:cantSplit/>
-        </w:trPr>
-        <w:tc>
-          <w:tcPr>
-            <w:tcW w:w="4000" w:type="dxa"/>
-          </w:tcPr>
-          <w:p>
-            <w:pPr>
-              <w:pStyle w:val="TextodeTabela"/>
-            </w:pPr>
-            <w:r>
-              <w:rPr>
-                <w:b/>
-                <w:bCs/>
-              </w:rPr>
-              <w:t>POST</w:t>
-            </w:r>
-            <w:r>
-              <w:t xml:space="preserve"> </w:t>
-            </w:r>
-            <w:r>
-              <w:rPr>
-                <w:rFonts w:ascii="Courier New" w:hAnsi="Courier New" w:cs="Courier New"/>
-                <w:sz w:val="16"/>
-                <w:szCs w:val="16"/>
-              </w:rPr>
-              <w:t>/api/admin/appointments/:id/complete</w:t>
-            </w:r>
-          </w:p>
-          <w:p>
-            <w:pPr>
-              <w:pStyle w:val="TextodeTabela"/>
-            </w:pPr>
-            <w:r>
-              <w:t>Conclui o atendimento e registra a forma de pagamento utilizada (</w:t>
             </w:r>
             <w:hyperlink r:id="rId219" w:anchor="UC12" w:history="1">
               <w:r>
@@ -40037,73 +40599,43 @@
               <w:pStyle w:val="TextodeTabela"/>
             </w:pPr>
             <w:r>
+              <w:t>Nenhuma.</w:t>
+            </w:r>
+          </w:p>
+        </w:tc>
+        <w:tc>
+          <w:tcPr>
+            <w:tcW w:w="2471" w:type="dxa"/>
+          </w:tcPr>
+          <w:p>
+            <w:pPr>
+              <w:pStyle w:val="TextodeTabela"/>
+            </w:pPr>
+            <w:r>
+              <w:rPr>
+                <w:b/>
+                <w:bCs/>
+              </w:rPr>
+              <w:t>200</w:t>
+            </w:r>
+            <w:r>
+              <w:t xml:space="preserve"> agendamento com o novo status.</w:t>
+            </w:r>
+          </w:p>
+          <w:p>
+            <w:pPr>
+              <w:pStyle w:val="TextodeTabela"/>
+            </w:pPr>
+            <w:r>
+              <w:t xml:space="preserve">409 </w:t>
+            </w:r>
+            <w:r>
               <w:rPr>
                 <w:rFonts w:ascii="Courier New" w:hAnsi="Courier New" w:cs="Courier New"/>
                 <w:sz w:val="16"/>
                 <w:szCs w:val="16"/>
               </w:rPr>
-              <w:t>paymentMethod*</w:t>
-            </w:r>
-          </w:p>
-        </w:tc>
-        <w:tc>
-          <w:tcPr>
-            <w:tcW w:w="2471" w:type="dxa"/>
-          </w:tcPr>
-          <w:p>
-            <w:pPr>
-              <w:pStyle w:val="TextodeTabela"/>
-            </w:pPr>
-            <w:r>
-              <w:rPr>
-                <w:b/>
-                <w:bCs/>
-              </w:rPr>
-              <w:t>200</w:t>
-            </w:r>
-            <w:r>
-              <w:t xml:space="preserve"> agendamento </w:t>
-            </w:r>
-            <w:r>
-              <w:rPr>
-                <w:rFonts w:ascii="Courier New" w:hAnsi="Courier New" w:cs="Courier New"/>
-                <w:sz w:val="16"/>
-                <w:szCs w:val="16"/>
-              </w:rPr>
-              <w:t>completed</w:t>
-            </w:r>
-            <w:r>
-              <w:t>, com o total recalculado se a forma de pagamento mudou.</w:t>
-            </w:r>
-          </w:p>
-          <w:p>
-            <w:pPr>
-              <w:pStyle w:val="TextodeTabela"/>
-            </w:pPr>
-            <w:r>
-              <w:t xml:space="preserve">409 </w:t>
-            </w:r>
-            <w:r>
-              <w:rPr>
-                <w:rFonts w:ascii="Courier New" w:hAnsi="Courier New" w:cs="Courier New"/>
-                <w:sz w:val="16"/>
-                <w:szCs w:val="16"/>
-              </w:rPr>
               <w:t>INVALID_STATUS</w:t>
-            </w:r>
-            <w:r>
-              <w:t xml:space="preserve"> se não estiver em </w:t>
-            </w:r>
-            <w:r>
-              <w:rPr>
-                <w:rFonts w:ascii="Courier New" w:hAnsi="Courier New" w:cs="Courier New"/>
-                <w:sz w:val="16"/>
-                <w:szCs w:val="16"/>
-              </w:rPr>
-              <w:t>awaiting_payment</w:t>
-            </w:r>
-            <w:r>
-              <w:t>.</w:t>
             </w:r>
           </w:p>
         </w:tc>
@@ -40136,15 +40668,26 @@
                 <w:sz w:val="16"/>
                 <w:szCs w:val="16"/>
               </w:rPr>
-              <w:t>/api/admin/appointments/:id/cancel</w:t>
-            </w:r>
-          </w:p>
-          <w:p>
-            <w:pPr>
-              <w:pStyle w:val="TextodeTabela"/>
-            </w:pPr>
-            <w:r>
-              <w:t>Cancela um agendamento agendado ou em espera.</w:t>
+              <w:t>/api/admin/appointments/:id/complete</w:t>
+            </w:r>
+          </w:p>
+          <w:p>
+            <w:pPr>
+              <w:pStyle w:val="TextodeTabela"/>
+            </w:pPr>
+            <w:r>
+              <w:t>Conclui o atendimento e registra a forma de pagamento utilizada (</w:t>
+            </w:r>
+            <w:hyperlink r:id="rId220" w:anchor="UC12" w:history="1">
+              <w:r>
+                <w:rPr>
+                  <w:rStyle w:val="Hyperlink"/>
+                </w:rPr>
+                <w:t>UC12</w:t>
+              </w:r>
+            </w:hyperlink>
+            <w:r>
+              <w:t>).</w:t>
             </w:r>
           </w:p>
         </w:tc>
@@ -40157,7 +40700,12 @@
               <w:pStyle w:val="TextodeTabela"/>
             </w:pPr>
             <w:r>
-              <w:t>Nenhuma.</w:t>
+              <w:rPr>
+                <w:rFonts w:ascii="Courier New" w:hAnsi="Courier New" w:cs="Courier New"/>
+                <w:sz w:val="16"/>
+                <w:szCs w:val="16"/>
+              </w:rPr>
+              <w:t>paymentMethod*</w:t>
             </w:r>
           </w:p>
         </w:tc>
@@ -40177,15 +40725,7 @@
               <w:t>200</w:t>
             </w:r>
             <w:r>
-              <w:t xml:space="preserve"> agendamento cancelado.</w:t>
-            </w:r>
-          </w:p>
-          <w:p>
-            <w:pPr>
-              <w:pStyle w:val="TextodeTabela"/>
-            </w:pPr>
-            <w:r>
-              <w:t xml:space="preserve">409 </w:t>
+              <w:t xml:space="preserve"> agendamento </w:t>
             </w:r>
             <w:r>
               <w:rPr>
@@ -40193,7 +40733,40 @@
                 <w:sz w:val="16"/>
                 <w:szCs w:val="16"/>
               </w:rPr>
+              <w:t>completed</w:t>
+            </w:r>
+            <w:r>
+              <w:t>, com o total recalculado se a forma de pagamento mudou.</w:t>
+            </w:r>
+          </w:p>
+          <w:p>
+            <w:pPr>
+              <w:pStyle w:val="TextodeTabela"/>
+            </w:pPr>
+            <w:r>
+              <w:t xml:space="preserve">409 </w:t>
+            </w:r>
+            <w:r>
+              <w:rPr>
+                <w:rFonts w:ascii="Courier New" w:hAnsi="Courier New" w:cs="Courier New"/>
+                <w:sz w:val="16"/>
+                <w:szCs w:val="16"/>
+              </w:rPr>
               <w:t>INVALID_STATUS</w:t>
+            </w:r>
+            <w:r>
+              <w:t xml:space="preserve"> se não estiver em </w:t>
+            </w:r>
+            <w:r>
+              <w:rPr>
+                <w:rFonts w:ascii="Courier New" w:hAnsi="Courier New" w:cs="Courier New"/>
+                <w:sz w:val="16"/>
+                <w:szCs w:val="16"/>
+              </w:rPr>
+              <w:t>awaiting_payment</w:t>
+            </w:r>
+            <w:r>
+              <w:t>.</w:t>
             </w:r>
           </w:p>
         </w:tc>
@@ -40226,6 +40799,96 @@
                 <w:sz w:val="16"/>
                 <w:szCs w:val="16"/>
               </w:rPr>
+              <w:t>/api/admin/appointments/:id/cancel</w:t>
+            </w:r>
+          </w:p>
+          <w:p>
+            <w:pPr>
+              <w:pStyle w:val="TextodeTabela"/>
+            </w:pPr>
+            <w:r>
+              <w:t>Cancela um agendamento agendado ou em espera.</w:t>
+            </w:r>
+          </w:p>
+        </w:tc>
+        <w:tc>
+          <w:tcPr>
+            <w:tcW w:w="2600" w:type="dxa"/>
+          </w:tcPr>
+          <w:p>
+            <w:pPr>
+              <w:pStyle w:val="TextodeTabela"/>
+            </w:pPr>
+            <w:r>
+              <w:t>Nenhuma.</w:t>
+            </w:r>
+          </w:p>
+        </w:tc>
+        <w:tc>
+          <w:tcPr>
+            <w:tcW w:w="2471" w:type="dxa"/>
+          </w:tcPr>
+          <w:p>
+            <w:pPr>
+              <w:pStyle w:val="TextodeTabela"/>
+            </w:pPr>
+            <w:r>
+              <w:rPr>
+                <w:b/>
+                <w:bCs/>
+              </w:rPr>
+              <w:t>200</w:t>
+            </w:r>
+            <w:r>
+              <w:t xml:space="preserve"> agendamento cancelado.</w:t>
+            </w:r>
+          </w:p>
+          <w:p>
+            <w:pPr>
+              <w:pStyle w:val="TextodeTabela"/>
+            </w:pPr>
+            <w:r>
+              <w:t xml:space="preserve">409 </w:t>
+            </w:r>
+            <w:r>
+              <w:rPr>
+                <w:rFonts w:ascii="Courier New" w:hAnsi="Courier New" w:cs="Courier New"/>
+                <w:sz w:val="16"/>
+                <w:szCs w:val="16"/>
+              </w:rPr>
+              <w:t>INVALID_STATUS</w:t>
+            </w:r>
+          </w:p>
+        </w:tc>
+      </w:tr>
+      <w:tr>
+        <w:trPr>
+          <w:cantSplit/>
+        </w:trPr>
+        <w:tc>
+          <w:tcPr>
+            <w:tcW w:w="4000" w:type="dxa"/>
+          </w:tcPr>
+          <w:p>
+            <w:pPr>
+              <w:pStyle w:val="TextodeTabela"/>
+            </w:pPr>
+            <w:r>
+              <w:rPr>
+                <w:b/>
+                <w:bCs/>
+              </w:rPr>
+              <w:t>POST</w:t>
+            </w:r>
+            <w:r>
+              <w:t xml:space="preserve"> </w:t>
+            </w:r>
+            <w:r>
+              <w:rPr>
+                <w:rFonts w:ascii="Courier New" w:hAnsi="Courier New" w:cs="Courier New"/>
+                <w:sz w:val="16"/>
+                <w:szCs w:val="16"/>
+              </w:rPr>
               <w:t>/api/admin/appointments/:id/reschedule</w:t>
             </w:r>
           </w:p>
@@ -40236,7 +40899,7 @@
             <w:r>
               <w:t>Reagenda um serviço concluído (</w:t>
             </w:r>
-            <w:hyperlink r:id="rId220" w:anchor="UC25" w:history="1">
+            <w:hyperlink r:id="rId221" w:anchor="UC25" w:history="1">
               <w:r>
                 <w:rPr>
                   <w:rStyle w:val="Hyperlink"/>
@@ -40549,6 +41212,7 @@
         <w:spacing w:before="240"/>
       </w:pPr>
       <w:r>
+        <w:lastRenderedPageBreak/>
         <w:t xml:space="preserve">Permissão </w:t>
       </w:r>
       <w:r>
@@ -40714,7 +41378,7 @@
             <w:r>
               <w:t>Lista os serviços (</w:t>
             </w:r>
-            <w:hyperlink r:id="rId221" w:anchor="UC14" w:history="1">
+            <w:hyperlink r:id="rId222" w:anchor="UC14" w:history="1">
               <w:r>
                 <w:rPr>
                   <w:rStyle w:val="Hyperlink"/>
@@ -40878,7 +41542,7 @@
             <w:r>
               <w:t>Cadastra um serviço (</w:t>
             </w:r>
-            <w:hyperlink r:id="rId222" w:anchor="UC13" w:history="1">
+            <w:hyperlink r:id="rId223" w:anchor="UC13" w:history="1">
               <w:r>
                 <w:rPr>
                   <w:rStyle w:val="Hyperlink"/>
@@ -41175,7 +41839,7 @@
             <w:r>
               <w:t>Exclui um serviço por exclusão lógica (</w:t>
             </w:r>
-            <w:hyperlink r:id="rId223" w:anchor="RN030" w:history="1">
+            <w:hyperlink r:id="rId224" w:anchor="RN030" w:history="1">
               <w:r>
                 <w:rPr>
                   <w:rStyle w:val="Hyperlink"/>
@@ -41432,7 +42096,7 @@
             <w:r>
               <w:t>Cadastra uma categoria (</w:t>
             </w:r>
-            <w:hyperlink r:id="rId224" w:anchor="UC15" w:history="1">
+            <w:hyperlink r:id="rId225" w:anchor="UC15" w:history="1">
               <w:r>
                 <w:rPr>
                   <w:rStyle w:val="Hyperlink"/>
@@ -41538,7 +42202,7 @@
             <w:r>
               <w:t>Edita, desativa ou reativa uma categoria (</w:t>
             </w:r>
-            <w:hyperlink r:id="rId225" w:anchor="UC15" w:history="1">
+            <w:hyperlink r:id="rId226" w:anchor="UC15" w:history="1">
               <w:r>
                 <w:rPr>
                   <w:rStyle w:val="Hyperlink"/>
@@ -41779,7 +42443,7 @@
             <w:r>
               <w:t>Lista e busca clientes (</w:t>
             </w:r>
-            <w:hyperlink r:id="rId226" w:anchor="UC17" w:history="1">
+            <w:hyperlink r:id="rId227" w:anchor="UC17" w:history="1">
               <w:r>
                 <w:rPr>
                   <w:rStyle w:val="Hyperlink"/>
@@ -41848,6 +42512,7 @@
                 <w:b/>
                 <w:bCs/>
               </w:rPr>
+              <w:lastRenderedPageBreak/>
               <w:t>GET</w:t>
             </w:r>
             <w:r>
@@ -42017,7 +42682,7 @@
             <w:r>
               <w:t>Cadastra um cliente (</w:t>
             </w:r>
-            <w:hyperlink r:id="rId227" w:anchor="UC16" w:history="1">
+            <w:hyperlink r:id="rId228" w:anchor="UC16" w:history="1">
               <w:r>
                 <w:rPr>
                   <w:rStyle w:val="Hyperlink"/>
@@ -42202,7 +42867,7 @@
             <w:r>
               <w:t>Exclui a conta do cliente por exclusão lógica; veículos e agendamentos são preservados (</w:t>
             </w:r>
-            <w:hyperlink r:id="rId228" w:anchor="RN030" w:history="1">
+            <w:hyperlink r:id="rId229" w:anchor="RN030" w:history="1">
               <w:r>
                 <w:rPr>
                   <w:rStyle w:val="Hyperlink"/>
@@ -42286,96 +42951,6 @@
             </w:pPr>
             <w:r>
               <w:t>Consulta uma placa antes do cadastro (</w:t>
-            </w:r>
-            <w:hyperlink r:id="rId229" w:anchor="UC18" w:history="1">
-              <w:r>
-                <w:rPr>
-                  <w:rStyle w:val="Hyperlink"/>
-                </w:rPr>
-                <w:t>UC18</w:t>
-              </w:r>
-            </w:hyperlink>
-            <w:r>
-              <w:t>).</w:t>
-            </w:r>
-          </w:p>
-        </w:tc>
-        <w:tc>
-          <w:tcPr>
-            <w:tcW w:w="2600" w:type="dxa"/>
-          </w:tcPr>
-          <w:p>
-            <w:pPr>
-              <w:pStyle w:val="TextodeTabela"/>
-            </w:pPr>
-            <w:r>
-              <w:rPr>
-                <w:rFonts w:ascii="Courier New" w:hAnsi="Courier New" w:cs="Courier New"/>
-                <w:sz w:val="16"/>
-                <w:szCs w:val="16"/>
-              </w:rPr>
-              <w:t>plate*</w:t>
-            </w:r>
-          </w:p>
-        </w:tc>
-        <w:tc>
-          <w:tcPr>
-            <w:tcW w:w="2471" w:type="dxa"/>
-          </w:tcPr>
-          <w:p>
-            <w:pPr>
-              <w:pStyle w:val="TextodeTabela"/>
-            </w:pPr>
-            <w:r>
-              <w:rPr>
-                <w:b/>
-                <w:bCs/>
-              </w:rPr>
-              <w:t>200</w:t>
-            </w:r>
-            <w:r>
-              <w:t xml:space="preserve"> tipo, marca, modelo, cor e ano do veículo, se a placa já estiver cadastrada, ou resposta vazia.</w:t>
-            </w:r>
-          </w:p>
-        </w:tc>
-      </w:tr>
-      <w:tr>
-        <w:trPr>
-          <w:cantSplit/>
-        </w:trPr>
-        <w:tc>
-          <w:tcPr>
-            <w:tcW w:w="4000" w:type="dxa"/>
-          </w:tcPr>
-          <w:p>
-            <w:pPr>
-              <w:pStyle w:val="TextodeTabela"/>
-            </w:pPr>
-            <w:r>
-              <w:rPr>
-                <w:b/>
-                <w:bCs/>
-              </w:rPr>
-              <w:t>POST</w:t>
-            </w:r>
-            <w:r>
-              <w:t xml:space="preserve"> </w:t>
-            </w:r>
-            <w:r>
-              <w:rPr>
-                <w:rFonts w:ascii="Courier New" w:hAnsi="Courier New" w:cs="Courier New"/>
-                <w:sz w:val="16"/>
-                <w:szCs w:val="16"/>
-              </w:rPr>
-              <w:t>/api/admin/clients/:id/vehicles</w:t>
-            </w:r>
-          </w:p>
-          <w:p>
-            <w:pPr>
-              <w:pStyle w:val="TextodeTabela"/>
-            </w:pPr>
-            <w:r>
-              <w:t>Cadastra um veículo para o cliente ou vincula o veículo de uma placa já cadastrada (</w:t>
             </w:r>
             <w:hyperlink r:id="rId230" w:anchor="UC18" w:history="1">
               <w:r>
@@ -42407,25 +42982,6 @@
               <w:t>plate*</w:t>
             </w:r>
           </w:p>
-          <w:p>
-            <w:pPr>
-              <w:pStyle w:val="TextodeTabela"/>
-            </w:pPr>
-            <w:r>
-              <w:t xml:space="preserve">Placa nova: </w:t>
-            </w:r>
-            <w:r>
-              <w:rPr>
-                <w:rFonts w:ascii="Courier New" w:hAnsi="Courier New" w:cs="Courier New"/>
-                <w:sz w:val="16"/>
-                <w:szCs w:val="16"/>
-              </w:rPr>
-              <w:t>type*, brand*, model*, color*, year*</w:t>
-            </w:r>
-            <w:r>
-              <w:t>.</w:t>
-            </w:r>
-          </w:p>
         </w:tc>
         <w:tc>
           <w:tcPr>
@@ -42440,26 +42996,10 @@
                 <w:b/>
                 <w:bCs/>
               </w:rPr>
-              <w:t>201</w:t>
-            </w:r>
-            <w:r>
-              <w:t xml:space="preserve"> veículo criado ou vinculado, com o porte definido.</w:t>
-            </w:r>
-          </w:p>
-          <w:p>
-            <w:pPr>
-              <w:pStyle w:val="TextodeTabela"/>
-            </w:pPr>
-            <w:r>
-              <w:t xml:space="preserve">409 </w:t>
-            </w:r>
-            <w:r>
-              <w:rPr>
-                <w:rFonts w:ascii="Courier New" w:hAnsi="Courier New" w:cs="Courier New"/>
-                <w:sz w:val="16"/>
-                <w:szCs w:val="16"/>
-              </w:rPr>
-              <w:t>VEHICLE_ALREADY_LINKED</w:t>
+              <w:t>200</w:t>
+            </w:r>
+            <w:r>
+              <w:t xml:space="preserve"> tipo, marca, modelo, cor e ano do veículo, se a placa já estiver cadastrada, ou resposta vazia.</w:t>
             </w:r>
           </w:p>
         </w:tc>
@@ -42481,7 +43021,7 @@
                 <w:b/>
                 <w:bCs/>
               </w:rPr>
-              <w:t>PATCH</w:t>
+              <w:t>POST</w:t>
             </w:r>
             <w:r>
               <w:t xml:space="preserve"> </w:t>
@@ -42492,6 +43032,131 @@
                 <w:sz w:val="16"/>
                 <w:szCs w:val="16"/>
               </w:rPr>
+              <w:t>/api/admin/clients/:id/vehicles</w:t>
+            </w:r>
+          </w:p>
+          <w:p>
+            <w:pPr>
+              <w:pStyle w:val="TextodeTabela"/>
+            </w:pPr>
+            <w:r>
+              <w:t>Cadastra um veículo para o cliente ou vincula o veículo de uma placa já cadastrada (</w:t>
+            </w:r>
+            <w:hyperlink r:id="rId231" w:anchor="UC18" w:history="1">
+              <w:r>
+                <w:rPr>
+                  <w:rStyle w:val="Hyperlink"/>
+                </w:rPr>
+                <w:t>UC18</w:t>
+              </w:r>
+            </w:hyperlink>
+            <w:r>
+              <w:t>).</w:t>
+            </w:r>
+          </w:p>
+        </w:tc>
+        <w:tc>
+          <w:tcPr>
+            <w:tcW w:w="2600" w:type="dxa"/>
+          </w:tcPr>
+          <w:p>
+            <w:pPr>
+              <w:pStyle w:val="TextodeTabela"/>
+            </w:pPr>
+            <w:r>
+              <w:rPr>
+                <w:rFonts w:ascii="Courier New" w:hAnsi="Courier New" w:cs="Courier New"/>
+                <w:sz w:val="16"/>
+                <w:szCs w:val="16"/>
+              </w:rPr>
+              <w:t>plate*</w:t>
+            </w:r>
+          </w:p>
+          <w:p>
+            <w:pPr>
+              <w:pStyle w:val="TextodeTabela"/>
+            </w:pPr>
+            <w:r>
+              <w:t xml:space="preserve">Placa nova: </w:t>
+            </w:r>
+            <w:r>
+              <w:rPr>
+                <w:rFonts w:ascii="Courier New" w:hAnsi="Courier New" w:cs="Courier New"/>
+                <w:sz w:val="16"/>
+                <w:szCs w:val="16"/>
+              </w:rPr>
+              <w:t>type*, brand*, model*, color*, year*</w:t>
+            </w:r>
+            <w:r>
+              <w:t>.</w:t>
+            </w:r>
+          </w:p>
+        </w:tc>
+        <w:tc>
+          <w:tcPr>
+            <w:tcW w:w="2471" w:type="dxa"/>
+          </w:tcPr>
+          <w:p>
+            <w:pPr>
+              <w:pStyle w:val="TextodeTabela"/>
+            </w:pPr>
+            <w:r>
+              <w:rPr>
+                <w:b/>
+                <w:bCs/>
+              </w:rPr>
+              <w:t>201</w:t>
+            </w:r>
+            <w:r>
+              <w:t xml:space="preserve"> veículo criado ou vinculado, com o porte definido.</w:t>
+            </w:r>
+          </w:p>
+          <w:p>
+            <w:pPr>
+              <w:pStyle w:val="TextodeTabela"/>
+            </w:pPr>
+            <w:r>
+              <w:t xml:space="preserve">409 </w:t>
+            </w:r>
+            <w:r>
+              <w:rPr>
+                <w:rFonts w:ascii="Courier New" w:hAnsi="Courier New" w:cs="Courier New"/>
+                <w:sz w:val="16"/>
+                <w:szCs w:val="16"/>
+              </w:rPr>
+              <w:t>VEHICLE_ALREADY_LINKED</w:t>
+            </w:r>
+          </w:p>
+        </w:tc>
+      </w:tr>
+      <w:tr>
+        <w:trPr>
+          <w:cantSplit/>
+        </w:trPr>
+        <w:tc>
+          <w:tcPr>
+            <w:tcW w:w="4000" w:type="dxa"/>
+          </w:tcPr>
+          <w:p>
+            <w:pPr>
+              <w:pStyle w:val="TextodeTabela"/>
+            </w:pPr>
+            <w:r>
+              <w:rPr>
+                <w:b/>
+                <w:bCs/>
+              </w:rPr>
+              <w:t>PATCH</w:t>
+            </w:r>
+            <w:r>
+              <w:t xml:space="preserve"> </w:t>
+            </w:r>
+            <w:r>
+              <w:rPr>
+                <w:rFonts w:ascii="Courier New" w:hAnsi="Courier New" w:cs="Courier New"/>
+                <w:sz w:val="16"/>
+                <w:szCs w:val="16"/>
+              </w:rPr>
               <w:t>/api/admin/vehicles/:id</w:t>
             </w:r>
           </w:p>
@@ -42502,7 +43167,7 @@
             <w:r>
               <w:t>Edita um veículo, inclusive o vinculado a mais de uma conta (</w:t>
             </w:r>
-            <w:hyperlink r:id="rId231" w:anchor="UC18" w:history="1">
+            <w:hyperlink r:id="rId232" w:anchor="UC18" w:history="1">
               <w:r>
                 <w:rPr>
                   <w:rStyle w:val="Hyperlink"/>
@@ -42743,7 +43408,7 @@
             <w:r>
               <w:t>Lista os funcionários, sem a conta de administrador (</w:t>
             </w:r>
-            <w:hyperlink r:id="rId232" w:anchor="UC20" w:history="1">
+            <w:hyperlink r:id="rId233" w:anchor="UC20" w:history="1">
               <w:r>
                 <w:rPr>
                   <w:rStyle w:val="Hyperlink"/>
@@ -42833,7 +43498,7 @@
             <w:r>
               <w:t>Cadastra um funcionário (</w:t>
             </w:r>
-            <w:hyperlink r:id="rId233" w:anchor="UC19" w:history="1">
+            <w:hyperlink r:id="rId234" w:anchor="UC19" w:history="1">
               <w:r>
                 <w:rPr>
                   <w:rStyle w:val="Hyperlink"/>
@@ -43018,7 +43683,7 @@
             <w:r>
               <w:t>Lista os cargos (</w:t>
             </w:r>
-            <w:hyperlink r:id="rId234" w:anchor="UC21" w:history="1">
+            <w:hyperlink r:id="rId235" w:anchor="UC21" w:history="1">
               <w:r>
                 <w:rPr>
                   <w:rStyle w:val="Hyperlink"/>
@@ -43087,6 +43752,7 @@
                 <w:b/>
                 <w:bCs/>
               </w:rPr>
+              <w:lastRenderedPageBreak/>
               <w:t>POST</w:t>
             </w:r>
             <w:r>
@@ -43449,7 +44115,7 @@
             <w:r>
               <w:t>Dados da empresa (</w:t>
             </w:r>
-            <w:hyperlink r:id="rId235" w:anchor="UC22" w:history="1">
+            <w:hyperlink r:id="rId236" w:anchor="UC22" w:history="1">
               <w:r>
                 <w:rPr>
                   <w:rStyle w:val="Hyperlink"/>
@@ -43613,7 +44279,7 @@
             <w:r>
               <w:t>Disponibilidade (</w:t>
             </w:r>
-            <w:hyperlink r:id="rId236" w:anchor="UC23" w:history="1">
+            <w:hyperlink r:id="rId237" w:anchor="UC23" w:history="1">
               <w:r>
                 <w:rPr>
                   <w:rStyle w:val="Hyperlink"/>
@@ -43791,7 +44457,7 @@
             <w:r>
               <w:t>Percentuais das formas de pagamento (</w:t>
             </w:r>
-            <w:hyperlink r:id="rId237" w:anchor="UC24" w:history="1">
+            <w:hyperlink r:id="rId238" w:anchor="UC24" w:history="1">
               <w:r>
                 <w:rPr>
                   <w:rStyle w:val="Hyperlink"/>
@@ -43938,7 +44604,7 @@
       </w:pPr>
     </w:p>
     <w:sectPr>
-      <w:headerReference w:type="default" r:id="rId238"/>
+      <w:headerReference w:type="default" r:id="rId239"/>
       <w:pgSz w:w="11906" w:h="16838"/>
       <w:pgMar w:top="1701" w:right="1134" w:bottom="1134" w:left="1701" w:header="709" w:footer="709" w:gutter="0"/>
       <w:cols w:space="708"/>
@@ -45341,6 +46007,18 @@
       <w:szCs w:val="18"/>
     </w:rPr>
   </w:style>
+  <w:style w:type="character" w:styleId="MenoPendente">
+    <w:name w:val="Unresolved Mention"/>
+    <w:basedOn w:val="Fontepargpadro"/>
+    <w:uiPriority w:val="99"/>
+    <w:semiHidden/>
+    <w:unhideWhenUsed/>
+    <w:rsid w:val="002E5307"/>
+    <w:rPr>
+      <w:color w:val="605E5C"/>
+      <w:shd w:val="clear" w:color="auto" w:fill="E1DFDD"/>
+    </w:rPr>
+  </w:style>
 </w:styles>
 </file>
 

</xml_diff>

<commit_message>
docs: update the formal documents after #15 and #17 (#20)
Co-authored-by: Claude Opus 5.5 <noreply@anthropic.com>
</commit_message>
<xml_diff>
--- a/documentos-formais/ArquiteturaDoSoftware.docx
+++ b/documentos-formais/ArquiteturaDoSoftware.docx
@@ -240,7 +240,7 @@
       <w:r>
         <w:fldChar w:fldCharType="separate"/>
       </w:r>
-      <w:hyperlink w:anchor="_Toc243219198" w:history="1">
+      <w:hyperlink w:anchor="_Toc243257931" w:history="1">
         <w:r>
           <w:rPr>
             <w:rStyle w:val="Hyperlink"/>
@@ -263,7 +263,7 @@
           <w:rPr>
             <w:webHidden/>
           </w:rPr>
-          <w:instrText xml:space="preserve"> PAGEREF _Toc243219198 \h </w:instrText>
+          <w:instrText xml:space="preserve"> PAGEREF _Toc243257931 \h </w:instrText>
         </w:r>
         <w:r>
           <w:rPr>
@@ -298,7 +298,7 @@
           <w:lang w:eastAsia="pt-BR"/>
         </w:rPr>
       </w:pPr>
-      <w:hyperlink w:anchor="_Toc243219199" w:history="1">
+      <w:hyperlink w:anchor="_Toc243257932" w:history="1">
         <w:r>
           <w:rPr>
             <w:rStyle w:val="Hyperlink"/>
@@ -321,7 +321,7 @@
           <w:rPr>
             <w:webHidden/>
           </w:rPr>
-          <w:instrText xml:space="preserve"> PAGEREF _Toc243219199 \h </w:instrText>
+          <w:instrText xml:space="preserve"> PAGEREF _Toc243257932 \h </w:instrText>
         </w:r>
         <w:r>
           <w:rPr>
@@ -358,7 +358,7 @@
           <w:lang w:eastAsia="pt-BR"/>
         </w:rPr>
       </w:pPr>
-      <w:hyperlink w:anchor="_Toc243219200" w:history="1">
+      <w:hyperlink w:anchor="_Toc243257933" w:history="1">
         <w:r>
           <w:rPr>
             <w:rStyle w:val="Hyperlink"/>
@@ -381,7 +381,7 @@
           <w:rPr>
             <w:webHidden/>
           </w:rPr>
-          <w:instrText xml:space="preserve"> PAGEREF _Toc243219200 \h </w:instrText>
+          <w:instrText xml:space="preserve"> PAGEREF _Toc243257933 \h </w:instrText>
         </w:r>
         <w:r>
           <w:rPr>
@@ -416,7 +416,7 @@
           <w:lang w:eastAsia="pt-BR"/>
         </w:rPr>
       </w:pPr>
-      <w:hyperlink w:anchor="_Toc243219201" w:history="1">
+      <w:hyperlink w:anchor="_Toc243257934" w:history="1">
         <w:r>
           <w:rPr>
             <w:rStyle w:val="Hyperlink"/>
@@ -439,7 +439,7 @@
           <w:rPr>
             <w:webHidden/>
           </w:rPr>
-          <w:instrText xml:space="preserve"> PAGEREF _Toc243219201 \h </w:instrText>
+          <w:instrText xml:space="preserve"> PAGEREF _Toc243257934 \h </w:instrText>
         </w:r>
         <w:r>
           <w:rPr>
@@ -474,7 +474,7 @@
           <w:lang w:eastAsia="pt-BR"/>
         </w:rPr>
       </w:pPr>
-      <w:hyperlink w:anchor="_Toc243219202" w:history="1">
+      <w:hyperlink w:anchor="_Toc243257935" w:history="1">
         <w:r>
           <w:rPr>
             <w:rStyle w:val="Hyperlink"/>
@@ -497,7 +497,7 @@
           <w:rPr>
             <w:webHidden/>
           </w:rPr>
-          <w:instrText xml:space="preserve"> PAGEREF _Toc243219202 \h </w:instrText>
+          <w:instrText xml:space="preserve"> PAGEREF _Toc243257935 \h </w:instrText>
         </w:r>
         <w:r>
           <w:rPr>
@@ -532,7 +532,7 @@
           <w:lang w:eastAsia="pt-BR"/>
         </w:rPr>
       </w:pPr>
-      <w:hyperlink w:anchor="_Toc243219203" w:history="1">
+      <w:hyperlink w:anchor="_Toc243257936" w:history="1">
         <w:r>
           <w:rPr>
             <w:rStyle w:val="Hyperlink"/>
@@ -555,7 +555,7 @@
           <w:rPr>
             <w:webHidden/>
           </w:rPr>
-          <w:instrText xml:space="preserve"> PAGEREF _Toc243219203 \h </w:instrText>
+          <w:instrText xml:space="preserve"> PAGEREF _Toc243257936 \h </w:instrText>
         </w:r>
         <w:r>
           <w:rPr>
@@ -590,7 +590,7 @@
           <w:lang w:eastAsia="pt-BR"/>
         </w:rPr>
       </w:pPr>
-      <w:hyperlink w:anchor="_Toc243219204" w:history="1">
+      <w:hyperlink w:anchor="_Toc243257937" w:history="1">
         <w:r>
           <w:rPr>
             <w:rStyle w:val="Hyperlink"/>
@@ -613,7 +613,7 @@
           <w:rPr>
             <w:webHidden/>
           </w:rPr>
-          <w:instrText xml:space="preserve"> PAGEREF _Toc243219204 \h </w:instrText>
+          <w:instrText xml:space="preserve"> PAGEREF _Toc243257937 \h </w:instrText>
         </w:r>
         <w:r>
           <w:rPr>
@@ -648,7 +648,7 @@
           <w:lang w:eastAsia="pt-BR"/>
         </w:rPr>
       </w:pPr>
-      <w:hyperlink w:anchor="_Toc243219205" w:history="1">
+      <w:hyperlink w:anchor="_Toc243257938" w:history="1">
         <w:r>
           <w:rPr>
             <w:rStyle w:val="Hyperlink"/>
@@ -671,7 +671,7 @@
           <w:rPr>
             <w:webHidden/>
           </w:rPr>
-          <w:instrText xml:space="preserve"> PAGEREF _Toc243219205 \h </w:instrText>
+          <w:instrText xml:space="preserve"> PAGEREF _Toc243257938 \h </w:instrText>
         </w:r>
         <w:r>
           <w:rPr>
@@ -688,7 +688,7 @@
           <w:rPr>
             <w:webHidden/>
           </w:rPr>
-          <w:t>7</w:t>
+          <w:t>8</w:t>
         </w:r>
         <w:r>
           <w:rPr>
@@ -706,7 +706,7 @@
           <w:lang w:eastAsia="pt-BR"/>
         </w:rPr>
       </w:pPr>
-      <w:hyperlink w:anchor="_Toc243219206" w:history="1">
+      <w:hyperlink w:anchor="_Toc243257939" w:history="1">
         <w:r>
           <w:rPr>
             <w:rStyle w:val="Hyperlink"/>
@@ -729,7 +729,7 @@
           <w:rPr>
             <w:webHidden/>
           </w:rPr>
-          <w:instrText xml:space="preserve"> PAGEREF _Toc243219206 \h </w:instrText>
+          <w:instrText xml:space="preserve"> PAGEREF _Toc243257939 \h </w:instrText>
         </w:r>
         <w:r>
           <w:rPr>
@@ -764,7 +764,7 @@
           <w:lang w:eastAsia="pt-BR"/>
         </w:rPr>
       </w:pPr>
-      <w:hyperlink w:anchor="_Toc243219207" w:history="1">
+      <w:hyperlink w:anchor="_Toc243257940" w:history="1">
         <w:r>
           <w:rPr>
             <w:rStyle w:val="Hyperlink"/>
@@ -787,7 +787,7 @@
           <w:rPr>
             <w:webHidden/>
           </w:rPr>
-          <w:instrText xml:space="preserve"> PAGEREF _Toc243219207 \h </w:instrText>
+          <w:instrText xml:space="preserve"> PAGEREF _Toc243257940 \h </w:instrText>
         </w:r>
         <w:r>
           <w:rPr>
@@ -822,7 +822,7 @@
           <w:lang w:eastAsia="pt-BR"/>
         </w:rPr>
       </w:pPr>
-      <w:hyperlink w:anchor="_Toc243219208" w:history="1">
+      <w:hyperlink w:anchor="_Toc243257941" w:history="1">
         <w:r>
           <w:rPr>
             <w:rStyle w:val="Hyperlink"/>
@@ -845,7 +845,7 @@
           <w:rPr>
             <w:webHidden/>
           </w:rPr>
-          <w:instrText xml:space="preserve"> PAGEREF _Toc243219208 \h </w:instrText>
+          <w:instrText xml:space="preserve"> PAGEREF _Toc243257941 \h </w:instrText>
         </w:r>
         <w:r>
           <w:rPr>
@@ -882,7 +882,7 @@
           <w:lang w:eastAsia="pt-BR"/>
         </w:rPr>
       </w:pPr>
-      <w:hyperlink w:anchor="_Toc243219209" w:history="1">
+      <w:hyperlink w:anchor="_Toc243257942" w:history="1">
         <w:r>
           <w:rPr>
             <w:rStyle w:val="Hyperlink"/>
@@ -905,7 +905,7 @@
           <w:rPr>
             <w:webHidden/>
           </w:rPr>
-          <w:instrText xml:space="preserve"> PAGEREF _Toc243219209 \h </w:instrText>
+          <w:instrText xml:space="preserve"> PAGEREF _Toc243257942 \h </w:instrText>
         </w:r>
         <w:r>
           <w:rPr>
@@ -940,7 +940,7 @@
           <w:lang w:eastAsia="pt-BR"/>
         </w:rPr>
       </w:pPr>
-      <w:hyperlink w:anchor="_Toc243219210" w:history="1">
+      <w:hyperlink w:anchor="_Toc243257943" w:history="1">
         <w:r>
           <w:rPr>
             <w:rStyle w:val="Hyperlink"/>
@@ -963,7 +963,7 @@
           <w:rPr>
             <w:webHidden/>
           </w:rPr>
-          <w:instrText xml:space="preserve"> PAGEREF _Toc243219210 \h </w:instrText>
+          <w:instrText xml:space="preserve"> PAGEREF _Toc243257943 \h </w:instrText>
         </w:r>
         <w:r>
           <w:rPr>
@@ -998,7 +998,7 @@
           <w:lang w:eastAsia="pt-BR"/>
         </w:rPr>
       </w:pPr>
-      <w:hyperlink w:anchor="_Toc243219211" w:history="1">
+      <w:hyperlink w:anchor="_Toc243257944" w:history="1">
         <w:r>
           <w:rPr>
             <w:rStyle w:val="Hyperlink"/>
@@ -1021,7 +1021,7 @@
           <w:rPr>
             <w:webHidden/>
           </w:rPr>
-          <w:instrText xml:space="preserve"> PAGEREF _Toc243219211 \h </w:instrText>
+          <w:instrText xml:space="preserve"> PAGEREF _Toc243257944 \h </w:instrText>
         </w:r>
         <w:r>
           <w:rPr>
@@ -1056,7 +1056,7 @@
           <w:lang w:eastAsia="pt-BR"/>
         </w:rPr>
       </w:pPr>
-      <w:hyperlink w:anchor="_Toc243219212" w:history="1">
+      <w:hyperlink w:anchor="_Toc243257945" w:history="1">
         <w:r>
           <w:rPr>
             <w:rStyle w:val="Hyperlink"/>
@@ -1079,7 +1079,7 @@
           <w:rPr>
             <w:webHidden/>
           </w:rPr>
-          <w:instrText xml:space="preserve"> PAGEREF _Toc243219212 \h </w:instrText>
+          <w:instrText xml:space="preserve"> PAGEREF _Toc243257945 \h </w:instrText>
         </w:r>
         <w:r>
           <w:rPr>
@@ -1114,7 +1114,7 @@
           <w:lang w:eastAsia="pt-BR"/>
         </w:rPr>
       </w:pPr>
-      <w:hyperlink w:anchor="_Toc243219213" w:history="1">
+      <w:hyperlink w:anchor="_Toc243257946" w:history="1">
         <w:r>
           <w:rPr>
             <w:rStyle w:val="Hyperlink"/>
@@ -1137,7 +1137,7 @@
           <w:rPr>
             <w:webHidden/>
           </w:rPr>
-          <w:instrText xml:space="preserve"> PAGEREF _Toc243219213 \h </w:instrText>
+          <w:instrText xml:space="preserve"> PAGEREF _Toc243257946 \h </w:instrText>
         </w:r>
         <w:r>
           <w:rPr>
@@ -1172,7 +1172,7 @@
           <w:lang w:eastAsia="pt-BR"/>
         </w:rPr>
       </w:pPr>
-      <w:hyperlink w:anchor="_Toc243219214" w:history="1">
+      <w:hyperlink w:anchor="_Toc243257947" w:history="1">
         <w:r>
           <w:rPr>
             <w:rStyle w:val="Hyperlink"/>
@@ -1195,7 +1195,7 @@
           <w:rPr>
             <w:webHidden/>
           </w:rPr>
-          <w:instrText xml:space="preserve"> PAGEREF _Toc243219214 \h </w:instrText>
+          <w:instrText xml:space="preserve"> PAGEREF _Toc243257947 \h </w:instrText>
         </w:r>
         <w:r>
           <w:rPr>
@@ -1230,7 +1230,7 @@
           <w:lang w:eastAsia="pt-BR"/>
         </w:rPr>
       </w:pPr>
-      <w:hyperlink w:anchor="_Toc243219215" w:history="1">
+      <w:hyperlink w:anchor="_Toc243257948" w:history="1">
         <w:r>
           <w:rPr>
             <w:rStyle w:val="Hyperlink"/>
@@ -1253,7 +1253,7 @@
           <w:rPr>
             <w:webHidden/>
           </w:rPr>
-          <w:instrText xml:space="preserve"> PAGEREF _Toc243219215 \h </w:instrText>
+          <w:instrText xml:space="preserve"> PAGEREF _Toc243257948 \h </w:instrText>
         </w:r>
         <w:r>
           <w:rPr>
@@ -1288,7 +1288,7 @@
           <w:lang w:eastAsia="pt-BR"/>
         </w:rPr>
       </w:pPr>
-      <w:hyperlink w:anchor="_Toc243219216" w:history="1">
+      <w:hyperlink w:anchor="_Toc243257949" w:history="1">
         <w:r>
           <w:rPr>
             <w:rStyle w:val="Hyperlink"/>
@@ -1311,7 +1311,7 @@
           <w:rPr>
             <w:webHidden/>
           </w:rPr>
-          <w:instrText xml:space="preserve"> PAGEREF _Toc243219216 \h </w:instrText>
+          <w:instrText xml:space="preserve"> PAGEREF _Toc243257949 \h </w:instrText>
         </w:r>
         <w:r>
           <w:rPr>
@@ -1346,7 +1346,7 @@
           <w:lang w:eastAsia="pt-BR"/>
         </w:rPr>
       </w:pPr>
-      <w:hyperlink w:anchor="_Toc243219217" w:history="1">
+      <w:hyperlink w:anchor="_Toc243257950" w:history="1">
         <w:r>
           <w:rPr>
             <w:rStyle w:val="Hyperlink"/>
@@ -1369,7 +1369,7 @@
           <w:rPr>
             <w:webHidden/>
           </w:rPr>
-          <w:instrText xml:space="preserve"> PAGEREF _Toc243219217 \h </w:instrText>
+          <w:instrText xml:space="preserve"> PAGEREF _Toc243257950 \h </w:instrText>
         </w:r>
         <w:r>
           <w:rPr>
@@ -1404,7 +1404,7 @@
           <w:lang w:eastAsia="pt-BR"/>
         </w:rPr>
       </w:pPr>
-      <w:hyperlink w:anchor="_Toc243219218" w:history="1">
+      <w:hyperlink w:anchor="_Toc243257951" w:history="1">
         <w:r>
           <w:rPr>
             <w:rStyle w:val="Hyperlink"/>
@@ -1427,7 +1427,7 @@
           <w:rPr>
             <w:webHidden/>
           </w:rPr>
-          <w:instrText xml:space="preserve"> PAGEREF _Toc243219218 \h </w:instrText>
+          <w:instrText xml:space="preserve"> PAGEREF _Toc243257951 \h </w:instrText>
         </w:r>
         <w:r>
           <w:rPr>
@@ -1464,7 +1464,7 @@
           <w:lang w:eastAsia="pt-BR"/>
         </w:rPr>
       </w:pPr>
-      <w:hyperlink w:anchor="_Toc243219219" w:history="1">
+      <w:hyperlink w:anchor="_Toc243257952" w:history="1">
         <w:r>
           <w:rPr>
             <w:rStyle w:val="Hyperlink"/>
@@ -1487,7 +1487,7 @@
           <w:rPr>
             <w:webHidden/>
           </w:rPr>
-          <w:instrText xml:space="preserve"> PAGEREF _Toc243219219 \h </w:instrText>
+          <w:instrText xml:space="preserve"> PAGEREF _Toc243257952 \h </w:instrText>
         </w:r>
         <w:r>
           <w:rPr>
@@ -1522,7 +1522,7 @@
           <w:lang w:eastAsia="pt-BR"/>
         </w:rPr>
       </w:pPr>
-      <w:hyperlink w:anchor="_Toc243219220" w:history="1">
+      <w:hyperlink w:anchor="_Toc243257953" w:history="1">
         <w:r>
           <w:rPr>
             <w:rStyle w:val="Hyperlink"/>
@@ -1545,7 +1545,7 @@
           <w:rPr>
             <w:webHidden/>
           </w:rPr>
-          <w:instrText xml:space="preserve"> PAGEREF _Toc243219220 \h </w:instrText>
+          <w:instrText xml:space="preserve"> PAGEREF _Toc243257953 \h </w:instrText>
         </w:r>
         <w:r>
           <w:rPr>
@@ -1580,7 +1580,7 @@
           <w:lang w:eastAsia="pt-BR"/>
         </w:rPr>
       </w:pPr>
-      <w:hyperlink w:anchor="_Toc243219221" w:history="1">
+      <w:hyperlink w:anchor="_Toc243257954" w:history="1">
         <w:r>
           <w:rPr>
             <w:rStyle w:val="Hyperlink"/>
@@ -1603,7 +1603,7 @@
           <w:rPr>
             <w:webHidden/>
           </w:rPr>
-          <w:instrText xml:space="preserve"> PAGEREF _Toc243219221 \h </w:instrText>
+          <w:instrText xml:space="preserve"> PAGEREF _Toc243257954 \h </w:instrText>
         </w:r>
         <w:r>
           <w:rPr>
@@ -1638,7 +1638,7 @@
           <w:lang w:eastAsia="pt-BR"/>
         </w:rPr>
       </w:pPr>
-      <w:hyperlink w:anchor="_Toc243219222" w:history="1">
+      <w:hyperlink w:anchor="_Toc243257955" w:history="1">
         <w:r>
           <w:rPr>
             <w:rStyle w:val="Hyperlink"/>
@@ -1661,7 +1661,7 @@
           <w:rPr>
             <w:webHidden/>
           </w:rPr>
-          <w:instrText xml:space="preserve"> PAGEREF _Toc243219222 \h </w:instrText>
+          <w:instrText xml:space="preserve"> PAGEREF _Toc243257955 \h </w:instrText>
         </w:r>
         <w:r>
           <w:rPr>
@@ -1696,7 +1696,7 @@
           <w:lang w:eastAsia="pt-BR"/>
         </w:rPr>
       </w:pPr>
-      <w:hyperlink w:anchor="_Toc243219223" w:history="1">
+      <w:hyperlink w:anchor="_Toc243257956" w:history="1">
         <w:r>
           <w:rPr>
             <w:rStyle w:val="Hyperlink"/>
@@ -1719,7 +1719,7 @@
           <w:rPr>
             <w:webHidden/>
           </w:rPr>
-          <w:instrText xml:space="preserve"> PAGEREF _Toc243219223 \h </w:instrText>
+          <w:instrText xml:space="preserve"> PAGEREF _Toc243257956 \h </w:instrText>
         </w:r>
         <w:r>
           <w:rPr>
@@ -1754,7 +1754,7 @@
           <w:lang w:eastAsia="pt-BR"/>
         </w:rPr>
       </w:pPr>
-      <w:hyperlink w:anchor="_Toc243219224" w:history="1">
+      <w:hyperlink w:anchor="_Toc243257957" w:history="1">
         <w:r>
           <w:rPr>
             <w:rStyle w:val="Hyperlink"/>
@@ -1777,7 +1777,7 @@
           <w:rPr>
             <w:webHidden/>
           </w:rPr>
-          <w:instrText xml:space="preserve"> PAGEREF _Toc243219224 \h </w:instrText>
+          <w:instrText xml:space="preserve"> PAGEREF _Toc243257957 \h </w:instrText>
         </w:r>
         <w:r>
           <w:rPr>
@@ -1812,7 +1812,7 @@
           <w:lang w:eastAsia="pt-BR"/>
         </w:rPr>
       </w:pPr>
-      <w:hyperlink w:anchor="_Toc243219225" w:history="1">
+      <w:hyperlink w:anchor="_Toc243257958" w:history="1">
         <w:r>
           <w:rPr>
             <w:rStyle w:val="Hyperlink"/>
@@ -1835,7 +1835,7 @@
           <w:rPr>
             <w:webHidden/>
           </w:rPr>
-          <w:instrText xml:space="preserve"> PAGEREF _Toc243219225 \h </w:instrText>
+          <w:instrText xml:space="preserve"> PAGEREF _Toc243257958 \h </w:instrText>
         </w:r>
         <w:r>
           <w:rPr>
@@ -1872,7 +1872,7 @@
           <w:lang w:eastAsia="pt-BR"/>
         </w:rPr>
       </w:pPr>
-      <w:hyperlink w:anchor="_Toc243219226" w:history="1">
+      <w:hyperlink w:anchor="_Toc243257959" w:history="1">
         <w:r>
           <w:rPr>
             <w:rStyle w:val="Hyperlink"/>
@@ -1895,7 +1895,7 @@
           <w:rPr>
             <w:webHidden/>
           </w:rPr>
-          <w:instrText xml:space="preserve"> PAGEREF _Toc243219226 \h </w:instrText>
+          <w:instrText xml:space="preserve"> PAGEREF _Toc243257959 \h </w:instrText>
         </w:r>
         <w:r>
           <w:rPr>
@@ -1930,7 +1930,7 @@
           <w:lang w:eastAsia="pt-BR"/>
         </w:rPr>
       </w:pPr>
-      <w:hyperlink w:anchor="_Toc243219227" w:history="1">
+      <w:hyperlink w:anchor="_Toc243257960" w:history="1">
         <w:r>
           <w:rPr>
             <w:rStyle w:val="Hyperlink"/>
@@ -1953,7 +1953,7 @@
           <w:rPr>
             <w:webHidden/>
           </w:rPr>
-          <w:instrText xml:space="preserve"> PAGEREF _Toc243219227 \h </w:instrText>
+          <w:instrText xml:space="preserve"> PAGEREF _Toc243257960 \h </w:instrText>
         </w:r>
         <w:r>
           <w:rPr>
@@ -1988,7 +1988,7 @@
           <w:lang w:eastAsia="pt-BR"/>
         </w:rPr>
       </w:pPr>
-      <w:hyperlink w:anchor="_Toc243219228" w:history="1">
+      <w:hyperlink w:anchor="_Toc243257961" w:history="1">
         <w:r>
           <w:rPr>
             <w:rStyle w:val="Hyperlink"/>
@@ -2011,7 +2011,7 @@
           <w:rPr>
             <w:webHidden/>
           </w:rPr>
-          <w:instrText xml:space="preserve"> PAGEREF _Toc243219228 \h </w:instrText>
+          <w:instrText xml:space="preserve"> PAGEREF _Toc243257961 \h </w:instrText>
         </w:r>
         <w:r>
           <w:rPr>
@@ -2028,7 +2028,7 @@
           <w:rPr>
             <w:webHidden/>
           </w:rPr>
-          <w:t>26</w:t>
+          <w:t>27</w:t>
         </w:r>
         <w:r>
           <w:rPr>
@@ -2046,7 +2046,7 @@
           <w:lang w:eastAsia="pt-BR"/>
         </w:rPr>
       </w:pPr>
-      <w:hyperlink w:anchor="_Toc243219229" w:history="1">
+      <w:hyperlink w:anchor="_Toc243257962" w:history="1">
         <w:r>
           <w:rPr>
             <w:rStyle w:val="Hyperlink"/>
@@ -2069,7 +2069,7 @@
           <w:rPr>
             <w:webHidden/>
           </w:rPr>
-          <w:instrText xml:space="preserve"> PAGEREF _Toc243219229 \h </w:instrText>
+          <w:instrText xml:space="preserve"> PAGEREF _Toc243257962 \h </w:instrText>
         </w:r>
         <w:r>
           <w:rPr>
@@ -2086,7 +2086,7 @@
           <w:rPr>
             <w:webHidden/>
           </w:rPr>
-          <w:t>36</w:t>
+          <w:t>38</w:t>
         </w:r>
         <w:r>
           <w:rPr>
@@ -2106,7 +2106,7 @@
           <w:lang w:eastAsia="pt-BR"/>
         </w:rPr>
       </w:pPr>
-      <w:hyperlink w:anchor="_Toc243219230" w:history="1">
+      <w:hyperlink w:anchor="_Toc243257963" w:history="1">
         <w:r>
           <w:rPr>
             <w:rStyle w:val="Hyperlink"/>
@@ -2129,7 +2129,7 @@
           <w:rPr>
             <w:webHidden/>
           </w:rPr>
-          <w:instrText xml:space="preserve"> PAGEREF _Toc243219230 \h </w:instrText>
+          <w:instrText xml:space="preserve"> PAGEREF _Toc243257963 \h </w:instrText>
         </w:r>
         <w:r>
           <w:rPr>
@@ -2146,7 +2146,7 @@
           <w:rPr>
             <w:webHidden/>
           </w:rPr>
-          <w:t>39</w:t>
+          <w:t>40</w:t>
         </w:r>
         <w:r>
           <w:rPr>
@@ -2164,7 +2164,7 @@
           <w:lang w:eastAsia="pt-BR"/>
         </w:rPr>
       </w:pPr>
-      <w:hyperlink w:anchor="_Toc243219231" w:history="1">
+      <w:hyperlink w:anchor="_Toc243257964" w:history="1">
         <w:r>
           <w:rPr>
             <w:rStyle w:val="Hyperlink"/>
@@ -2187,7 +2187,7 @@
           <w:rPr>
             <w:webHidden/>
           </w:rPr>
-          <w:instrText xml:space="preserve"> PAGEREF _Toc243219231 \h </w:instrText>
+          <w:instrText xml:space="preserve"> PAGEREF _Toc243257964 \h </w:instrText>
         </w:r>
         <w:r>
           <w:rPr>
@@ -2204,7 +2204,7 @@
           <w:rPr>
             <w:webHidden/>
           </w:rPr>
-          <w:t>39</w:t>
+          <w:t>40</w:t>
         </w:r>
         <w:r>
           <w:rPr>
@@ -2222,7 +2222,7 @@
           <w:lang w:eastAsia="pt-BR"/>
         </w:rPr>
       </w:pPr>
-      <w:hyperlink w:anchor="_Toc243219232" w:history="1">
+      <w:hyperlink w:anchor="_Toc243257965" w:history="1">
         <w:r>
           <w:rPr>
             <w:rStyle w:val="Hyperlink"/>
@@ -2245,7 +2245,7 @@
           <w:rPr>
             <w:webHidden/>
           </w:rPr>
-          <w:instrText xml:space="preserve"> PAGEREF _Toc243219232 \h </w:instrText>
+          <w:instrText xml:space="preserve"> PAGEREF _Toc243257965 \h </w:instrText>
         </w:r>
         <w:r>
           <w:rPr>
@@ -2262,7 +2262,7 @@
           <w:rPr>
             <w:webHidden/>
           </w:rPr>
-          <w:t>40</w:t>
+          <w:t>41</w:t>
         </w:r>
         <w:r>
           <w:rPr>
@@ -2280,7 +2280,7 @@
           <w:lang w:eastAsia="pt-BR"/>
         </w:rPr>
       </w:pPr>
-      <w:hyperlink w:anchor="_Toc243219233" w:history="1">
+      <w:hyperlink w:anchor="_Toc243257966" w:history="1">
         <w:r>
           <w:rPr>
             <w:rStyle w:val="Hyperlink"/>
@@ -2303,7 +2303,7 @@
           <w:rPr>
             <w:webHidden/>
           </w:rPr>
-          <w:instrText xml:space="preserve"> PAGEREF _Toc243219233 \h </w:instrText>
+          <w:instrText xml:space="preserve"> PAGEREF _Toc243257966 \h </w:instrText>
         </w:r>
         <w:r>
           <w:rPr>
@@ -2320,7 +2320,7 @@
           <w:rPr>
             <w:webHidden/>
           </w:rPr>
-          <w:t>41</w:t>
+          <w:t>42</w:t>
         </w:r>
         <w:r>
           <w:rPr>
@@ -2338,7 +2338,7 @@
           <w:lang w:eastAsia="pt-BR"/>
         </w:rPr>
       </w:pPr>
-      <w:hyperlink w:anchor="_Toc243219234" w:history="1">
+      <w:hyperlink w:anchor="_Toc243257967" w:history="1">
         <w:r>
           <w:rPr>
             <w:rStyle w:val="Hyperlink"/>
@@ -2361,7 +2361,7 @@
           <w:rPr>
             <w:webHidden/>
           </w:rPr>
-          <w:instrText xml:space="preserve"> PAGEREF _Toc243219234 \h </w:instrText>
+          <w:instrText xml:space="preserve"> PAGEREF _Toc243257967 \h </w:instrText>
         </w:r>
         <w:r>
           <w:rPr>
@@ -2378,7 +2378,7 @@
           <w:rPr>
             <w:webHidden/>
           </w:rPr>
-          <w:t>42</w:t>
+          <w:t>43</w:t>
         </w:r>
         <w:r>
           <w:rPr>
@@ -2396,7 +2396,7 @@
           <w:lang w:eastAsia="pt-BR"/>
         </w:rPr>
       </w:pPr>
-      <w:hyperlink w:anchor="_Toc243219235" w:history="1">
+      <w:hyperlink w:anchor="_Toc243257968" w:history="1">
         <w:r>
           <w:rPr>
             <w:rStyle w:val="Hyperlink"/>
@@ -2419,7 +2419,7 @@
           <w:rPr>
             <w:webHidden/>
           </w:rPr>
-          <w:instrText xml:space="preserve"> PAGEREF _Toc243219235 \h </w:instrText>
+          <w:instrText xml:space="preserve"> PAGEREF _Toc243257968 \h </w:instrText>
         </w:r>
         <w:r>
           <w:rPr>
@@ -2436,7 +2436,7 @@
           <w:rPr>
             <w:webHidden/>
           </w:rPr>
-          <w:t>44</w:t>
+          <w:t>45</w:t>
         </w:r>
         <w:r>
           <w:rPr>
@@ -2454,7 +2454,7 @@
           <w:lang w:eastAsia="pt-BR"/>
         </w:rPr>
       </w:pPr>
-      <w:hyperlink w:anchor="_Toc243219236" w:history="1">
+      <w:hyperlink w:anchor="_Toc243257969" w:history="1">
         <w:r>
           <w:rPr>
             <w:rStyle w:val="Hyperlink"/>
@@ -2477,7 +2477,7 @@
           <w:rPr>
             <w:webHidden/>
           </w:rPr>
-          <w:instrText xml:space="preserve"> PAGEREF _Toc243219236 \h </w:instrText>
+          <w:instrText xml:space="preserve"> PAGEREF _Toc243257969 \h </w:instrText>
         </w:r>
         <w:r>
           <w:rPr>
@@ -2494,7 +2494,7 @@
           <w:rPr>
             <w:webHidden/>
           </w:rPr>
-          <w:t>45</w:t>
+          <w:t>46</w:t>
         </w:r>
         <w:r>
           <w:rPr>
@@ -2514,7 +2514,7 @@
           <w:lang w:eastAsia="pt-BR"/>
         </w:rPr>
       </w:pPr>
-      <w:hyperlink w:anchor="_Toc243219237" w:history="1">
+      <w:hyperlink w:anchor="_Toc243257970" w:history="1">
         <w:r>
           <w:rPr>
             <w:rStyle w:val="Hyperlink"/>
@@ -2537,7 +2537,7 @@
           <w:rPr>
             <w:webHidden/>
           </w:rPr>
-          <w:instrText xml:space="preserve"> PAGEREF _Toc243219237 \h </w:instrText>
+          <w:instrText xml:space="preserve"> PAGEREF _Toc243257970 \h </w:instrText>
         </w:r>
         <w:r>
           <w:rPr>
@@ -2554,7 +2554,7 @@
           <w:rPr>
             <w:webHidden/>
           </w:rPr>
-          <w:t>46</w:t>
+          <w:t>47</w:t>
         </w:r>
         <w:r>
           <w:rPr>
@@ -2574,7 +2574,7 @@
           <w:lang w:eastAsia="pt-BR"/>
         </w:rPr>
       </w:pPr>
-      <w:hyperlink w:anchor="_Toc243219238" w:history="1">
+      <w:hyperlink w:anchor="_Toc243257971" w:history="1">
         <w:r>
           <w:rPr>
             <w:rStyle w:val="Hyperlink"/>
@@ -2597,7 +2597,7 @@
           <w:rPr>
             <w:webHidden/>
           </w:rPr>
-          <w:instrText xml:space="preserve"> PAGEREF _Toc243219238 \h </w:instrText>
+          <w:instrText xml:space="preserve"> PAGEREF _Toc243257971 \h </w:instrText>
         </w:r>
         <w:r>
           <w:rPr>
@@ -2614,7 +2614,7 @@
           <w:rPr>
             <w:webHidden/>
           </w:rPr>
-          <w:t>49</w:t>
+          <w:t>50</w:t>
         </w:r>
         <w:r>
           <w:rPr>
@@ -2632,7 +2632,7 @@
           <w:lang w:eastAsia="pt-BR"/>
         </w:rPr>
       </w:pPr>
-      <w:hyperlink w:anchor="_Toc243219239" w:history="1">
+      <w:hyperlink w:anchor="_Toc243257972" w:history="1">
         <w:r>
           <w:rPr>
             <w:rStyle w:val="Hyperlink"/>
@@ -2655,7 +2655,7 @@
           <w:rPr>
             <w:webHidden/>
           </w:rPr>
-          <w:instrText xml:space="preserve"> PAGEREF _Toc243219239 \h </w:instrText>
+          <w:instrText xml:space="preserve"> PAGEREF _Toc243257972 \h </w:instrText>
         </w:r>
         <w:r>
           <w:rPr>
@@ -2672,7 +2672,7 @@
           <w:rPr>
             <w:webHidden/>
           </w:rPr>
-          <w:t>49</w:t>
+          <w:t>50</w:t>
         </w:r>
         <w:r>
           <w:rPr>
@@ -2690,7 +2690,7 @@
           <w:lang w:eastAsia="pt-BR"/>
         </w:rPr>
       </w:pPr>
-      <w:hyperlink w:anchor="_Toc243219240" w:history="1">
+      <w:hyperlink w:anchor="_Toc243257973" w:history="1">
         <w:r>
           <w:rPr>
             <w:rStyle w:val="Hyperlink"/>
@@ -2713,7 +2713,7 @@
           <w:rPr>
             <w:webHidden/>
           </w:rPr>
-          <w:instrText xml:space="preserve"> PAGEREF _Toc243219240 \h </w:instrText>
+          <w:instrText xml:space="preserve"> PAGEREF _Toc243257973 \h </w:instrText>
         </w:r>
         <w:r>
           <w:rPr>
@@ -2730,7 +2730,7 @@
           <w:rPr>
             <w:webHidden/>
           </w:rPr>
-          <w:t>49</w:t>
+          <w:t>50</w:t>
         </w:r>
         <w:r>
           <w:rPr>
@@ -2748,7 +2748,7 @@
           <w:lang w:eastAsia="pt-BR"/>
         </w:rPr>
       </w:pPr>
-      <w:hyperlink w:anchor="_Toc243219241" w:history="1">
+      <w:hyperlink w:anchor="_Toc243257974" w:history="1">
         <w:r>
           <w:rPr>
             <w:rStyle w:val="Hyperlink"/>
@@ -2771,7 +2771,7 @@
           <w:rPr>
             <w:webHidden/>
           </w:rPr>
-          <w:instrText xml:space="preserve"> PAGEREF _Toc243219241 \h </w:instrText>
+          <w:instrText xml:space="preserve"> PAGEREF _Toc243257974 \h </w:instrText>
         </w:r>
         <w:r>
           <w:rPr>
@@ -2788,7 +2788,7 @@
           <w:rPr>
             <w:webHidden/>
           </w:rPr>
-          <w:t>50</w:t>
+          <w:t>51</w:t>
         </w:r>
         <w:r>
           <w:rPr>
@@ -2806,7 +2806,7 @@
           <w:lang w:eastAsia="pt-BR"/>
         </w:rPr>
       </w:pPr>
-      <w:hyperlink w:anchor="_Toc243219242" w:history="1">
+      <w:hyperlink w:anchor="_Toc243257975" w:history="1">
         <w:r>
           <w:rPr>
             <w:rStyle w:val="Hyperlink"/>
@@ -2829,7 +2829,7 @@
           <w:rPr>
             <w:webHidden/>
           </w:rPr>
-          <w:instrText xml:space="preserve"> PAGEREF _Toc243219242 \h </w:instrText>
+          <w:instrText xml:space="preserve"> PAGEREF _Toc243257975 \h </w:instrText>
         </w:r>
         <w:r>
           <w:rPr>
@@ -2846,7 +2846,7 @@
           <w:rPr>
             <w:webHidden/>
           </w:rPr>
-          <w:t>51</w:t>
+          <w:t>52</w:t>
         </w:r>
         <w:r>
           <w:rPr>
@@ -2864,7 +2864,7 @@
           <w:lang w:eastAsia="pt-BR"/>
         </w:rPr>
       </w:pPr>
-      <w:hyperlink w:anchor="_Toc243219243" w:history="1">
+      <w:hyperlink w:anchor="_Toc243257976" w:history="1">
         <w:r>
           <w:rPr>
             <w:rStyle w:val="Hyperlink"/>
@@ -2887,7 +2887,7 @@
           <w:rPr>
             <w:webHidden/>
           </w:rPr>
-          <w:instrText xml:space="preserve"> PAGEREF _Toc243219243 \h </w:instrText>
+          <w:instrText xml:space="preserve"> PAGEREF _Toc243257976 \h </w:instrText>
         </w:r>
         <w:r>
           <w:rPr>
@@ -2904,7 +2904,7 @@
           <w:rPr>
             <w:webHidden/>
           </w:rPr>
-          <w:t>52</w:t>
+          <w:t>53</w:t>
         </w:r>
         <w:r>
           <w:rPr>
@@ -2922,7 +2922,7 @@
           <w:lang w:eastAsia="pt-BR"/>
         </w:rPr>
       </w:pPr>
-      <w:hyperlink w:anchor="_Toc243219244" w:history="1">
+      <w:hyperlink w:anchor="_Toc243257977" w:history="1">
         <w:r>
           <w:rPr>
             <w:rStyle w:val="Hyperlink"/>
@@ -2945,7 +2945,7 @@
           <w:rPr>
             <w:webHidden/>
           </w:rPr>
-          <w:instrText xml:space="preserve"> PAGEREF _Toc243219244 \h </w:instrText>
+          <w:instrText xml:space="preserve"> PAGEREF _Toc243257977 \h </w:instrText>
         </w:r>
         <w:r>
           <w:rPr>
@@ -2962,7 +2962,7 @@
           <w:rPr>
             <w:webHidden/>
           </w:rPr>
-          <w:t>53</w:t>
+          <w:t>54</w:t>
         </w:r>
         <w:r>
           <w:rPr>
@@ -2982,7 +2982,7 @@
           <w:lang w:eastAsia="pt-BR"/>
         </w:rPr>
       </w:pPr>
-      <w:hyperlink w:anchor="_Toc243219245" w:history="1">
+      <w:hyperlink w:anchor="_Toc243257978" w:history="1">
         <w:r>
           <w:rPr>
             <w:rStyle w:val="Hyperlink"/>
@@ -3005,7 +3005,7 @@
           <w:rPr>
             <w:webHidden/>
           </w:rPr>
-          <w:instrText xml:space="preserve"> PAGEREF _Toc243219245 \h </w:instrText>
+          <w:instrText xml:space="preserve"> PAGEREF _Toc243257978 \h </w:instrText>
         </w:r>
         <w:r>
           <w:rPr>
@@ -3022,7 +3022,7 @@
           <w:rPr>
             <w:webHidden/>
           </w:rPr>
-          <w:t>55</w:t>
+          <w:t>56</w:t>
         </w:r>
         <w:r>
           <w:rPr>
@@ -3042,7 +3042,7 @@
           <w:lang w:eastAsia="pt-BR"/>
         </w:rPr>
       </w:pPr>
-      <w:hyperlink w:anchor="_Toc243219246" w:history="1">
+      <w:hyperlink w:anchor="_Toc243257979" w:history="1">
         <w:r>
           <w:rPr>
             <w:rStyle w:val="Hyperlink"/>
@@ -3065,7 +3065,7 @@
           <w:rPr>
             <w:webHidden/>
           </w:rPr>
-          <w:instrText xml:space="preserve"> PAGEREF _Toc243219246 \h </w:instrText>
+          <w:instrText xml:space="preserve"> PAGEREF _Toc243257979 \h </w:instrText>
         </w:r>
         <w:r>
           <w:rPr>
@@ -3082,7 +3082,7 @@
           <w:rPr>
             <w:webHidden/>
           </w:rPr>
-          <w:t>58</w:t>
+          <w:t>60</w:t>
         </w:r>
         <w:r>
           <w:rPr>
@@ -3100,7 +3100,7 @@
           <w:lang w:eastAsia="pt-BR"/>
         </w:rPr>
       </w:pPr>
-      <w:hyperlink w:anchor="_Toc243219247" w:history="1">
+      <w:hyperlink w:anchor="_Toc243257980" w:history="1">
         <w:r>
           <w:rPr>
             <w:rStyle w:val="Hyperlink"/>
@@ -3123,7 +3123,7 @@
           <w:rPr>
             <w:webHidden/>
           </w:rPr>
-          <w:instrText xml:space="preserve"> PAGEREF _Toc243219247 \h </w:instrText>
+          <w:instrText xml:space="preserve"> PAGEREF _Toc243257980 \h </w:instrText>
         </w:r>
         <w:r>
           <w:rPr>
@@ -3140,7 +3140,7 @@
           <w:rPr>
             <w:webHidden/>
           </w:rPr>
-          <w:t>58</w:t>
+          <w:t>60</w:t>
         </w:r>
         <w:r>
           <w:rPr>
@@ -3158,7 +3158,7 @@
           <w:lang w:eastAsia="pt-BR"/>
         </w:rPr>
       </w:pPr>
-      <w:hyperlink w:anchor="_Toc243219248" w:history="1">
+      <w:hyperlink w:anchor="_Toc243257981" w:history="1">
         <w:r>
           <w:rPr>
             <w:rStyle w:val="Hyperlink"/>
@@ -3181,7 +3181,7 @@
           <w:rPr>
             <w:webHidden/>
           </w:rPr>
-          <w:instrText xml:space="preserve"> PAGEREF _Toc243219248 \h </w:instrText>
+          <w:instrText xml:space="preserve"> PAGEREF _Toc243257981 \h </w:instrText>
         </w:r>
         <w:r>
           <w:rPr>
@@ -3198,7 +3198,7 @@
           <w:rPr>
             <w:webHidden/>
           </w:rPr>
-          <w:t>59</w:t>
+          <w:t>61</w:t>
         </w:r>
         <w:r>
           <w:rPr>
@@ -3216,7 +3216,7 @@
           <w:lang w:eastAsia="pt-BR"/>
         </w:rPr>
       </w:pPr>
-      <w:hyperlink w:anchor="_Toc243219249" w:history="1">
+      <w:hyperlink w:anchor="_Toc243257982" w:history="1">
         <w:r>
           <w:rPr>
             <w:rStyle w:val="Hyperlink"/>
@@ -3239,7 +3239,7 @@
           <w:rPr>
             <w:webHidden/>
           </w:rPr>
-          <w:instrText xml:space="preserve"> PAGEREF _Toc243219249 \h </w:instrText>
+          <w:instrText xml:space="preserve"> PAGEREF _Toc243257982 \h </w:instrText>
         </w:r>
         <w:r>
           <w:rPr>
@@ -3256,7 +3256,7 @@
           <w:rPr>
             <w:webHidden/>
           </w:rPr>
-          <w:t>59</w:t>
+          <w:t>61</w:t>
         </w:r>
         <w:r>
           <w:rPr>
@@ -3274,7 +3274,7 @@
           <w:lang w:eastAsia="pt-BR"/>
         </w:rPr>
       </w:pPr>
-      <w:hyperlink w:anchor="_Toc243219250" w:history="1">
+      <w:hyperlink w:anchor="_Toc243257983" w:history="1">
         <w:r>
           <w:rPr>
             <w:rStyle w:val="Hyperlink"/>
@@ -3297,7 +3297,7 @@
           <w:rPr>
             <w:webHidden/>
           </w:rPr>
-          <w:instrText xml:space="preserve"> PAGEREF _Toc243219250 \h </w:instrText>
+          <w:instrText xml:space="preserve"> PAGEREF _Toc243257983 \h </w:instrText>
         </w:r>
         <w:r>
           <w:rPr>
@@ -3314,7 +3314,7 @@
           <w:rPr>
             <w:webHidden/>
           </w:rPr>
-          <w:t>61</w:t>
+          <w:t>63</w:t>
         </w:r>
         <w:r>
           <w:rPr>
@@ -3346,7 +3346,7 @@
       <w:pPr>
         <w:pStyle w:val="Ttulo1"/>
       </w:pPr>
-      <w:bookmarkStart w:id="0" w:name="_Toc243219198"/>
+      <w:bookmarkStart w:id="0" w:name="_Toc243257931"/>
       <w:r>
         <w:lastRenderedPageBreak/>
         <w:t>INTRODUÇÃO</w:t>
@@ -3401,7 +3401,7 @@
       <w:pPr>
         <w:pStyle w:val="Ttulo2"/>
       </w:pPr>
-      <w:bookmarkStart w:id="1" w:name="_Toc243219199"/>
+      <w:bookmarkStart w:id="1" w:name="_Toc243257932"/>
       <w:r>
         <w:t>Convenções Adotadas</w:t>
       </w:r>
@@ -3460,8 +3460,9 @@
       <w:pPr>
         <w:pStyle w:val="Ttulo1"/>
       </w:pPr>
-      <w:bookmarkStart w:id="2" w:name="_Toc243219200"/>
-      <w:r>
+      <w:bookmarkStart w:id="2" w:name="_Toc243257933"/>
+      <w:r>
+        <w:lastRenderedPageBreak/>
         <w:t>VISÃO GERAL</w:t>
       </w:r>
       <w:bookmarkEnd w:id="2"/>
@@ -3565,7 +3566,7 @@
       <w:pPr>
         <w:pStyle w:val="Ttulo2"/>
       </w:pPr>
-      <w:bookmarkStart w:id="3" w:name="_Toc243219201"/>
+      <w:bookmarkStart w:id="3" w:name="_Toc243257934"/>
       <w:r>
         <w:t>Componentes da Solução</w:t>
       </w:r>
@@ -3665,8 +3666,9 @@
       <w:pPr>
         <w:pStyle w:val="Ttulo2"/>
       </w:pPr>
-      <w:bookmarkStart w:id="4" w:name="_Toc243219202"/>
-      <w:r>
+      <w:bookmarkStart w:id="4" w:name="_Toc243257935"/>
+      <w:r>
+        <w:lastRenderedPageBreak/>
         <w:t>Tecnologias</w:t>
       </w:r>
       <w:bookmarkEnd w:id="4"/>
@@ -4610,7 +4612,10 @@
               <w:pStyle w:val="TextodeTabela"/>
             </w:pPr>
             <w:r>
-              <w:t>Testes e qualidade</w:t>
+              <w:rPr>
+                <w:i/>
+              </w:rPr>
+              <w:t>Migrations</w:t>
             </w:r>
           </w:p>
         </w:tc>
@@ -4623,7 +4628,7 @@
               <w:pStyle w:val="TextodeTabela"/>
             </w:pPr>
             <w:r>
-              <w:t>Vitest, ESLint e Prettier</w:t>
+              <w:t>Supabase CLI</w:t>
             </w:r>
           </w:p>
         </w:tc>
@@ -4637,7 +4642,7 @@
               <w:jc w:val="center"/>
             </w:pPr>
             <w:r>
-              <w:t>5.0, 9 e 3.9</w:t>
+              <w:t>2.120</w:t>
             </w:r>
           </w:p>
         </w:tc>
@@ -4650,7 +4655,16 @@
               <w:pStyle w:val="TextodeTabela"/>
             </w:pPr>
             <w:r>
-              <w:t>Testes das regras de negócio, análise estática e formatação automática do código.</w:t>
+              <w:t xml:space="preserve">Conferência das </w:t>
+            </w:r>
+            <w:r>
+              <w:rPr>
+                <w:i/>
+              </w:rPr>
+              <w:t>migrations</w:t>
+            </w:r>
+            <w:r>
+              <w:t xml:space="preserve"> num banco local, no Docker, e aplicação delas no projeto.</w:t>
             </w:r>
           </w:p>
         </w:tc>
@@ -4668,7 +4682,7 @@
               <w:pStyle w:val="TextodeTabela"/>
             </w:pPr>
             <w:r>
-              <w:t>Versionamento</w:t>
+              <w:t>Testes e qualidade</w:t>
             </w:r>
           </w:p>
         </w:tc>
@@ -4681,7 +4695,7 @@
               <w:pStyle w:val="TextodeTabela"/>
             </w:pPr>
             <w:r>
-              <w:t>Git, GitHub e GitHub Actions</w:t>
+              <w:t>Vitest, ESLint e Prettier</w:t>
             </w:r>
           </w:p>
         </w:tc>
@@ -4695,7 +4709,7 @@
               <w:jc w:val="center"/>
             </w:pPr>
             <w:r>
-              <w:t>Serviço</w:t>
+              <w:t>5.0, 9 e 3.9</w:t>
             </w:r>
           </w:p>
         </w:tc>
@@ -4708,7 +4722,7 @@
               <w:pStyle w:val="TextodeTabela"/>
             </w:pPr>
             <w:r>
-              <w:t>Repositório do código e verificação automática a cada alteração.</w:t>
+              <w:t>Testes das regras de negócio, análise estática e formatação automática do código.</w:t>
             </w:r>
           </w:p>
         </w:tc>
@@ -4726,6 +4740,64 @@
               <w:pStyle w:val="TextodeTabela"/>
             </w:pPr>
             <w:r>
+              <w:t>Versionamento</w:t>
+            </w:r>
+          </w:p>
+        </w:tc>
+        <w:tc>
+          <w:tcPr>
+            <w:tcW w:w="2500" w:type="dxa"/>
+          </w:tcPr>
+          <w:p>
+            <w:pPr>
+              <w:pStyle w:val="TextodeTabela"/>
+            </w:pPr>
+            <w:r>
+              <w:t>Git, GitHub e GitHub Actions</w:t>
+            </w:r>
+          </w:p>
+        </w:tc>
+        <w:tc>
+          <w:tcPr>
+            <w:tcW w:w="1300" w:type="dxa"/>
+          </w:tcPr>
+          <w:p>
+            <w:pPr>
+              <w:pStyle w:val="TextodeTabela"/>
+              <w:jc w:val="center"/>
+            </w:pPr>
+            <w:r>
+              <w:t>Serviço</w:t>
+            </w:r>
+          </w:p>
+        </w:tc>
+        <w:tc>
+          <w:tcPr>
+            <w:tcW w:w="3371" w:type="dxa"/>
+          </w:tcPr>
+          <w:p>
+            <w:pPr>
+              <w:pStyle w:val="TextodeTabela"/>
+            </w:pPr>
+            <w:r>
+              <w:t>Repositório do código e verificação automática a cada alteração.</w:t>
+            </w:r>
+          </w:p>
+        </w:tc>
+      </w:tr>
+      <w:tr>
+        <w:trPr>
+          <w:cantSplit/>
+        </w:trPr>
+        <w:tc>
+          <w:tcPr>
+            <w:tcW w:w="1900" w:type="dxa"/>
+          </w:tcPr>
+          <w:p>
+            <w:pPr>
+              <w:pStyle w:val="TextodeTabela"/>
+            </w:pPr>
+            <w:r>
               <w:t>Hospedagem</w:t>
             </w:r>
           </w:p>
@@ -4778,6 +4850,7 @@
         <w:spacing w:before="240"/>
       </w:pPr>
       <w:r>
+        <w:lastRenderedPageBreak/>
         <w:t xml:space="preserve">Quatro dessas versões foram definidas por compatibilidade. O Node.js 24 é a versão com suporte de longo prazo, adotada como padrão pela Vercel e suportada pelo Vitest 5. O React 19 é a linha atual, suportada pelo Next.js 16. O TypeScript permanece na linha 6.0, e não na 7.0, porque as regras de análise estática para TypeScript utilizadas pela configuração de ESLint do Next.js ainda não suportam a linha 7. O ESLint permanece na linha 9, e não na 10, porque essa mesma configuração do Next.js ainda não aceita a linha 10; a escolha é revista a cada atualização do Next.js. As versões exatas de todas as dependências ficam registradas no arquivo </w:t>
       </w:r>
       <w:r>
@@ -4796,7 +4869,7 @@
       <w:pPr>
         <w:pStyle w:val="Ttulo2"/>
       </w:pPr>
-      <w:bookmarkStart w:id="5" w:name="_Toc243219203"/>
+      <w:bookmarkStart w:id="5" w:name="_Toc243257936"/>
       <w:r>
         <w:t>Princípios de Arquitetura</w:t>
       </w:r>
@@ -4917,7 +4990,7 @@
       <w:pPr>
         <w:pStyle w:val="Ttulo2"/>
       </w:pPr>
-      <w:bookmarkStart w:id="6" w:name="_Toc243219204"/>
+      <w:bookmarkStart w:id="6" w:name="_Toc243257937"/>
       <w:r>
         <w:t>Padrões de Código</w:t>
       </w:r>
@@ -4945,8 +5018,9 @@
       <w:pPr>
         <w:pStyle w:val="Ttulo3"/>
       </w:pPr>
-      <w:bookmarkStart w:id="7" w:name="_Toc243219205"/>
-      <w:r>
+      <w:bookmarkStart w:id="7" w:name="_Toc243257938"/>
+      <w:r>
+        <w:lastRenderedPageBreak/>
         <w:t>Nomenclatura</w:t>
       </w:r>
       <w:bookmarkEnd w:id="7"/>
@@ -5717,7 +5791,7 @@
       <w:pPr>
         <w:pStyle w:val="Ttulo3"/>
       </w:pPr>
-      <w:bookmarkStart w:id="8" w:name="_Toc243219206"/>
+      <w:bookmarkStart w:id="8" w:name="_Toc243257939"/>
       <w:r>
         <w:t>Funções e Módulos</w:t>
       </w:r>
@@ -5766,6 +5840,7 @@
         </w:numPr>
       </w:pPr>
       <w:r>
+        <w:lastRenderedPageBreak/>
         <w:t>as funções são curtas: uma função que não cabe em uma tela é sinal de que faz mais de uma coisa e deve ser dividida. Funções com mais de três parâmetros recebem um objeto com campos nomeados;</w:t>
       </w:r>
     </w:p>
@@ -5877,7 +5952,7 @@
       <w:pPr>
         <w:pStyle w:val="Ttulo3"/>
       </w:pPr>
-      <w:bookmarkStart w:id="9" w:name="_Toc243219207"/>
+      <w:bookmarkStart w:id="9" w:name="_Toc243257940"/>
       <w:r>
         <w:t>Tipos, Constantes e Valores Ausentes</w:t>
       </w:r>
@@ -6008,8 +6083,9 @@
       <w:pPr>
         <w:pStyle w:val="Ttulo3"/>
       </w:pPr>
-      <w:bookmarkStart w:id="10" w:name="_Toc243219208"/>
-      <w:r>
+      <w:bookmarkStart w:id="10" w:name="_Toc243257941"/>
+      <w:r>
+        <w:lastRenderedPageBreak/>
         <w:t>Comentários e Formatação</w:t>
       </w:r>
       <w:bookmarkEnd w:id="10"/>
@@ -6075,8 +6151,9 @@
       <w:pPr>
         <w:pStyle w:val="Ttulo1"/>
       </w:pPr>
-      <w:bookmarkStart w:id="11" w:name="_Toc243219209"/>
-      <w:r>
+      <w:bookmarkStart w:id="11" w:name="_Toc243257942"/>
+      <w:r>
+        <w:lastRenderedPageBreak/>
         <w:t>FRONTEND</w:t>
       </w:r>
       <w:bookmarkEnd w:id="11"/>
@@ -6113,7 +6190,7 @@
       <w:pPr>
         <w:pStyle w:val="Ttulo2"/>
       </w:pPr>
-      <w:bookmarkStart w:id="12" w:name="_Toc243219210"/>
+      <w:bookmarkStart w:id="12" w:name="_Toc243257943"/>
       <w:r>
         <w:t>Estrutura</w:t>
       </w:r>
@@ -6456,14 +6533,18 @@
         </w:r>
       </w:hyperlink>
       <w:r>
-        <w:t>); as funções de exibição de valores, telefones, placas, CNPJ e datas; o catálogo de códigos de erro e de mensagens ao usuário; e os tipos das respostas. Assim, cada regra de formato e cada mensagem existe em um só lugar.</w:t>
+        <w:t xml:space="preserve">); as funções de exibição de valores, telefones, placas, CNPJ e datas; o catálogo de </w:t>
+      </w:r>
+      <w:r>
+        <w:lastRenderedPageBreak/>
+        <w:t>códigos de erro e de mensagens ao usuário; e os tipos das respostas. Assim, cada regra de formato e cada mensagem existe em um só lugar.</w:t>
       </w:r>
     </w:p>
     <w:p>
       <w:pPr>
         <w:pStyle w:val="Ttulo2"/>
       </w:pPr>
-      <w:bookmarkStart w:id="13" w:name="_Toc243219211"/>
+      <w:bookmarkStart w:id="13" w:name="_Toc243257944"/>
       <w:r>
         <w:t>Telas e Rotas</w:t>
       </w:r>
@@ -7923,6 +8004,7 @@
         <w:spacing w:before="240"/>
       </w:pPr>
       <w:r>
+        <w:lastRenderedPageBreak/>
         <w:t xml:space="preserve">A página de </w:t>
       </w:r>
       <w:r>
@@ -8434,7 +8516,7 @@
       <w:pPr>
         <w:pStyle w:val="Ttulo2"/>
       </w:pPr>
-      <w:bookmarkStart w:id="14" w:name="_Toc243219212"/>
+      <w:bookmarkStart w:id="14" w:name="_Toc243257945"/>
       <w:r>
         <w:t>Componentes</w:t>
       </w:r>
@@ -8657,6 +8739,7 @@
               <w:pStyle w:val="TextodeTabela"/>
             </w:pPr>
             <w:r>
+              <w:lastRenderedPageBreak/>
               <w:t>Comuns (</w:t>
             </w:r>
             <w:r>
@@ -8866,7 +8949,7 @@
       <w:pPr>
         <w:pStyle w:val="Ttulo2"/>
       </w:pPr>
-      <w:bookmarkStart w:id="15" w:name="_Toc243219213"/>
+      <w:bookmarkStart w:id="15" w:name="_Toc243257946"/>
       <w:r>
         <w:t>Comunicação com a API</w:t>
       </w:r>
@@ -9045,6 +9128,7 @@
         </w:numPr>
       </w:pPr>
       <w:r>
+        <w:lastRenderedPageBreak/>
         <w:t>durante a chamada, o componente exibe o estado de carregamento e mantém o botão de envio desativado, o que evita uma gravação em dobro por clique repetido, e, ao final, exibe um aviso de sucesso ou de falha; o cliente HTTP nunca repete automaticamente uma requisição de gravação.</w:t>
       </w:r>
     </w:p>
@@ -9093,7 +9177,7 @@
       <w:pPr>
         <w:pStyle w:val="Ttulo2"/>
       </w:pPr>
-      <w:bookmarkStart w:id="16" w:name="_Toc243219214"/>
+      <w:bookmarkStart w:id="16" w:name="_Toc243257947"/>
       <w:r>
         <w:t>Renderização, Estado e Desempenho</w:t>
       </w:r>
@@ -9103,7 +9187,7 @@
       <w:pPr>
         <w:pStyle w:val="Ttulo3"/>
       </w:pPr>
-      <w:bookmarkStart w:id="17" w:name="_Toc243219215"/>
+      <w:bookmarkStart w:id="17" w:name="_Toc243257948"/>
       <w:r>
         <w:t>Renderização</w:t>
       </w:r>
@@ -9141,7 +9225,7 @@
       <w:pPr>
         <w:pStyle w:val="Ttulo3"/>
       </w:pPr>
-      <w:bookmarkStart w:id="18" w:name="_Toc243219216"/>
+      <w:bookmarkStart w:id="18" w:name="_Toc243257949"/>
       <w:r>
         <w:t>Estado e Formulários</w:t>
       </w:r>
@@ -9256,6 +9340,7 @@
         </w:numPr>
       </w:pPr>
       <w:r>
+        <w:lastRenderedPageBreak/>
         <w:t xml:space="preserve">a lógica reutilizada por vários componentes, como a listagem paginada com busca e filtros e a chamada à API com o estado de carregamento, fica em hooks próprios, em </w:t>
       </w:r>
       <w:r>
@@ -9274,7 +9359,7 @@
       <w:pPr>
         <w:pStyle w:val="Ttulo3"/>
       </w:pPr>
-      <w:bookmarkStart w:id="19" w:name="_Toc243219217"/>
+      <w:bookmarkStart w:id="19" w:name="_Toc243257950"/>
       <w:r>
         <w:t>Desempenho</w:t>
       </w:r>
@@ -9383,7 +9468,7 @@
       <w:pPr>
         <w:pStyle w:val="Ttulo3"/>
       </w:pPr>
-      <w:bookmarkStart w:id="20" w:name="_Toc243219218"/>
+      <w:bookmarkStart w:id="20" w:name="_Toc243257951"/>
       <w:r>
         <w:t>Acessibilidade e Identidade Visual</w:t>
       </w:r>
@@ -9498,6 +9583,7 @@
         </w:numPr>
       </w:pPr>
       <w:r>
+        <w:lastRenderedPageBreak/>
         <w:t>as cores garantem contraste mínimo de 4,5:1 para o texto, e nenhuma informação depende só da cor, como o status do agendamento, que também é escrito;</w:t>
       </w:r>
     </w:p>
@@ -9528,8 +9614,9 @@
       <w:pPr>
         <w:pStyle w:val="Ttulo1"/>
       </w:pPr>
-      <w:bookmarkStart w:id="21" w:name="_Toc243219219"/>
-      <w:r>
+      <w:bookmarkStart w:id="21" w:name="_Toc243257952"/>
+      <w:r>
+        <w:lastRenderedPageBreak/>
         <w:t>BACKEND</w:t>
       </w:r>
       <w:bookmarkEnd w:id="21"/>
@@ -9556,7 +9643,7 @@
       <w:pPr>
         <w:pStyle w:val="Ttulo2"/>
       </w:pPr>
-      <w:bookmarkStart w:id="22" w:name="_Toc243219220"/>
+      <w:bookmarkStart w:id="22" w:name="_Toc243257953"/>
       <w:r>
         <w:t>Camadas</w:t>
       </w:r>
@@ -10092,6 +10179,7 @@
         </w:numPr>
       </w:pPr>
       <w:r>
+        <w:lastRenderedPageBreak/>
         <w:t>a rota chama o serviço, informando os dados validados e o usuário autenticado;</w:t>
       </w:r>
     </w:p>
@@ -10135,7 +10223,7 @@
       <w:pPr>
         <w:pStyle w:val="Ttulo2"/>
       </w:pPr>
-      <w:bookmarkStart w:id="23" w:name="_Toc243219221"/>
+      <w:bookmarkStart w:id="23" w:name="_Toc243257954"/>
       <w:r>
         <w:t>Módulos</w:t>
       </w:r>
@@ -11014,6 +11102,7 @@
         <w:spacing w:before="240"/>
       </w:pPr>
       <w:r>
+        <w:lastRenderedPageBreak/>
         <w:t xml:space="preserve">Quatro conjuntos de regras do módulo </w:t>
       </w:r>
       <w:r>
@@ -11330,8 +11419,9 @@
       <w:pPr>
         <w:pStyle w:val="Ttulo2"/>
       </w:pPr>
-      <w:bookmarkStart w:id="24" w:name="_Toc243219222"/>
-      <w:r>
+      <w:bookmarkStart w:id="24" w:name="_Toc243257955"/>
+      <w:r>
+        <w:lastRenderedPageBreak/>
         <w:t>Autenticação e Autorização</w:t>
       </w:r>
       <w:bookmarkEnd w:id="24"/>
@@ -11340,7 +11430,7 @@
       <w:pPr>
         <w:pStyle w:val="Ttulo3"/>
       </w:pPr>
-      <w:bookmarkStart w:id="25" w:name="_Toc243219223"/>
+      <w:bookmarkStart w:id="25" w:name="_Toc243257956"/>
       <w:r>
         <w:t>Autenticação</w:t>
       </w:r>
@@ -11588,7 +11678,7 @@
       <w:pPr>
         <w:pStyle w:val="Ttulo3"/>
       </w:pPr>
-      <w:bookmarkStart w:id="26" w:name="_Toc243219224"/>
+      <w:bookmarkStart w:id="26" w:name="_Toc243257957"/>
       <w:r>
         <w:t>Perfis e Contas</w:t>
       </w:r>
@@ -11643,7 +11733,27 @@
         </w:r>
       </w:hyperlink>
       <w:r>
-        <w:t>). O Quadro 9 relaciona os perfis aos atores definidos na análise.</w:t>
+        <w:t xml:space="preserve">). </w:t>
+      </w:r>
+      <w:r>
+        <w:t>Toda conta é criada pelo servidor com a chave de serviço, pela API administrativa do Supabase Auth (</w:t>
+      </w:r>
+      <w:r>
+        <w:rPr>
+          <w:rFonts w:ascii="Courier New" w:hAnsi="Courier New" w:cs="Courier New"/>
+          <w:sz w:val="22"/>
+        </w:rPr>
+        <w:t>auth.admin.createUser</w:t>
+      </w:r>
+      <w:r>
+        <w:t xml:space="preserve">), já com o e-mail confirmado: a aplicação </w:t>
+      </w:r>
+      <w:r>
+        <w:lastRenderedPageBreak/>
+        <w:t xml:space="preserve">não usa o cadastro público do Supabase Auth, nenhum e-mail é enviado e não há confirmação de e-mail. </w:t>
+      </w:r>
+      <w:r>
+        <w:t>O Quadro 9 relaciona os perfis aos atores definidos na análise.</w:t>
       </w:r>
     </w:p>
     <w:p>
@@ -12202,7 +12312,7 @@
       <w:pPr>
         <w:pStyle w:val="Ttulo3"/>
       </w:pPr>
-      <w:bookmarkStart w:id="27" w:name="_Toc243219225"/>
+      <w:bookmarkStart w:id="27" w:name="_Toc243257958"/>
       <w:r>
         <w:t>Autorização</w:t>
       </w:r>
@@ -12309,7 +12419,11 @@
         <w:t>src/shared</w:t>
       </w:r>
       <w:r>
-        <w:t xml:space="preserve">. O Quadro 10 relaciona as permissões às páginas e aos grupos de rotas. A barra de navegação do painel é montada com a lista de permissões devolvida por </w:t>
+        <w:t xml:space="preserve">. O Quadro 10 relaciona as permissões às páginas e aos grupos de rotas. </w:t>
+      </w:r>
+      <w:r>
+        <w:lastRenderedPageBreak/>
+        <w:t xml:space="preserve">A barra de navegação do painel é montada com a lista de permissões devolvida por </w:t>
       </w:r>
       <w:r>
         <w:rPr>
@@ -12847,8 +12961,9 @@
       <w:pPr>
         <w:pStyle w:val="Ttulo1"/>
       </w:pPr>
-      <w:bookmarkStart w:id="28" w:name="_Toc243219226"/>
-      <w:r>
+      <w:bookmarkStart w:id="28" w:name="_Toc243257959"/>
+      <w:r>
+        <w:lastRenderedPageBreak/>
         <w:t>BANCO DE DADOS</w:t>
       </w:r>
       <w:bookmarkEnd w:id="28"/>
@@ -12858,39 +12973,61 @@
         <w:pStyle w:val="Texto"/>
       </w:pPr>
       <w:r>
-        <w:t xml:space="preserve">O banco de dados é um PostgreSQL gerenciado pelo Supabase. Toda a estrutura é criada por um único arquivo de </w:t>
+        <w:t xml:space="preserve">O banco de dados é um PostgreSQL gerenciado pelo Supabase. </w:t>
+      </w:r>
+      <w:r>
+        <w:t xml:space="preserve">A estrutura é criada por </w:t>
       </w:r>
       <w:r>
         <w:rPr>
           <w:i/>
-          <w:iCs/>
         </w:rPr>
-        <w:t>migration</w:t>
-      </w:r>
-      <w:r>
-        <w:t xml:space="preserve">, versionado no repositório em </w:t>
+        <w:t>migrations</w:t>
+      </w:r>
+      <w:r>
+        <w:t xml:space="preserve"> versionadas no repositório em </w:t>
       </w:r>
       <w:r>
         <w:rPr>
           <w:rFonts w:ascii="Courier New" w:hAnsi="Courier New" w:cs="Courier New"/>
           <w:sz w:val="22"/>
-          <w:szCs w:val="22"/>
         </w:rPr>
         <w:t>supabase/migrations/</w:t>
       </w:r>
       <w:r>
-        <w:t xml:space="preserve">, e os dados iniciais ficam em </w:t>
+        <w:t xml:space="preserve">: a inicial cria os tipos, as tabelas, as restrições, os gatilhos, os índices, a segurança em nível de linha e o repositório de arquivos </w:t>
       </w:r>
       <w:r>
         <w:rPr>
           <w:rFonts w:ascii="Courier New" w:hAnsi="Courier New" w:cs="Courier New"/>
           <w:sz w:val="22"/>
-          <w:szCs w:val="22"/>
+        </w:rPr>
+        <w:t>service-images</w:t>
+      </w:r>
+      <w:r>
+        <w:t xml:space="preserve">, e cada função de gravação em várias tabelas entra depois, em </w:t>
+      </w:r>
+      <w:r>
+        <w:rPr>
+          <w:i/>
+        </w:rPr>
+        <w:t>migration</w:t>
+      </w:r>
+      <w:r>
+        <w:t xml:space="preserve"> própria, com a funcionalidade que a chama. Os dados iniciais ficam em </w:t>
+      </w:r>
+      <w:r>
+        <w:rPr>
+          <w:rFonts w:ascii="Courier New" w:hAnsi="Courier New" w:cs="Courier New"/>
+          <w:sz w:val="22"/>
         </w:rPr>
         <w:t>supabase/seed.sql</w:t>
       </w:r>
       <w:r>
-        <w:t xml:space="preserve">. As tabelas e as colunas são nomeadas em inglês, no padrão </w:t>
+        <w:t>.</w:t>
+      </w:r>
+      <w:r>
+        <w:t xml:space="preserve"> As tabelas e as colunas são nomeadas em inglês, no padrão </w:t>
       </w:r>
       <w:r>
         <w:rPr>
@@ -12921,6 +13058,29 @@
       <w:r>
         <w:t>, que usa a chave de serviço guardada no servidor, lê e grava os dados.</w:t>
       </w:r>
+      <w:r>
+        <w:t xml:space="preserve"> Além disso, os papéis </w:t>
+      </w:r>
+      <w:r>
+        <w:rPr>
+          <w:rFonts w:ascii="Courier New" w:hAnsi="Courier New" w:cs="Courier New"/>
+          <w:sz w:val="22"/>
+        </w:rPr>
+        <w:t>anon</w:t>
+      </w:r>
+      <w:r>
+        <w:t xml:space="preserve"> e </w:t>
+      </w:r>
+      <w:r>
+        <w:rPr>
+          <w:rFonts w:ascii="Courier New" w:hAnsi="Courier New" w:cs="Courier New"/>
+          <w:sz w:val="22"/>
+        </w:rPr>
+        <w:t>authenticated</w:t>
+      </w:r>
+      <w:r>
+        <w:t xml:space="preserve"> do Supabase, usados pelas chaves públicas, não têm nenhum privilégio nas tabelas e funções; só o papel de serviço tem, e toda função nova revoga a execução desses papéis.</w:t>
+      </w:r>
     </w:p>
     <w:p>
       <w:pPr>
@@ -12955,7 +13115,7 @@
       <w:pPr>
         <w:pStyle w:val="Ttulo2"/>
       </w:pPr>
-      <w:bookmarkStart w:id="29" w:name="_Toc243219227"/>
+      <w:bookmarkStart w:id="29" w:name="_Toc243257960"/>
       <w:r>
         <w:t>Modelo Entidade-Relacionamento</w:t>
       </w:r>
@@ -13207,6 +13367,7 @@
         <w:pStyle w:val="Texto"/>
       </w:pPr>
       <w:r>
+        <w:lastRenderedPageBreak/>
         <w:t>O modelo é normalizado até a terceira forma normal: cada informação é gravada em um único lugar. Os dados copiados no agendamento não contrariam essa regra, pois registram uma informação diferente da do cadastro: o nome, o valor, a duração e os dados do veículo vigentes no momento da ordem de serviço, que podem mudar depois no cadastro sem alterar o que foi contratado (</w:t>
       </w:r>
       <w:hyperlink r:id="rId120" w:anchor="RN037" w:history="1">
@@ -13226,6 +13387,7 @@
         <w:pStyle w:val="Legenda"/>
       </w:pPr>
       <w:r>
+        <w:lastRenderedPageBreak/>
         <w:t xml:space="preserve">Figura </w:t>
       </w:r>
       <w:fldSimple w:instr=" SEQ Figura \* ARABIC ">
@@ -13290,8 +13452,9 @@
       <w:pPr>
         <w:pStyle w:val="Ttulo2"/>
       </w:pPr>
-      <w:bookmarkStart w:id="30" w:name="_Toc243219228"/>
-      <w:r>
+      <w:bookmarkStart w:id="30" w:name="_Toc243257961"/>
+      <w:r>
+        <w:lastRenderedPageBreak/>
         <w:t>Tabelas</w:t>
       </w:r>
       <w:bookmarkEnd w:id="30"/>
@@ -14601,7 +14764,11 @@
         <w:t>created_at</w:t>
       </w:r>
       <w:r>
-        <w:t xml:space="preserve">, preenchida automaticamente. Valores monetários usam </w:t>
+        <w:t xml:space="preserve">, preenchida automaticamente. </w:t>
+      </w:r>
+      <w:r>
+        <w:lastRenderedPageBreak/>
+        <w:t xml:space="preserve">Valores monetários usam </w:t>
       </w:r>
       <w:r>
         <w:rPr>
@@ -15104,6 +15271,9 @@
             <w:r>
               <w:t>Único entre clientes não excluídos</w:t>
             </w:r>
+            <w:r>
+              <w:t>; em minúsculas</w:t>
+            </w:r>
           </w:p>
         </w:tc>
         <w:tc>
@@ -15783,6 +15953,7 @@
                 <w:sz w:val="18"/>
                 <w:szCs w:val="18"/>
               </w:rPr>
+              <w:lastRenderedPageBreak/>
               <w:t>email</w:t>
             </w:r>
           </w:p>
@@ -15815,6 +15986,9 @@
             </w:pPr>
             <w:r>
               <w:t>Único</w:t>
+            </w:r>
+            <w:r>
+              <w:t>; em minúsculas</w:t>
             </w:r>
           </w:p>
         </w:tc>
@@ -16049,6 +16223,9 @@
             </w:pPr>
             <w:r>
               <w:t>Padrão: falso</w:t>
+            </w:r>
+            <w:r>
+              <w:t>; no máximo uma conta</w:t>
             </w:r>
           </w:p>
         </w:tc>
@@ -16562,6 +16739,9 @@
             <w:r>
               <w:t>Único</w:t>
             </w:r>
+            <w:r>
+              <w:t>, sem diferenciar maiúsculas</w:t>
+            </w:r>
           </w:p>
         </w:tc>
         <w:tc>
@@ -17082,6 +17262,7 @@
         <w:pStyle w:val="Legenda"/>
       </w:pPr>
       <w:r>
+        <w:lastRenderedPageBreak/>
         <w:t xml:space="preserve">Quadro </w:t>
       </w:r>
       <w:fldSimple w:instr=" SEQ Quadro \* ARABIC ">
@@ -17491,6 +17672,9 @@
             <w:r>
               <w:t>Única</w:t>
             </w:r>
+            <w:r>
+              <w:t>; em maiúsculas, sem hífen, no padrão Mercosul ou no antigo</w:t>
+            </w:r>
           </w:p>
         </w:tc>
         <w:tc>
@@ -18414,6 +18598,9 @@
             <w:r>
               <w:t>Único</w:t>
             </w:r>
+            <w:r>
+              <w:t>, sem diferenciar maiúsculas</w:t>
+            </w:r>
           </w:p>
         </w:tc>
         <w:tc>
@@ -18590,6 +18777,7 @@
                 <w:sz w:val="18"/>
                 <w:szCs w:val="18"/>
               </w:rPr>
+              <w:lastRenderedPageBreak/>
               <w:t>updated_at</w:t>
             </w:r>
           </w:p>
@@ -19057,6 +19245,9 @@
             <w:r>
               <w:t>Único entre serviços não excluídos</w:t>
             </w:r>
+            <w:r>
+              <w:t>, sem diferenciar maiúsculas</w:t>
+            </w:r>
           </w:p>
         </w:tc>
         <w:tc>
@@ -19946,6 +20137,7 @@
                 <w:sz w:val="18"/>
                 <w:szCs w:val="18"/>
               </w:rPr>
+              <w:lastRenderedPageBreak/>
               <w:t>price</w:t>
             </w:r>
           </w:p>
@@ -21166,6 +21358,7 @@
                 <w:sz w:val="18"/>
                 <w:szCs w:val="18"/>
               </w:rPr>
+              <w:lastRenderedPageBreak/>
               <w:t>fee_percent</w:t>
             </w:r>
           </w:p>
@@ -22493,6 +22686,7 @@
                 <w:sz w:val="18"/>
                 <w:szCs w:val="18"/>
               </w:rPr>
+              <w:lastRenderedPageBreak/>
               <w:t>service_name</w:t>
             </w:r>
           </w:p>
@@ -23989,6 +24183,7 @@
                 <w:sz w:val="18"/>
                 <w:szCs w:val="18"/>
               </w:rPr>
+              <w:lastRenderedPageBreak/>
               <w:t>break_starts_at</w:t>
             </w:r>
           </w:p>
@@ -24741,6 +24936,9 @@
             <w:r>
               <w:t>PK</w:t>
             </w:r>
+            <w:r>
+              <w:t>; em minúsculas</w:t>
+            </w:r>
           </w:p>
         </w:tc>
         <w:tc>
@@ -25025,6 +25223,28 @@
         <w:rPr>
           <w:rFonts w:ascii="Courier New" w:hAnsi="Courier New" w:cs="Courier New"/>
           <w:sz w:val="22"/>
+        </w:rPr>
+        <w:t>staff</w:t>
+      </w:r>
+      <w:r>
+        <w:t>, há no máximo uma conta de administrador;</w:t>
+      </w:r>
+    </w:p>
+    <w:p>
+      <w:pPr>
+        <w:pStyle w:val="Texto"/>
+        <w:numPr>
+          <w:ilvl w:val="0"/>
+          <w:numId w:val="14"/>
+        </w:numPr>
+      </w:pPr>
+      <w:r>
+        <w:t xml:space="preserve">em </w:t>
+      </w:r>
+      <w:r>
+        <w:rPr>
+          <w:rFonts w:ascii="Courier New" w:hAnsi="Courier New" w:cs="Courier New"/>
+          <w:sz w:val="22"/>
           <w:szCs w:val="22"/>
         </w:rPr>
         <w:t>services</w:t>
@@ -25053,6 +25273,7 @@
         </w:numPr>
       </w:pPr>
       <w:r>
+        <w:lastRenderedPageBreak/>
         <w:t xml:space="preserve">em </w:t>
       </w:r>
       <w:r>
@@ -25082,6 +25303,38 @@
         <w:rPr>
           <w:rFonts w:ascii="Courier New" w:hAnsi="Courier New" w:cs="Courier New"/>
           <w:sz w:val="22"/>
+        </w:rPr>
+        <w:t>service_prices</w:t>
+      </w:r>
+      <w:r>
+        <w:t xml:space="preserve">, um serviço com valor por porte tem exatamente os quatro valores, e um serviço de valor fixo não tem nenhum; a conferência é feita no fim da transação, por isso o serviço e os seus valores são gravados juntos, pela função </w:t>
+      </w:r>
+      <w:r>
+        <w:rPr>
+          <w:rFonts w:ascii="Courier New" w:hAnsi="Courier New" w:cs="Courier New"/>
+          <w:sz w:val="22"/>
+        </w:rPr>
+        <w:t>save_service</w:t>
+      </w:r>
+      <w:r>
+        <w:t>;</w:t>
+      </w:r>
+    </w:p>
+    <w:p>
+      <w:pPr>
+        <w:pStyle w:val="Texto"/>
+        <w:numPr>
+          <w:ilvl w:val="0"/>
+          <w:numId w:val="14"/>
+        </w:numPr>
+      </w:pPr>
+      <w:r>
+        <w:t xml:space="preserve">em </w:t>
+      </w:r>
+      <w:r>
+        <w:rPr>
+          <w:rFonts w:ascii="Courier New" w:hAnsi="Courier New" w:cs="Courier New"/>
+          <w:sz w:val="22"/>
           <w:szCs w:val="22"/>
         </w:rPr>
         <w:t>appointments</w:t>
@@ -25177,15 +25430,75 @@
         </w:numPr>
       </w:pPr>
       <w:r>
-        <w:t>os valores de serviço e de agendamento são maiores que zero, exceto o total, que pode ser zero quando houver desconto de 100%.</w:t>
+        <w:t xml:space="preserve">a placa é gravada em maiúsculas e sem hífen, no padrão Mercosul ou no antigo, e o e-mail de </w:t>
+      </w:r>
+      <w:r>
+        <w:rPr>
+          <w:rFonts w:ascii="Courier New" w:hAnsi="Courier New" w:cs="Courier New"/>
+          <w:sz w:val="22"/>
+        </w:rPr>
+        <w:t>clients</w:t>
+      </w:r>
+      <w:r>
+        <w:t xml:space="preserve">, </w:t>
+      </w:r>
+      <w:r>
+        <w:rPr>
+          <w:rFonts w:ascii="Courier New" w:hAnsi="Courier New" w:cs="Courier New"/>
+          <w:sz w:val="22"/>
+        </w:rPr>
+        <w:t>staff</w:t>
+      </w:r>
+      <w:r>
+        <w:t xml:space="preserve"> e </w:t>
+      </w:r>
+      <w:r>
+        <w:rPr>
+          <w:rFonts w:ascii="Courier New" w:hAnsi="Courier New" w:cs="Courier New"/>
+          <w:sz w:val="22"/>
+        </w:rPr>
+        <w:t>login_attempts</w:t>
+      </w:r>
+      <w:r>
+        <w:t>, em minúsculas e sem espaços;</w:t>
       </w:r>
     </w:p>
     <w:p>
       <w:pPr>
         <w:pStyle w:val="Texto"/>
-      </w:pPr>
-      <w:r>
-        <w:t xml:space="preserve">As regras que envolvem mais de uma linha, como a dos tipos no vínculo entre serviço principal e adicional e a que impede a alteração do tipo do serviço, são garantidas por gatilhos; as demais, por restrições </w:t>
+        <w:numPr>
+          <w:ilvl w:val="0"/>
+          <w:numId w:val="14"/>
+        </w:numPr>
+      </w:pPr>
+      <w:r>
+        <w:t>os nomes de cargo, de categoria e de serviço não excluído não se repetem, sem diferenciar maiúsculas e minúsculas;</w:t>
+      </w:r>
+    </w:p>
+    <w:p>
+      <w:pPr>
+        <w:pStyle w:val="Texto"/>
+        <w:numPr>
+          <w:ilvl w:val="0"/>
+          <w:numId w:val="14"/>
+        </w:numPr>
+      </w:pPr>
+      <w:r>
+        <w:t>os valores de serviço e de agendamento são maiores que zero, exceto o total, que pode ser zero quando houver desconto de 100%.</w:t>
+      </w:r>
+    </w:p>
+    <w:p>
+      <w:pPr>
+        <w:pStyle w:val="Texto"/>
+      </w:pPr>
+      <w:r>
+        <w:t>As regras que envolvem mais de uma linha, como a dos tipos no vínculo entre serviço principal e adicional</w:t>
+      </w:r>
+      <w:r>
+        <w:t>, a dos quatro valores do serviço por porte</w:t>
+      </w:r>
+      <w:r>
+        <w:t xml:space="preserve"> e a que impede a alteração do tipo do serviço, são garantidas por gatilhos; as demais, por restrições </w:t>
       </w:r>
       <w:r>
         <w:rPr>
@@ -25196,7 +25509,33 @@
         <w:t>CHECK</w:t>
       </w:r>
       <w:r>
-        <w:t xml:space="preserve">. A </w:t>
+        <w:t>.</w:t>
+      </w:r>
+      <w:r>
+        <w:t xml:space="preserve"> Os gatilhos são nomeados com </w:t>
+      </w:r>
+      <w:r>
+        <w:rPr>
+          <w:rFonts w:ascii="Courier New" w:hAnsi="Courier New" w:cs="Courier New"/>
+          <w:sz w:val="22"/>
+        </w:rPr>
+        <w:t>trg_</w:t>
+      </w:r>
+      <w:r>
+        <w:t xml:space="preserve"> seguido da tabela e da regra, e o que recusa uma gravação levanta a violação com o nome </w:t>
+      </w:r>
+      <w:r>
+        <w:rPr>
+          <w:rFonts w:ascii="Courier New" w:hAnsi="Courier New" w:cs="Courier New"/>
+          <w:sz w:val="22"/>
+        </w:rPr>
+        <w:t>ck_</w:t>
+      </w:r>
+      <w:r>
+        <w:t xml:space="preserve"> da regra, que o repositório converte como as demais restrições.</w:t>
+      </w:r>
+      <w:r>
+        <w:t xml:space="preserve"> A </w:t>
       </w:r>
       <w:r>
         <w:rPr>
@@ -25336,6 +25675,7 @@
           <w:sz w:val="22"/>
           <w:szCs w:val="22"/>
         </w:rPr>
+        <w:lastRenderedPageBreak/>
         <w:t>link_vehicle</w:t>
       </w:r>
       <w:r>
@@ -25346,6 +25686,18 @@
       <w:pPr>
         <w:pStyle w:val="Texto"/>
       </w:pPr>
+      <w:r>
+        <w:t xml:space="preserve">Cada função entra em </w:t>
+      </w:r>
+      <w:r>
+        <w:rPr>
+          <w:i/>
+        </w:rPr>
+        <w:t>migration</w:t>
+      </w:r>
+      <w:r>
+        <w:t xml:space="preserve"> própria, na tarefa da funcionalidade que a chama, com os parâmetros definidos pelo serviço dessa tarefa. </w:t>
+      </w:r>
       <w:r>
         <w:t xml:space="preserve">As funções são curtas e não fazem chamadas externas: o envio de imagens ao Storage e a criação de contas no Supabase Auth ficam fora delas. Adota-se o nível de isolamento padrão do PostgreSQL, </w:t>
       </w:r>
@@ -25875,8 +26227,9 @@
       <w:pPr>
         <w:pStyle w:val="Ttulo2"/>
       </w:pPr>
-      <w:bookmarkStart w:id="31" w:name="_Toc243219229"/>
-      <w:r>
+      <w:bookmarkStart w:id="31" w:name="_Toc243257962"/>
+      <w:r>
+        <w:lastRenderedPageBreak/>
         <w:t>Relacionamentos</w:t>
       </w:r>
       <w:bookmarkEnd w:id="31"/>
@@ -26852,7 +27205,11 @@
         <w:t>deleted_at</w:t>
       </w:r>
       <w:r>
-        <w:t xml:space="preserve">, deixa de aparecer nas listagens e de poder ser usado em novos agendamentos, mas permanece no banco, e os agendamentos anteriores e os indicadores do </w:t>
+        <w:t xml:space="preserve">, deixa de aparecer nas listagens e de poder ser usado em novos agendamentos, mas permanece no banco, e os agendamentos anteriores e os </w:t>
+      </w:r>
+      <w:r>
+        <w:lastRenderedPageBreak/>
+        <w:t xml:space="preserve">indicadores do </w:t>
       </w:r>
       <w:r>
         <w:rPr>
@@ -26962,8 +27319,9 @@
       <w:pPr>
         <w:pStyle w:val="Ttulo1"/>
       </w:pPr>
-      <w:bookmarkStart w:id="32" w:name="_Toc243219230"/>
-      <w:r>
+      <w:bookmarkStart w:id="32" w:name="_Toc243257963"/>
+      <w:r>
+        <w:lastRenderedPageBreak/>
         <w:t>API</w:t>
       </w:r>
       <w:bookmarkEnd w:id="32"/>
@@ -27000,7 +27358,7 @@
       <w:pPr>
         <w:pStyle w:val="Ttulo2"/>
       </w:pPr>
-      <w:bookmarkStart w:id="33" w:name="_Toc243219231"/>
+      <w:bookmarkStart w:id="33" w:name="_Toc243257964"/>
       <w:r>
         <w:t>Desenho Geral</w:t>
       </w:r>
@@ -27312,6 +27670,7 @@
         <w:keepNext/>
       </w:pPr>
       <w:r>
+        <w:lastRenderedPageBreak/>
         <w:t>As rotas são agrupadas pelo tipo de acesso, conforme o Quadro 31.</w:t>
       </w:r>
     </w:p>
@@ -27787,7 +28146,7 @@
       <w:pPr>
         <w:pStyle w:val="Ttulo2"/>
       </w:pPr>
-      <w:bookmarkStart w:id="34" w:name="_Toc243219232"/>
+      <w:bookmarkStart w:id="34" w:name="_Toc243257965"/>
       <w:r>
         <w:t>Validação dos Dados</w:t>
       </w:r>
@@ -27855,6 +28214,7 @@
         </w:numPr>
       </w:pPr>
       <w:r>
+        <w:lastRenderedPageBreak/>
         <w:t>os identificadores nos caminhos devem ser UUIDs válidos; um identificador inválido recebe a mesma resposta 404 de um registro inexistente;</w:t>
       </w:r>
     </w:p>
@@ -27921,7 +28281,7 @@
       <w:pPr>
         <w:pStyle w:val="Ttulo2"/>
       </w:pPr>
-      <w:bookmarkStart w:id="35" w:name="_Toc243219233"/>
+      <w:bookmarkStart w:id="35" w:name="_Toc243257966"/>
       <w:r>
         <w:t>Paginação</w:t>
       </w:r>
@@ -28538,6 +28898,7 @@
         <w:spacing w:before="240"/>
       </w:pPr>
       <w:r>
+        <w:lastRenderedPageBreak/>
         <w:t>Não são paginadas apenas as listas de tamanho fixo: os sete dias da semana, as quatro formas de pagamento e os serviços de um mesmo agendamento. As listagens respondem no formato a seguir.</w:t>
       </w:r>
     </w:p>
@@ -28599,7 +28960,7 @@
       <w:pPr>
         <w:pStyle w:val="Ttulo2"/>
       </w:pPr>
-      <w:bookmarkStart w:id="36" w:name="_Toc243219234"/>
+      <w:bookmarkStart w:id="36" w:name="_Toc243257967"/>
       <w:r>
         <w:t>Respostas e Erros</w:t>
       </w:r>
@@ -28843,7 +29204,11 @@
         <w:t>requestId</w:t>
       </w:r>
       <w:r>
-        <w:t xml:space="preserve"> trazem as mensagens de cada campo e o identificador do registro. O formato é exemplificado a seguir, e os códigos utilizados estão no Quadro 33.</w:t>
+        <w:t xml:space="preserve"> trazem as mensagens de cada campo e o identificador </w:t>
+      </w:r>
+      <w:r>
+        <w:lastRenderedPageBreak/>
+        <w:t>do registro. O formato é exemplificado a seguir, e os códigos utilizados estão no Quadro 33.</w:t>
       </w:r>
     </w:p>
     <w:p>
@@ -30007,6 +30372,7 @@
         <w:spacing w:before="240"/>
       </w:pPr>
       <w:r>
+        <w:lastRenderedPageBreak/>
         <w:t>No código, os erros seguem três regras:</w:t>
       </w:r>
     </w:p>
@@ -30467,7 +30833,7 @@
       <w:pPr>
         <w:pStyle w:val="Ttulo2"/>
       </w:pPr>
-      <w:bookmarkStart w:id="37" w:name="_Toc243219235"/>
+      <w:bookmarkStart w:id="37" w:name="_Toc243257968"/>
       <w:r>
         <w:t>Controle de Concorrência</w:t>
       </w:r>
@@ -30522,7 +30888,11 @@
         <w:t>updatedAt</w:t>
       </w:r>
       <w:r>
-        <w:t xml:space="preserve">, em uma única instrução no banco. Se outra pessoa tiver alterado o registro nesse intervalo, nada é gravado e a resposta é 409 </w:t>
+        <w:t xml:space="preserve">, em uma única instrução no banco. Se </w:t>
+      </w:r>
+      <w:r>
+        <w:lastRenderedPageBreak/>
+        <w:t xml:space="preserve">outra pessoa tiver alterado o registro nesse intervalo, nada é gravado e a resposta é 409 </w:t>
       </w:r>
       <w:r>
         <w:rPr>
@@ -30580,7 +30950,7 @@
       <w:pPr>
         <w:pStyle w:val="Ttulo2"/>
       </w:pPr>
-      <w:bookmarkStart w:id="38" w:name="_Toc243219236"/>
+      <w:bookmarkStart w:id="38" w:name="_Toc243257969"/>
       <w:r>
         <w:t>Contrato Detalhado (Apêndice A)</w:t>
       </w:r>
@@ -30598,8 +30968,9 @@
       <w:pPr>
         <w:pStyle w:val="Ttulo1"/>
       </w:pPr>
-      <w:bookmarkStart w:id="39" w:name="_Toc243219237"/>
-      <w:r>
+      <w:bookmarkStart w:id="39" w:name="_Toc243257970"/>
+      <w:r>
+        <w:lastRenderedPageBreak/>
         <w:t>SEGURANÇA (IMPLEMENTAÇÃO)</w:t>
       </w:r>
       <w:bookmarkEnd w:id="39"/>
@@ -30939,7 +31310,19 @@
               <w:t>src/shared/validation</w:t>
             </w:r>
             <w:r>
-              <w:t xml:space="preserve"> exige de 8 a 72 caracteres, com letra maiúscula, número e caractere especial, em todos os formulários e rotas; 72 é o tamanho máximo tratado pelo algoritmo bcrypt. O mínimo de 8 também é configurado no Supabase Auth.</w:t>
+              <w:t xml:space="preserve"> exige de 8 a 72 caracteres, com letra maiúscula, número e caractere especial, em todos os formulários e rotas; 72 é o tamanho máximo tratado pelo algoritmo bcrypt. </w:t>
+            </w:r>
+            <w:r>
+              <w:t xml:space="preserve">O Supabase Auth fica com a configuração padrão; o esquema é aplicado no servidor antes de toda chamada que define senha, inclusive no </w:t>
+            </w:r>
+            <w:r>
+              <w:rPr>
+                <w:i/>
+              </w:rPr>
+              <w:t>script</w:t>
+            </w:r>
+            <w:r>
+              <w:t xml:space="preserve"> da conta de administrador.</w:t>
             </w:r>
           </w:p>
         </w:tc>
@@ -32127,7 +32510,11 @@
         <w:t>src/server</w:t>
       </w:r>
       <w:r>
-        <w:t>, o fluxo do GitHub Actions tem somente permissão de leitura do repositório e não recebe nenhuma chave, e cada funcionário acessa apenas as páginas do seu cargo.</w:t>
+        <w:t xml:space="preserve">, o fluxo do GitHub </w:t>
+      </w:r>
+      <w:r>
+        <w:lastRenderedPageBreak/>
+        <w:t>Actions tem somente permissão de leitura do repositório e não recebe nenhuma chave, e cada funcionário acessa apenas as páginas do seu cargo.</w:t>
       </w:r>
     </w:p>
     <w:p>
@@ -32162,8 +32549,9 @@
       <w:pPr>
         <w:pStyle w:val="Ttulo1"/>
       </w:pPr>
-      <w:bookmarkStart w:id="40" w:name="_Toc243219238"/>
-      <w:r>
+      <w:bookmarkStart w:id="40" w:name="_Toc243257971"/>
+      <w:r>
+        <w:lastRenderedPageBreak/>
         <w:t>INFRAESTRUTURA E DEPLOY</w:t>
       </w:r>
       <w:bookmarkEnd w:id="40"/>
@@ -32180,7 +32568,7 @@
       <w:pPr>
         <w:pStyle w:val="Ttulo2"/>
       </w:pPr>
-      <w:bookmarkStart w:id="41" w:name="_Toc243219239"/>
+      <w:bookmarkStart w:id="41" w:name="_Toc243257972"/>
       <w:r>
         <w:t>Ambientes</w:t>
       </w:r>
@@ -32521,7 +32909,7 @@
       <w:pPr>
         <w:pStyle w:val="Ttulo2"/>
       </w:pPr>
-      <w:bookmarkStart w:id="42" w:name="_Toc243219240"/>
+      <w:bookmarkStart w:id="42" w:name="_Toc243257973"/>
       <w:r>
         <w:t>Variáveis de Ambiente</w:t>
       </w:r>
@@ -32577,7 +32965,11 @@
         </w:r>
       </w:hyperlink>
       <w:r>
-        <w:t>). O código lê as variáveis durante a execução, a cada requisição, e nunca durante a construção: a Vercel as fornece também na compilação, mas a imagem do contêiner é construída sem elas (seção 8.6).</w:t>
+        <w:t xml:space="preserve">). O código lê as variáveis durante a execução, a cada requisição, e nunca durante a construção: a </w:t>
+      </w:r>
+      <w:r>
+        <w:lastRenderedPageBreak/>
+        <w:t>Vercel as fornece também na compilação, mas a imagem do contêiner é construída sem elas (seção 8.6).</w:t>
       </w:r>
     </w:p>
     <w:p>
@@ -33061,7 +33453,7 @@
       <w:pPr>
         <w:pStyle w:val="Ttulo2"/>
       </w:pPr>
-      <w:bookmarkStart w:id="43" w:name="_Toc243219241"/>
+      <w:bookmarkStart w:id="43" w:name="_Toc243257974"/>
       <w:r>
         <w:t>Banco de Dados e Dados Iniciais</w:t>
       </w:r>
@@ -33085,17 +33477,35 @@
         </w:numPr>
       </w:pPr>
       <w:r>
-        <w:t xml:space="preserve">aplicação da </w:t>
+        <w:t xml:space="preserve">aplicação das </w:t>
       </w:r>
       <w:r>
         <w:rPr>
           <w:i/>
-          <w:iCs/>
         </w:rPr>
-        <w:t>migration</w:t>
-      </w:r>
-      <w:r>
-        <w:t>, que cria os tipos, as tabelas, as funções e ativa a segurança em nível de linha;</w:t>
+        <w:t>migrations</w:t>
+      </w:r>
+      <w:r>
+        <w:t xml:space="preserve">: a inicial cria os tipos, as tabelas, as restrições, os gatilhos e os índices, ativa a segurança em nível de linha, retira os privilégios das chaves públicas e cria o repositório de arquivos </w:t>
+      </w:r>
+      <w:r>
+        <w:rPr>
+          <w:rFonts w:ascii="Courier New" w:hAnsi="Courier New" w:cs="Courier New"/>
+          <w:sz w:val="22"/>
+        </w:rPr>
+        <w:t>service-images</w:t>
+      </w:r>
+      <w:r>
+        <w:t xml:space="preserve">, com leitura pública, gravação restrita ao </w:t>
+      </w:r>
+      <w:r>
+        <w:rPr>
+          <w:i/>
+        </w:rPr>
+        <w:t>backend</w:t>
+      </w:r>
+      <w:r>
+        <w:t>, limite de 2 MB e os formatos JPEG, PNG e WebP;</w:t>
       </w:r>
     </w:p>
     <w:p>
@@ -33113,12 +33523,30 @@
         <w:rPr>
           <w:rFonts w:ascii="Courier New" w:hAnsi="Courier New" w:cs="Courier New"/>
           <w:sz w:val="22"/>
-          <w:szCs w:val="22"/>
         </w:rPr>
         <w:t>supabase/seed.sql</w:t>
       </w:r>
       <w:r>
-        <w:t>: as quatro formas de pagamento sem ajuste, os sete dias da semana e a linha de dados da empresa;</w:t>
+        <w:t xml:space="preserve">, junto com a </w:t>
+      </w:r>
+      <w:r>
+        <w:rPr>
+          <w:i/>
+        </w:rPr>
+        <w:t>migration</w:t>
+      </w:r>
+      <w:r>
+        <w:t xml:space="preserve">, pelo comando </w:t>
+      </w:r>
+      <w:r>
+        <w:rPr>
+          <w:rFonts w:ascii="Courier New" w:hAnsi="Courier New" w:cs="Courier New"/>
+          <w:sz w:val="22"/>
+        </w:rPr>
+        <w:t>npx supabase db push --include-seed</w:t>
+      </w:r>
+      <w:r>
+        <w:t>: as quatro formas de pagamento sem ajuste; os sete dias da semana, de segunda a sexta das 08:00 às 18:00 com pausa das 12:00 às 13:00, sábado das 08:00 às 12:00 e domingo fechado; e a linha de dados da empresa, com o nome Glow – Estética Automotiva;</w:t>
       </w:r>
     </w:p>
     <w:p>
@@ -33162,7 +33590,13 @@
         <w:t>is_admin</w:t>
       </w:r>
       <w:r>
-        <w:t xml:space="preserve"> verdadeiro.</w:t>
+        <w:t xml:space="preserve"> verdadeiro</w:t>
+      </w:r>
+      <w:r>
+        <w:t>; a conta nasce com o e-mail confirmado</w:t>
+      </w:r>
+      <w:r>
+        <w:t>.</w:t>
       </w:r>
     </w:p>
     <w:p>
@@ -33170,25 +33604,25 @@
         <w:pStyle w:val="Texto"/>
       </w:pPr>
       <w:r>
-        <w:t xml:space="preserve">No painel do Supabase, a confirmação de e-mail é desativada, pois o MVP não envia e-mails, o tamanho mínimo de senha é definido em 8 caracteres e é criado o repositório de arquivos </w:t>
-      </w:r>
-      <w:r>
-        <w:rPr>
-          <w:rFonts w:ascii="Courier New" w:hAnsi="Courier New" w:cs="Courier New"/>
-          <w:sz w:val="22"/>
-          <w:szCs w:val="22"/>
-        </w:rPr>
-        <w:t>service-images</w:t>
-      </w:r>
-      <w:r>
-        <w:t xml:space="preserve">, com leitura pública e gravação restrita ao </w:t>
+        <w:lastRenderedPageBreak/>
+        <w:t>Nada é configurado à mão no painel do Supabase: como o MVP não envia e-mails, as contas são criadas pelo servidor já com o e-mail confirmado, sem confirmação de e-mail; a política de senha é exigida pelos esquemas de validação no servidor (</w:t>
+      </w:r>
+      <w:hyperlink r:id="rId188" w:anchor="RS003" w:history="1">
+        <w:r>
+          <w:rPr>
+            <w:rStyle w:val="Hyperlink"/>
+          </w:rPr>
+          <w:t>RS003</w:t>
+        </w:r>
+      </w:hyperlink>
+      <w:r>
+        <w:t xml:space="preserve">); e o repositório de arquivos vem da </w:t>
       </w:r>
       <w:r>
         <w:rPr>
           <w:i/>
-          <w:iCs/>
         </w:rPr>
-        <w:t>backend</w:t>
+        <w:t>migration</w:t>
       </w:r>
       <w:r>
         <w:t>.</w:t>
@@ -33211,12 +33645,15 @@
       <w:r>
         <w:t xml:space="preserve"> não sejam apresentados vazios.</w:t>
       </w:r>
+      <w:r>
+        <w:t xml:space="preserve"> Ele é carregado à parte, pelo editor de SQL do painel, e pode ser carregado de novo sem duplicar nada: como as datas são relativas ao dia da carga, uma nova carga só acrescenta os dias ainda sem agendamentos.</w:t>
+      </w:r>
     </w:p>
     <w:p>
       <w:pPr>
         <w:pStyle w:val="Ttulo2"/>
       </w:pPr>
-      <w:bookmarkStart w:id="44" w:name="_Toc243219242"/>
+      <w:bookmarkStart w:id="44" w:name="_Toc243257975"/>
       <w:r>
         <w:t>Publicação</w:t>
       </w:r>
@@ -33417,7 +33854,11 @@
         <w:t>pull request</w:t>
       </w:r>
       <w:r>
-        <w:t xml:space="preserve">, e não pelo GitHub Actions. Como o resultado dessa compilação é uma das condições de incorporação, um erro de compilação impede a alteração de chegar à </w:t>
+        <w:t xml:space="preserve">, e não pelo GitHub Actions. Como o resultado dessa compilação é uma das condições </w:t>
+      </w:r>
+      <w:r>
+        <w:lastRenderedPageBreak/>
+        <w:t xml:space="preserve">de incorporação, um erro de compilação impede a alteração de chegar à </w:t>
       </w:r>
       <w:r>
         <w:rPr>
@@ -33467,7 +33908,42 @@
         <w:t>pull request</w:t>
       </w:r>
       <w:r>
-        <w:t xml:space="preserve"> do código que depende dela. A </w:t>
+        <w:t xml:space="preserve"> do código que depende dela. </w:t>
+      </w:r>
+      <w:r>
+        <w:t>Antes de ser aplicada, ela é conferida num banco local descartável, criado pelo Supabase CLI no Docker (</w:t>
+      </w:r>
+      <w:r>
+        <w:rPr>
+          <w:rFonts w:ascii="Courier New" w:hAnsi="Courier New" w:cs="Courier New"/>
+          <w:sz w:val="22"/>
+        </w:rPr>
+        <w:t>npx supabase start</w:t>
+      </w:r>
+      <w:r>
+        <w:t xml:space="preserve">) e recriado com as </w:t>
+      </w:r>
+      <w:r>
+        <w:rPr>
+          <w:i/>
+        </w:rPr>
+        <w:t>migrations</w:t>
+      </w:r>
+      <w:r>
+        <w:t xml:space="preserve"> e os dados iniciais (</w:t>
+      </w:r>
+      <w:r>
+        <w:rPr>
+          <w:rFonts w:ascii="Courier New" w:hAnsi="Courier New" w:cs="Courier New"/>
+          <w:sz w:val="22"/>
+        </w:rPr>
+        <w:t>npx supabase db reset</w:t>
+      </w:r>
+      <w:r>
+        <w:t xml:space="preserve">), sem acesso ao projeto real. </w:t>
+      </w:r>
+      <w:r>
+        <w:t xml:space="preserve">A </w:t>
       </w:r>
       <w:r>
         <w:rPr>
@@ -33591,7 +34067,7 @@
       <w:pPr>
         <w:pStyle w:val="Ttulo2"/>
       </w:pPr>
-      <w:bookmarkStart w:id="45" w:name="_Toc243219243"/>
+      <w:bookmarkStart w:id="45" w:name="_Toc243257976"/>
       <w:r>
         <w:t>Integração Contínua</w:t>
       </w:r>
@@ -33637,7 +34113,7 @@
       <w:r>
         <w:t xml:space="preserve"> (</w:t>
       </w:r>
-      <w:hyperlink r:id="rId188" w:anchor="RNF014" w:history="1">
+      <w:hyperlink r:id="rId189" w:anchor="RNF014" w:history="1">
         <w:r>
           <w:rPr>
             <w:rStyle w:val="Hyperlink"/>
@@ -33657,7 +34133,11 @@
         <w:t>npm ci</w:t>
       </w:r>
       <w:r>
-        <w:t>, que segue exatamente o arquivo de travamento, e reaproveita o cache do npm entre as execuções. As etapas, executadas em sequência, são:</w:t>
+        <w:t xml:space="preserve">, que segue exatamente o arquivo de travamento, e </w:t>
+      </w:r>
+      <w:r>
+        <w:lastRenderedPageBreak/>
+        <w:t>reaproveita o cache do npm entre as execuções. As etapas, executadas em sequência, são:</w:t>
       </w:r>
     </w:p>
     <w:p>
@@ -33857,7 +34337,7 @@
       <w:pPr>
         <w:pStyle w:val="Ttulo2"/>
       </w:pPr>
-      <w:bookmarkStart w:id="46" w:name="_Toc243219244"/>
+      <w:bookmarkStart w:id="46" w:name="_Toc243257977"/>
       <w:r>
         <w:t>Execução em Contêiner</w:t>
       </w:r>
@@ -33916,6 +34396,7 @@
           <w:sz w:val="22"/>
           <w:szCs w:val="22"/>
         </w:rPr>
+        <w:lastRenderedPageBreak/>
         <w:t>next build</w:t>
       </w:r>
       <w:r>
@@ -34004,7 +34485,10 @@
         <w:t>.claude</w:t>
       </w:r>
       <w:r>
-        <w:t xml:space="preserve">, onde ficam as cópias de trabalho do Claude Code, e da pasta </w:t>
+        <w:t xml:space="preserve">, onde ficam as cópias de trabalho do </w:t>
+      </w:r>
+      <w:r>
+        <w:t xml:space="preserve">Claude Code, e das pastas </w:t>
       </w:r>
       <w:r>
         <w:rPr>
@@ -34015,9 +34499,23 @@
         <w:t>documentos-formais</w:t>
       </w:r>
       <w:r>
+        <w:rPr>
+          <w:szCs w:val="22"/>
+        </w:rPr>
+        <w:t xml:space="preserve"> e </w:t>
+      </w:r>
+      <w:r>
+        <w:rPr>
+          <w:rFonts w:ascii="Courier New" w:hAnsi="Courier New" w:cs="Courier New"/>
+          <w:sz w:val="22"/>
+          <w:szCs w:val="22"/>
+        </w:rPr>
+        <w:t>wireframes</w:t>
+      </w:r>
+      <w:r>
         <w:t>, de modo que nenhuma chave é copiada para ela (</w:t>
       </w:r>
-      <w:hyperlink r:id="rId189" w:anchor="RS016" w:history="1">
+      <w:hyperlink r:id="rId190" w:anchor="RS016" w:history="1">
         <w:r>
           <w:rPr>
             <w:rStyle w:val="Hyperlink"/>
@@ -34261,8 +34759,9 @@
       <w:pPr>
         <w:pStyle w:val="Ttulo1"/>
       </w:pPr>
-      <w:bookmarkStart w:id="47" w:name="_Toc243219245"/>
-      <w:r>
+      <w:bookmarkStart w:id="47" w:name="_Toc243257978"/>
+      <w:r>
+        <w:lastRenderedPageBreak/>
         <w:t>DECISÕES TÉCNICAS E JUSTIFICATIVAS</w:t>
       </w:r>
       <w:bookmarkEnd w:id="47"/>
@@ -34880,7 +35379,7 @@
             <w:r>
               <w:t>Impede que uma edição apague a de outro funcionário sem exigir bloqueios; a verificação é feita pelo banco, na própria gravação (</w:t>
             </w:r>
-            <w:hyperlink r:id="rId190" w:anchor="RNF011" w:history="1">
+            <w:hyperlink r:id="rId191" w:anchor="RNF011" w:history="1">
               <w:r>
                 <w:rPr>
                   <w:rStyle w:val="Hyperlink"/>
@@ -34907,6 +35406,7 @@
               <w:pStyle w:val="TextodeTabela"/>
             </w:pPr>
             <w:r>
+              <w:lastRenderedPageBreak/>
               <w:t>Permissões fixas, uma por página do painel</w:t>
             </w:r>
           </w:p>
@@ -34935,7 +35435,7 @@
             <w:r>
               <w:t>Atende à regra definida na análise (</w:t>
             </w:r>
-            <w:hyperlink r:id="rId191" w:anchor="RN025" w:history="1">
+            <w:hyperlink r:id="rId192" w:anchor="RN025" w:history="1">
               <w:r>
                 <w:rPr>
                   <w:rStyle w:val="Hyperlink"/>
@@ -34990,7 +35490,7 @@
             <w:r>
               <w:t>O agendamento permanece como foi feito, como uma ordem de serviço: mudanças de preço, de nome de serviço ou de dados do veículo e do cliente não alteram o histórico nem a receita apurada (</w:t>
             </w:r>
-            <w:hyperlink r:id="rId192" w:anchor="RN037" w:history="1">
+            <w:hyperlink r:id="rId193" w:anchor="RN037" w:history="1">
               <w:r>
                 <w:rPr>
                   <w:rStyle w:val="Hyperlink"/>
@@ -35100,7 +35600,7 @@
             <w:r>
               <w:t>O porte nunca diverge do tipo, e um novo tipo de veículo exige apenas incluir a sua correspondência (</w:t>
             </w:r>
-            <w:hyperlink r:id="rId193" w:anchor="RN002" w:history="1">
+            <w:hyperlink r:id="rId194" w:anchor="RN002" w:history="1">
               <w:r>
                 <w:rPr>
                   <w:rStyle w:val="Hyperlink"/>
@@ -35155,7 +35655,7 @@
             <w:r>
               <w:t>Decisão de escopo do MVP (</w:t>
             </w:r>
-            <w:hyperlink r:id="rId194" w:anchor="RN016" w:history="1">
+            <w:hyperlink r:id="rId195" w:anchor="RN016" w:history="1">
               <w:r>
                 <w:rPr>
                   <w:rStyle w:val="Hyperlink"/>
@@ -35210,7 +35710,7 @@
             <w:r>
               <w:t>Decisão de escopo do MVP; as contas criadas pelo painel recebem senha inicial com troca obrigatória (</w:t>
             </w:r>
-            <w:hyperlink r:id="rId195" w:anchor="RN023" w:history="1">
+            <w:hyperlink r:id="rId196" w:anchor="RN023" w:history="1">
               <w:r>
                 <w:rPr>
                   <w:rStyle w:val="Hyperlink"/>
@@ -35275,7 +35775,7 @@
             <w:r>
               <w:t xml:space="preserve">Atende ao requisito </w:t>
             </w:r>
-            <w:hyperlink r:id="rId196" w:anchor="RS006" w:history="1">
+            <w:hyperlink r:id="rId197" w:anchor="RS006" w:history="1">
               <w:r>
                 <w:rPr>
                   <w:rStyle w:val="Hyperlink"/>
@@ -35384,7 +35884,7 @@
             <w:r>
               <w:t>Um mesmo carro nunca tem dois cadastros diferentes; o cadastro de uma placa existente apenas cria o vínculo, e o histórico do veículo é preservado na troca de proprietário (</w:t>
             </w:r>
-            <w:hyperlink r:id="rId197" w:anchor="RN036" w:history="1">
+            <w:hyperlink r:id="rId198" w:anchor="RN036" w:history="1">
               <w:r>
                 <w:rPr>
                   <w:rStyle w:val="Hyperlink"/>
@@ -35469,7 +35969,7 @@
             <w:r>
               <w:t xml:space="preserve"> (</w:t>
             </w:r>
-            <w:hyperlink r:id="rId198" w:anchor="RN029" w:history="1">
+            <w:hyperlink r:id="rId199" w:anchor="RN029" w:history="1">
               <w:r>
                 <w:rPr>
                   <w:rStyle w:val="Hyperlink"/>
@@ -35578,7 +36078,7 @@
             <w:r>
               <w:t>Impede que o total fique incoerente com os serviços, o porte do veículo e a forma de pagamento (</w:t>
             </w:r>
-            <w:hyperlink r:id="rId199" w:anchor="RN033" w:history="1">
+            <w:hyperlink r:id="rId200" w:anchor="RN033" w:history="1">
               <w:r>
                 <w:rPr>
                   <w:rStyle w:val="Hyperlink"/>
@@ -35643,7 +36143,7 @@
             <w:r>
               <w:t xml:space="preserve"> (</w:t>
             </w:r>
-            <w:hyperlink r:id="rId200" w:anchor="RN030" w:history="1">
+            <w:hyperlink r:id="rId201" w:anchor="RN030" w:history="1">
               <w:r>
                 <w:rPr>
                   <w:rStyle w:val="Hyperlink"/>
@@ -35670,6 +36170,7 @@
               <w:pStyle w:val="TextodeTabela"/>
             </w:pPr>
             <w:r>
+              <w:lastRenderedPageBreak/>
               <w:t>TypeScript 6.0 e Node.js 24 LTS</w:t>
             </w:r>
           </w:p>
@@ -36143,6 +36644,163 @@
             </w:pPr>
             <w:r>
               <w:t>Exigência da disciplina; a aplicação roda da mesma forma em qualquer máquina com o Docker. A publicação continua na Vercel, e o banco, no Supabase.</w:t>
+            </w:r>
+          </w:p>
+        </w:tc>
+      </w:tr>
+      <w:tr>
+        <w:trPr>
+          <w:cantSplit/>
+        </w:trPr>
+        <w:tc>
+          <w:tcPr>
+            <w:tcW w:w="2400" w:type="dxa"/>
+          </w:tcPr>
+          <w:p>
+            <w:pPr>
+              <w:pStyle w:val="TextodeTabela"/>
+            </w:pPr>
+            <w:r>
+              <w:t>Banco sem privilégios para as chaves públicas</w:t>
+            </w:r>
+          </w:p>
+        </w:tc>
+        <w:tc>
+          <w:tcPr>
+            <w:tcW w:w="2300" w:type="dxa"/>
+          </w:tcPr>
+          <w:p>
+            <w:pPr>
+              <w:pStyle w:val="TextodeTabela"/>
+            </w:pPr>
+            <w:r>
+              <w:t>Apenas a segurança em nível de linha, com os privilégios padrão do Supabase</w:t>
+            </w:r>
+          </w:p>
+        </w:tc>
+        <w:tc>
+          <w:tcPr>
+            <w:tcW w:w="4371" w:type="dxa"/>
+          </w:tcPr>
+          <w:p>
+            <w:pPr>
+              <w:pStyle w:val="TextodeTabela"/>
+            </w:pPr>
+            <w:r>
+              <w:t>Segunda barreira para o banco fechado ao navegador: mesmo com a segurança em nível de linha desativada ou uma política criada por engano, a chave pública continua sem acesso; toda função nova revoga a execução desses papéis.</w:t>
+            </w:r>
+          </w:p>
+        </w:tc>
+      </w:tr>
+      <w:tr>
+        <w:trPr>
+          <w:cantSplit/>
+        </w:trPr>
+        <w:tc>
+          <w:tcPr>
+            <w:tcW w:w="2400" w:type="dxa"/>
+          </w:tcPr>
+          <w:p>
+            <w:pPr>
+              <w:pStyle w:val="TextodeTabela"/>
+            </w:pPr>
+            <w:r>
+              <w:lastRenderedPageBreak/>
+              <w:t xml:space="preserve">Supabase CLI fixada no projeto e banco local para conferir as </w:t>
+            </w:r>
+            <w:r>
+              <w:rPr>
+                <w:i/>
+              </w:rPr>
+              <w:t>migrations</w:t>
+            </w:r>
+          </w:p>
+        </w:tc>
+        <w:tc>
+          <w:tcPr>
+            <w:tcW w:w="2300" w:type="dxa"/>
+          </w:tcPr>
+          <w:p>
+            <w:pPr>
+              <w:pStyle w:val="TextodeTabela"/>
+            </w:pPr>
+            <w:r>
+              <w:t>CLI baixada sob demanda, testes de banco versionados ou conferência apenas no projeto real</w:t>
+            </w:r>
+          </w:p>
+        </w:tc>
+        <w:tc>
+          <w:tcPr>
+            <w:tcW w:w="4371" w:type="dxa"/>
+          </w:tcPr>
+          <w:p>
+            <w:pPr>
+              <w:pStyle w:val="TextodeTabela"/>
+            </w:pPr>
+            <w:r>
+              <w:t xml:space="preserve">A </w:t>
+            </w:r>
+            <w:r>
+              <w:rPr>
+                <w:i/>
+              </w:rPr>
+              <w:t>migration</w:t>
+            </w:r>
+            <w:r>
+              <w:t xml:space="preserve"> aplicada não se edita e vale na hora para a produção; num banco local descartável, o erro aparece antes. A versão fixa evita diferenças entre as máquinas da equipe.</w:t>
+            </w:r>
+          </w:p>
+        </w:tc>
+      </w:tr>
+      <w:tr>
+        <w:trPr>
+          <w:cantSplit/>
+        </w:trPr>
+        <w:tc>
+          <w:tcPr>
+            <w:tcW w:w="2400" w:type="dxa"/>
+          </w:tcPr>
+          <w:p>
+            <w:pPr>
+              <w:pStyle w:val="TextodeTabela"/>
+            </w:pPr>
+            <w:r>
+              <w:t>Preparação do Supabase sem configuração manual no painel</w:t>
+            </w:r>
+          </w:p>
+        </w:tc>
+        <w:tc>
+          <w:tcPr>
+            <w:tcW w:w="2300" w:type="dxa"/>
+          </w:tcPr>
+          <w:p>
+            <w:pPr>
+              <w:pStyle w:val="TextodeTabela"/>
+            </w:pPr>
+            <w:r>
+              <w:t>Confirmação de e-mail, senha mínima e repositório de arquivos configurados no painel</w:t>
+            </w:r>
+          </w:p>
+        </w:tc>
+        <w:tc>
+          <w:tcPr>
+            <w:tcW w:w="4371" w:type="dxa"/>
+          </w:tcPr>
+          <w:p>
+            <w:pPr>
+              <w:pStyle w:val="TextodeTabela"/>
+            </w:pPr>
+            <w:r>
+              <w:t xml:space="preserve">Tudo o que o sistema precisa fica versionado: as contas nascem com o e-mail confirmado, pois o MVP não envia e-mails; a senha é exigida pelos esquemas de validação; e o repositório de arquivos vem da </w:t>
+            </w:r>
+            <w:r>
+              <w:rPr>
+                <w:i/>
+              </w:rPr>
+              <w:t>migration</w:t>
+            </w:r>
+            <w:r>
+              <w:t>.</w:t>
             </w:r>
           </w:p>
         </w:tc>
@@ -36157,8 +36815,9 @@
         </w:numPr>
         <w:jc w:val="center"/>
       </w:pPr>
-      <w:bookmarkStart w:id="48" w:name="_Toc243219246"/>
-      <w:r>
+      <w:bookmarkStart w:id="48" w:name="_Toc243257979"/>
+      <w:r>
+        <w:lastRenderedPageBreak/>
         <w:t>APÊNDICE A – CONTRATO DETALHADO DA API</w:t>
       </w:r>
       <w:bookmarkEnd w:id="48"/>
@@ -36264,7 +36923,7 @@
           <w:numId w:val="0"/>
         </w:numPr>
       </w:pPr>
-      <w:bookmarkStart w:id="49" w:name="_Toc243219247"/>
+      <w:bookmarkStart w:id="49" w:name="_Toc243257980"/>
       <w:r>
         <w:t>Autenticação</w:t>
       </w:r>
@@ -36440,7 +37099,7 @@
             <w:r>
               <w:t>Cria a conta de cliente (</w:t>
             </w:r>
-            <w:hyperlink r:id="rId201" w:anchor="UC02" w:history="1">
+            <w:hyperlink r:id="rId202" w:anchor="UC02" w:history="1">
               <w:r>
                 <w:rPr>
                   <w:rStyle w:val="Hyperlink"/>
@@ -36546,7 +37205,7 @@
             <w:r>
               <w:t>Inicia a sessão de cliente ou de funcionário (</w:t>
             </w:r>
-            <w:hyperlink r:id="rId202" w:anchor="UC03" w:history="1">
+            <w:hyperlink r:id="rId203" w:anchor="UC03" w:history="1">
               <w:r>
                 <w:rPr>
                   <w:rStyle w:val="Hyperlink"/>
@@ -36557,7 +37216,7 @@
             <w:r>
               <w:t xml:space="preserve">, </w:t>
             </w:r>
-            <w:hyperlink r:id="rId203" w:anchor="UC08" w:history="1">
+            <w:hyperlink r:id="rId204" w:anchor="UC08" w:history="1">
               <w:r>
                 <w:rPr>
                   <w:rStyle w:val="Hyperlink"/>
@@ -36942,8 +37601,9 @@
           <w:numId w:val="0"/>
         </w:numPr>
       </w:pPr>
-      <w:bookmarkStart w:id="50" w:name="_Toc243219248"/>
-      <w:r>
+      <w:bookmarkStart w:id="50" w:name="_Toc243257981"/>
+      <w:r>
+        <w:lastRenderedPageBreak/>
         <w:t>Rotas Públicas</w:t>
       </w:r>
       <w:bookmarkEnd w:id="50"/>
@@ -37108,7 +37768,7 @@
             <w:r>
               <w:t>Dados institucionais e horários de funcionamento (</w:t>
             </w:r>
-            <w:hyperlink r:id="rId204" w:anchor="RN028" w:history="1">
+            <w:hyperlink r:id="rId205" w:anchor="RN028" w:history="1">
               <w:r>
                 <w:rPr>
                   <w:rStyle w:val="Hyperlink"/>
@@ -37193,7 +37853,7 @@
             <w:r>
               <w:t>Catálogo de serviços principais e complementares ativos (</w:t>
             </w:r>
-            <w:hyperlink r:id="rId205" w:anchor="UC01" w:history="1">
+            <w:hyperlink r:id="rId206" w:anchor="UC01" w:history="1">
               <w:r>
                 <w:rPr>
                   <w:rStyle w:val="Hyperlink"/>
@@ -37257,7 +37917,7 @@
           <w:numId w:val="0"/>
         </w:numPr>
       </w:pPr>
-      <w:bookmarkStart w:id="51" w:name="_Toc243219249"/>
+      <w:bookmarkStart w:id="51" w:name="_Toc243257982"/>
       <w:r>
         <w:t>Rotas do Cliente</w:t>
       </w:r>
@@ -37434,7 +38094,7 @@
             <w:r>
               <w:t>Dados da conta (</w:t>
             </w:r>
-            <w:hyperlink r:id="rId206" w:anchor="UC04" w:history="1">
+            <w:hyperlink r:id="rId207" w:anchor="UC04" w:history="1">
               <w:r>
                 <w:rPr>
                   <w:rStyle w:val="Hyperlink"/>
@@ -37671,96 +38331,6 @@
             </w:pPr>
             <w:r>
               <w:t>Consulta uma placa antes do cadastro (</w:t>
-            </w:r>
-            <w:hyperlink r:id="rId207" w:anchor="UC05" w:history="1">
-              <w:r>
-                <w:rPr>
-                  <w:rStyle w:val="Hyperlink"/>
-                </w:rPr>
-                <w:t>UC05</w:t>
-              </w:r>
-            </w:hyperlink>
-            <w:r>
-              <w:t>).</w:t>
-            </w:r>
-          </w:p>
-        </w:tc>
-        <w:tc>
-          <w:tcPr>
-            <w:tcW w:w="2600" w:type="dxa"/>
-          </w:tcPr>
-          <w:p>
-            <w:pPr>
-              <w:pStyle w:val="TextodeTabela"/>
-            </w:pPr>
-            <w:r>
-              <w:rPr>
-                <w:rFonts w:ascii="Courier New" w:hAnsi="Courier New" w:cs="Courier New"/>
-                <w:sz w:val="16"/>
-                <w:szCs w:val="16"/>
-              </w:rPr>
-              <w:t>plate*</w:t>
-            </w:r>
-          </w:p>
-        </w:tc>
-        <w:tc>
-          <w:tcPr>
-            <w:tcW w:w="2471" w:type="dxa"/>
-          </w:tcPr>
-          <w:p>
-            <w:pPr>
-              <w:pStyle w:val="TextodeTabela"/>
-            </w:pPr>
-            <w:r>
-              <w:rPr>
-                <w:b/>
-                <w:bCs/>
-              </w:rPr>
-              <w:t>200</w:t>
-            </w:r>
-            <w:r>
-              <w:t xml:space="preserve"> tipo, marca, modelo, cor e ano do veículo, se a placa já estiver cadastrada, ou resposta vazia; nunca devolve dados de clientes.</w:t>
-            </w:r>
-          </w:p>
-        </w:tc>
-      </w:tr>
-      <w:tr>
-        <w:trPr>
-          <w:cantSplit/>
-        </w:trPr>
-        <w:tc>
-          <w:tcPr>
-            <w:tcW w:w="4000" w:type="dxa"/>
-          </w:tcPr>
-          <w:p>
-            <w:pPr>
-              <w:pStyle w:val="TextodeTabela"/>
-            </w:pPr>
-            <w:r>
-              <w:rPr>
-                <w:b/>
-                <w:bCs/>
-              </w:rPr>
-              <w:t>POST</w:t>
-            </w:r>
-            <w:r>
-              <w:t xml:space="preserve"> </w:t>
-            </w:r>
-            <w:r>
-              <w:rPr>
-                <w:rFonts w:ascii="Courier New" w:hAnsi="Courier New" w:cs="Courier New"/>
-                <w:sz w:val="16"/>
-                <w:szCs w:val="16"/>
-              </w:rPr>
-              <w:t>/api/me/vehicles</w:t>
-            </w:r>
-          </w:p>
-          <w:p>
-            <w:pPr>
-              <w:pStyle w:val="TextodeTabela"/>
-            </w:pPr>
-            <w:r>
-              <w:t>Cadastra um veículo ou vincula à conta o veículo de uma placa já cadastrada (</w:t>
             </w:r>
             <w:hyperlink r:id="rId208" w:anchor="UC05" w:history="1">
               <w:r>
@@ -37792,25 +38362,6 @@
               <w:t>plate*</w:t>
             </w:r>
           </w:p>
-          <w:p>
-            <w:pPr>
-              <w:pStyle w:val="TextodeTabela"/>
-            </w:pPr>
-            <w:r>
-              <w:t xml:space="preserve">Placa nova: </w:t>
-            </w:r>
-            <w:r>
-              <w:rPr>
-                <w:rFonts w:ascii="Courier New" w:hAnsi="Courier New" w:cs="Courier New"/>
-                <w:sz w:val="16"/>
-                <w:szCs w:val="16"/>
-              </w:rPr>
-              <w:t>type*, brand*, model*, color*, year*</w:t>
-            </w:r>
-            <w:r>
-              <w:t>.</w:t>
-            </w:r>
-          </w:p>
         </w:tc>
         <w:tc>
           <w:tcPr>
@@ -37825,26 +38376,10 @@
                 <w:b/>
                 <w:bCs/>
               </w:rPr>
-              <w:t>201</w:t>
-            </w:r>
-            <w:r>
-              <w:t xml:space="preserve"> veículo criado ou vinculado, com o porte definido.</w:t>
-            </w:r>
-          </w:p>
-          <w:p>
-            <w:pPr>
-              <w:pStyle w:val="TextodeTabela"/>
-            </w:pPr>
-            <w:r>
-              <w:t xml:space="preserve">409 </w:t>
-            </w:r>
-            <w:r>
-              <w:rPr>
-                <w:rFonts w:ascii="Courier New" w:hAnsi="Courier New" w:cs="Courier New"/>
-                <w:sz w:val="16"/>
-                <w:szCs w:val="16"/>
-              </w:rPr>
-              <w:t>VEHICLE_ALREADY_LINKED</w:t>
+              <w:t>200</w:t>
+            </w:r>
+            <w:r>
+              <w:t xml:space="preserve"> tipo, marca, modelo, cor e ano do veículo, se a placa já estiver cadastrada, ou resposta vazia; nunca devolve dados de clientes.</w:t>
             </w:r>
           </w:p>
         </w:tc>
@@ -37866,7 +38401,7 @@
                 <w:b/>
                 <w:bCs/>
               </w:rPr>
-              <w:t>PATCH</w:t>
+              <w:t>POST</w:t>
             </w:r>
             <w:r>
               <w:t xml:space="preserve"> </w:t>
@@ -37877,6 +38412,132 @@
                 <w:sz w:val="16"/>
                 <w:szCs w:val="16"/>
               </w:rPr>
+              <w:t>/api/me/vehicles</w:t>
+            </w:r>
+          </w:p>
+          <w:p>
+            <w:pPr>
+              <w:pStyle w:val="TextodeTabela"/>
+            </w:pPr>
+            <w:r>
+              <w:t>Cadastra um veículo ou vincula à conta o veículo de uma placa já cadastrada (</w:t>
+            </w:r>
+            <w:hyperlink r:id="rId209" w:anchor="UC05" w:history="1">
+              <w:r>
+                <w:rPr>
+                  <w:rStyle w:val="Hyperlink"/>
+                </w:rPr>
+                <w:t>UC05</w:t>
+              </w:r>
+            </w:hyperlink>
+            <w:r>
+              <w:t>).</w:t>
+            </w:r>
+          </w:p>
+        </w:tc>
+        <w:tc>
+          <w:tcPr>
+            <w:tcW w:w="2600" w:type="dxa"/>
+          </w:tcPr>
+          <w:p>
+            <w:pPr>
+              <w:pStyle w:val="TextodeTabela"/>
+            </w:pPr>
+            <w:r>
+              <w:rPr>
+                <w:rFonts w:ascii="Courier New" w:hAnsi="Courier New" w:cs="Courier New"/>
+                <w:sz w:val="16"/>
+                <w:szCs w:val="16"/>
+              </w:rPr>
+              <w:t>plate*</w:t>
+            </w:r>
+          </w:p>
+          <w:p>
+            <w:pPr>
+              <w:pStyle w:val="TextodeTabela"/>
+            </w:pPr>
+            <w:r>
+              <w:t xml:space="preserve">Placa nova: </w:t>
+            </w:r>
+            <w:r>
+              <w:rPr>
+                <w:rFonts w:ascii="Courier New" w:hAnsi="Courier New" w:cs="Courier New"/>
+                <w:sz w:val="16"/>
+                <w:szCs w:val="16"/>
+              </w:rPr>
+              <w:t>type*, brand*, model*, color*, year*</w:t>
+            </w:r>
+            <w:r>
+              <w:t>.</w:t>
+            </w:r>
+          </w:p>
+        </w:tc>
+        <w:tc>
+          <w:tcPr>
+            <w:tcW w:w="2471" w:type="dxa"/>
+          </w:tcPr>
+          <w:p>
+            <w:pPr>
+              <w:pStyle w:val="TextodeTabela"/>
+            </w:pPr>
+            <w:r>
+              <w:rPr>
+                <w:b/>
+                <w:bCs/>
+              </w:rPr>
+              <w:t>201</w:t>
+            </w:r>
+            <w:r>
+              <w:t xml:space="preserve"> veículo criado ou vinculado, com o porte definido.</w:t>
+            </w:r>
+          </w:p>
+          <w:p>
+            <w:pPr>
+              <w:pStyle w:val="TextodeTabela"/>
+            </w:pPr>
+            <w:r>
+              <w:t xml:space="preserve">409 </w:t>
+            </w:r>
+            <w:r>
+              <w:rPr>
+                <w:rFonts w:ascii="Courier New" w:hAnsi="Courier New" w:cs="Courier New"/>
+                <w:sz w:val="16"/>
+                <w:szCs w:val="16"/>
+              </w:rPr>
+              <w:t>VEHICLE_ALREADY_LINKED</w:t>
+            </w:r>
+          </w:p>
+        </w:tc>
+      </w:tr>
+      <w:tr>
+        <w:trPr>
+          <w:cantSplit/>
+        </w:trPr>
+        <w:tc>
+          <w:tcPr>
+            <w:tcW w:w="4000" w:type="dxa"/>
+          </w:tcPr>
+          <w:p>
+            <w:pPr>
+              <w:pStyle w:val="TextodeTabela"/>
+            </w:pPr>
+            <w:r>
+              <w:rPr>
+                <w:b/>
+                <w:bCs/>
+              </w:rPr>
+              <w:lastRenderedPageBreak/>
+              <w:t>PATCH</w:t>
+            </w:r>
+            <w:r>
+              <w:t xml:space="preserve"> </w:t>
+            </w:r>
+            <w:r>
+              <w:rPr>
+                <w:rFonts w:ascii="Courier New" w:hAnsi="Courier New" w:cs="Courier New"/>
+                <w:sz w:val="16"/>
+                <w:szCs w:val="16"/>
+              </w:rPr>
               <w:t>/api/me/vehicles/:id</w:t>
             </w:r>
           </w:p>
@@ -37887,7 +38548,7 @@
             <w:r>
               <w:t>Edita um veículo do cliente (</w:t>
             </w:r>
-            <w:hyperlink r:id="rId209" w:anchor="UC05" w:history="1">
+            <w:hyperlink r:id="rId210" w:anchor="UC05" w:history="1">
               <w:r>
                 <w:rPr>
                   <w:rStyle w:val="Hyperlink"/>
@@ -38306,7 +38967,7 @@
             <w:r>
               <w:t>Registra o agendamento (</w:t>
             </w:r>
-            <w:hyperlink r:id="rId210" w:anchor="UC06" w:history="1">
+            <w:hyperlink r:id="rId211" w:anchor="UC06" w:history="1">
               <w:r>
                 <w:rPr>
                   <w:rStyle w:val="Hyperlink"/>
@@ -38415,7 +39076,7 @@
             <w:r>
               <w:t>Lista os agendamentos (</w:t>
             </w:r>
-            <w:hyperlink r:id="rId211" w:anchor="UC07" w:history="1">
+            <w:hyperlink r:id="rId212" w:anchor="UC07" w:history="1">
               <w:r>
                 <w:rPr>
                   <w:rStyle w:val="Hyperlink"/>
@@ -38615,7 +39276,7 @@
             <w:r>
               <w:t xml:space="preserve"> (</w:t>
             </w:r>
-            <w:hyperlink r:id="rId212" w:anchor="UC26" w:history="1">
+            <w:hyperlink r:id="rId213" w:anchor="UC26" w:history="1">
               <w:r>
                 <w:rPr>
                   <w:rStyle w:val="Hyperlink"/>
@@ -38804,6 +39465,7 @@
                 <w:b/>
                 <w:bCs/>
               </w:rPr>
+              <w:lastRenderedPageBreak/>
               <w:t>POST</w:t>
             </w:r>
             <w:r>
@@ -38825,7 +39487,7 @@
             <w:r>
               <w:t>Reagenda um serviço concluído (</w:t>
             </w:r>
-            <w:hyperlink r:id="rId213" w:anchor="UC25" w:history="1">
+            <w:hyperlink r:id="rId214" w:anchor="UC25" w:history="1">
               <w:r>
                 <w:rPr>
                   <w:rStyle w:val="Hyperlink"/>
@@ -38916,7 +39578,7 @@
           <w:numId w:val="0"/>
         </w:numPr>
       </w:pPr>
-      <w:bookmarkStart w:id="52" w:name="_Toc243219250"/>
+      <w:bookmarkStart w:id="52" w:name="_Toc243257983"/>
       <w:r>
         <w:t>Rotas do Painel</w:t>
       </w:r>
@@ -39130,7 +39792,7 @@
             <w:r>
               <w:t>Indicadores e agenda do dia (</w:t>
             </w:r>
-            <w:hyperlink r:id="rId214" w:anchor="UC09" w:history="1">
+            <w:hyperlink r:id="rId215" w:anchor="UC09" w:history="1">
               <w:r>
                 <w:rPr>
                   <w:rStyle w:val="Hyperlink"/>
@@ -39366,7 +40028,7 @@
             <w:r>
               <w:t>Lista os agendamentos (</w:t>
             </w:r>
-            <w:hyperlink r:id="rId215" w:anchor="UC10" w:history="1">
+            <w:hyperlink r:id="rId216" w:anchor="UC10" w:history="1">
               <w:r>
                 <w:rPr>
                   <w:rStyle w:val="Hyperlink"/>
@@ -39675,6 +40337,7 @@
                 <w:b/>
                 <w:bCs/>
               </w:rPr>
+              <w:lastRenderedPageBreak/>
               <w:t>POST</w:t>
             </w:r>
             <w:r>
@@ -39696,7 +40359,7 @@
             <w:r>
               <w:t>Registra um agendamento para um cliente (</w:t>
             </w:r>
-            <w:hyperlink r:id="rId216" w:anchor="UC11" w:history="1">
+            <w:hyperlink r:id="rId217" w:anchor="UC11" w:history="1">
               <w:r>
                 <w:rPr>
                   <w:rStyle w:val="Hyperlink"/>
@@ -39805,7 +40468,7 @@
             <w:r>
               <w:t>Edita um agendamento em qualquer status (</w:t>
             </w:r>
-            <w:hyperlink r:id="rId217" w:anchor="UC26" w:history="1">
+            <w:hyperlink r:id="rId218" w:anchor="UC26" w:history="1">
               <w:r>
                 <w:rPr>
                   <w:rStyle w:val="Hyperlink"/>
@@ -39913,107 +40576,6 @@
             </w:r>
             <w:r>
               <w:t xml:space="preserve"> (</w:t>
-            </w:r>
-            <w:hyperlink r:id="rId218" w:anchor="UC12" w:history="1">
-              <w:r>
-                <w:rPr>
-                  <w:rStyle w:val="Hyperlink"/>
-                </w:rPr>
-                <w:t>UC12</w:t>
-              </w:r>
-            </w:hyperlink>
-            <w:r>
-              <w:t>).</w:t>
-            </w:r>
-          </w:p>
-        </w:tc>
-        <w:tc>
-          <w:tcPr>
-            <w:tcW w:w="2600" w:type="dxa"/>
-          </w:tcPr>
-          <w:p>
-            <w:pPr>
-              <w:pStyle w:val="TextodeTabela"/>
-            </w:pPr>
-            <w:r>
-              <w:t>Nenhuma.</w:t>
-            </w:r>
-          </w:p>
-        </w:tc>
-        <w:tc>
-          <w:tcPr>
-            <w:tcW w:w="2471" w:type="dxa"/>
-          </w:tcPr>
-          <w:p>
-            <w:pPr>
-              <w:pStyle w:val="TextodeTabela"/>
-            </w:pPr>
-            <w:r>
-              <w:rPr>
-                <w:b/>
-                <w:bCs/>
-              </w:rPr>
-              <w:t>200</w:t>
-            </w:r>
-            <w:r>
-              <w:t xml:space="preserve"> agendamento com o novo status.</w:t>
-            </w:r>
-          </w:p>
-          <w:p>
-            <w:pPr>
-              <w:pStyle w:val="TextodeTabela"/>
-            </w:pPr>
-            <w:r>
-              <w:t xml:space="preserve">409 </w:t>
-            </w:r>
-            <w:r>
-              <w:rPr>
-                <w:rFonts w:ascii="Courier New" w:hAnsi="Courier New" w:cs="Courier New"/>
-                <w:sz w:val="16"/>
-                <w:szCs w:val="16"/>
-              </w:rPr>
-              <w:t>INVALID_STATUS</w:t>
-            </w:r>
-          </w:p>
-        </w:tc>
-      </w:tr>
-      <w:tr>
-        <w:trPr>
-          <w:cantSplit/>
-        </w:trPr>
-        <w:tc>
-          <w:tcPr>
-            <w:tcW w:w="4000" w:type="dxa"/>
-          </w:tcPr>
-          <w:p>
-            <w:pPr>
-              <w:pStyle w:val="TextodeTabela"/>
-            </w:pPr>
-            <w:r>
-              <w:rPr>
-                <w:b/>
-                <w:bCs/>
-              </w:rPr>
-              <w:t>POST</w:t>
-            </w:r>
-            <w:r>
-              <w:t xml:space="preserve"> </w:t>
-            </w:r>
-            <w:r>
-              <w:rPr>
-                <w:rFonts w:ascii="Courier New" w:hAnsi="Courier New" w:cs="Courier New"/>
-                <w:sz w:val="16"/>
-                <w:szCs w:val="16"/>
-              </w:rPr>
-              <w:t>/api/admin/appointments/:id/complete</w:t>
-            </w:r>
-          </w:p>
-          <w:p>
-            <w:pPr>
-              <w:pStyle w:val="TextodeTabela"/>
-            </w:pPr>
-            <w:r>
-              <w:t>Conclui o atendimento e registra a forma de pagamento utilizada (</w:t>
             </w:r>
             <w:hyperlink r:id="rId219" w:anchor="UC12" w:history="1">
               <w:r>
@@ -40037,73 +40599,43 @@
               <w:pStyle w:val="TextodeTabela"/>
             </w:pPr>
             <w:r>
+              <w:t>Nenhuma.</w:t>
+            </w:r>
+          </w:p>
+        </w:tc>
+        <w:tc>
+          <w:tcPr>
+            <w:tcW w:w="2471" w:type="dxa"/>
+          </w:tcPr>
+          <w:p>
+            <w:pPr>
+              <w:pStyle w:val="TextodeTabela"/>
+            </w:pPr>
+            <w:r>
+              <w:rPr>
+                <w:b/>
+                <w:bCs/>
+              </w:rPr>
+              <w:t>200</w:t>
+            </w:r>
+            <w:r>
+              <w:t xml:space="preserve"> agendamento com o novo status.</w:t>
+            </w:r>
+          </w:p>
+          <w:p>
+            <w:pPr>
+              <w:pStyle w:val="TextodeTabela"/>
+            </w:pPr>
+            <w:r>
+              <w:t xml:space="preserve">409 </w:t>
+            </w:r>
+            <w:r>
               <w:rPr>
                 <w:rFonts w:ascii="Courier New" w:hAnsi="Courier New" w:cs="Courier New"/>
                 <w:sz w:val="16"/>
                 <w:szCs w:val="16"/>
               </w:rPr>
-              <w:t>paymentMethod*</w:t>
-            </w:r>
-          </w:p>
-        </w:tc>
-        <w:tc>
-          <w:tcPr>
-            <w:tcW w:w="2471" w:type="dxa"/>
-          </w:tcPr>
-          <w:p>
-            <w:pPr>
-              <w:pStyle w:val="TextodeTabela"/>
-            </w:pPr>
-            <w:r>
-              <w:rPr>
-                <w:b/>
-                <w:bCs/>
-              </w:rPr>
-              <w:t>200</w:t>
-            </w:r>
-            <w:r>
-              <w:t xml:space="preserve"> agendamento </w:t>
-            </w:r>
-            <w:r>
-              <w:rPr>
-                <w:rFonts w:ascii="Courier New" w:hAnsi="Courier New" w:cs="Courier New"/>
-                <w:sz w:val="16"/>
-                <w:szCs w:val="16"/>
-              </w:rPr>
-              <w:t>completed</w:t>
-            </w:r>
-            <w:r>
-              <w:t>, com o total recalculado se a forma de pagamento mudou.</w:t>
-            </w:r>
-          </w:p>
-          <w:p>
-            <w:pPr>
-              <w:pStyle w:val="TextodeTabela"/>
-            </w:pPr>
-            <w:r>
-              <w:t xml:space="preserve">409 </w:t>
-            </w:r>
-            <w:r>
-              <w:rPr>
-                <w:rFonts w:ascii="Courier New" w:hAnsi="Courier New" w:cs="Courier New"/>
-                <w:sz w:val="16"/>
-                <w:szCs w:val="16"/>
-              </w:rPr>
               <w:t>INVALID_STATUS</w:t>
-            </w:r>
-            <w:r>
-              <w:t xml:space="preserve"> se não estiver em </w:t>
-            </w:r>
-            <w:r>
-              <w:rPr>
-                <w:rFonts w:ascii="Courier New" w:hAnsi="Courier New" w:cs="Courier New"/>
-                <w:sz w:val="16"/>
-                <w:szCs w:val="16"/>
-              </w:rPr>
-              <w:t>awaiting_payment</w:t>
-            </w:r>
-            <w:r>
-              <w:t>.</w:t>
             </w:r>
           </w:p>
         </w:tc>
@@ -40136,15 +40668,26 @@
                 <w:sz w:val="16"/>
                 <w:szCs w:val="16"/>
               </w:rPr>
-              <w:t>/api/admin/appointments/:id/cancel</w:t>
-            </w:r>
-          </w:p>
-          <w:p>
-            <w:pPr>
-              <w:pStyle w:val="TextodeTabela"/>
-            </w:pPr>
-            <w:r>
-              <w:t>Cancela um agendamento agendado ou em espera.</w:t>
+              <w:t>/api/admin/appointments/:id/complete</w:t>
+            </w:r>
+          </w:p>
+          <w:p>
+            <w:pPr>
+              <w:pStyle w:val="TextodeTabela"/>
+            </w:pPr>
+            <w:r>
+              <w:t>Conclui o atendimento e registra a forma de pagamento utilizada (</w:t>
+            </w:r>
+            <w:hyperlink r:id="rId220" w:anchor="UC12" w:history="1">
+              <w:r>
+                <w:rPr>
+                  <w:rStyle w:val="Hyperlink"/>
+                </w:rPr>
+                <w:t>UC12</w:t>
+              </w:r>
+            </w:hyperlink>
+            <w:r>
+              <w:t>).</w:t>
             </w:r>
           </w:p>
         </w:tc>
@@ -40157,7 +40700,12 @@
               <w:pStyle w:val="TextodeTabela"/>
             </w:pPr>
             <w:r>
-              <w:t>Nenhuma.</w:t>
+              <w:rPr>
+                <w:rFonts w:ascii="Courier New" w:hAnsi="Courier New" w:cs="Courier New"/>
+                <w:sz w:val="16"/>
+                <w:szCs w:val="16"/>
+              </w:rPr>
+              <w:t>paymentMethod*</w:t>
             </w:r>
           </w:p>
         </w:tc>
@@ -40177,15 +40725,7 @@
               <w:t>200</w:t>
             </w:r>
             <w:r>
-              <w:t xml:space="preserve"> agendamento cancelado.</w:t>
-            </w:r>
-          </w:p>
-          <w:p>
-            <w:pPr>
-              <w:pStyle w:val="TextodeTabela"/>
-            </w:pPr>
-            <w:r>
-              <w:t xml:space="preserve">409 </w:t>
+              <w:t xml:space="preserve"> agendamento </w:t>
             </w:r>
             <w:r>
               <w:rPr>
@@ -40193,7 +40733,40 @@
                 <w:sz w:val="16"/>
                 <w:szCs w:val="16"/>
               </w:rPr>
+              <w:t>completed</w:t>
+            </w:r>
+            <w:r>
+              <w:t>, com o total recalculado se a forma de pagamento mudou.</w:t>
+            </w:r>
+          </w:p>
+          <w:p>
+            <w:pPr>
+              <w:pStyle w:val="TextodeTabela"/>
+            </w:pPr>
+            <w:r>
+              <w:t xml:space="preserve">409 </w:t>
+            </w:r>
+            <w:r>
+              <w:rPr>
+                <w:rFonts w:ascii="Courier New" w:hAnsi="Courier New" w:cs="Courier New"/>
+                <w:sz w:val="16"/>
+                <w:szCs w:val="16"/>
+              </w:rPr>
               <w:t>INVALID_STATUS</w:t>
+            </w:r>
+            <w:r>
+              <w:t xml:space="preserve"> se não estiver em </w:t>
+            </w:r>
+            <w:r>
+              <w:rPr>
+                <w:rFonts w:ascii="Courier New" w:hAnsi="Courier New" w:cs="Courier New"/>
+                <w:sz w:val="16"/>
+                <w:szCs w:val="16"/>
+              </w:rPr>
+              <w:t>awaiting_payment</w:t>
+            </w:r>
+            <w:r>
+              <w:t>.</w:t>
             </w:r>
           </w:p>
         </w:tc>
@@ -40226,6 +40799,96 @@
                 <w:sz w:val="16"/>
                 <w:szCs w:val="16"/>
               </w:rPr>
+              <w:t>/api/admin/appointments/:id/cancel</w:t>
+            </w:r>
+          </w:p>
+          <w:p>
+            <w:pPr>
+              <w:pStyle w:val="TextodeTabela"/>
+            </w:pPr>
+            <w:r>
+              <w:t>Cancela um agendamento agendado ou em espera.</w:t>
+            </w:r>
+          </w:p>
+        </w:tc>
+        <w:tc>
+          <w:tcPr>
+            <w:tcW w:w="2600" w:type="dxa"/>
+          </w:tcPr>
+          <w:p>
+            <w:pPr>
+              <w:pStyle w:val="TextodeTabela"/>
+            </w:pPr>
+            <w:r>
+              <w:t>Nenhuma.</w:t>
+            </w:r>
+          </w:p>
+        </w:tc>
+        <w:tc>
+          <w:tcPr>
+            <w:tcW w:w="2471" w:type="dxa"/>
+          </w:tcPr>
+          <w:p>
+            <w:pPr>
+              <w:pStyle w:val="TextodeTabela"/>
+            </w:pPr>
+            <w:r>
+              <w:rPr>
+                <w:b/>
+                <w:bCs/>
+              </w:rPr>
+              <w:t>200</w:t>
+            </w:r>
+            <w:r>
+              <w:t xml:space="preserve"> agendamento cancelado.</w:t>
+            </w:r>
+          </w:p>
+          <w:p>
+            <w:pPr>
+              <w:pStyle w:val="TextodeTabela"/>
+            </w:pPr>
+            <w:r>
+              <w:t xml:space="preserve">409 </w:t>
+            </w:r>
+            <w:r>
+              <w:rPr>
+                <w:rFonts w:ascii="Courier New" w:hAnsi="Courier New" w:cs="Courier New"/>
+                <w:sz w:val="16"/>
+                <w:szCs w:val="16"/>
+              </w:rPr>
+              <w:t>INVALID_STATUS</w:t>
+            </w:r>
+          </w:p>
+        </w:tc>
+      </w:tr>
+      <w:tr>
+        <w:trPr>
+          <w:cantSplit/>
+        </w:trPr>
+        <w:tc>
+          <w:tcPr>
+            <w:tcW w:w="4000" w:type="dxa"/>
+          </w:tcPr>
+          <w:p>
+            <w:pPr>
+              <w:pStyle w:val="TextodeTabela"/>
+            </w:pPr>
+            <w:r>
+              <w:rPr>
+                <w:b/>
+                <w:bCs/>
+              </w:rPr>
+              <w:t>POST</w:t>
+            </w:r>
+            <w:r>
+              <w:t xml:space="preserve"> </w:t>
+            </w:r>
+            <w:r>
+              <w:rPr>
+                <w:rFonts w:ascii="Courier New" w:hAnsi="Courier New" w:cs="Courier New"/>
+                <w:sz w:val="16"/>
+                <w:szCs w:val="16"/>
+              </w:rPr>
               <w:t>/api/admin/appointments/:id/reschedule</w:t>
             </w:r>
           </w:p>
@@ -40236,7 +40899,7 @@
             <w:r>
               <w:t>Reagenda um serviço concluído (</w:t>
             </w:r>
-            <w:hyperlink r:id="rId220" w:anchor="UC25" w:history="1">
+            <w:hyperlink r:id="rId221" w:anchor="UC25" w:history="1">
               <w:r>
                 <w:rPr>
                   <w:rStyle w:val="Hyperlink"/>
@@ -40549,6 +41212,7 @@
         <w:spacing w:before="240"/>
       </w:pPr>
       <w:r>
+        <w:lastRenderedPageBreak/>
         <w:t xml:space="preserve">Permissão </w:t>
       </w:r>
       <w:r>
@@ -40714,7 +41378,7 @@
             <w:r>
               <w:t>Lista os serviços (</w:t>
             </w:r>
-            <w:hyperlink r:id="rId221" w:anchor="UC14" w:history="1">
+            <w:hyperlink r:id="rId222" w:anchor="UC14" w:history="1">
               <w:r>
                 <w:rPr>
                   <w:rStyle w:val="Hyperlink"/>
@@ -40878,7 +41542,7 @@
             <w:r>
               <w:t>Cadastra um serviço (</w:t>
             </w:r>
-            <w:hyperlink r:id="rId222" w:anchor="UC13" w:history="1">
+            <w:hyperlink r:id="rId223" w:anchor="UC13" w:history="1">
               <w:r>
                 <w:rPr>
                   <w:rStyle w:val="Hyperlink"/>
@@ -41175,7 +41839,7 @@
             <w:r>
               <w:t>Exclui um serviço por exclusão lógica (</w:t>
             </w:r>
-            <w:hyperlink r:id="rId223" w:anchor="RN030" w:history="1">
+            <w:hyperlink r:id="rId224" w:anchor="RN030" w:history="1">
               <w:r>
                 <w:rPr>
                   <w:rStyle w:val="Hyperlink"/>
@@ -41432,7 +42096,7 @@
             <w:r>
               <w:t>Cadastra uma categoria (</w:t>
             </w:r>
-            <w:hyperlink r:id="rId224" w:anchor="UC15" w:history="1">
+            <w:hyperlink r:id="rId225" w:anchor="UC15" w:history="1">
               <w:r>
                 <w:rPr>
                   <w:rStyle w:val="Hyperlink"/>
@@ -41538,7 +42202,7 @@
             <w:r>
               <w:t>Edita, desativa ou reativa uma categoria (</w:t>
             </w:r>
-            <w:hyperlink r:id="rId225" w:anchor="UC15" w:history="1">
+            <w:hyperlink r:id="rId226" w:anchor="UC15" w:history="1">
               <w:r>
                 <w:rPr>
                   <w:rStyle w:val="Hyperlink"/>
@@ -41779,7 +42443,7 @@
             <w:r>
               <w:t>Lista e busca clientes (</w:t>
             </w:r>
-            <w:hyperlink r:id="rId226" w:anchor="UC17" w:history="1">
+            <w:hyperlink r:id="rId227" w:anchor="UC17" w:history="1">
               <w:r>
                 <w:rPr>
                   <w:rStyle w:val="Hyperlink"/>
@@ -41848,6 +42512,7 @@
                 <w:b/>
                 <w:bCs/>
               </w:rPr>
+              <w:lastRenderedPageBreak/>
               <w:t>GET</w:t>
             </w:r>
             <w:r>
@@ -42017,7 +42682,7 @@
             <w:r>
               <w:t>Cadastra um cliente (</w:t>
             </w:r>
-            <w:hyperlink r:id="rId227" w:anchor="UC16" w:history="1">
+            <w:hyperlink r:id="rId228" w:anchor="UC16" w:history="1">
               <w:r>
                 <w:rPr>
                   <w:rStyle w:val="Hyperlink"/>
@@ -42202,7 +42867,7 @@
             <w:r>
               <w:t>Exclui a conta do cliente por exclusão lógica; veículos e agendamentos são preservados (</w:t>
             </w:r>
-            <w:hyperlink r:id="rId228" w:anchor="RN030" w:history="1">
+            <w:hyperlink r:id="rId229" w:anchor="RN030" w:history="1">
               <w:r>
                 <w:rPr>
                   <w:rStyle w:val="Hyperlink"/>
@@ -42286,96 +42951,6 @@
             </w:pPr>
             <w:r>
               <w:t>Consulta uma placa antes do cadastro (</w:t>
-            </w:r>
-            <w:hyperlink r:id="rId229" w:anchor="UC18" w:history="1">
-              <w:r>
-                <w:rPr>
-                  <w:rStyle w:val="Hyperlink"/>
-                </w:rPr>
-                <w:t>UC18</w:t>
-              </w:r>
-            </w:hyperlink>
-            <w:r>
-              <w:t>).</w:t>
-            </w:r>
-          </w:p>
-        </w:tc>
-        <w:tc>
-          <w:tcPr>
-            <w:tcW w:w="2600" w:type="dxa"/>
-          </w:tcPr>
-          <w:p>
-            <w:pPr>
-              <w:pStyle w:val="TextodeTabela"/>
-            </w:pPr>
-            <w:r>
-              <w:rPr>
-                <w:rFonts w:ascii="Courier New" w:hAnsi="Courier New" w:cs="Courier New"/>
-                <w:sz w:val="16"/>
-                <w:szCs w:val="16"/>
-              </w:rPr>
-              <w:t>plate*</w:t>
-            </w:r>
-          </w:p>
-        </w:tc>
-        <w:tc>
-          <w:tcPr>
-            <w:tcW w:w="2471" w:type="dxa"/>
-          </w:tcPr>
-          <w:p>
-            <w:pPr>
-              <w:pStyle w:val="TextodeTabela"/>
-            </w:pPr>
-            <w:r>
-              <w:rPr>
-                <w:b/>
-                <w:bCs/>
-              </w:rPr>
-              <w:t>200</w:t>
-            </w:r>
-            <w:r>
-              <w:t xml:space="preserve"> tipo, marca, modelo, cor e ano do veículo, se a placa já estiver cadastrada, ou resposta vazia.</w:t>
-            </w:r>
-          </w:p>
-        </w:tc>
-      </w:tr>
-      <w:tr>
-        <w:trPr>
-          <w:cantSplit/>
-        </w:trPr>
-        <w:tc>
-          <w:tcPr>
-            <w:tcW w:w="4000" w:type="dxa"/>
-          </w:tcPr>
-          <w:p>
-            <w:pPr>
-              <w:pStyle w:val="TextodeTabela"/>
-            </w:pPr>
-            <w:r>
-              <w:rPr>
-                <w:b/>
-                <w:bCs/>
-              </w:rPr>
-              <w:t>POST</w:t>
-            </w:r>
-            <w:r>
-              <w:t xml:space="preserve"> </w:t>
-            </w:r>
-            <w:r>
-              <w:rPr>
-                <w:rFonts w:ascii="Courier New" w:hAnsi="Courier New" w:cs="Courier New"/>
-                <w:sz w:val="16"/>
-                <w:szCs w:val="16"/>
-              </w:rPr>
-              <w:t>/api/admin/clients/:id/vehicles</w:t>
-            </w:r>
-          </w:p>
-          <w:p>
-            <w:pPr>
-              <w:pStyle w:val="TextodeTabela"/>
-            </w:pPr>
-            <w:r>
-              <w:t>Cadastra um veículo para o cliente ou vincula o veículo de uma placa já cadastrada (</w:t>
             </w:r>
             <w:hyperlink r:id="rId230" w:anchor="UC18" w:history="1">
               <w:r>
@@ -42407,25 +42982,6 @@
               <w:t>plate*</w:t>
             </w:r>
           </w:p>
-          <w:p>
-            <w:pPr>
-              <w:pStyle w:val="TextodeTabela"/>
-            </w:pPr>
-            <w:r>
-              <w:t xml:space="preserve">Placa nova: </w:t>
-            </w:r>
-            <w:r>
-              <w:rPr>
-                <w:rFonts w:ascii="Courier New" w:hAnsi="Courier New" w:cs="Courier New"/>
-                <w:sz w:val="16"/>
-                <w:szCs w:val="16"/>
-              </w:rPr>
-              <w:t>type*, brand*, model*, color*, year*</w:t>
-            </w:r>
-            <w:r>
-              <w:t>.</w:t>
-            </w:r>
-          </w:p>
         </w:tc>
         <w:tc>
           <w:tcPr>
@@ -42440,26 +42996,10 @@
                 <w:b/>
                 <w:bCs/>
               </w:rPr>
-              <w:t>201</w:t>
-            </w:r>
-            <w:r>
-              <w:t xml:space="preserve"> veículo criado ou vinculado, com o porte definido.</w:t>
-            </w:r>
-          </w:p>
-          <w:p>
-            <w:pPr>
-              <w:pStyle w:val="TextodeTabela"/>
-            </w:pPr>
-            <w:r>
-              <w:t xml:space="preserve">409 </w:t>
-            </w:r>
-            <w:r>
-              <w:rPr>
-                <w:rFonts w:ascii="Courier New" w:hAnsi="Courier New" w:cs="Courier New"/>
-                <w:sz w:val="16"/>
-                <w:szCs w:val="16"/>
-              </w:rPr>
-              <w:t>VEHICLE_ALREADY_LINKED</w:t>
+              <w:t>200</w:t>
+            </w:r>
+            <w:r>
+              <w:t xml:space="preserve"> tipo, marca, modelo, cor e ano do veículo, se a placa já estiver cadastrada, ou resposta vazia.</w:t>
             </w:r>
           </w:p>
         </w:tc>
@@ -42481,7 +43021,7 @@
                 <w:b/>
                 <w:bCs/>
               </w:rPr>
-              <w:t>PATCH</w:t>
+              <w:t>POST</w:t>
             </w:r>
             <w:r>
               <w:t xml:space="preserve"> </w:t>
@@ -42492,6 +43032,131 @@
                 <w:sz w:val="16"/>
                 <w:szCs w:val="16"/>
               </w:rPr>
+              <w:t>/api/admin/clients/:id/vehicles</w:t>
+            </w:r>
+          </w:p>
+          <w:p>
+            <w:pPr>
+              <w:pStyle w:val="TextodeTabela"/>
+            </w:pPr>
+            <w:r>
+              <w:t>Cadastra um veículo para o cliente ou vincula o veículo de uma placa já cadastrada (</w:t>
+            </w:r>
+            <w:hyperlink r:id="rId231" w:anchor="UC18" w:history="1">
+              <w:r>
+                <w:rPr>
+                  <w:rStyle w:val="Hyperlink"/>
+                </w:rPr>
+                <w:t>UC18</w:t>
+              </w:r>
+            </w:hyperlink>
+            <w:r>
+              <w:t>).</w:t>
+            </w:r>
+          </w:p>
+        </w:tc>
+        <w:tc>
+          <w:tcPr>
+            <w:tcW w:w="2600" w:type="dxa"/>
+          </w:tcPr>
+          <w:p>
+            <w:pPr>
+              <w:pStyle w:val="TextodeTabela"/>
+            </w:pPr>
+            <w:r>
+              <w:rPr>
+                <w:rFonts w:ascii="Courier New" w:hAnsi="Courier New" w:cs="Courier New"/>
+                <w:sz w:val="16"/>
+                <w:szCs w:val="16"/>
+              </w:rPr>
+              <w:t>plate*</w:t>
+            </w:r>
+          </w:p>
+          <w:p>
+            <w:pPr>
+              <w:pStyle w:val="TextodeTabela"/>
+            </w:pPr>
+            <w:r>
+              <w:t xml:space="preserve">Placa nova: </w:t>
+            </w:r>
+            <w:r>
+              <w:rPr>
+                <w:rFonts w:ascii="Courier New" w:hAnsi="Courier New" w:cs="Courier New"/>
+                <w:sz w:val="16"/>
+                <w:szCs w:val="16"/>
+              </w:rPr>
+              <w:t>type*, brand*, model*, color*, year*</w:t>
+            </w:r>
+            <w:r>
+              <w:t>.</w:t>
+            </w:r>
+          </w:p>
+        </w:tc>
+        <w:tc>
+          <w:tcPr>
+            <w:tcW w:w="2471" w:type="dxa"/>
+          </w:tcPr>
+          <w:p>
+            <w:pPr>
+              <w:pStyle w:val="TextodeTabela"/>
+            </w:pPr>
+            <w:r>
+              <w:rPr>
+                <w:b/>
+                <w:bCs/>
+              </w:rPr>
+              <w:t>201</w:t>
+            </w:r>
+            <w:r>
+              <w:t xml:space="preserve"> veículo criado ou vinculado, com o porte definido.</w:t>
+            </w:r>
+          </w:p>
+          <w:p>
+            <w:pPr>
+              <w:pStyle w:val="TextodeTabela"/>
+            </w:pPr>
+            <w:r>
+              <w:t xml:space="preserve">409 </w:t>
+            </w:r>
+            <w:r>
+              <w:rPr>
+                <w:rFonts w:ascii="Courier New" w:hAnsi="Courier New" w:cs="Courier New"/>
+                <w:sz w:val="16"/>
+                <w:szCs w:val="16"/>
+              </w:rPr>
+              <w:t>VEHICLE_ALREADY_LINKED</w:t>
+            </w:r>
+          </w:p>
+        </w:tc>
+      </w:tr>
+      <w:tr>
+        <w:trPr>
+          <w:cantSplit/>
+        </w:trPr>
+        <w:tc>
+          <w:tcPr>
+            <w:tcW w:w="4000" w:type="dxa"/>
+          </w:tcPr>
+          <w:p>
+            <w:pPr>
+              <w:pStyle w:val="TextodeTabela"/>
+            </w:pPr>
+            <w:r>
+              <w:rPr>
+                <w:b/>
+                <w:bCs/>
+              </w:rPr>
+              <w:t>PATCH</w:t>
+            </w:r>
+            <w:r>
+              <w:t xml:space="preserve"> </w:t>
+            </w:r>
+            <w:r>
+              <w:rPr>
+                <w:rFonts w:ascii="Courier New" w:hAnsi="Courier New" w:cs="Courier New"/>
+                <w:sz w:val="16"/>
+                <w:szCs w:val="16"/>
+              </w:rPr>
               <w:t>/api/admin/vehicles/:id</w:t>
             </w:r>
           </w:p>
@@ -42502,7 +43167,7 @@
             <w:r>
               <w:t>Edita um veículo, inclusive o vinculado a mais de uma conta (</w:t>
             </w:r>
-            <w:hyperlink r:id="rId231" w:anchor="UC18" w:history="1">
+            <w:hyperlink r:id="rId232" w:anchor="UC18" w:history="1">
               <w:r>
                 <w:rPr>
                   <w:rStyle w:val="Hyperlink"/>
@@ -42743,7 +43408,7 @@
             <w:r>
               <w:t>Lista os funcionários, sem a conta de administrador (</w:t>
             </w:r>
-            <w:hyperlink r:id="rId232" w:anchor="UC20" w:history="1">
+            <w:hyperlink r:id="rId233" w:anchor="UC20" w:history="1">
               <w:r>
                 <w:rPr>
                   <w:rStyle w:val="Hyperlink"/>
@@ -42833,7 +43498,7 @@
             <w:r>
               <w:t>Cadastra um funcionário (</w:t>
             </w:r>
-            <w:hyperlink r:id="rId233" w:anchor="UC19" w:history="1">
+            <w:hyperlink r:id="rId234" w:anchor="UC19" w:history="1">
               <w:r>
                 <w:rPr>
                   <w:rStyle w:val="Hyperlink"/>
@@ -43018,7 +43683,7 @@
             <w:r>
               <w:t>Lista os cargos (</w:t>
             </w:r>
-            <w:hyperlink r:id="rId234" w:anchor="UC21" w:history="1">
+            <w:hyperlink r:id="rId235" w:anchor="UC21" w:history="1">
               <w:r>
                 <w:rPr>
                   <w:rStyle w:val="Hyperlink"/>
@@ -43087,6 +43752,7 @@
                 <w:b/>
                 <w:bCs/>
               </w:rPr>
+              <w:lastRenderedPageBreak/>
               <w:t>POST</w:t>
             </w:r>
             <w:r>
@@ -43449,7 +44115,7 @@
             <w:r>
               <w:t>Dados da empresa (</w:t>
             </w:r>
-            <w:hyperlink r:id="rId235" w:anchor="UC22" w:history="1">
+            <w:hyperlink r:id="rId236" w:anchor="UC22" w:history="1">
               <w:r>
                 <w:rPr>
                   <w:rStyle w:val="Hyperlink"/>
@@ -43613,7 +44279,7 @@
             <w:r>
               <w:t>Disponibilidade (</w:t>
             </w:r>
-            <w:hyperlink r:id="rId236" w:anchor="UC23" w:history="1">
+            <w:hyperlink r:id="rId237" w:anchor="UC23" w:history="1">
               <w:r>
                 <w:rPr>
                   <w:rStyle w:val="Hyperlink"/>
@@ -43791,7 +44457,7 @@
             <w:r>
               <w:t>Percentuais das formas de pagamento (</w:t>
             </w:r>
-            <w:hyperlink r:id="rId237" w:anchor="UC24" w:history="1">
+            <w:hyperlink r:id="rId238" w:anchor="UC24" w:history="1">
               <w:r>
                 <w:rPr>
                   <w:rStyle w:val="Hyperlink"/>
@@ -43938,7 +44604,7 @@
       </w:pPr>
     </w:p>
     <w:sectPr>
-      <w:headerReference w:type="default" r:id="rId238"/>
+      <w:headerReference w:type="default" r:id="rId239"/>
       <w:pgSz w:w="11906" w:h="16838"/>
       <w:pgMar w:top="1701" w:right="1134" w:bottom="1134" w:left="1701" w:header="709" w:footer="709" w:gutter="0"/>
       <w:cols w:space="708"/>
@@ -45341,6 +46007,18 @@
       <w:szCs w:val="18"/>
     </w:rPr>
   </w:style>
+  <w:style w:type="character" w:styleId="MenoPendente">
+    <w:name w:val="Unresolved Mention"/>
+    <w:basedOn w:val="Fontepargpadro"/>
+    <w:uiPriority w:val="99"/>
+    <w:semiHidden/>
+    <w:unhideWhenUsed/>
+    <w:rsid w:val="002E5307"/>
+    <w:rPr>
+      <w:color w:val="605E5C"/>
+      <w:shd w:val="clear" w:color="auto" w:fill="E1DFDD"/>
+    </w:rPr>
+  </w:style>
 </w:styles>
 </file>
 

</xml_diff>